<commit_message>
Removed t12e as grids.nc file is too big
Former-commit-id: 4f898e7064bfc95af21660b60f0b4d91f3e51f45
</commit_message>
<xml_diff>
--- a/examples/regrid_environment/regrid_environment_documentation.docx
+++ b/examples/regrid_environment/regrid_environment_documentation.docx
@@ -1327,61 +1327,6 @@
         <w:rPr>
           <w:lang w:val="en-GB"/>
         </w:rPr>
-        <w:t>“t12e</w:t>
-      </w:r>
-      <w:r>
-        <w:rPr>
-          <w:lang w:val="en-GB"/>
-        </w:rPr>
-        <w:t>”:</w:t>
-      </w:r>
-      <w:r>
-        <w:rPr>
-          <w:lang w:val="en-GB"/>
-        </w:rPr>
-        <w:t xml:space="preserve"> NEMO ORCA012 </w:t>
-      </w:r>
-      <w:r>
-        <w:rPr>
-          <w:lang w:val="en-GB"/>
-        </w:rPr>
-        <w:t xml:space="preserve">rotated-stretched logically-rectangular (ocean, </w:t>
-      </w:r>
-      <w:r>
-        <w:rPr>
-          <w:lang w:val="en-GB"/>
-        </w:rPr>
-        <w:t xml:space="preserve">LR, </w:t>
-      </w:r>
-      <w:r>
-        <w:rPr>
-          <w:lang w:val="en-GB"/>
-        </w:rPr>
-        <w:t>3147x4322</w:t>
-      </w:r>
-      <w:r>
-        <w:rPr>
-          <w:lang w:val="en-GB"/>
-        </w:rPr>
-        <w:t>)</w:t>
-      </w:r>
-    </w:p>
-    <w:p>
-      <w:pPr>
-        <w:numPr>
-          <w:ilvl w:val="0"/>
-          <w:numId w:val="3"/>
-        </w:numPr>
-        <w:suppressAutoHyphens w:val="0"/>
-        <w:ind w:left="714" w:hanging="357"/>
-        <w:rPr>
-          <w:lang w:val="en-GB"/>
-        </w:rPr>
-      </w:pPr>
-      <w:r>
-        <w:rPr>
-          <w:lang w:val="en-GB"/>
-        </w:rPr>
         <w:t>“</w:t>
       </w:r>
       <w:proofErr w:type="spellStart"/>
@@ -2506,32 +2451,15 @@
         </w:rPr>
         <w:t>Instructions on how to install OASIS3-MCT, and therefore the SCRIP library, are provided in section 6 of the User Guide (</w:t>
       </w:r>
-      <w:r>
-        <w:fldChar w:fldCharType="begin"/>
-      </w:r>
-      <w:r>
-        <w:rPr>
-          <w:lang w:val="en-US"/>
-        </w:rPr>
-        <w:instrText xml:space="preserve"> HYPERLINK "https://oasis.cerfacs.fr/en/documentation/" </w:instrText>
-      </w:r>
-      <w:r>
-        <w:fldChar w:fldCharType="separate"/>
-      </w:r>
-      <w:r>
-        <w:rPr>
-          <w:rStyle w:val="Hyperlink"/>
-          <w:lang w:val="en-GB"/>
-        </w:rPr>
-        <w:t>https://oasis.cerfacs.fr/en/documentation/</w:t>
-      </w:r>
-      <w:r>
-        <w:rPr>
-          <w:rStyle w:val="Hyperlink"/>
-          <w:lang w:val="en-GB"/>
-        </w:rPr>
-        <w:fldChar w:fldCharType="end"/>
-      </w:r>
+      <w:hyperlink r:id="rId9" w:history="1">
+        <w:r>
+          <w:rPr>
+            <w:rStyle w:val="Hyperlink"/>
+            <w:lang w:val="en-GB"/>
+          </w:rPr>
+          <w:t>https://oasis.cerfacs.fr/en/documentation/</w:t>
+        </w:r>
+      </w:hyperlink>
       <w:r>
         <w:rPr>
           <w:color w:val="000000" w:themeColor="text1"/>
@@ -2600,7 +2528,7 @@
         </w:rPr>
         <w:t xml:space="preserve">are available at </w:t>
       </w:r>
-      <w:hyperlink r:id="rId9" w:history="1">
+      <w:hyperlink r:id="rId10" w:history="1">
         <w:r>
           <w:rPr>
             <w:rStyle w:val="Hyperlink"/>
@@ -2647,34 +2575,16 @@
         </w:rPr>
         <w:t xml:space="preserve">git clone </w:t>
       </w:r>
-      <w:r>
-        <w:fldChar w:fldCharType="begin"/>
-      </w:r>
-      <w:r>
-        <w:rPr>
-          <w:lang w:val="en-US"/>
-        </w:rPr>
-        <w:instrText xml:space="preserve"> HYPERLINK "https://github.com/esmf-org/esmf.git%20--branch%20ESMF_8_2_0%20--depth%201" </w:instrText>
-      </w:r>
-      <w:r>
-        <w:fldChar w:fldCharType="separate"/>
-      </w:r>
-      <w:r>
-        <w:rPr>
-          <w:rStyle w:val="Hyperlink"/>
-          <w:rFonts w:ascii="Courier New" w:hAnsi="Courier New" w:cs="Courier New"/>
-          <w:lang w:val="en-GB" w:eastAsia="en-US"/>
-        </w:rPr>
-        <w:t>https://github.com/esmf-org/esmf.git --branch ESMF_8_2_0 --depth 1</w:t>
-      </w:r>
-      <w:r>
-        <w:rPr>
-          <w:rStyle w:val="Hyperlink"/>
-          <w:rFonts w:ascii="Courier New" w:hAnsi="Courier New" w:cs="Courier New"/>
-          <w:lang w:val="en-GB" w:eastAsia="en-US"/>
-        </w:rPr>
-        <w:fldChar w:fldCharType="end"/>
-      </w:r>
+      <w:hyperlink r:id="rId11" w:history="1">
+        <w:r>
+          <w:rPr>
+            <w:rStyle w:val="Hyperlink"/>
+            <w:rFonts w:ascii="Courier New" w:hAnsi="Courier New" w:cs="Courier New"/>
+            <w:lang w:val="en-GB" w:eastAsia="en-US"/>
+          </w:rPr>
+          <w:t>https://github.com/esmf-org/esmf.git --branch ESMF_8_2_0 --depth 1</w:t>
+        </w:r>
+      </w:hyperlink>
     </w:p>
     <w:p>
       <w:pPr>
@@ -3490,32 +3400,15 @@
         </w:rPr>
         <w:t xml:space="preserve">Details on XIOS installation are available at </w:t>
       </w:r>
-      <w:r>
-        <w:fldChar w:fldCharType="begin"/>
-      </w:r>
-      <w:r>
-        <w:rPr>
-          <w:lang w:val="en-US"/>
-        </w:rPr>
-        <w:instrText xml:space="preserve"> HYPERLINK "https://forge.ipsl.jussieu.fr/ioserver/wiki/documentation" </w:instrText>
-      </w:r>
-      <w:r>
-        <w:fldChar w:fldCharType="separate"/>
-      </w:r>
-      <w:r>
-        <w:rPr>
-          <w:rStyle w:val="Hyperlink"/>
-          <w:lang w:val="en-GB"/>
-        </w:rPr>
-        <w:t>https://forge.ipsl.jussieu.fr/ioserver/wiki/documentation</w:t>
-      </w:r>
-      <w:r>
-        <w:rPr>
-          <w:rStyle w:val="Hyperlink"/>
-          <w:lang w:val="en-GB"/>
-        </w:rPr>
-        <w:fldChar w:fldCharType="end"/>
-      </w:r>
+      <w:hyperlink r:id="rId12" w:history="1">
+        <w:r>
+          <w:rPr>
+            <w:rStyle w:val="Hyperlink"/>
+            <w:lang w:val="en-GB"/>
+          </w:rPr>
+          <w:t>https://forge.ipsl.jussieu.fr/ioserver/wiki/documentation</w:t>
+        </w:r>
+      </w:hyperlink>
       <w:r>
         <w:rPr>
           <w:lang w:val="en-GB"/>
@@ -3599,38 +3492,18 @@
         </w:rPr>
         <w:t xml:space="preserve"> co </w:t>
       </w:r>
-      <w:r>
-        <w:fldChar w:fldCharType="begin"/>
-      </w:r>
-      <w:r>
-        <w:rPr>
-          <w:lang w:val="en-US"/>
-        </w:rPr>
-        <w:instrText xml:space="preserve"> HYPERLINK "http://forge.ipsl.jussieu.fr/ioserver/svn/XIOS/trunk" </w:instrText>
-      </w:r>
-      <w:r>
-        <w:fldChar w:fldCharType="separate"/>
-      </w:r>
-      <w:r>
-        <w:rPr>
-          <w:rStyle w:val="Hyperlink"/>
-          <w:rFonts w:ascii="Courier New" w:hAnsi="Courier New" w:cs="Courier New"/>
-          <w:sz w:val="21"/>
-          <w:szCs w:val="21"/>
-          <w:lang w:val="en-GB" w:eastAsia="en-US"/>
-        </w:rPr>
-        <w:t>http://forge.ipsl.jussieu.fr/ioserver/svn/XIOS/trunk</w:t>
-      </w:r>
-      <w:r>
-        <w:rPr>
-          <w:rStyle w:val="Hyperlink"/>
-          <w:rFonts w:ascii="Courier New" w:hAnsi="Courier New" w:cs="Courier New"/>
-          <w:sz w:val="21"/>
-          <w:szCs w:val="21"/>
-          <w:lang w:val="en-GB" w:eastAsia="en-US"/>
-        </w:rPr>
-        <w:fldChar w:fldCharType="end"/>
-      </w:r>
+      <w:hyperlink r:id="rId13" w:history="1">
+        <w:r>
+          <w:rPr>
+            <w:rStyle w:val="Hyperlink"/>
+            <w:rFonts w:ascii="Courier New" w:hAnsi="Courier New" w:cs="Courier New"/>
+            <w:sz w:val="21"/>
+            <w:szCs w:val="21"/>
+            <w:lang w:val="en-GB" w:eastAsia="en-US"/>
+          </w:rPr>
+          <w:t>http://forge.ipsl.jussieu.fr/ioserver/svn/XIOS/trunk</w:t>
+        </w:r>
+      </w:hyperlink>
       <w:r>
         <w:rPr>
           <w:rFonts w:ascii="Courier New" w:hAnsi="Courier New" w:cs="Courier New"/>
@@ -5021,7 +4894,7 @@
         <w:rPr>
           <w:lang w:val="en-GB"/>
         </w:rPr>
-        <w:t>, torc or t12e</w:t>
+        <w:t>, torc</w:t>
       </w:r>
       <w:r>
         <w:rPr>
@@ -5145,7 +5018,7 @@
         <w:rPr>
           <w:lang w:val="en-GB"/>
         </w:rPr>
-        <w:t>, torc or t12e</w:t>
+        <w:t>, torc</w:t>
       </w:r>
       <w:r>
         <w:rPr>
@@ -5464,7 +5337,6 @@
         </w:rPr>
         <w:t>$</w:t>
       </w:r>
-      <w:proofErr w:type="spellStart"/>
       <w:r>
         <w:rPr>
           <w:rFonts w:ascii="Courier New" w:hAnsi="Courier New" w:cs="Courier New"/>
@@ -5472,7 +5344,6 @@
         </w:rPr>
         <w:t>ext</w:t>
       </w:r>
-      <w:proofErr w:type="spellEnd"/>
       <w:r>
         <w:rPr>
           <w:rFonts w:ascii="Courier New" w:hAnsi="Courier New" w:cs="Courier New"/>
@@ -7601,20 +7472,7 @@
         <w:rPr>
           <w:lang w:val="en-GB"/>
         </w:rPr>
-        <w:t>is defined and copied to the working directory</w:t>
-      </w:r>
-      <w:r>
-        <w:rPr>
-          <w:rStyle w:val="FootnoteReference"/>
-          <w:lang w:val="en-GB"/>
-        </w:rPr>
-        <w:footnoteReference w:id="4"/>
-      </w:r>
-      <w:r>
-        <w:rPr>
-          <w:lang w:val="en-GB"/>
-        </w:rPr>
-        <w:t xml:space="preserve">. </w:t>
+        <w:t xml:space="preserve">is defined and copied to the working directory. </w:t>
       </w:r>
     </w:p>
     <w:p>
@@ -7861,21 +7719,14 @@
         <w:rPr>
           <w:lang w:val="en-US"/>
         </w:rPr>
-        <w:t xml:space="preserve">are also copied to the working </w:t>
-      </w:r>
-      <w:r>
-        <w:rPr>
-          <w:lang w:val="en-US"/>
-        </w:rPr>
-        <w:lastRenderedPageBreak/>
-        <w:t>directory</w:t>
+        <w:t>are also copied to the working directory</w:t>
       </w:r>
       <w:r>
         <w:rPr>
           <w:rStyle w:val="FootnoteReference"/>
           <w:lang w:val="en-US"/>
         </w:rPr>
-        <w:footnoteReference w:id="5"/>
+        <w:footnoteReference w:id="4"/>
       </w:r>
       <w:r>
         <w:rPr>
@@ -7922,6 +7773,7 @@
         <w:rPr>
           <w:lang w:val="en-US"/>
         </w:rPr>
+        <w:lastRenderedPageBreak/>
         <w:t xml:space="preserve">For XIOS, the </w:t>
       </w:r>
       <w:r>
@@ -9712,7 +9564,6 @@
           <w:szCs w:val="22"/>
           <w:lang w:val="en-GB"/>
         </w:rPr>
-        <w:lastRenderedPageBreak/>
         <w:t>--</w:t>
       </w:r>
       <w:proofErr w:type="spellStart"/>
@@ -9903,7 +9754,14 @@
         <w:rPr>
           <w:lang w:val="en-GB"/>
         </w:rPr>
-        <w:t xml:space="preserve"> each target point that does not receive a value with the original algorithm uses the closest unmasked source point to define its value; this option</w:t>
+        <w:t xml:space="preserve"> each target point that does not receive a value with the original algorithm uses the closest unmasked source point to define its value; this </w:t>
+      </w:r>
+      <w:r>
+        <w:rPr>
+          <w:lang w:val="en-GB"/>
+        </w:rPr>
+        <w:lastRenderedPageBreak/>
+        <w:t>option</w:t>
       </w:r>
       <w:r>
         <w:rPr>
@@ -11208,14 +11066,7 @@
         <w:rPr>
           <w:lang w:val="en-GB"/>
         </w:rPr>
-        <w:t xml:space="preserve"> </w:t>
-      </w:r>
-      <w:r>
-        <w:rPr>
-          <w:lang w:val="en-GB"/>
-        </w:rPr>
-        <w:lastRenderedPageBreak/>
-        <w:t>call</w:t>
+        <w:t xml:space="preserve"> call</w:t>
       </w:r>
       <w:r>
         <w:rPr>
@@ -11330,7 +11181,14 @@
         <w:rPr>
           <w:lang w:val="en-GB"/>
         </w:rPr>
-        <w:t xml:space="preserve"> to be able to easily detect them. The error field is then calculated </w:t>
+        <w:t xml:space="preserve"> to be </w:t>
+      </w:r>
+      <w:r>
+        <w:rPr>
+          <w:lang w:val="en-GB"/>
+        </w:rPr>
+        <w:lastRenderedPageBreak/>
+        <w:t xml:space="preserve">able to easily detect them. The error field is then calculated </w:t>
       </w:r>
       <w:r>
         <w:rPr>
@@ -12446,32 +12304,15 @@
         </w:rPr>
         <w:t>(</w:t>
       </w:r>
-      <w:r>
-        <w:fldChar w:fldCharType="begin"/>
-      </w:r>
-      <w:r>
-        <w:rPr>
-          <w:lang w:val="en-US"/>
-        </w:rPr>
-        <w:instrText xml:space="preserve"> HYPERLINK "mailto:oasishelp@cerfacs.fr" </w:instrText>
-      </w:r>
-      <w:r>
-        <w:fldChar w:fldCharType="separate"/>
-      </w:r>
-      <w:r>
-        <w:rPr>
-          <w:rStyle w:val="Hyperlink"/>
-          <w:lang w:val="en-GB"/>
-        </w:rPr>
-        <w:t>oasishelp@cerfacs.fr</w:t>
-      </w:r>
-      <w:r>
-        <w:rPr>
-          <w:rStyle w:val="Hyperlink"/>
-          <w:lang w:val="en-GB"/>
-        </w:rPr>
-        <w:fldChar w:fldCharType="end"/>
-      </w:r>
+      <w:hyperlink r:id="rId14" w:history="1">
+        <w:r>
+          <w:rPr>
+            <w:rStyle w:val="Hyperlink"/>
+            <w:lang w:val="en-GB"/>
+          </w:rPr>
+          <w:t>oasishelp@cerfacs.fr</w:t>
+        </w:r>
+      </w:hyperlink>
       <w:r>
         <w:rPr>
           <w:lang w:val="en-GB"/>
@@ -13018,12 +12859,12 @@
       </w:pPr>
     </w:p>
     <w:sectPr>
-      <w:headerReference w:type="even" r:id="rId10"/>
-      <w:headerReference w:type="default" r:id="rId11"/>
-      <w:footerReference w:type="even" r:id="rId12"/>
-      <w:footerReference w:type="default" r:id="rId13"/>
-      <w:headerReference w:type="first" r:id="rId14"/>
-      <w:footerReference w:type="first" r:id="rId15"/>
+      <w:headerReference w:type="even" r:id="rId15"/>
+      <w:headerReference w:type="default" r:id="rId16"/>
+      <w:footerReference w:type="even" r:id="rId17"/>
+      <w:footerReference w:type="default" r:id="rId18"/>
+      <w:headerReference w:type="first" r:id="rId19"/>
+      <w:footerReference w:type="first" r:id="rId20"/>
       <w:pgSz w:w="11906" w:h="16838"/>
       <w:pgMar w:top="180" w:right="1106" w:bottom="1417" w:left="1417" w:header="720" w:footer="708" w:gutter="0"/>
       <w:cols w:space="720"/>
@@ -13419,25 +13260,31 @@
           <w:szCs w:val="22"/>
           <w:lang w:val="en-US"/>
         </w:rPr>
-        <w:t xml:space="preserve"> W</w:t>
-      </w:r>
-      <w:proofErr w:type="spellStart"/>
-      <w:r>
-        <w:rPr>
-          <w:sz w:val="22"/>
-          <w:szCs w:val="22"/>
-          <w:lang w:val="en-GB"/>
-        </w:rPr>
-        <w:t>e</w:t>
-      </w:r>
-      <w:proofErr w:type="spellEnd"/>
-      <w:r>
-        <w:rPr>
-          <w:sz w:val="22"/>
-          <w:szCs w:val="22"/>
-          <w:lang w:val="en-GB"/>
-        </w:rPr>
-        <w:t xml:space="preserve"> did not yet follow this best practice when the t12e grid is involved; in those cases, we use masks generated with the </w:t>
+        <w:t xml:space="preserve"> Two formats can be used to describe a grid in</w:t>
+      </w:r>
+      <w:r>
+        <w:rPr>
+          <w:sz w:val="22"/>
+          <w:szCs w:val="22"/>
+          <w:lang w:val="en-GB"/>
+        </w:rPr>
+        <w:t xml:space="preserve"> ESMF: the so-called “SCRIP” format or the “unstructured” format. The “SCRIP” format describes the grid providing the latitude and the longitude of the centre and corners of each cell. The unstructured format describes the grid as an ensemble of elements and provides the element connectivity associating for each element a certain number of nodes in the list of nodes for which the latitude and longitude are provided. The grids torc</w:t>
+      </w:r>
+      <w:r>
+        <w:rPr>
+          <w:sz w:val="22"/>
+          <w:szCs w:val="22"/>
+          <w:lang w:val="en-GB"/>
+        </w:rPr>
+        <w:t xml:space="preserve"> and</w:t>
+      </w:r>
+      <w:r>
+        <w:rPr>
+          <w:sz w:val="22"/>
+          <w:szCs w:val="22"/>
+          <w:lang w:val="en-GB"/>
+        </w:rPr>
+        <w:t xml:space="preserve"> </w:t>
       </w:r>
       <w:proofErr w:type="spellStart"/>
       <w:r>
@@ -13455,61 +13302,7 @@
           <w:szCs w:val="22"/>
           <w:lang w:val="en-GB"/>
         </w:rPr>
-        <w:t xml:space="preserve"> sea-land mask.</w:t>
-      </w:r>
-    </w:p>
-  </w:footnote>
-  <w:footnote w:id="5">
-    <w:p>
-      <w:pPr>
-        <w:pStyle w:val="FootnoteText"/>
-        <w:rPr>
-          <w:sz w:val="22"/>
-          <w:szCs w:val="22"/>
-          <w:lang w:val="en-US"/>
-        </w:rPr>
-      </w:pPr>
-      <w:r>
-        <w:rPr>
-          <w:rStyle w:val="FootnoteReference"/>
-          <w:sz w:val="22"/>
-          <w:szCs w:val="22"/>
-        </w:rPr>
-        <w:footnoteRef/>
-      </w:r>
-      <w:r>
-        <w:rPr>
-          <w:sz w:val="22"/>
-          <w:szCs w:val="22"/>
-          <w:lang w:val="en-US"/>
-        </w:rPr>
-        <w:t xml:space="preserve"> Two formats can be used to describe a grid in</w:t>
-      </w:r>
-      <w:r>
-        <w:rPr>
-          <w:sz w:val="22"/>
-          <w:szCs w:val="22"/>
-          <w:lang w:val="en-GB"/>
-        </w:rPr>
-        <w:t xml:space="preserve"> ESMF: the so-called “SCRIP” format or the “unstructured” format. The “SCRIP” format describes the grid providing the latitude and the longitude of the centre and corners of each cell. The unstructured format describes the grid as an ensemble of elements and provides the element connectivity associating for each element a certain number of nodes in the list of nodes for which the latitude and longitude are provided. The grids torc, </w:t>
-      </w:r>
-      <w:proofErr w:type="spellStart"/>
-      <w:r>
-        <w:rPr>
-          <w:sz w:val="22"/>
-          <w:szCs w:val="22"/>
-          <w:lang w:val="en-GB"/>
-        </w:rPr>
-        <w:t>nogt</w:t>
-      </w:r>
-      <w:proofErr w:type="spellEnd"/>
-      <w:r>
-        <w:rPr>
-          <w:sz w:val="22"/>
-          <w:szCs w:val="22"/>
-          <w:lang w:val="en-GB"/>
-        </w:rPr>
-        <w:t xml:space="preserve"> and t12e are structured and can in principle be described in ESMF with the SCRIP format. However, as detailed in section 7.4 of (Valcke et al</w:t>
+        <w:t xml:space="preserve"> are structured and can in principle be described in ESMF with the SCRIP format. However, as detailed in section 7.4 of (Valcke et al</w:t>
       </w:r>
       <w:r>
         <w:rPr>

</xml_diff>

<commit_message>
[regrid_environment] Update of clean documentation
Former-commit-id: 7e95498d688c44fac3158a0b5244db094ff8edcc
</commit_message>
<xml_diff>
--- a/examples/regrid_environment/regrid_environment_documentation.docx
+++ b/examples/regrid_environment/regrid_environment_documentation.docx
@@ -121,6 +121,7 @@
       <w:r>
         <w:rPr>
           <w:b w:val="0"/>
+          <w:i/>
           <w:sz w:val="32"/>
           <w:szCs w:val="32"/>
         </w:rPr>
@@ -226,6 +227,9 @@
       <w:proofErr w:type="spellStart"/>
       <w:r>
         <w:rPr>
+          <w:rFonts w:ascii="Courier New" w:hAnsi="Courier New" w:cs="Courier New"/>
+          <w:sz w:val="22"/>
+          <w:szCs w:val="22"/>
           <w:lang w:val="en-GB"/>
         </w:rPr>
         <w:t>regrid_environment</w:t>
@@ -342,6 +346,7 @@
       <w:proofErr w:type="spellStart"/>
       <w:r>
         <w:rPr>
+          <w:i/>
           <w:lang w:val="en-GB"/>
         </w:rPr>
         <w:t>regrid_environment</w:t>
@@ -822,6 +827,7 @@
       <w:proofErr w:type="spellStart"/>
       <w:r>
         <w:rPr>
+          <w:i/>
           <w:lang w:val="en-GB"/>
         </w:rPr>
         <w:t>regrid_environment</w:t>
@@ -1022,6 +1028,7 @@
       <w:proofErr w:type="spellStart"/>
       <w:r>
         <w:rPr>
+          <w:i/>
           <w:lang w:val="en-GB"/>
         </w:rPr>
         <w:t>regrid_environment</w:t>
@@ -2860,6 +2867,7 @@
       <w:proofErr w:type="spellStart"/>
       <w:r>
         <w:rPr>
+          <w:i/>
           <w:sz w:val="22"/>
           <w:szCs w:val="22"/>
           <w:lang w:val="en-GB"/>
@@ -3160,6 +3168,9 @@
       <w:proofErr w:type="spellStart"/>
       <w:r>
         <w:rPr>
+          <w:rFonts w:ascii="Courier New" w:hAnsi="Courier New" w:cs="Courier New"/>
+          <w:sz w:val="22"/>
+          <w:szCs w:val="22"/>
           <w:lang w:val="en-GB"/>
         </w:rPr>
         <w:t>regrid_environment</w:t>
@@ -4933,6 +4944,9 @@
       <w:proofErr w:type="spellStart"/>
       <w:r>
         <w:rPr>
+          <w:rFonts w:ascii="Courier New" w:hAnsi="Courier New" w:cs="Courier New"/>
+          <w:sz w:val="22"/>
+          <w:szCs w:val="22"/>
           <w:u w:val="single"/>
           <w:lang w:val="en-GB"/>
         </w:rPr>
@@ -10409,49 +10423,6 @@
         </w:rPr>
         <w:t>OasisGridsToESMF.py</w:t>
       </w:r>
-      <w:del w:id="1" w:author="Gabriel Jonville" w:date="2023-01-24T15:53:00Z">
-        <w:r>
-          <w:rPr>
-            <w:rFonts w:ascii="Courier New" w:hAnsi="Courier New" w:cs="Courier New"/>
-            <w:lang w:val="en-GB"/>
-          </w:rPr>
-          <w:delText xml:space="preserve"> </w:delText>
-        </w:r>
-        <w:r>
-          <w:rPr>
-            <w:color w:val="000000" w:themeColor="text1"/>
-            <w:lang w:val="en-US" w:eastAsia="fr-FR"/>
-          </w:rPr>
-          <w:delText>or</w:delText>
-        </w:r>
-        <w:r>
-          <w:rPr>
-            <w:rFonts w:ascii="Courier New" w:hAnsi="Courier New" w:cs="Courier New"/>
-            <w:lang w:val="en-GB"/>
-          </w:rPr>
-          <w:delText xml:space="preserve"> </w:delText>
-        </w:r>
-        <w:r>
-          <w:rPr>
-            <w:rFonts w:ascii="Courier New" w:hAnsi="Courier New" w:cs="Courier New"/>
-            <w:lang w:val="en-GB"/>
-          </w:rPr>
-          <w:delText>OasisGridsToESMF</w:delText>
-        </w:r>
-        <w:r>
-          <w:rPr>
-            <w:lang w:val="en-US"/>
-          </w:rPr>
-          <w:delText xml:space="preserve"> </w:delText>
-        </w:r>
-        <w:r>
-          <w:rPr>
-            <w:rFonts w:ascii="Courier New" w:hAnsi="Courier New" w:cs="Courier New"/>
-            <w:lang w:val="en-GB"/>
-          </w:rPr>
-          <w:delText>_nogtunstruct.py</w:delText>
-        </w:r>
-      </w:del>
       <w:r>
         <w:rPr>
           <w:color w:val="000000" w:themeColor="text1"/>
@@ -11297,30 +11268,12 @@
         <w:t>conserv</w:t>
       </w:r>
       <w:proofErr w:type="gramEnd"/>
-      <w:del w:id="2" w:author="Gabriel Jonville" w:date="2023-01-24T16:14:00Z">
-        <w:r>
-          <w:rPr>
-            <w:lang w:val="en-GB"/>
-          </w:rPr>
-          <w:delText>1</w:delText>
-        </w:r>
-      </w:del>
-      <w:del w:id="3" w:author="Gabriel Jonville" w:date="2023-01-24T16:13:00Z">
-        <w:r>
-          <w:rPr>
-            <w:lang w:val="en-GB"/>
-          </w:rPr>
-          <w:delText>st</w:delText>
-        </w:r>
-      </w:del>
-      <w:ins w:id="4" w:author="Gabriel Jonville" w:date="2023-01-24T16:13:00Z">
-        <w:r>
-          <w:rPr>
-            <w:lang w:val="en-GB"/>
-          </w:rPr>
-          <w:t>_1st_fracarea</w:t>
-        </w:r>
-      </w:ins>
+      <w:r>
+        <w:rPr>
+          <w:lang w:val="en-GB"/>
+        </w:rPr>
+        <w:t>_1st_fracarea</w:t>
+      </w:r>
       <w:r>
         <w:rPr>
           <w:lang w:val="en-GB"/>
@@ -11504,44 +11457,32 @@
           <w:lang w:val="en-GB"/>
         </w:rPr>
       </w:pPr>
-      <w:del w:id="5" w:author="Gabriel Jonville" w:date="2023-01-24T16:14:00Z">
-        <w:r>
-          <w:rPr>
-            <w:lang w:val="en-GB"/>
-          </w:rPr>
-          <w:delText>conserv</w:delText>
-        </w:r>
-      </w:del>
-      <w:ins w:id="6" w:author="Gabriel Jonville" w:date="2023-01-24T16:14:00Z">
-        <w:r>
-          <w:rPr>
-            <w:lang w:val="en-GB"/>
-          </w:rPr>
-          <w:t>conserv</w:t>
-        </w:r>
-        <w:bookmarkStart w:id="7" w:name="_GoBack"/>
-        <w:bookmarkEnd w:id="7"/>
-        <w:r>
-          <w:rPr>
-            <w:lang w:val="en-GB"/>
-          </w:rPr>
-          <w:t>_</w:t>
-        </w:r>
-      </w:ins>
+      <w:proofErr w:type="gramStart"/>
+      <w:r>
+        <w:rPr>
+          <w:lang w:val="en-GB"/>
+        </w:rPr>
+        <w:t>conserv</w:t>
+      </w:r>
+      <w:proofErr w:type="gramEnd"/>
+      <w:r>
+        <w:rPr>
+          <w:lang w:val="en-GB"/>
+        </w:rPr>
+        <w:t>_</w:t>
+      </w:r>
       <w:r>
         <w:rPr>
           <w:lang w:val="en-GB"/>
         </w:rPr>
         <w:t>2nd</w:t>
       </w:r>
-      <w:ins w:id="8" w:author="Gabriel Jonville" w:date="2023-01-24T16:14:00Z">
-        <w:r>
-          <w:rPr>
-            <w:lang w:val="en-GB"/>
-          </w:rPr>
-          <w:t>_fracarea</w:t>
-        </w:r>
-      </w:ins>
+      <w:r>
+        <w:rPr>
+          <w:lang w:val="en-GB"/>
+        </w:rPr>
+        <w:t>_fracarea</w:t>
+      </w:r>
       <w:r>
         <w:rPr>
           <w:lang w:val="en-GB"/>
@@ -13669,6 +13610,7 @@
         </w:rPr>
       </w:pPr>
       <w:proofErr w:type="spellStart"/>
+      <w:proofErr w:type="gramStart"/>
       <w:r>
         <w:rPr>
           <w:rFonts w:ascii="Courier New" w:hAnsi="Courier New" w:cs="Courier New"/>
@@ -13676,7 +13618,17 @@
           <w:szCs w:val="22"/>
           <w:lang w:val="en-GB"/>
         </w:rPr>
-        <w:t>regrid_environment</w:t>
+        <w:t>regrid</w:t>
+      </w:r>
+      <w:proofErr w:type="gramEnd"/>
+      <w:r>
+        <w:rPr>
+          <w:rFonts w:ascii="Courier New" w:hAnsi="Courier New" w:cs="Courier New"/>
+          <w:sz w:val="22"/>
+          <w:szCs w:val="22"/>
+          <w:lang w:val="en-GB"/>
+        </w:rPr>
+        <w:t>_environment</w:t>
       </w:r>
       <w:proofErr w:type="spellEnd"/>
       <w:r>
@@ -14103,7 +14055,15 @@
         <w:rPr>
           <w:lang w:val="en-GB"/>
         </w:rPr>
-        <w:t>to generate a</w:t>
+        <w:t>to generate</w:t>
+      </w:r>
+      <w:bookmarkStart w:id="0" w:name="_GoBack"/>
+      <w:bookmarkEnd w:id="0"/>
+      <w:r>
+        <w:rPr>
+          <w:lang w:val="en-GB"/>
+        </w:rPr>
+        <w:t xml:space="preserve"> a</w:t>
       </w:r>
       <w:r>
         <w:rPr>
@@ -14165,44 +14125,84 @@
         <w:spacing w:before="120"/>
         <w:jc w:val="both"/>
         <w:rPr>
-          <w:del w:id="9" w:author="Gabriel Jonville" w:date="2023-01-24T15:53:00Z"/>
-          <w:lang w:val="en-GB"/>
-        </w:rPr>
-      </w:pPr>
-      <w:del w:id="10" w:author="Gabriel Jonville" w:date="2023-01-24T15:53:00Z">
-        <w:r>
-          <w:rPr>
-            <w:lang w:val="en-GB"/>
-          </w:rPr>
-          <w:delText xml:space="preserve">For ESMF, if your grid is unstructured, you have to add it in the corresponding list in </w:delText>
-        </w:r>
-        <w:r>
-          <w:rPr>
-            <w:rFonts w:ascii="Courier New" w:hAnsi="Courier New" w:cs="Courier New"/>
-            <w:sz w:val="22"/>
-            <w:szCs w:val="22"/>
-            <w:lang w:val="en-GB"/>
-          </w:rPr>
-          <w:delText>OasisGridsToESMF.py</w:delText>
-        </w:r>
-        <w:r>
-          <w:rPr>
-            <w:rFonts w:ascii="Courier New" w:hAnsi="Courier New" w:cs="Courier New"/>
-            <w:sz w:val="22"/>
-            <w:szCs w:val="22"/>
-            <w:lang w:val="en-GB"/>
-          </w:rPr>
-          <w:delText>.</w:delText>
-        </w:r>
-      </w:del>
+          <w:lang w:val="en-GB"/>
+        </w:rPr>
+      </w:pPr>
+      <w:r>
+        <w:rPr>
+          <w:lang w:val="en-GB"/>
+        </w:rPr>
+        <w:t xml:space="preserve">For XIOS, you will have to add your grid in </w:t>
+      </w:r>
+      <w:r>
+        <w:rPr>
+          <w:rFonts w:ascii="Courier New" w:hAnsi="Courier New" w:cs="Courier New"/>
+          <w:sz w:val="22"/>
+          <w:szCs w:val="22"/>
+          <w:lang w:val="en-GB"/>
+        </w:rPr>
+        <w:t>oasis_testcase.f90</w:t>
+      </w:r>
+      <w:r>
+        <w:rPr>
+          <w:lang w:val="en-GB"/>
+        </w:rPr>
+        <w:t xml:space="preserve"> in subroutine </w:t>
+      </w:r>
+      <w:proofErr w:type="spellStart"/>
+      <w:r>
+        <w:rPr>
+          <w:rFonts w:ascii="Courier New" w:hAnsi="Courier New" w:cs="Courier New"/>
+          <w:sz w:val="22"/>
+          <w:szCs w:val="22"/>
+          <w:lang w:val="en-GB"/>
+        </w:rPr>
+        <w:t>init_model_params</w:t>
+      </w:r>
+      <w:proofErr w:type="spellEnd"/>
+      <w:r>
+        <w:rPr>
+          <w:lang w:val="en-GB"/>
+        </w:rPr>
+        <w:t xml:space="preserve"> and </w:t>
+      </w:r>
+      <w:proofErr w:type="spellStart"/>
+      <w:r>
+        <w:rPr>
+          <w:rFonts w:ascii="Courier New" w:hAnsi="Courier New" w:cs="Courier New"/>
+          <w:sz w:val="22"/>
+          <w:szCs w:val="22"/>
+          <w:lang w:val="en-GB"/>
+        </w:rPr>
+        <w:t>init_</w:t>
+      </w:r>
+      <w:proofErr w:type="gramStart"/>
+      <w:r>
+        <w:rPr>
+          <w:rFonts w:ascii="Courier New" w:hAnsi="Courier New" w:cs="Courier New"/>
+          <w:sz w:val="22"/>
+          <w:szCs w:val="22"/>
+          <w:lang w:val="en-GB"/>
+        </w:rPr>
+        <w:t>domain</w:t>
+      </w:r>
+      <w:proofErr w:type="spellEnd"/>
+      <w:r>
+        <w:rPr>
+          <w:lang w:val="en-GB"/>
+        </w:rPr>
+        <w:t xml:space="preserve"> .</w:t>
+      </w:r>
+      <w:proofErr w:type="gramEnd"/>
+      <w:r>
+        <w:rPr>
+          <w:lang w:val="en-GB"/>
+        </w:rPr>
+        <w:t xml:space="preserve"> </w:t>
+      </w:r>
     </w:p>
     <w:p>
       <w:pPr>
-        <w:pStyle w:val="Paragraphedeliste"/>
-        <w:numPr>
-          <w:ilvl w:val="0"/>
-          <w:numId w:val="10"/>
-        </w:numPr>
         <w:spacing w:before="120"/>
         <w:jc w:val="both"/>
         <w:rPr>
@@ -14213,104 +14213,131 @@
         <w:rPr>
           <w:lang w:val="en-GB"/>
         </w:rPr>
-        <w:t xml:space="preserve">For XIOS, you will have to add your grid in </w:t>
-      </w:r>
-      <w:r>
-        <w:rPr>
-          <w:rFonts w:ascii="Courier New" w:hAnsi="Courier New" w:cs="Courier New"/>
-          <w:sz w:val="22"/>
-          <w:szCs w:val="22"/>
-          <w:lang w:val="en-GB"/>
-        </w:rPr>
-        <w:t>oasis_testcase.f90</w:t>
-      </w:r>
-      <w:r>
-        <w:rPr>
-          <w:lang w:val="en-GB"/>
-        </w:rPr>
-        <w:t xml:space="preserve"> in subroutine </w:t>
-      </w:r>
-      <w:proofErr w:type="spellStart"/>
-      <w:r>
-        <w:rPr>
-          <w:rFonts w:ascii="Courier New" w:hAnsi="Courier New" w:cs="Courier New"/>
-          <w:sz w:val="22"/>
-          <w:szCs w:val="22"/>
-          <w:lang w:val="en-GB"/>
-        </w:rPr>
-        <w:t>init_model_params</w:t>
-      </w:r>
-      <w:proofErr w:type="spellEnd"/>
-      <w:r>
-        <w:rPr>
-          <w:lang w:val="en-GB"/>
-        </w:rPr>
-        <w:t xml:space="preserve"> and </w:t>
-      </w:r>
-      <w:proofErr w:type="spellStart"/>
-      <w:r>
-        <w:rPr>
-          <w:rFonts w:ascii="Courier New" w:hAnsi="Courier New" w:cs="Courier New"/>
-          <w:sz w:val="22"/>
-          <w:szCs w:val="22"/>
-          <w:lang w:val="en-GB"/>
-        </w:rPr>
-        <w:t>init_</w:t>
-      </w:r>
-      <w:proofErr w:type="gramStart"/>
-      <w:r>
-        <w:rPr>
-          <w:rFonts w:ascii="Courier New" w:hAnsi="Courier New" w:cs="Courier New"/>
-          <w:sz w:val="22"/>
-          <w:szCs w:val="22"/>
-          <w:lang w:val="en-GB"/>
-        </w:rPr>
-        <w:t>domain</w:t>
-      </w:r>
-      <w:proofErr w:type="spellEnd"/>
-      <w:r>
-        <w:rPr>
-          <w:lang w:val="en-GB"/>
-        </w:rPr>
-        <w:t xml:space="preserve"> .</w:t>
-      </w:r>
-      <w:proofErr w:type="gramEnd"/>
+        <w:t xml:space="preserve">You should then be able to </w:t>
+      </w:r>
+      <w:r>
+        <w:rPr>
+          <w:lang w:val="en-GB"/>
+        </w:rPr>
+        <w:t xml:space="preserve">use </w:t>
+      </w:r>
+      <w:proofErr w:type="spellStart"/>
+      <w:r>
+        <w:rPr>
+          <w:i/>
+          <w:lang w:val="en-GB"/>
+        </w:rPr>
+        <w:t>regrid_environment</w:t>
+      </w:r>
+      <w:proofErr w:type="spellEnd"/>
       <w:r>
         <w:rPr>
           <w:lang w:val="en-GB"/>
         </w:rPr>
         <w:t xml:space="preserve"> </w:t>
       </w:r>
-    </w:p>
-    <w:p>
-      <w:pPr>
-        <w:spacing w:before="120"/>
-        <w:jc w:val="both"/>
-        <w:rPr>
-          <w:lang w:val="en-GB"/>
-        </w:rPr>
-      </w:pPr>
-      <w:r>
-        <w:rPr>
-          <w:lang w:val="en-GB"/>
-        </w:rPr>
-        <w:t xml:space="preserve">You should then be able to </w:t>
-      </w:r>
-      <w:r>
-        <w:rPr>
-          <w:lang w:val="en-GB"/>
-        </w:rPr>
-        <w:t xml:space="preserve">use </w:t>
-      </w:r>
-      <w:proofErr w:type="spellStart"/>
-      <w:r>
-        <w:rPr>
-          <w:rFonts w:ascii="Courier New" w:hAnsi="Courier New" w:cs="Courier New"/>
-          <w:sz w:val="22"/>
-          <w:szCs w:val="22"/>
-          <w:lang w:val="en-GB"/>
-        </w:rPr>
-        <w:t>regrid_environment</w:t>
+      <w:r>
+        <w:rPr>
+          <w:lang w:val="en-GB"/>
+        </w:rPr>
+        <w:t xml:space="preserve">to </w:t>
+      </w:r>
+      <w:r>
+        <w:rPr>
+          <w:lang w:val="en-GB"/>
+        </w:rPr>
+        <w:t xml:space="preserve">calculate the </w:t>
+      </w:r>
+      <w:proofErr w:type="spellStart"/>
+      <w:r>
+        <w:rPr>
+          <w:lang w:val="en-GB"/>
+        </w:rPr>
+        <w:t>regridding</w:t>
+      </w:r>
+      <w:proofErr w:type="spellEnd"/>
+      <w:r>
+        <w:rPr>
+          <w:lang w:val="en-GB"/>
+        </w:rPr>
+        <w:t xml:space="preserve"> weights and the </w:t>
+      </w:r>
+      <w:proofErr w:type="spellStart"/>
+      <w:r>
+        <w:rPr>
+          <w:lang w:val="en-GB"/>
+        </w:rPr>
+        <w:t>regridding</w:t>
+      </w:r>
+      <w:proofErr w:type="spellEnd"/>
+      <w:r>
+        <w:rPr>
+          <w:lang w:val="en-GB"/>
+        </w:rPr>
+        <w:t xml:space="preserve"> error for</w:t>
+      </w:r>
+      <w:r>
+        <w:rPr>
+          <w:lang w:val="en-GB"/>
+        </w:rPr>
+        <w:t xml:space="preserve"> your own grids and algorithm</w:t>
+      </w:r>
+      <w:r>
+        <w:rPr>
+          <w:lang w:val="en-GB"/>
+        </w:rPr>
+        <w:t xml:space="preserve">, and therefore evaluate the quality of your </w:t>
+      </w:r>
+      <w:proofErr w:type="spellStart"/>
+      <w:r>
+        <w:rPr>
+          <w:lang w:val="en-GB"/>
+        </w:rPr>
+        <w:t>regriddings</w:t>
+      </w:r>
+      <w:proofErr w:type="spellEnd"/>
+      <w:r>
+        <w:rPr>
+          <w:lang w:val="en-GB"/>
+        </w:rPr>
+        <w:t xml:space="preserve">. </w:t>
+      </w:r>
+      <w:r>
+        <w:rPr>
+          <w:lang w:val="en-GB"/>
+        </w:rPr>
+        <w:t>In practice, d</w:t>
+      </w:r>
+      <w:r>
+        <w:rPr>
+          <w:lang w:val="en-GB"/>
+        </w:rPr>
+        <w:t>efining</w:t>
+      </w:r>
+      <w:r>
+        <w:rPr>
+          <w:lang w:val="en-GB"/>
+        </w:rPr>
+        <w:t xml:space="preserve"> what a “good” </w:t>
+      </w:r>
+      <w:proofErr w:type="spellStart"/>
+      <w:r>
+        <w:rPr>
+          <w:lang w:val="en-GB"/>
+        </w:rPr>
+        <w:t>re</w:t>
+      </w:r>
+      <w:r>
+        <w:rPr>
+          <w:lang w:val="en-GB"/>
+        </w:rPr>
+        <w:t>gridd</w:t>
+      </w:r>
+      <w:r>
+        <w:rPr>
+          <w:lang w:val="en-GB"/>
+        </w:rPr>
+        <w:t>ing</w:t>
       </w:r>
       <w:proofErr w:type="spellEnd"/>
       <w:r>
@@ -14323,116 +14350,6 @@
         <w:rPr>
           <w:lang w:val="en-GB"/>
         </w:rPr>
-        <w:t xml:space="preserve">to </w:t>
-      </w:r>
-      <w:r>
-        <w:rPr>
-          <w:lang w:val="en-GB"/>
-        </w:rPr>
-        <w:t xml:space="preserve">calculate the </w:t>
-      </w:r>
-      <w:proofErr w:type="spellStart"/>
-      <w:r>
-        <w:rPr>
-          <w:lang w:val="en-GB"/>
-        </w:rPr>
-        <w:t>regridding</w:t>
-      </w:r>
-      <w:proofErr w:type="spellEnd"/>
-      <w:r>
-        <w:rPr>
-          <w:lang w:val="en-GB"/>
-        </w:rPr>
-        <w:t xml:space="preserve"> weights and the </w:t>
-      </w:r>
-      <w:proofErr w:type="spellStart"/>
-      <w:r>
-        <w:rPr>
-          <w:lang w:val="en-GB"/>
-        </w:rPr>
-        <w:t>regridding</w:t>
-      </w:r>
-      <w:proofErr w:type="spellEnd"/>
-      <w:r>
-        <w:rPr>
-          <w:lang w:val="en-GB"/>
-        </w:rPr>
-        <w:t xml:space="preserve"> error for</w:t>
-      </w:r>
-      <w:r>
-        <w:rPr>
-          <w:lang w:val="en-GB"/>
-        </w:rPr>
-        <w:t xml:space="preserve"> your own grids and algorithm</w:t>
-      </w:r>
-      <w:r>
-        <w:rPr>
-          <w:lang w:val="en-GB"/>
-        </w:rPr>
-        <w:t xml:space="preserve">, and therefore evaluate the quality of your </w:t>
-      </w:r>
-      <w:proofErr w:type="spellStart"/>
-      <w:r>
-        <w:rPr>
-          <w:lang w:val="en-GB"/>
-        </w:rPr>
-        <w:t>regriddings</w:t>
-      </w:r>
-      <w:proofErr w:type="spellEnd"/>
-      <w:r>
-        <w:rPr>
-          <w:lang w:val="en-GB"/>
-        </w:rPr>
-        <w:t xml:space="preserve">. </w:t>
-      </w:r>
-      <w:r>
-        <w:rPr>
-          <w:lang w:val="en-GB"/>
-        </w:rPr>
-        <w:t>In practice, d</w:t>
-      </w:r>
-      <w:r>
-        <w:rPr>
-          <w:lang w:val="en-GB"/>
-        </w:rPr>
-        <w:t>efining</w:t>
-      </w:r>
-      <w:r>
-        <w:rPr>
-          <w:lang w:val="en-GB"/>
-        </w:rPr>
-        <w:t xml:space="preserve"> what a “good” </w:t>
-      </w:r>
-      <w:proofErr w:type="spellStart"/>
-      <w:r>
-        <w:rPr>
-          <w:lang w:val="en-GB"/>
-        </w:rPr>
-        <w:t>re</w:t>
-      </w:r>
-      <w:r>
-        <w:rPr>
-          <w:lang w:val="en-GB"/>
-        </w:rPr>
-        <w:t>gridd</w:t>
-      </w:r>
-      <w:r>
-        <w:rPr>
-          <w:lang w:val="en-GB"/>
-        </w:rPr>
-        <w:t>ing</w:t>
-      </w:r>
-      <w:proofErr w:type="spellEnd"/>
-      <w:r>
-        <w:rPr>
-          <w:lang w:val="en-GB"/>
-        </w:rPr>
-        <w:t xml:space="preserve"> </w:t>
-      </w:r>
-      <w:r>
-        <w:rPr>
-          <w:lang w:val="en-GB"/>
-        </w:rPr>
         <w:t xml:space="preserve">precisely </w:t>
       </w:r>
       <w:r>
@@ -14456,9 +14373,7 @@
       <w:proofErr w:type="spellStart"/>
       <w:r>
         <w:rPr>
-          <w:rFonts w:ascii="Courier New" w:hAnsi="Courier New" w:cs="Courier New"/>
-          <w:sz w:val="22"/>
-          <w:szCs w:val="22"/>
+          <w:i/>
           <w:lang w:val="en-GB"/>
         </w:rPr>
         <w:t>regrid_environment</w:t>
@@ -15145,7 +15060,7 @@
       <w:rPr>
         <w:noProof/>
       </w:rPr>
-      <w:t>1</w:t>
+      <w:t>11</w:t>
     </w:r>
     <w:r>
       <w:fldChar w:fldCharType="end"/>
@@ -15356,176 +15271,166 @@
           <w:szCs w:val="22"/>
           <w:lang w:val="en-GB"/>
         </w:rPr>
-        <w:t xml:space="preserve"> ESMF: the so-called “SCRIP” format or the “unstructured” format. The “SCRIP” format describes the grid providing the latitude and the longitude of the centre and corners of each cell. The unstructured format describes the grid as an ensemble of elements and provides the element connectivity associating for each element a certain number of nodes in the list of nodes for which the latitude and longitude are provided. </w:t>
-      </w:r>
-      <w:ins w:id="0" w:author="Gabriel Jonville" w:date="2023-01-24T15:57:00Z">
-        <w:r>
-          <w:rPr>
-            <w:sz w:val="22"/>
-            <w:szCs w:val="22"/>
-            <w:lang w:val="en-GB"/>
-          </w:rPr>
-          <w:t xml:space="preserve">The grids </w:t>
-        </w:r>
-        <w:proofErr w:type="spellStart"/>
-        <w:r>
-          <w:rPr>
-            <w:sz w:val="22"/>
-            <w:szCs w:val="22"/>
-            <w:lang w:val="en-GB"/>
-          </w:rPr>
-          <w:t>torc</w:t>
-        </w:r>
-        <w:proofErr w:type="spellEnd"/>
-        <w:r>
-          <w:rPr>
-            <w:sz w:val="22"/>
-            <w:szCs w:val="22"/>
-            <w:lang w:val="en-GB"/>
-          </w:rPr>
-          <w:t xml:space="preserve"> and</w:t>
-        </w:r>
-        <w:r>
-          <w:rPr>
-            <w:sz w:val="22"/>
-            <w:szCs w:val="22"/>
-            <w:lang w:val="en-GB"/>
-          </w:rPr>
-          <w:t xml:space="preserve"> </w:t>
-        </w:r>
-        <w:proofErr w:type="spellStart"/>
-        <w:r>
-          <w:rPr>
-            <w:sz w:val="22"/>
-            <w:szCs w:val="22"/>
-            <w:lang w:val="en-GB"/>
-          </w:rPr>
-          <w:t>nogt</w:t>
-        </w:r>
-        <w:proofErr w:type="spellEnd"/>
-        <w:r>
-          <w:rPr>
-            <w:sz w:val="22"/>
-            <w:szCs w:val="22"/>
-            <w:lang w:val="en-GB"/>
-          </w:rPr>
-          <w:t xml:space="preserve"> are structured and can in principle be described in ESMF with the SCRIP format. However, as detailed in section 7.4 of (</w:t>
-        </w:r>
-        <w:proofErr w:type="spellStart"/>
-        <w:r>
-          <w:rPr>
-            <w:sz w:val="22"/>
-            <w:szCs w:val="22"/>
-            <w:lang w:val="en-GB"/>
-          </w:rPr>
-          <w:t>Valcke</w:t>
-        </w:r>
-        <w:proofErr w:type="spellEnd"/>
-        <w:r>
-          <w:rPr>
-            <w:sz w:val="22"/>
-            <w:szCs w:val="22"/>
-            <w:lang w:val="en-GB"/>
-          </w:rPr>
-          <w:t xml:space="preserve"> et al. 2021), the conservative remapping for a field expressed on a </w:t>
-        </w:r>
-        <w:proofErr w:type="spellStart"/>
-        <w:r>
-          <w:rPr>
-            <w:sz w:val="22"/>
-            <w:szCs w:val="22"/>
-            <w:lang w:val="en-GB"/>
-          </w:rPr>
-          <w:t>nogt</w:t>
-        </w:r>
-        <w:proofErr w:type="spellEnd"/>
-        <w:r>
-          <w:rPr>
-            <w:sz w:val="22"/>
-            <w:szCs w:val="22"/>
-            <w:lang w:val="en-GB"/>
-          </w:rPr>
-          <w:t xml:space="preserve"> grid shows wrong values in the region of the North fold of the grid. But this problem disappears when the </w:t>
-        </w:r>
-        <w:proofErr w:type="spellStart"/>
-        <w:r>
-          <w:rPr>
-            <w:sz w:val="22"/>
-            <w:szCs w:val="22"/>
-            <w:lang w:val="en-GB"/>
-          </w:rPr>
-          <w:t>nogt</w:t>
-        </w:r>
-        <w:proofErr w:type="spellEnd"/>
-        <w:r>
-          <w:rPr>
-            <w:sz w:val="22"/>
-            <w:szCs w:val="22"/>
-            <w:lang w:val="en-GB"/>
-          </w:rPr>
-          <w:t xml:space="preserve"> grid is expressed as an unstructured grid. This is why the script </w:t>
-        </w:r>
-        <w:r>
-          <w:rPr>
-            <w:rFonts w:ascii="Courier New" w:hAnsi="Courier New" w:cs="Courier New"/>
-            <w:sz w:val="22"/>
-            <w:szCs w:val="22"/>
-            <w:lang w:val="en-GB"/>
-          </w:rPr>
-          <w:t>OasisGridsToESMF</w:t>
-        </w:r>
-        <w:r>
-          <w:rPr>
-            <w:rFonts w:ascii="Courier New" w:hAnsi="Courier New" w:cs="Courier New"/>
-            <w:lang w:val="en-GB"/>
-          </w:rPr>
-          <w:t>.py</w:t>
-        </w:r>
-        <w:r>
-          <w:rPr>
-            <w:sz w:val="22"/>
-            <w:szCs w:val="22"/>
-            <w:lang w:val="en-GB"/>
-          </w:rPr>
-          <w:t xml:space="preserve"> expresses the </w:t>
-        </w:r>
-        <w:proofErr w:type="spellStart"/>
-        <w:r>
-          <w:rPr>
-            <w:sz w:val="22"/>
-            <w:szCs w:val="22"/>
-            <w:lang w:val="en-GB"/>
-          </w:rPr>
-          <w:t>nogt</w:t>
-        </w:r>
-        <w:proofErr w:type="spellEnd"/>
-        <w:r>
-          <w:rPr>
-            <w:sz w:val="22"/>
-            <w:szCs w:val="22"/>
-            <w:lang w:val="en-GB"/>
-          </w:rPr>
-          <w:t xml:space="preserve"> grid in the unstructured ESMF format, for conserv1st and conserv2nd when </w:t>
-        </w:r>
-        <w:proofErr w:type="spellStart"/>
-        <w:r>
-          <w:rPr>
-            <w:sz w:val="22"/>
-            <w:szCs w:val="22"/>
-            <w:lang w:val="en-GB"/>
-          </w:rPr>
-          <w:t>nogt</w:t>
-        </w:r>
-        <w:proofErr w:type="spellEnd"/>
-        <w:r>
-          <w:rPr>
-            <w:sz w:val="22"/>
-            <w:szCs w:val="22"/>
-            <w:lang w:val="en-GB"/>
-          </w:rPr>
-          <w:t xml:space="preserve"> is the source grid.</w:t>
-        </w:r>
-      </w:ins>
+        <w:t xml:space="preserve"> ESMF: the so-called “SCRIP” format or the “unstructured” format. The “SCRIP” format describes the grid providing the latitude and the longitude of the centre and corners of each cell. The unstructured format describes the grid as an ensemble of elements and provides the element connectivity associating for each element a certain number of nodes in the list of nodes for which the latitude and longitude are provided. The grids </w:t>
+      </w:r>
+      <w:proofErr w:type="spellStart"/>
+      <w:r>
+        <w:rPr>
+          <w:sz w:val="22"/>
+          <w:szCs w:val="22"/>
+          <w:lang w:val="en-GB"/>
+        </w:rPr>
+        <w:t>torc</w:t>
+      </w:r>
+      <w:proofErr w:type="spellEnd"/>
+      <w:r>
+        <w:rPr>
+          <w:sz w:val="22"/>
+          <w:szCs w:val="22"/>
+          <w:lang w:val="en-GB"/>
+        </w:rPr>
+        <w:t xml:space="preserve"> and</w:t>
+      </w:r>
+      <w:r>
+        <w:rPr>
+          <w:sz w:val="22"/>
+          <w:szCs w:val="22"/>
+          <w:lang w:val="en-GB"/>
+        </w:rPr>
+        <w:t xml:space="preserve"> </w:t>
+      </w:r>
+      <w:proofErr w:type="spellStart"/>
+      <w:r>
+        <w:rPr>
+          <w:sz w:val="22"/>
+          <w:szCs w:val="22"/>
+          <w:lang w:val="en-GB"/>
+        </w:rPr>
+        <w:t>nogt</w:t>
+      </w:r>
+      <w:proofErr w:type="spellEnd"/>
+      <w:r>
+        <w:rPr>
+          <w:sz w:val="22"/>
+          <w:szCs w:val="22"/>
+          <w:lang w:val="en-GB"/>
+        </w:rPr>
+        <w:t xml:space="preserve"> are structured and can in principle be described in ESMF with the SCRIP format. However, as detailed in section 7.4 of (</w:t>
+      </w:r>
+      <w:proofErr w:type="spellStart"/>
+      <w:r>
+        <w:rPr>
+          <w:sz w:val="22"/>
+          <w:szCs w:val="22"/>
+          <w:lang w:val="en-GB"/>
+        </w:rPr>
+        <w:t>Valcke</w:t>
+      </w:r>
+      <w:proofErr w:type="spellEnd"/>
+      <w:r>
+        <w:rPr>
+          <w:sz w:val="22"/>
+          <w:szCs w:val="22"/>
+          <w:lang w:val="en-GB"/>
+        </w:rPr>
+        <w:t xml:space="preserve"> et al. 2021), the conservative remapping for a field expressed on a </w:t>
+      </w:r>
+      <w:proofErr w:type="spellStart"/>
+      <w:r>
+        <w:rPr>
+          <w:sz w:val="22"/>
+          <w:szCs w:val="22"/>
+          <w:lang w:val="en-GB"/>
+        </w:rPr>
+        <w:t>nogt</w:t>
+      </w:r>
+      <w:proofErr w:type="spellEnd"/>
+      <w:r>
+        <w:rPr>
+          <w:sz w:val="22"/>
+          <w:szCs w:val="22"/>
+          <w:lang w:val="en-GB"/>
+        </w:rPr>
+        <w:t xml:space="preserve"> grid shows wrong values in the region of the North fold of the grid. But this problem disappears when the </w:t>
+      </w:r>
+      <w:proofErr w:type="spellStart"/>
+      <w:r>
+        <w:rPr>
+          <w:sz w:val="22"/>
+          <w:szCs w:val="22"/>
+          <w:lang w:val="en-GB"/>
+        </w:rPr>
+        <w:t>nogt</w:t>
+      </w:r>
+      <w:proofErr w:type="spellEnd"/>
+      <w:r>
+        <w:rPr>
+          <w:sz w:val="22"/>
+          <w:szCs w:val="22"/>
+          <w:lang w:val="en-GB"/>
+        </w:rPr>
+        <w:t xml:space="preserve"> grid is expressed as an unstructured grid. This is why the script </w:t>
+      </w:r>
+      <w:r>
+        <w:rPr>
+          <w:rFonts w:ascii="Courier New" w:hAnsi="Courier New" w:cs="Courier New"/>
+          <w:sz w:val="22"/>
+          <w:szCs w:val="22"/>
+          <w:lang w:val="en-GB"/>
+        </w:rPr>
+        <w:t>OasisGridsToESMF</w:t>
+      </w:r>
+      <w:r>
+        <w:rPr>
+          <w:rFonts w:ascii="Courier New" w:hAnsi="Courier New" w:cs="Courier New"/>
+          <w:lang w:val="en-GB"/>
+        </w:rPr>
+        <w:t>.py</w:t>
+      </w:r>
+      <w:r>
+        <w:rPr>
+          <w:sz w:val="22"/>
+          <w:szCs w:val="22"/>
+          <w:lang w:val="en-GB"/>
+        </w:rPr>
+        <w:t xml:space="preserve"> expresses the </w:t>
+      </w:r>
+      <w:proofErr w:type="spellStart"/>
+      <w:r>
+        <w:rPr>
+          <w:sz w:val="22"/>
+          <w:szCs w:val="22"/>
+          <w:lang w:val="en-GB"/>
+        </w:rPr>
+        <w:t>nogt</w:t>
+      </w:r>
+      <w:proofErr w:type="spellEnd"/>
+      <w:r>
+        <w:rPr>
+          <w:sz w:val="22"/>
+          <w:szCs w:val="22"/>
+          <w:lang w:val="en-GB"/>
+        </w:rPr>
+        <w:t xml:space="preserve"> grid in the unstructured ESMF format, for conserv1st and conserv2nd when </w:t>
+      </w:r>
+      <w:proofErr w:type="spellStart"/>
+      <w:r>
+        <w:rPr>
+          <w:sz w:val="22"/>
+          <w:szCs w:val="22"/>
+          <w:lang w:val="en-GB"/>
+        </w:rPr>
+        <w:t>nogt</w:t>
+      </w:r>
+      <w:proofErr w:type="spellEnd"/>
+      <w:r>
+        <w:rPr>
+          <w:sz w:val="22"/>
+          <w:szCs w:val="22"/>
+          <w:lang w:val="en-GB"/>
+        </w:rPr>
+        <w:t xml:space="preserve"> is the source grid.</w:t>
+      </w:r>
     </w:p>
   </w:footnote>
 </w:footnotes>

</xml_diff>

<commit_message>
Update documentation of regrid_environment as grids.nc is now stored on mercure (too large for the repository git) Signed-off-by: coquart <coquart@cerfacs.fr>
Former-commit-id: 7f3e9c26768f43a5b40c3b9c1ab697df684a0979
</commit_message>
<xml_diff>
--- a/examples/regrid_environment/regrid_environment_documentation.docx
+++ b/examples/regrid_environment/regrid_environment_documentation.docx
@@ -1,6 +1,6 @@
 
 <file path=word/document.xml><?xml version="1.0" encoding="utf-8"?>
-<w:document xmlns:wpc="http://schemas.microsoft.com/office/word/2010/wordprocessingCanvas" xmlns:mo="http://schemas.microsoft.com/office/mac/office/2008/main" xmlns:mc="http://schemas.openxmlformats.org/markup-compatibility/2006" xmlns:mv="urn:schemas-microsoft-com:mac:vml" xmlns:o="urn:schemas-microsoft-com:office:office" xmlns:r="http://schemas.openxmlformats.org/officeDocument/2006/relationships" xmlns:m="http://schemas.openxmlformats.org/officeDocument/2006/math" xmlns:v="urn:schemas-microsoft-com:vml" xmlns:wp14="http://schemas.microsoft.com/office/word/2010/wordprocessingDrawing" xmlns:wp="http://schemas.openxmlformats.org/drawingml/2006/wordprocessingDrawing" xmlns:w10="urn:schemas-microsoft-com:office:word" xmlns:w="http://schemas.openxmlformats.org/wordprocessingml/2006/main" xmlns:w14="http://schemas.microsoft.com/office/word/2010/wordml" xmlns:wpg="http://schemas.microsoft.com/office/word/2010/wordprocessingGroup" xmlns:wpi="http://schemas.microsoft.com/office/word/2010/wordprocessingInk" xmlns:wne="http://schemas.microsoft.com/office/word/2006/wordml" xmlns:wps="http://schemas.microsoft.com/office/word/2010/wordprocessingShape" mc:Ignorable="w14 wp14">
+<w:document xmlns:wpc="http://schemas.microsoft.com/office/word/2010/wordprocessingCanvas" xmlns:cx="http://schemas.microsoft.com/office/drawing/2014/chartex" xmlns:cx1="http://schemas.microsoft.com/office/drawing/2015/9/8/chartex" xmlns:cx2="http://schemas.microsoft.com/office/drawing/2015/10/21/chartex" xmlns:cx3="http://schemas.microsoft.com/office/drawing/2016/5/9/chartex" xmlns:cx4="http://schemas.microsoft.com/office/drawing/2016/5/10/chartex" xmlns:cx5="http://schemas.microsoft.com/office/drawing/2016/5/11/chartex" xmlns:cx6="http://schemas.microsoft.com/office/drawing/2016/5/12/chartex" xmlns:cx7="http://schemas.microsoft.com/office/drawing/2016/5/13/chartex" xmlns:cx8="http://schemas.microsoft.com/office/drawing/2016/5/14/chartex" xmlns:mc="http://schemas.openxmlformats.org/markup-compatibility/2006" xmlns:aink="http://schemas.microsoft.com/office/drawing/2016/ink" xmlns:am3d="http://schemas.microsoft.com/office/drawing/2017/model3d" xmlns:o="urn:schemas-microsoft-com:office:office" xmlns:oel="http://schemas.microsoft.com/office/2019/extlst" xmlns:r="http://schemas.openxmlformats.org/officeDocument/2006/relationships" xmlns:m="http://schemas.openxmlformats.org/officeDocument/2006/math" xmlns:v="urn:schemas-microsoft-com:vml" xmlns:wp14="http://schemas.microsoft.com/office/word/2010/wordprocessingDrawing" xmlns:wp="http://schemas.openxmlformats.org/drawingml/2006/wordprocessingDrawing" xmlns:w10="urn:schemas-microsoft-com:office:word" xmlns:w="http://schemas.openxmlformats.org/wordprocessingml/2006/main" xmlns:w14="http://schemas.microsoft.com/office/word/2010/wordml" xmlns:w15="http://schemas.microsoft.com/office/word/2012/wordml" xmlns:w16cex="http://schemas.microsoft.com/office/word/2018/wordml/cex" xmlns:w16cid="http://schemas.microsoft.com/office/word/2016/wordml/cid" xmlns:w16="http://schemas.microsoft.com/office/word/2018/wordml" xmlns:w16sdtdh="http://schemas.microsoft.com/office/word/2020/wordml/sdtdatahash" xmlns:w16se="http://schemas.microsoft.com/office/word/2015/wordml/symex" xmlns:wpg="http://schemas.microsoft.com/office/word/2010/wordprocessingGroup" xmlns:wpi="http://schemas.microsoft.com/office/word/2010/wordprocessingInk" xmlns:wne="http://schemas.microsoft.com/office/word/2006/wordml" xmlns:wps="http://schemas.microsoft.com/office/word/2010/wordprocessingShape" mc:Ignorable="w14 w15 w16se w16cid w16 w16cex w16sdtdh wp14">
   <w:background w:color="FFFFFF"/>
   <w:body>
     <w:p>
@@ -47,7 +47,7 @@
                     </pic:cNvPicPr>
                   </pic:nvPicPr>
                   <pic:blipFill>
-                    <a:blip r:embed="rId8">
+                    <a:blip r:embed="rId7">
                       <a:extLst>
                         <a:ext uri="{28A0092B-C50C-407E-A947-70E740481C1C}">
                           <a14:useLocalDpi xmlns:a14="http://schemas.microsoft.com/office/drawing/2010/main" val="0"/>
@@ -572,7 +572,21 @@
         <w:rPr>
           <w:lang w:val="en-GB"/>
         </w:rPr>
-        <w:t xml:space="preserve">, 2019; Jonville &amp; Valcke, 2019). This analysis led to the conclusion that other </w:t>
+        <w:t xml:space="preserve">, 2019; </w:t>
+      </w:r>
+      <w:proofErr w:type="spellStart"/>
+      <w:r>
+        <w:rPr>
+          <w:lang w:val="en-GB"/>
+        </w:rPr>
+        <w:t>Jonville</w:t>
+      </w:r>
+      <w:proofErr w:type="spellEnd"/>
+      <w:r>
+        <w:rPr>
+          <w:lang w:val="en-GB"/>
+        </w:rPr>
+        <w:t xml:space="preserve"> &amp; Valcke, 2019). This analysis led to the conclusion that other </w:t>
       </w:r>
       <w:proofErr w:type="spellStart"/>
       <w:r>
@@ -2001,7 +2015,7 @@
       </w:r>
       <w:r>
         <w:rPr>
-          <w:rStyle w:val="Marquenotebasdepage"/>
+          <w:rStyle w:val="Appelnotedebasdep"/>
           <w:lang w:val="en-GB"/>
         </w:rPr>
         <w:footnoteReference w:id="1"/>
@@ -2385,7 +2399,7 @@
                     <pic:cNvPicPr/>
                   </pic:nvPicPr>
                   <pic:blipFill>
-                    <a:blip r:embed="rId9"/>
+                    <a:blip r:embed="rId8"/>
                     <a:stretch>
                       <a:fillRect/>
                     </a:stretch>
@@ -3239,7 +3253,7 @@
         </w:rPr>
         <w:t>Instructions on how to install OASIS3-MCT, and therefore the SCRIP library, are provided in section 6 of the User Guide (</w:t>
       </w:r>
-      <w:hyperlink r:id="rId10" w:history="1">
+      <w:hyperlink r:id="rId9" w:history="1">
         <w:r>
           <w:rPr>
             <w:rStyle w:val="Lienhypertexte"/>
@@ -3316,7 +3330,7 @@
         </w:rPr>
         <w:t xml:space="preserve">are available at </w:t>
       </w:r>
-      <w:hyperlink r:id="rId11" w:history="1">
+      <w:hyperlink r:id="rId10" w:history="1">
         <w:r>
           <w:rPr>
             <w:rStyle w:val="Lienhypertexte"/>
@@ -3349,7 +3363,7 @@
         </w:rPr>
         <w:t xml:space="preserve">git clone </w:t>
       </w:r>
-      <w:hyperlink r:id="rId12" w:history="1">
+      <w:hyperlink r:id="rId11" w:history="1">
         <w:r>
           <w:rPr>
             <w:rStyle w:val="Lienhypertexte"/>
@@ -3729,7 +3743,31 @@
           <w:shd w:val="clear" w:color="auto" w:fill="FFFFFF"/>
           <w:lang w:val="en-US"/>
         </w:rPr>
-        <w:t>export ESMF_INSTALL_BINDIR=bin/bing/Linux.intel.64.intelmpi</w:t>
+        <w:t>export ESMF_INSTALL_BINDIR=bin/</w:t>
+      </w:r>
+      <w:proofErr w:type="spellStart"/>
+      <w:r>
+        <w:rPr>
+          <w:rFonts w:ascii="Verdana" w:hAnsi="Verdana"/>
+          <w:color w:val="000000" w:themeColor="text1"/>
+          <w:sz w:val="20"/>
+          <w:szCs w:val="20"/>
+          <w:shd w:val="clear" w:color="auto" w:fill="FFFFFF"/>
+          <w:lang w:val="en-US"/>
+        </w:rPr>
+        <w:t>bing</w:t>
+      </w:r>
+      <w:proofErr w:type="spellEnd"/>
+      <w:r>
+        <w:rPr>
+          <w:rFonts w:ascii="Verdana" w:hAnsi="Verdana"/>
+          <w:color w:val="000000" w:themeColor="text1"/>
+          <w:sz w:val="20"/>
+          <w:szCs w:val="20"/>
+          <w:shd w:val="clear" w:color="auto" w:fill="FFFFFF"/>
+          <w:lang w:val="en-US"/>
+        </w:rPr>
+        <w:t>/Linux.intel.64.intelmpi</w:t>
       </w:r>
       <w:r>
         <w:rPr>
@@ -4149,7 +4187,7 @@
         </w:rPr>
         <w:t xml:space="preserve">Details on XIOS installation are available at </w:t>
       </w:r>
-      <w:hyperlink r:id="rId13" w:history="1">
+      <w:hyperlink r:id="rId12" w:history="1">
         <w:r>
           <w:rPr>
             <w:rStyle w:val="Lienhypertexte"/>
@@ -4241,7 +4279,7 @@
         </w:rPr>
         <w:t xml:space="preserve"> co </w:t>
       </w:r>
-      <w:hyperlink r:id="rId14" w:history="1">
+      <w:hyperlink r:id="rId13" w:history="1">
         <w:r>
           <w:rPr>
             <w:rStyle w:val="Lienhypertexte"/>
@@ -4420,7 +4458,7 @@
           <w:color w:val="000000" w:themeColor="text1"/>
           <w:lang w:val="en-US"/>
         </w:rPr>
-        <w:t xml:space="preserve"> refers to the specific platform (see examples in there). XIOS compilation can then be launched with “</w:t>
+        <w:t xml:space="preserve"> refers to the specific platform (see examples in there). XIOS compilation can then be launched with </w:t>
       </w:r>
       <w:proofErr w:type="gramStart"/>
       <w:r>
@@ -4428,7 +4466,7 @@
           <w:color w:val="000000" w:themeColor="text1"/>
           <w:lang w:val="en-US"/>
         </w:rPr>
-        <w:t>.</w:t>
+        <w:t>“.</w:t>
       </w:r>
       <w:r>
         <w:rPr>
@@ -4573,7 +4611,25 @@
           <w:color w:val="000000" w:themeColor="text1"/>
           <w:lang w:val="en-GB"/>
         </w:rPr>
-        <w:t xml:space="preserve">oasis_testcase.f90 </w:t>
+        <w:t>oasis_</w:t>
+      </w:r>
+      <w:proofErr w:type="gramStart"/>
+      <w:r>
+        <w:rPr>
+          <w:rFonts w:ascii="Courier New" w:hAnsi="Courier New" w:cs="Courier New"/>
+          <w:color w:val="000000" w:themeColor="text1"/>
+          <w:lang w:val="en-GB"/>
+        </w:rPr>
+        <w:t>testcase.f</w:t>
+      </w:r>
+      <w:proofErr w:type="gramEnd"/>
+      <w:r>
+        <w:rPr>
+          <w:rFonts w:ascii="Courier New" w:hAnsi="Courier New" w:cs="Courier New"/>
+          <w:color w:val="000000" w:themeColor="text1"/>
+          <w:lang w:val="en-GB"/>
+        </w:rPr>
+        <w:t xml:space="preserve">90 </w:t>
       </w:r>
       <w:r>
         <w:rPr>
@@ -4651,21 +4707,12 @@
         <w:t>bld</w:t>
       </w:r>
       <w:proofErr w:type="spellEnd"/>
-      <w:proofErr w:type="gramStart"/>
-      <w:r>
-        <w:rPr>
-          <w:rFonts w:ascii="Courier New" w:hAnsi="Courier New" w:cs="Courier New"/>
-          <w:lang w:val="en-GB"/>
-        </w:rPr>
-        <w:t>::</w:t>
-      </w:r>
-      <w:proofErr w:type="gramEnd"/>
-      <w:r>
-        <w:rPr>
-          <w:rFonts w:ascii="Courier New" w:hAnsi="Courier New" w:cs="Courier New"/>
-          <w:lang w:val="en-GB"/>
-        </w:rPr>
-        <w:t>target oasis_testcase.exe</w:t>
+      <w:r>
+        <w:rPr>
+          <w:rFonts w:ascii="Courier New" w:hAnsi="Courier New" w:cs="Courier New"/>
+          <w:lang w:val="en-GB"/>
+        </w:rPr>
+        <w:t>::target oasis_testcase.exe</w:t>
       </w:r>
       <w:r>
         <w:rPr>
@@ -4821,96 +4868,82 @@
           <w:color w:val="000000" w:themeColor="text1"/>
           <w:lang w:val="en-US"/>
         </w:rPr>
+        <w:t xml:space="preserve"> o</w:t>
+      </w:r>
+      <w:r>
+        <w:rPr>
+          <w:color w:val="000000" w:themeColor="text1"/>
+          <w:lang w:val="en-US"/>
+        </w:rPr>
+        <w:t xml:space="preserve">r create a symbolic link in </w:t>
+      </w:r>
+      <w:r>
+        <w:rPr>
+          <w:rFonts w:ascii="Courier New" w:hAnsi="Courier New" w:cs="Courier New"/>
+          <w:lang w:val="en-GB"/>
+        </w:rPr>
+        <w:t>/XIOS/</w:t>
+      </w:r>
+      <w:r>
+        <w:rPr>
+          <w:color w:val="000000" w:themeColor="text1"/>
+          <w:lang w:val="en-US"/>
+        </w:rPr>
+        <w:t xml:space="preserve"> to </w:t>
+      </w:r>
+      <w:proofErr w:type="spellStart"/>
+      <w:proofErr w:type="gramStart"/>
+      <w:r>
+        <w:rPr>
+          <w:rFonts w:ascii="Courier New" w:hAnsi="Courier New" w:cs="Courier New"/>
+          <w:lang w:val="en-GB"/>
+        </w:rPr>
+        <w:t>XIOS</w:t>
+      </w:r>
+      <w:r>
+        <w:rPr>
+          <w:rFonts w:ascii="Courier New" w:hAnsi="Courier New" w:cs="Courier New"/>
+          <w:lang w:val="en-GB"/>
+        </w:rPr>
+        <w:t>_trunk</w:t>
+      </w:r>
+      <w:proofErr w:type="spellEnd"/>
+      <w:r>
+        <w:rPr>
+          <w:rFonts w:ascii="Courier New" w:hAnsi="Courier New" w:cs="Courier New"/>
+          <w:lang w:val="en-GB"/>
+        </w:rPr>
+        <w:t>/bin</w:t>
+      </w:r>
+      <w:r>
+        <w:rPr>
+          <w:rFonts w:ascii="Courier New" w:hAnsi="Courier New" w:cs="Courier New"/>
+          <w:lang w:val="en-GB"/>
+        </w:rPr>
+        <w:t>/</w:t>
+      </w:r>
+      <w:r>
+        <w:rPr>
+          <w:rFonts w:ascii="Courier New" w:hAnsi="Courier New" w:cs="Courier New"/>
+          <w:lang w:val="en-GB"/>
+        </w:rPr>
+        <w:t>oasis_testcase.exe</w:t>
+      </w:r>
+      <w:r>
+        <w:rPr>
+          <w:color w:val="000000" w:themeColor="text1"/>
+          <w:lang w:val="en-US"/>
+        </w:rPr>
         <w:t xml:space="preserve"> </w:t>
       </w:r>
-      <w:proofErr w:type="gramStart"/>
       <w:r>
         <w:rPr>
           <w:color w:val="000000" w:themeColor="text1"/>
           <w:lang w:val="en-US"/>
         </w:rPr>
-        <w:t>o</w:t>
-      </w:r>
-      <w:r>
-        <w:rPr>
-          <w:color w:val="000000" w:themeColor="text1"/>
-          <w:lang w:val="en-US"/>
-        </w:rPr>
-        <w:t>r</w:t>
+        <w:t>.</w:t>
       </w:r>
       <w:proofErr w:type="gramEnd"/>
-      <w:r>
-        <w:rPr>
-          <w:color w:val="000000" w:themeColor="text1"/>
-          <w:lang w:val="en-US"/>
-        </w:rPr>
-        <w:t xml:space="preserve"> create a symbolic link in </w:t>
-      </w:r>
-      <w:r>
-        <w:rPr>
-          <w:rFonts w:ascii="Courier New" w:hAnsi="Courier New" w:cs="Courier New"/>
-          <w:lang w:val="en-GB"/>
-        </w:rPr>
-        <w:t>/XIOS/</w:t>
-      </w:r>
-      <w:r>
-        <w:rPr>
-          <w:color w:val="000000" w:themeColor="text1"/>
-          <w:lang w:val="en-US"/>
-        </w:rPr>
-        <w:t xml:space="preserve"> to </w:t>
-      </w:r>
-      <w:proofErr w:type="spellStart"/>
-      <w:r>
-        <w:rPr>
-          <w:rFonts w:ascii="Courier New" w:hAnsi="Courier New" w:cs="Courier New"/>
-          <w:lang w:val="en-GB"/>
-        </w:rPr>
-        <w:t>XIOS</w:t>
-      </w:r>
-      <w:r>
-        <w:rPr>
-          <w:rFonts w:ascii="Courier New" w:hAnsi="Courier New" w:cs="Courier New"/>
-          <w:lang w:val="en-GB"/>
-        </w:rPr>
-        <w:t>_trunk</w:t>
-      </w:r>
-      <w:proofErr w:type="spellEnd"/>
-      <w:r>
-        <w:rPr>
-          <w:rFonts w:ascii="Courier New" w:hAnsi="Courier New" w:cs="Courier New"/>
-          <w:lang w:val="en-GB"/>
-        </w:rPr>
-        <w:t>/bin</w:t>
-      </w:r>
-      <w:r>
-        <w:rPr>
-          <w:rFonts w:ascii="Courier New" w:hAnsi="Courier New" w:cs="Courier New"/>
-          <w:lang w:val="en-GB"/>
-        </w:rPr>
-        <w:t>/</w:t>
-      </w:r>
-      <w:r>
-        <w:rPr>
-          <w:rFonts w:ascii="Courier New" w:hAnsi="Courier New" w:cs="Courier New"/>
-          <w:lang w:val="en-GB"/>
-        </w:rPr>
-        <w:t>oasis_testcase.exe</w:t>
-      </w:r>
-      <w:r>
-        <w:rPr>
-          <w:color w:val="000000" w:themeColor="text1"/>
-          <w:lang w:val="en-US"/>
-        </w:rPr>
-        <w:t xml:space="preserve"> </w:t>
-      </w:r>
-      <w:r>
-        <w:rPr>
-          <w:color w:val="000000" w:themeColor="text1"/>
-          <w:lang w:val="en-US"/>
-        </w:rPr>
-        <w:t>.</w:t>
-      </w:r>
       <w:r>
         <w:rPr>
           <w:color w:val="000000" w:themeColor="text1"/>
@@ -5327,23 +5360,7 @@
           <w:rFonts w:ascii="Courier New" w:hAnsi="Courier New" w:cs="Courier New"/>
           <w:lang w:val="en-GB"/>
         </w:rPr>
-        <w:t>oasis3-mct/</w:t>
-      </w:r>
-      <w:proofErr w:type="spellStart"/>
-      <w:r>
-        <w:rPr>
-          <w:rFonts w:ascii="Courier New" w:hAnsi="Courier New" w:cs="Courier New"/>
-          <w:lang w:val="en-GB"/>
-        </w:rPr>
-        <w:t>util</w:t>
-      </w:r>
-      <w:proofErr w:type="spellEnd"/>
-      <w:r>
-        <w:rPr>
-          <w:rFonts w:ascii="Courier New" w:hAnsi="Courier New" w:cs="Courier New"/>
-          <w:lang w:val="en-GB"/>
-        </w:rPr>
-        <w:t>/</w:t>
+        <w:t>oasis3-mct/util/</w:t>
       </w:r>
       <w:proofErr w:type="spellStart"/>
       <w:r>
@@ -6348,7 +6365,7 @@
       </w:r>
       <w:r>
         <w:rPr>
-          <w:rStyle w:val="Marquenotebasdepage"/>
+          <w:rStyle w:val="Appelnotedebasdep"/>
           <w:lang w:val="en-GB"/>
         </w:rPr>
         <w:footnoteReference w:id="2"/>
@@ -6797,7 +6814,7 @@
       </w:r>
       <w:r>
         <w:rPr>
-          <w:rStyle w:val="Marquenotebasdepage"/>
+          <w:rStyle w:val="Appelnotedebasdep"/>
           <w:lang w:val="en-GB"/>
         </w:rPr>
         <w:footnoteReference w:id="3"/>
@@ -8831,7 +8848,33 @@
           <w:rFonts w:ascii="Courier New" w:hAnsi="Courier New" w:cs="Courier New"/>
           <w:lang w:val="en-GB"/>
         </w:rPr>
-        <w:t>$</w:t>
+        <w:t>$opt</w:t>
+      </w:r>
+      <w:r>
+        <w:rPr>
+          <w:rFonts w:ascii="Courier New" w:hAnsi="Courier New" w:cs="Courier New"/>
+          <w:lang w:val="en-GB"/>
+        </w:rPr>
+        <w:t xml:space="preserve"> </w:t>
+      </w:r>
+      <w:r>
+        <w:rPr>
+          <w:lang w:val="en-GB"/>
+        </w:rPr>
+        <w:t>is</w:t>
+      </w:r>
+      <w:r>
+        <w:rPr>
+          <w:lang w:val="en-GB"/>
+        </w:rPr>
+        <w:t xml:space="preserve"> an optional argument to plot the binary and fractional masks with Ferret if set to </w:t>
+      </w:r>
+      <w:r>
+        <w:rPr>
+          <w:rFonts w:ascii="Courier New" w:hAnsi="Courier New" w:cs="Courier New"/>
+          <w:lang w:val="en-GB"/>
+        </w:rPr>
+        <w:t>–</w:t>
       </w:r>
       <w:proofErr w:type="gramStart"/>
       <w:r>
@@ -8839,41 +8882,15 @@
           <w:rFonts w:ascii="Courier New" w:hAnsi="Courier New" w:cs="Courier New"/>
           <w:lang w:val="en-GB"/>
         </w:rPr>
-        <w:t>opt</w:t>
+        <w:t>plot</w:t>
+      </w:r>
+      <w:r>
+        <w:rPr>
+          <w:lang w:val="en-GB"/>
+        </w:rPr>
+        <w:t xml:space="preserve"> .</w:t>
       </w:r>
       <w:proofErr w:type="gramEnd"/>
-      <w:r>
-        <w:rPr>
-          <w:rFonts w:ascii="Courier New" w:hAnsi="Courier New" w:cs="Courier New"/>
-          <w:lang w:val="en-GB"/>
-        </w:rPr>
-        <w:t xml:space="preserve"> </w:t>
-      </w:r>
-      <w:r>
-        <w:rPr>
-          <w:lang w:val="en-GB"/>
-        </w:rPr>
-        <w:t>is</w:t>
-      </w:r>
-      <w:r>
-        <w:rPr>
-          <w:lang w:val="en-GB"/>
-        </w:rPr>
-        <w:t xml:space="preserve"> an optional argument to plot the binary and fractional masks with Ferret if set to </w:t>
-      </w:r>
-      <w:r>
-        <w:rPr>
-          <w:rFonts w:ascii="Courier New" w:hAnsi="Courier New" w:cs="Courier New"/>
-          <w:lang w:val="en-GB"/>
-        </w:rPr>
-        <w:t>–plot</w:t>
-      </w:r>
-      <w:r>
-        <w:rPr>
-          <w:lang w:val="en-GB"/>
-        </w:rPr>
-        <w:t xml:space="preserve"> .</w:t>
-      </w:r>
     </w:p>
     <w:p>
       <w:pPr>
@@ -9033,6 +9050,7 @@
         </w:rPr>
         <w:t xml:space="preserve"> file </w:t>
       </w:r>
+      <w:proofErr w:type="gramStart"/>
       <w:r>
         <w:rPr>
           <w:rFonts w:ascii="Courier New" w:hAnsi="Courier New" w:cs="Courier New"/>
@@ -9045,15 +9063,7 @@
           <w:rFonts w:ascii="Courier New" w:hAnsi="Courier New" w:cs="Courier New"/>
           <w:lang w:val="en-GB"/>
         </w:rPr>
-        <w:t>s/masks_$ogrid_$</w:t>
-      </w:r>
-      <w:proofErr w:type="gramStart"/>
-      <w:r>
-        <w:rPr>
-          <w:rFonts w:ascii="Courier New" w:hAnsi="Courier New" w:cs="Courier New"/>
-          <w:lang w:val="en-GB"/>
-        </w:rPr>
-        <w:t>library.nc</w:t>
+        <w:t>s/masks_$ogrid_$library.nc</w:t>
       </w:r>
       <w:r>
         <w:rPr>
@@ -9567,7 +9577,19 @@
         <w:rPr>
           <w:lang w:val="en-GB"/>
         </w:rPr>
-        <w:t xml:space="preserve">all required files </w:t>
+        <w:t>all required files</w:t>
+      </w:r>
+      <w:r>
+        <w:rPr>
+          <w:lang w:val="en-GB"/>
+        </w:rPr>
+        <w:t xml:space="preserve"> from the /OASIS directory</w:t>
+      </w:r>
+      <w:r>
+        <w:rPr>
+          <w:lang w:val="en-GB"/>
+        </w:rPr>
+        <w:t xml:space="preserve"> </w:t>
       </w:r>
       <w:r>
         <w:rPr>
@@ -9579,7 +9601,38 @@
         <w:rPr>
           <w:lang w:val="en-GB"/>
         </w:rPr>
-        <w:t xml:space="preserve">, including the grid file </w:t>
+        <w:t xml:space="preserve">, including </w:t>
+      </w:r>
+      <w:r>
+        <w:rPr>
+          <w:lang w:val="en-GB"/>
+        </w:rPr>
+        <w:t xml:space="preserve">the </w:t>
+      </w:r>
+      <w:r>
+        <w:rPr>
+          <w:lang w:val="en-GB"/>
+        </w:rPr>
+        <w:t xml:space="preserve">mask file </w:t>
+      </w:r>
+      <w:r>
+        <w:rPr>
+          <w:rFonts w:ascii="Courier New" w:hAnsi="Courier New" w:cs="Courier New"/>
+          <w:lang w:val="en-GB"/>
+        </w:rPr>
+        <w:t>masks.nc</w:t>
+      </w:r>
+      <w:r>
+        <w:rPr>
+          <w:lang w:val="en-GB"/>
+        </w:rPr>
+        <w:t xml:space="preserve">. </w:t>
+      </w:r>
+      <w:r>
+        <w:rPr>
+          <w:lang w:val="en-GB"/>
+        </w:rPr>
+        <w:t xml:space="preserve">In order to limit the size of the git repository, the grid file </w:t>
       </w:r>
       <w:r>
         <w:rPr>
@@ -9590,57 +9643,50 @@
       </w:r>
       <w:r>
         <w:rPr>
-          <w:lang w:val="en-GB"/>
-        </w:rPr>
-        <w:t xml:space="preserve"> and </w:t>
-      </w:r>
-      <w:r>
-        <w:rPr>
-          <w:lang w:val="en-GB"/>
-        </w:rPr>
-        <w:t xml:space="preserve">the </w:t>
-      </w:r>
-      <w:r>
-        <w:rPr>
-          <w:lang w:val="en-GB"/>
-        </w:rPr>
-        <w:t xml:space="preserve">mask file </w:t>
-      </w:r>
-      <w:r>
-        <w:rPr>
-          <w:rFonts w:ascii="Courier New" w:hAnsi="Courier New" w:cs="Courier New"/>
-          <w:lang w:val="en-GB"/>
-        </w:rPr>
-        <w:t>masks.nc</w:t>
-      </w:r>
-      <w:r>
-        <w:rPr>
-          <w:lang w:val="en-GB"/>
-        </w:rPr>
-        <w:t xml:space="preserve"> from the /</w:t>
-      </w:r>
-      <w:r>
-        <w:rPr>
-          <w:rFonts w:ascii="Courier New" w:hAnsi="Courier New" w:cs="Courier New"/>
-          <w:lang w:val="en-GB"/>
-        </w:rPr>
-        <w:t>OASIS</w:t>
-      </w:r>
-      <w:r>
-        <w:rPr>
-          <w:lang w:val="en-GB"/>
-        </w:rPr>
-        <w:t xml:space="preserve"> directory</w:t>
-      </w:r>
-      <w:r>
-        <w:rPr>
-          <w:lang w:val="en-GB"/>
-        </w:rPr>
-        <w:t xml:space="preserve"> (see section 2.5 above)</w:t>
-      </w:r>
-      <w:r>
-        <w:rPr>
-          <w:lang w:val="en-GB"/>
+          <w:rFonts w:ascii="Courier New" w:hAnsi="Courier New" w:cs="Courier New"/>
+          <w:lang w:val="en-GB"/>
+        </w:rPr>
+        <w:t xml:space="preserve"> </w:t>
+      </w:r>
+      <w:r>
+        <w:rPr>
+          <w:lang w:val="en-GB"/>
+        </w:rPr>
+        <w:t xml:space="preserve">is extracted from </w:t>
+      </w:r>
+      <w:hyperlink r:id="rId14" w:history="1">
+        <w:r>
+          <w:rPr>
+            <w:lang w:val="en-GB"/>
+          </w:rPr>
+          <w:t>https://mercure.cerfacs.fr/oasis3-mct/examples/regrid_environment/OASIS/</w:t>
+        </w:r>
+        <w:r>
+          <w:rPr>
+            <w:lang w:val="en-GB"/>
+          </w:rPr>
+          <w:t>g</w:t>
+        </w:r>
+        <w:r>
+          <w:rPr>
+            <w:lang w:val="en-GB"/>
+          </w:rPr>
+          <w:t>rids.nc</w:t>
+        </w:r>
+      </w:hyperlink>
+      <w:r>
+        <w:rPr>
+          <w:lang w:val="en-GB"/>
+        </w:rPr>
+        <w:t xml:space="preserve"> with the “curl” command</w:t>
+      </w:r>
+      <w:r>
+        <w:rPr>
+          <w:rFonts w:ascii="Menlo" w:hAnsi="Menlo" w:cs="Menlo"/>
+          <w:color w:val="000000"/>
+          <w:sz w:val="22"/>
+          <w:szCs w:val="22"/>
+          <w:lang w:val="en-GB" w:eastAsia="en-GB"/>
         </w:rPr>
         <w:t>.</w:t>
       </w:r>
@@ -9853,7 +9899,7 @@
       </w:r>
       <w:r>
         <w:rPr>
-          <w:rStyle w:val="Marquenotebasdepage"/>
+          <w:rStyle w:val="Appelnotedebasdep"/>
           <w:lang w:val="en-US"/>
         </w:rPr>
         <w:footnoteReference w:id="4"/>
@@ -11260,14 +11306,12 @@
           <w:lang w:val="en-GB"/>
         </w:rPr>
       </w:pPr>
-      <w:proofErr w:type="gramStart"/>
       <w:r>
         <w:rPr>
           <w:lang w:val="en-GB"/>
         </w:rPr>
         <w:t>conserv</w:t>
       </w:r>
-      <w:proofErr w:type="gramEnd"/>
       <w:r>
         <w:rPr>
           <w:lang w:val="en-GB"/>
@@ -11457,14 +11501,12 @@
           <w:lang w:val="en-GB"/>
         </w:rPr>
       </w:pPr>
-      <w:proofErr w:type="gramStart"/>
       <w:r>
         <w:rPr>
           <w:lang w:val="en-GB"/>
         </w:rPr>
         <w:t>conserv</w:t>
       </w:r>
-      <w:proofErr w:type="gramEnd"/>
       <w:r>
         <w:rPr>
           <w:lang w:val="en-GB"/>
@@ -11706,7 +11748,6 @@
         <w:t>--</w:t>
       </w:r>
       <w:proofErr w:type="spellStart"/>
-      <w:proofErr w:type="gramStart"/>
       <w:r>
         <w:rPr>
           <w:rFonts w:ascii="Courier New" w:hAnsi="Courier New" w:cs="Courier New"/>
@@ -11714,9 +11755,9 @@
           <w:szCs w:val="22"/>
           <w:lang w:val="en-GB"/>
         </w:rPr>
-        <w:t>src</w:t>
-      </w:r>
-      <w:proofErr w:type="gramEnd"/>
+        <w:t>src_loc</w:t>
+      </w:r>
+      <w:proofErr w:type="spellEnd"/>
       <w:r>
         <w:rPr>
           <w:rFonts w:ascii="Courier New" w:hAnsi="Courier New" w:cs="Courier New"/>
@@ -11724,9 +11765,9 @@
           <w:szCs w:val="22"/>
           <w:lang w:val="en-GB"/>
         </w:rPr>
-        <w:t>_loc</w:t>
-      </w:r>
-      <w:proofErr w:type="spellEnd"/>
+        <w:t xml:space="preserve"> </w:t>
+      </w:r>
+      <w:proofErr w:type="spellStart"/>
       <w:r>
         <w:rPr>
           <w:rFonts w:ascii="Courier New" w:hAnsi="Courier New" w:cs="Courier New"/>
@@ -11734,9 +11775,9 @@
           <w:szCs w:val="22"/>
           <w:lang w:val="en-GB"/>
         </w:rPr>
-        <w:t xml:space="preserve"> </w:t>
-      </w:r>
-      <w:proofErr w:type="spellStart"/>
+        <w:t>center</w:t>
+      </w:r>
+      <w:proofErr w:type="spellEnd"/>
       <w:r>
         <w:rPr>
           <w:rFonts w:ascii="Courier New" w:hAnsi="Courier New" w:cs="Courier New"/>
@@ -11744,9 +11785,9 @@
           <w:szCs w:val="22"/>
           <w:lang w:val="en-GB"/>
         </w:rPr>
-        <w:t>center</w:t>
-      </w:r>
-      <w:proofErr w:type="spellEnd"/>
+        <w:t xml:space="preserve"> --</w:t>
+      </w:r>
+      <w:proofErr w:type="spellStart"/>
       <w:r>
         <w:rPr>
           <w:rFonts w:ascii="Courier New" w:hAnsi="Courier New" w:cs="Courier New"/>
@@ -11754,9 +11795,9 @@
           <w:szCs w:val="22"/>
           <w:lang w:val="en-GB"/>
         </w:rPr>
-        <w:t xml:space="preserve"> --</w:t>
-      </w:r>
-      <w:proofErr w:type="spellStart"/>
+        <w:t>dst_loc</w:t>
+      </w:r>
+      <w:proofErr w:type="spellEnd"/>
       <w:r>
         <w:rPr>
           <w:rFonts w:ascii="Courier New" w:hAnsi="Courier New" w:cs="Courier New"/>
@@ -11764,9 +11805,10 @@
           <w:szCs w:val="22"/>
           <w:lang w:val="en-GB"/>
         </w:rPr>
-        <w:t>dst_loc</w:t>
-      </w:r>
-      <w:proofErr w:type="spellEnd"/>
+        <w:t xml:space="preserve"> </w:t>
+      </w:r>
+      <w:proofErr w:type="spellStart"/>
+      <w:proofErr w:type="gramStart"/>
       <w:r>
         <w:rPr>
           <w:rFonts w:ascii="Courier New" w:hAnsi="Courier New" w:cs="Courier New"/>
@@ -11774,16 +11816,6 @@
           <w:szCs w:val="22"/>
           <w:lang w:val="en-GB"/>
         </w:rPr>
-        <w:t xml:space="preserve"> </w:t>
-      </w:r>
-      <w:proofErr w:type="spellStart"/>
-      <w:r>
-        <w:rPr>
-          <w:rFonts w:ascii="Courier New" w:hAnsi="Courier New" w:cs="Courier New"/>
-          <w:sz w:val="22"/>
-          <w:szCs w:val="22"/>
-          <w:lang w:val="en-GB"/>
-        </w:rPr>
         <w:t>center</w:t>
       </w:r>
       <w:proofErr w:type="spellEnd"/>
@@ -11791,7 +11823,14 @@
         <w:rPr>
           <w:lang w:val="en-GB"/>
         </w:rPr>
-        <w:t xml:space="preserve"> : allow non-conservative </w:t>
+        <w:t xml:space="preserve"> :</w:t>
+      </w:r>
+      <w:proofErr w:type="gramEnd"/>
+      <w:r>
+        <w:rPr>
+          <w:lang w:val="en-GB"/>
+        </w:rPr>
+        <w:t xml:space="preserve"> allow non-conservative </w:t>
       </w:r>
       <w:proofErr w:type="spellStart"/>
       <w:r>
@@ -11855,7 +11894,6 @@
         <w:t>--</w:t>
       </w:r>
       <w:proofErr w:type="spellStart"/>
-      <w:proofErr w:type="gramStart"/>
       <w:r>
         <w:rPr>
           <w:rFonts w:ascii="Courier New" w:hAnsi="Courier New" w:cs="Courier New"/>
@@ -11863,9 +11901,9 @@
           <w:szCs w:val="22"/>
           <w:lang w:val="en-GB"/>
         </w:rPr>
-        <w:t>extrap</w:t>
-      </w:r>
-      <w:proofErr w:type="gramEnd"/>
+        <w:t>extrap_method</w:t>
+      </w:r>
+      <w:proofErr w:type="spellEnd"/>
       <w:r>
         <w:rPr>
           <w:rFonts w:ascii="Courier New" w:hAnsi="Courier New" w:cs="Courier New"/>
@@ -11873,9 +11911,10 @@
           <w:szCs w:val="22"/>
           <w:lang w:val="en-GB"/>
         </w:rPr>
-        <w:t>_method</w:t>
-      </w:r>
-      <w:proofErr w:type="spellEnd"/>
+        <w:t xml:space="preserve"> </w:t>
+      </w:r>
+      <w:proofErr w:type="spellStart"/>
+      <w:proofErr w:type="gramStart"/>
       <w:r>
         <w:rPr>
           <w:rFonts w:ascii="Courier New" w:hAnsi="Courier New" w:cs="Courier New"/>
@@ -11883,16 +11922,6 @@
           <w:szCs w:val="22"/>
           <w:lang w:val="en-GB"/>
         </w:rPr>
-        <w:t xml:space="preserve"> </w:t>
-      </w:r>
-      <w:proofErr w:type="spellStart"/>
-      <w:r>
-        <w:rPr>
-          <w:rFonts w:ascii="Courier New" w:hAnsi="Courier New" w:cs="Courier New"/>
-          <w:sz w:val="22"/>
-          <w:szCs w:val="22"/>
-          <w:lang w:val="en-GB"/>
-        </w:rPr>
         <w:t>neareststod</w:t>
       </w:r>
       <w:proofErr w:type="spellEnd"/>
@@ -11900,7 +11929,14 @@
         <w:rPr>
           <w:lang w:val="en-GB"/>
         </w:rPr>
-        <w:t xml:space="preserve"> : each target point that does not receive a value with the original algorithm uses the closest unmasked source point to define its value; this option</w:t>
+        <w:t xml:space="preserve"> :</w:t>
+      </w:r>
+      <w:proofErr w:type="gramEnd"/>
+      <w:r>
+        <w:rPr>
+          <w:lang w:val="en-GB"/>
+        </w:rPr>
+        <w:t xml:space="preserve"> each target point that does not receive a value with the original algorithm uses the closest unmasked source point to define its value; this option</w:t>
       </w:r>
       <w:r>
         <w:rPr>
@@ -11967,7 +12003,6 @@
         <w:t>--</w:t>
       </w:r>
       <w:proofErr w:type="spellStart"/>
-      <w:proofErr w:type="gramStart"/>
       <w:r>
         <w:rPr>
           <w:rFonts w:ascii="Courier New" w:hAnsi="Courier New" w:cs="Courier New"/>
@@ -11975,9 +12010,9 @@
           <w:szCs w:val="22"/>
           <w:lang w:val="en-GB"/>
         </w:rPr>
-        <w:t>ignore</w:t>
-      </w:r>
-      <w:proofErr w:type="gramEnd"/>
+        <w:t>ignore_</w:t>
+      </w:r>
+      <w:proofErr w:type="gramStart"/>
       <w:r>
         <w:rPr>
           <w:rFonts w:ascii="Courier New" w:hAnsi="Courier New" w:cs="Courier New"/>
@@ -11985,14 +12020,21 @@
           <w:szCs w:val="22"/>
           <w:lang w:val="en-GB"/>
         </w:rPr>
-        <w:t>_unmapped</w:t>
-      </w:r>
-      <w:proofErr w:type="spellEnd"/>
-      <w:r>
-        <w:rPr>
-          <w:lang w:val="en-GB"/>
-        </w:rPr>
-        <w:t xml:space="preserve"> : do not do anything special for target point that does not receive a value with the original algorithm; this option </w:t>
+        <w:t>unmapped</w:t>
+      </w:r>
+      <w:proofErr w:type="spellEnd"/>
+      <w:r>
+        <w:rPr>
+          <w:lang w:val="en-GB"/>
+        </w:rPr>
+        <w:t xml:space="preserve"> :</w:t>
+      </w:r>
+      <w:proofErr w:type="gramEnd"/>
+      <w:r>
+        <w:rPr>
+          <w:lang w:val="en-GB"/>
+        </w:rPr>
+        <w:t xml:space="preserve"> do not do anything special for target point that does not receive a value with the original algorithm; this option </w:t>
       </w:r>
       <w:r>
         <w:rPr>
@@ -12059,7 +12101,6 @@
         <w:t>--</w:t>
       </w:r>
       <w:proofErr w:type="spellStart"/>
-      <w:proofErr w:type="gramStart"/>
       <w:r>
         <w:rPr>
           <w:rFonts w:ascii="Courier New" w:hAnsi="Courier New" w:cs="Courier New"/>
@@ -12067,50 +12108,54 @@
           <w:szCs w:val="22"/>
           <w:lang w:val="en-GB"/>
         </w:rPr>
-        <w:t>ignore</w:t>
+        <w:t>ignore_degenerate</w:t>
+      </w:r>
+      <w:proofErr w:type="spellEnd"/>
+      <w:r>
+        <w:rPr>
+          <w:lang w:val="en-GB"/>
+        </w:rPr>
+        <w:t xml:space="preserve"> to ignore degenerate cells in either the source or the destination grid; this can be useful for the </w:t>
+      </w:r>
+      <w:r>
+        <w:rPr>
+          <w:lang w:val="en-GB"/>
+        </w:rPr>
+        <w:t xml:space="preserve">torc and </w:t>
+      </w:r>
+      <w:proofErr w:type="spellStart"/>
+      <w:r>
+        <w:rPr>
+          <w:lang w:val="en-GB"/>
+        </w:rPr>
+        <w:t>nogt</w:t>
+      </w:r>
+      <w:proofErr w:type="spellEnd"/>
+      <w:r>
+        <w:rPr>
+          <w:lang w:val="en-GB"/>
+        </w:rPr>
+        <w:t xml:space="preserve"> </w:t>
+      </w:r>
+      <w:r>
+        <w:rPr>
+          <w:lang w:val="en-GB"/>
+        </w:rPr>
+        <w:t>grids which may have masked cells (</w:t>
+      </w:r>
+      <w:proofErr w:type="gramStart"/>
+      <w:r>
+        <w:rPr>
+          <w:lang w:val="en-GB"/>
+        </w:rPr>
+        <w:t>i.e.</w:t>
       </w:r>
       <w:proofErr w:type="gramEnd"/>
       <w:r>
         <w:rPr>
-          <w:rFonts w:ascii="Courier New" w:hAnsi="Courier New" w:cs="Courier New"/>
-          <w:sz w:val="22"/>
-          <w:szCs w:val="22"/>
-          <w:lang w:val="en-GB"/>
-        </w:rPr>
-        <w:t>_degenerate</w:t>
-      </w:r>
-      <w:proofErr w:type="spellEnd"/>
-      <w:r>
-        <w:rPr>
-          <w:lang w:val="en-GB"/>
-        </w:rPr>
-        <w:t xml:space="preserve"> to ignore degenerate cells in either the source or the destination grid; this can be useful for the </w:t>
-      </w:r>
-      <w:r>
-        <w:rPr>
-          <w:lang w:val="en-GB"/>
-        </w:rPr>
-        <w:t xml:space="preserve">torc and </w:t>
-      </w:r>
-      <w:proofErr w:type="spellStart"/>
-      <w:r>
-        <w:rPr>
-          <w:lang w:val="en-GB"/>
-        </w:rPr>
-        <w:t>nogt</w:t>
-      </w:r>
-      <w:proofErr w:type="spellEnd"/>
-      <w:r>
-        <w:rPr>
-          <w:lang w:val="en-GB"/>
-        </w:rPr>
-        <w:t xml:space="preserve"> </w:t>
-      </w:r>
-      <w:r>
-        <w:rPr>
-          <w:lang w:val="en-GB"/>
-        </w:rPr>
-        <w:t xml:space="preserve">grids which may have masked cells (i.e. not used in the </w:t>
+          <w:lang w:val="en-GB"/>
+        </w:rPr>
+        <w:t xml:space="preserve"> not used in the </w:t>
       </w:r>
       <w:proofErr w:type="spellStart"/>
       <w:r>
@@ -13610,7 +13655,6 @@
         </w:rPr>
       </w:pPr>
       <w:proofErr w:type="spellStart"/>
-      <w:proofErr w:type="gramStart"/>
       <w:r>
         <w:rPr>
           <w:rFonts w:ascii="Courier New" w:hAnsi="Courier New" w:cs="Courier New"/>
@@ -13618,17 +13662,7 @@
           <w:szCs w:val="22"/>
           <w:lang w:val="en-GB"/>
         </w:rPr>
-        <w:t>regrid</w:t>
-      </w:r>
-      <w:proofErr w:type="gramEnd"/>
-      <w:r>
-        <w:rPr>
-          <w:rFonts w:ascii="Courier New" w:hAnsi="Courier New" w:cs="Courier New"/>
-          <w:sz w:val="22"/>
-          <w:szCs w:val="22"/>
-          <w:lang w:val="en-GB"/>
-        </w:rPr>
-        <w:t>_environment</w:t>
+        <w:t>regrid_environment</w:t>
       </w:r>
       <w:proofErr w:type="spellEnd"/>
       <w:r>
@@ -14057,8 +14091,6 @@
         </w:rPr>
         <w:t>to generate</w:t>
       </w:r>
-      <w:bookmarkStart w:id="0" w:name="_GoBack"/>
-      <w:bookmarkEnd w:id="0"/>
       <w:r>
         <w:rPr>
           <w:lang w:val="en-GB"/>
@@ -14141,15 +14173,9 @@
           <w:szCs w:val="22"/>
           <w:lang w:val="en-GB"/>
         </w:rPr>
-        <w:t>oasis_testcase.f90</w:t>
-      </w:r>
-      <w:r>
-        <w:rPr>
-          <w:lang w:val="en-GB"/>
-        </w:rPr>
-        <w:t xml:space="preserve"> in subroutine </w:t>
-      </w:r>
-      <w:proofErr w:type="spellStart"/>
+        <w:t>oasis_</w:t>
+      </w:r>
+      <w:proofErr w:type="gramStart"/>
       <w:r>
         <w:rPr>
           <w:rFonts w:ascii="Courier New" w:hAnsi="Courier New" w:cs="Courier New"/>
@@ -14157,16 +14183,9 @@
           <w:szCs w:val="22"/>
           <w:lang w:val="en-GB"/>
         </w:rPr>
-        <w:t>init_model_params</w:t>
-      </w:r>
-      <w:proofErr w:type="spellEnd"/>
-      <w:r>
-        <w:rPr>
-          <w:lang w:val="en-GB"/>
-        </w:rPr>
-        <w:t xml:space="preserve"> and </w:t>
-      </w:r>
-      <w:proofErr w:type="spellStart"/>
+        <w:t>testcase.f</w:t>
+      </w:r>
+      <w:proofErr w:type="gramEnd"/>
       <w:r>
         <w:rPr>
           <w:rFonts w:ascii="Courier New" w:hAnsi="Courier New" w:cs="Courier New"/>
@@ -14174,9 +14193,15 @@
           <w:szCs w:val="22"/>
           <w:lang w:val="en-GB"/>
         </w:rPr>
-        <w:t>init_</w:t>
-      </w:r>
-      <w:proofErr w:type="gramStart"/>
+        <w:t>90</w:t>
+      </w:r>
+      <w:r>
+        <w:rPr>
+          <w:lang w:val="en-GB"/>
+        </w:rPr>
+        <w:t xml:space="preserve"> in subroutine </w:t>
+      </w:r>
+      <w:proofErr w:type="spellStart"/>
       <w:r>
         <w:rPr>
           <w:rFonts w:ascii="Courier New" w:hAnsi="Courier New" w:cs="Courier New"/>
@@ -14184,21 +14209,31 @@
           <w:szCs w:val="22"/>
           <w:lang w:val="en-GB"/>
         </w:rPr>
-        <w:t>domain</w:t>
-      </w:r>
-      <w:proofErr w:type="spellEnd"/>
-      <w:r>
-        <w:rPr>
-          <w:lang w:val="en-GB"/>
-        </w:rPr>
-        <w:t xml:space="preserve"> .</w:t>
-      </w:r>
-      <w:proofErr w:type="gramEnd"/>
-      <w:r>
-        <w:rPr>
-          <w:lang w:val="en-GB"/>
-        </w:rPr>
-        <w:t xml:space="preserve"> </w:t>
+        <w:t>init_model_params</w:t>
+      </w:r>
+      <w:proofErr w:type="spellEnd"/>
+      <w:r>
+        <w:rPr>
+          <w:lang w:val="en-GB"/>
+        </w:rPr>
+        <w:t xml:space="preserve"> and </w:t>
+      </w:r>
+      <w:proofErr w:type="spellStart"/>
+      <w:r>
+        <w:rPr>
+          <w:rFonts w:ascii="Courier New" w:hAnsi="Courier New" w:cs="Courier New"/>
+          <w:sz w:val="22"/>
+          <w:szCs w:val="22"/>
+          <w:lang w:val="en-GB"/>
+        </w:rPr>
+        <w:t>init_domain</w:t>
+      </w:r>
+      <w:proofErr w:type="spellEnd"/>
+      <w:r>
+        <w:rPr>
+          <w:lang w:val="en-GB"/>
+        </w:rPr>
+        <w:t xml:space="preserve"> . </w:t>
       </w:r>
     </w:p>
     <w:p>
@@ -14914,18 +14949,12 @@
         <w:t xml:space="preserve">: SCRIP, YAC, ESMF and </w:t>
       </w:r>
       <w:proofErr w:type="spellStart"/>
-      <w:r>
-        <w:rPr>
-          <w:lang w:val="en-GB"/>
-        </w:rPr>
-        <w:t>XIOS</w:t>
-      </w:r>
       <w:proofErr w:type="gramStart"/>
       <w:r>
         <w:rPr>
           <w:lang w:val="en-GB"/>
         </w:rPr>
-        <w:t>,</w:t>
+        <w:t>XIOS,</w:t>
       </w:r>
       <w:r>
         <w:rPr>
@@ -15012,7 +15041,7 @@
 </file>
 
 <file path=word/endnotes.xml><?xml version="1.0" encoding="utf-8"?>
-<w:endnotes xmlns:wpc="http://schemas.microsoft.com/office/word/2010/wordprocessingCanvas" xmlns:mo="http://schemas.microsoft.com/office/mac/office/2008/main" xmlns:mc="http://schemas.openxmlformats.org/markup-compatibility/2006" xmlns:mv="urn:schemas-microsoft-com:mac:vml" xmlns:o="urn:schemas-microsoft-com:office:office" xmlns:r="http://schemas.openxmlformats.org/officeDocument/2006/relationships" xmlns:m="http://schemas.openxmlformats.org/officeDocument/2006/math" xmlns:v="urn:schemas-microsoft-com:vml" xmlns:wp14="http://schemas.microsoft.com/office/word/2010/wordprocessingDrawing" xmlns:wp="http://schemas.openxmlformats.org/drawingml/2006/wordprocessingDrawing" xmlns:w10="urn:schemas-microsoft-com:office:word" xmlns:w="http://schemas.openxmlformats.org/wordprocessingml/2006/main" xmlns:w14="http://schemas.microsoft.com/office/word/2010/wordml" xmlns:wpg="http://schemas.microsoft.com/office/word/2010/wordprocessingGroup" xmlns:wpi="http://schemas.microsoft.com/office/word/2010/wordprocessingInk" xmlns:wne="http://schemas.microsoft.com/office/word/2006/wordml" xmlns:wps="http://schemas.microsoft.com/office/word/2010/wordprocessingShape" mc:Ignorable="w14 wp14">
+<w:endnotes xmlns:wpc="http://schemas.microsoft.com/office/word/2010/wordprocessingCanvas" xmlns:cx="http://schemas.microsoft.com/office/drawing/2014/chartex" xmlns:cx1="http://schemas.microsoft.com/office/drawing/2015/9/8/chartex" xmlns:cx2="http://schemas.microsoft.com/office/drawing/2015/10/21/chartex" xmlns:cx3="http://schemas.microsoft.com/office/drawing/2016/5/9/chartex" xmlns:cx4="http://schemas.microsoft.com/office/drawing/2016/5/10/chartex" xmlns:cx5="http://schemas.microsoft.com/office/drawing/2016/5/11/chartex" xmlns:cx6="http://schemas.microsoft.com/office/drawing/2016/5/12/chartex" xmlns:cx7="http://schemas.microsoft.com/office/drawing/2016/5/13/chartex" xmlns:cx8="http://schemas.microsoft.com/office/drawing/2016/5/14/chartex" xmlns:mc="http://schemas.openxmlformats.org/markup-compatibility/2006" xmlns:aink="http://schemas.microsoft.com/office/drawing/2016/ink" xmlns:am3d="http://schemas.microsoft.com/office/drawing/2017/model3d" xmlns:o="urn:schemas-microsoft-com:office:office" xmlns:oel="http://schemas.microsoft.com/office/2019/extlst" xmlns:r="http://schemas.openxmlformats.org/officeDocument/2006/relationships" xmlns:m="http://schemas.openxmlformats.org/officeDocument/2006/math" xmlns:v="urn:schemas-microsoft-com:vml" xmlns:wp14="http://schemas.microsoft.com/office/word/2010/wordprocessingDrawing" xmlns:wp="http://schemas.openxmlformats.org/drawingml/2006/wordprocessingDrawing" xmlns:w10="urn:schemas-microsoft-com:office:word" xmlns:w="http://schemas.openxmlformats.org/wordprocessingml/2006/main" xmlns:w14="http://schemas.microsoft.com/office/word/2010/wordml" xmlns:w15="http://schemas.microsoft.com/office/word/2012/wordml" xmlns:w16cex="http://schemas.microsoft.com/office/word/2018/wordml/cex" xmlns:w16cid="http://schemas.microsoft.com/office/word/2016/wordml/cid" xmlns:w16="http://schemas.microsoft.com/office/word/2018/wordml" xmlns:w16sdtdh="http://schemas.microsoft.com/office/word/2020/wordml/sdtdatahash" xmlns:w16se="http://schemas.microsoft.com/office/word/2015/wordml/symex" xmlns:wpg="http://schemas.microsoft.com/office/word/2010/wordprocessingGroup" xmlns:wpi="http://schemas.microsoft.com/office/word/2010/wordprocessingInk" xmlns:wne="http://schemas.microsoft.com/office/word/2006/wordml" xmlns:wps="http://schemas.microsoft.com/office/word/2010/wordprocessingShape" mc:Ignorable="w14 w15 w16se w16cid w16 w16cex w16sdtdh wp14">
   <w:endnote w:type="separator" w:id="-1">
     <w:p>
       <w:r>
@@ -15031,7 +15060,7 @@
 </file>
 
 <file path=word/footer1.xml><?xml version="1.0" encoding="utf-8"?>
-<w:ftr xmlns:wpc="http://schemas.microsoft.com/office/word/2010/wordprocessingCanvas" xmlns:mo="http://schemas.microsoft.com/office/mac/office/2008/main" xmlns:mc="http://schemas.openxmlformats.org/markup-compatibility/2006" xmlns:mv="urn:schemas-microsoft-com:mac:vml" xmlns:o="urn:schemas-microsoft-com:office:office" xmlns:r="http://schemas.openxmlformats.org/officeDocument/2006/relationships" xmlns:m="http://schemas.openxmlformats.org/officeDocument/2006/math" xmlns:v="urn:schemas-microsoft-com:vml" xmlns:wp14="http://schemas.microsoft.com/office/word/2010/wordprocessingDrawing" xmlns:wp="http://schemas.openxmlformats.org/drawingml/2006/wordprocessingDrawing" xmlns:w10="urn:schemas-microsoft-com:office:word" xmlns:w="http://schemas.openxmlformats.org/wordprocessingml/2006/main" xmlns:w14="http://schemas.microsoft.com/office/word/2010/wordml" xmlns:wpg="http://schemas.microsoft.com/office/word/2010/wordprocessingGroup" xmlns:wpi="http://schemas.microsoft.com/office/word/2010/wordprocessingInk" xmlns:wne="http://schemas.microsoft.com/office/word/2006/wordml" xmlns:wps="http://schemas.microsoft.com/office/word/2010/wordprocessingShape" mc:Ignorable="w14 wp14">
+<w:ftr xmlns:wpc="http://schemas.microsoft.com/office/word/2010/wordprocessingCanvas" xmlns:cx="http://schemas.microsoft.com/office/drawing/2014/chartex" xmlns:cx1="http://schemas.microsoft.com/office/drawing/2015/9/8/chartex" xmlns:cx2="http://schemas.microsoft.com/office/drawing/2015/10/21/chartex" xmlns:cx3="http://schemas.microsoft.com/office/drawing/2016/5/9/chartex" xmlns:cx4="http://schemas.microsoft.com/office/drawing/2016/5/10/chartex" xmlns:cx5="http://schemas.microsoft.com/office/drawing/2016/5/11/chartex" xmlns:cx6="http://schemas.microsoft.com/office/drawing/2016/5/12/chartex" xmlns:cx7="http://schemas.microsoft.com/office/drawing/2016/5/13/chartex" xmlns:cx8="http://schemas.microsoft.com/office/drawing/2016/5/14/chartex" xmlns:mc="http://schemas.openxmlformats.org/markup-compatibility/2006" xmlns:aink="http://schemas.microsoft.com/office/drawing/2016/ink" xmlns:am3d="http://schemas.microsoft.com/office/drawing/2017/model3d" xmlns:o="urn:schemas-microsoft-com:office:office" xmlns:oel="http://schemas.microsoft.com/office/2019/extlst" xmlns:r="http://schemas.openxmlformats.org/officeDocument/2006/relationships" xmlns:m="http://schemas.openxmlformats.org/officeDocument/2006/math" xmlns:v="urn:schemas-microsoft-com:vml" xmlns:wp14="http://schemas.microsoft.com/office/word/2010/wordprocessingDrawing" xmlns:wp="http://schemas.openxmlformats.org/drawingml/2006/wordprocessingDrawing" xmlns:w10="urn:schemas-microsoft-com:office:word" xmlns:w="http://schemas.openxmlformats.org/wordprocessingml/2006/main" xmlns:w14="http://schemas.microsoft.com/office/word/2010/wordml" xmlns:w15="http://schemas.microsoft.com/office/word/2012/wordml" xmlns:w16cex="http://schemas.microsoft.com/office/word/2018/wordml/cex" xmlns:w16cid="http://schemas.microsoft.com/office/word/2016/wordml/cid" xmlns:w16="http://schemas.microsoft.com/office/word/2018/wordml" xmlns:w16sdtdh="http://schemas.microsoft.com/office/word/2020/wordml/sdtdatahash" xmlns:w16se="http://schemas.microsoft.com/office/word/2015/wordml/symex" xmlns:wpg="http://schemas.microsoft.com/office/word/2010/wordprocessingGroup" xmlns:wpi="http://schemas.microsoft.com/office/word/2010/wordprocessingInk" xmlns:wne="http://schemas.microsoft.com/office/word/2006/wordml" xmlns:wps="http://schemas.microsoft.com/office/word/2010/wordprocessingShape" mc:Ignorable="w14 w15 w16se w16cid w16 w16cex w16sdtdh wp14">
   <w:p>
     <w:pPr>
       <w:pStyle w:val="Pieddepage"/>
@@ -15041,7 +15070,7 @@
 </file>
 
 <file path=word/footer2.xml><?xml version="1.0" encoding="utf-8"?>
-<w:ftr xmlns:wpc="http://schemas.microsoft.com/office/word/2010/wordprocessingCanvas" xmlns:mo="http://schemas.microsoft.com/office/mac/office/2008/main" xmlns:mc="http://schemas.openxmlformats.org/markup-compatibility/2006" xmlns:mv="urn:schemas-microsoft-com:mac:vml" xmlns:o="urn:schemas-microsoft-com:office:office" xmlns:r="http://schemas.openxmlformats.org/officeDocument/2006/relationships" xmlns:m="http://schemas.openxmlformats.org/officeDocument/2006/math" xmlns:v="urn:schemas-microsoft-com:vml" xmlns:wp14="http://schemas.microsoft.com/office/word/2010/wordprocessingDrawing" xmlns:wp="http://schemas.openxmlformats.org/drawingml/2006/wordprocessingDrawing" xmlns:w10="urn:schemas-microsoft-com:office:word" xmlns:w="http://schemas.openxmlformats.org/wordprocessingml/2006/main" xmlns:w14="http://schemas.microsoft.com/office/word/2010/wordml" xmlns:wpg="http://schemas.microsoft.com/office/word/2010/wordprocessingGroup" xmlns:wpi="http://schemas.microsoft.com/office/word/2010/wordprocessingInk" xmlns:wne="http://schemas.microsoft.com/office/word/2006/wordml" xmlns:wps="http://schemas.microsoft.com/office/word/2010/wordprocessingShape" mc:Ignorable="w14 wp14">
+<w:ftr xmlns:wpc="http://schemas.microsoft.com/office/word/2010/wordprocessingCanvas" xmlns:cx="http://schemas.microsoft.com/office/drawing/2014/chartex" xmlns:cx1="http://schemas.microsoft.com/office/drawing/2015/9/8/chartex" xmlns:cx2="http://schemas.microsoft.com/office/drawing/2015/10/21/chartex" xmlns:cx3="http://schemas.microsoft.com/office/drawing/2016/5/9/chartex" xmlns:cx4="http://schemas.microsoft.com/office/drawing/2016/5/10/chartex" xmlns:cx5="http://schemas.microsoft.com/office/drawing/2016/5/11/chartex" xmlns:cx6="http://schemas.microsoft.com/office/drawing/2016/5/12/chartex" xmlns:cx7="http://schemas.microsoft.com/office/drawing/2016/5/13/chartex" xmlns:cx8="http://schemas.microsoft.com/office/drawing/2016/5/14/chartex" xmlns:mc="http://schemas.openxmlformats.org/markup-compatibility/2006" xmlns:aink="http://schemas.microsoft.com/office/drawing/2016/ink" xmlns:am3d="http://schemas.microsoft.com/office/drawing/2017/model3d" xmlns:o="urn:schemas-microsoft-com:office:office" xmlns:oel="http://schemas.microsoft.com/office/2019/extlst" xmlns:r="http://schemas.openxmlformats.org/officeDocument/2006/relationships" xmlns:m="http://schemas.openxmlformats.org/officeDocument/2006/math" xmlns:v="urn:schemas-microsoft-com:vml" xmlns:wp14="http://schemas.microsoft.com/office/word/2010/wordprocessingDrawing" xmlns:wp="http://schemas.openxmlformats.org/drawingml/2006/wordprocessingDrawing" xmlns:w10="urn:schemas-microsoft-com:office:word" xmlns:w="http://schemas.openxmlformats.org/wordprocessingml/2006/main" xmlns:w14="http://schemas.microsoft.com/office/word/2010/wordml" xmlns:w15="http://schemas.microsoft.com/office/word/2012/wordml" xmlns:w16cex="http://schemas.microsoft.com/office/word/2018/wordml/cex" xmlns:w16cid="http://schemas.microsoft.com/office/word/2016/wordml/cid" xmlns:w16="http://schemas.microsoft.com/office/word/2018/wordml" xmlns:w16sdtdh="http://schemas.microsoft.com/office/word/2020/wordml/sdtdatahash" xmlns:w16se="http://schemas.microsoft.com/office/word/2015/wordml/symex" xmlns:wpg="http://schemas.microsoft.com/office/word/2010/wordprocessingGroup" xmlns:wpi="http://schemas.microsoft.com/office/word/2010/wordprocessingInk" xmlns:wne="http://schemas.microsoft.com/office/word/2006/wordml" xmlns:wps="http://schemas.microsoft.com/office/word/2010/wordprocessingShape" mc:Ignorable="w14 w15 w16se w16cid w16 w16cex w16sdtdh wp14">
   <w:p>
     <w:pPr>
       <w:pStyle w:val="Pieddepage"/>
@@ -15075,7 +15104,7 @@
 </file>
 
 <file path=word/footer3.xml><?xml version="1.0" encoding="utf-8"?>
-<w:ftr xmlns:wpc="http://schemas.microsoft.com/office/word/2010/wordprocessingCanvas" xmlns:mo="http://schemas.microsoft.com/office/mac/office/2008/main" xmlns:mc="http://schemas.openxmlformats.org/markup-compatibility/2006" xmlns:mv="urn:schemas-microsoft-com:mac:vml" xmlns:o="urn:schemas-microsoft-com:office:office" xmlns:r="http://schemas.openxmlformats.org/officeDocument/2006/relationships" xmlns:m="http://schemas.openxmlformats.org/officeDocument/2006/math" xmlns:v="urn:schemas-microsoft-com:vml" xmlns:wp14="http://schemas.microsoft.com/office/word/2010/wordprocessingDrawing" xmlns:wp="http://schemas.openxmlformats.org/drawingml/2006/wordprocessingDrawing" xmlns:w10="urn:schemas-microsoft-com:office:word" xmlns:w="http://schemas.openxmlformats.org/wordprocessingml/2006/main" xmlns:w14="http://schemas.microsoft.com/office/word/2010/wordml" xmlns:wpg="http://schemas.microsoft.com/office/word/2010/wordprocessingGroup" xmlns:wpi="http://schemas.microsoft.com/office/word/2010/wordprocessingInk" xmlns:wne="http://schemas.microsoft.com/office/word/2006/wordml" xmlns:wps="http://schemas.microsoft.com/office/word/2010/wordprocessingShape" mc:Ignorable="w14 wp14">
+<w:ftr xmlns:wpc="http://schemas.microsoft.com/office/word/2010/wordprocessingCanvas" xmlns:cx="http://schemas.microsoft.com/office/drawing/2014/chartex" xmlns:cx1="http://schemas.microsoft.com/office/drawing/2015/9/8/chartex" xmlns:cx2="http://schemas.microsoft.com/office/drawing/2015/10/21/chartex" xmlns:cx3="http://schemas.microsoft.com/office/drawing/2016/5/9/chartex" xmlns:cx4="http://schemas.microsoft.com/office/drawing/2016/5/10/chartex" xmlns:cx5="http://schemas.microsoft.com/office/drawing/2016/5/11/chartex" xmlns:cx6="http://schemas.microsoft.com/office/drawing/2016/5/12/chartex" xmlns:cx7="http://schemas.microsoft.com/office/drawing/2016/5/13/chartex" xmlns:cx8="http://schemas.microsoft.com/office/drawing/2016/5/14/chartex" xmlns:mc="http://schemas.openxmlformats.org/markup-compatibility/2006" xmlns:aink="http://schemas.microsoft.com/office/drawing/2016/ink" xmlns:am3d="http://schemas.microsoft.com/office/drawing/2017/model3d" xmlns:o="urn:schemas-microsoft-com:office:office" xmlns:oel="http://schemas.microsoft.com/office/2019/extlst" xmlns:r="http://schemas.openxmlformats.org/officeDocument/2006/relationships" xmlns:m="http://schemas.openxmlformats.org/officeDocument/2006/math" xmlns:v="urn:schemas-microsoft-com:vml" xmlns:wp14="http://schemas.microsoft.com/office/word/2010/wordprocessingDrawing" xmlns:wp="http://schemas.openxmlformats.org/drawingml/2006/wordprocessingDrawing" xmlns:w10="urn:schemas-microsoft-com:office:word" xmlns:w="http://schemas.openxmlformats.org/wordprocessingml/2006/main" xmlns:w14="http://schemas.microsoft.com/office/word/2010/wordml" xmlns:w15="http://schemas.microsoft.com/office/word/2012/wordml" xmlns:w16cex="http://schemas.microsoft.com/office/word/2018/wordml/cex" xmlns:w16cid="http://schemas.microsoft.com/office/word/2016/wordml/cid" xmlns:w16="http://schemas.microsoft.com/office/word/2018/wordml" xmlns:w16sdtdh="http://schemas.microsoft.com/office/word/2020/wordml/sdtdatahash" xmlns:w16se="http://schemas.microsoft.com/office/word/2015/wordml/symex" xmlns:wpg="http://schemas.microsoft.com/office/word/2010/wordprocessingGroup" xmlns:wpi="http://schemas.microsoft.com/office/word/2010/wordprocessingInk" xmlns:wne="http://schemas.microsoft.com/office/word/2006/wordml" xmlns:wps="http://schemas.microsoft.com/office/word/2010/wordprocessingShape" mc:Ignorable="w14 w15 w16se w16cid w16 w16cex w16sdtdh wp14">
   <w:p>
     <w:pPr>
       <w:pStyle w:val="Pieddepage"/>
@@ -15085,7 +15114,7 @@
 </file>
 
 <file path=word/footnotes.xml><?xml version="1.0" encoding="utf-8"?>
-<w:footnotes xmlns:wpc="http://schemas.microsoft.com/office/word/2010/wordprocessingCanvas" xmlns:mo="http://schemas.microsoft.com/office/mac/office/2008/main" xmlns:mc="http://schemas.openxmlformats.org/markup-compatibility/2006" xmlns:mv="urn:schemas-microsoft-com:mac:vml" xmlns:o="urn:schemas-microsoft-com:office:office" xmlns:r="http://schemas.openxmlformats.org/officeDocument/2006/relationships" xmlns:m="http://schemas.openxmlformats.org/officeDocument/2006/math" xmlns:v="urn:schemas-microsoft-com:vml" xmlns:wp14="http://schemas.microsoft.com/office/word/2010/wordprocessingDrawing" xmlns:wp="http://schemas.openxmlformats.org/drawingml/2006/wordprocessingDrawing" xmlns:w10="urn:schemas-microsoft-com:office:word" xmlns:w="http://schemas.openxmlformats.org/wordprocessingml/2006/main" xmlns:w14="http://schemas.microsoft.com/office/word/2010/wordml" xmlns:wpg="http://schemas.microsoft.com/office/word/2010/wordprocessingGroup" xmlns:wpi="http://schemas.microsoft.com/office/word/2010/wordprocessingInk" xmlns:wne="http://schemas.microsoft.com/office/word/2006/wordml" xmlns:wps="http://schemas.microsoft.com/office/word/2010/wordprocessingShape" mc:Ignorable="w14 wp14">
+<w:footnotes xmlns:wpc="http://schemas.microsoft.com/office/word/2010/wordprocessingCanvas" xmlns:cx="http://schemas.microsoft.com/office/drawing/2014/chartex" xmlns:cx1="http://schemas.microsoft.com/office/drawing/2015/9/8/chartex" xmlns:cx2="http://schemas.microsoft.com/office/drawing/2015/10/21/chartex" xmlns:cx3="http://schemas.microsoft.com/office/drawing/2016/5/9/chartex" xmlns:cx4="http://schemas.microsoft.com/office/drawing/2016/5/10/chartex" xmlns:cx5="http://schemas.microsoft.com/office/drawing/2016/5/11/chartex" xmlns:cx6="http://schemas.microsoft.com/office/drawing/2016/5/12/chartex" xmlns:cx7="http://schemas.microsoft.com/office/drawing/2016/5/13/chartex" xmlns:cx8="http://schemas.microsoft.com/office/drawing/2016/5/14/chartex" xmlns:mc="http://schemas.openxmlformats.org/markup-compatibility/2006" xmlns:aink="http://schemas.microsoft.com/office/drawing/2016/ink" xmlns:am3d="http://schemas.microsoft.com/office/drawing/2017/model3d" xmlns:o="urn:schemas-microsoft-com:office:office" xmlns:oel="http://schemas.microsoft.com/office/2019/extlst" xmlns:r="http://schemas.openxmlformats.org/officeDocument/2006/relationships" xmlns:m="http://schemas.openxmlformats.org/officeDocument/2006/math" xmlns:v="urn:schemas-microsoft-com:vml" xmlns:wp14="http://schemas.microsoft.com/office/word/2010/wordprocessingDrawing" xmlns:wp="http://schemas.openxmlformats.org/drawingml/2006/wordprocessingDrawing" xmlns:w10="urn:schemas-microsoft-com:office:word" xmlns:w="http://schemas.openxmlformats.org/wordprocessingml/2006/main" xmlns:w14="http://schemas.microsoft.com/office/word/2010/wordml" xmlns:w15="http://schemas.microsoft.com/office/word/2012/wordml" xmlns:w16cex="http://schemas.microsoft.com/office/word/2018/wordml/cex" xmlns:w16cid="http://schemas.microsoft.com/office/word/2016/wordml/cid" xmlns:w16="http://schemas.microsoft.com/office/word/2018/wordml" xmlns:w16sdtdh="http://schemas.microsoft.com/office/word/2020/wordml/sdtdatahash" xmlns:w16se="http://schemas.microsoft.com/office/word/2015/wordml/symex" xmlns:wpg="http://schemas.microsoft.com/office/word/2010/wordprocessingGroup" xmlns:wpi="http://schemas.microsoft.com/office/word/2010/wordprocessingInk" xmlns:wne="http://schemas.microsoft.com/office/word/2006/wordml" xmlns:wps="http://schemas.microsoft.com/office/word/2010/wordprocessingShape" mc:Ignorable="w14 w15 w16se w16cid w16 w16cex w16sdtdh wp14">
   <w:footnote w:type="separator" w:id="-1">
     <w:p>
       <w:r>
@@ -15111,7 +15140,7 @@
       </w:pPr>
       <w:r>
         <w:rPr>
-          <w:rStyle w:val="Marquenotebasdepage"/>
+          <w:rStyle w:val="Appelnotedebasdep"/>
         </w:rPr>
         <w:footnoteRef/>
       </w:r>
@@ -15153,7 +15182,7 @@
       </w:pPr>
       <w:r>
         <w:rPr>
-          <w:rStyle w:val="Marquenotebasdepage"/>
+          <w:rStyle w:val="Appelnotedebasdep"/>
         </w:rPr>
         <w:footnoteRef/>
       </w:r>
@@ -15219,7 +15248,7 @@
       </w:pPr>
       <w:r>
         <w:rPr>
-          <w:rStyle w:val="Marquenotebasdepage"/>
+          <w:rStyle w:val="Appelnotedebasdep"/>
         </w:rPr>
         <w:footnoteRef/>
       </w:r>
@@ -15251,7 +15280,7 @@
       </w:pPr>
       <w:r>
         <w:rPr>
-          <w:rStyle w:val="Marquenotebasdepage"/>
+          <w:rStyle w:val="Appelnotedebasdep"/>
           <w:sz w:val="22"/>
           <w:szCs w:val="22"/>
         </w:rPr>
@@ -15271,69 +15300,41 @@
           <w:szCs w:val="22"/>
           <w:lang w:val="en-GB"/>
         </w:rPr>
-        <w:t xml:space="preserve"> ESMF: the so-called “SCRIP” format or the “unstructured” format. The “SCRIP” format describes the grid providing the latitude and the longitude of the centre and corners of each cell. The unstructured format describes the grid as an ensemble of elements and provides the element connectivity associating for each element a certain number of nodes in the list of nodes for which the latitude and longitude are provided. The grids </w:t>
-      </w:r>
-      <w:proofErr w:type="spellStart"/>
+        <w:t xml:space="preserve"> ESMF: the so-called “SCRIP” format or the “unstructured” format. The “SCRIP” format describes the grid providing the latitude and the longitude of the centre and corners of each cell. The unstructured format describes the grid as an ensemble of elements and provides the element connectivity associating for each element a certain number of nodes in the list of nodes for which the latitude and longitude are provided. The grids torc</w:t>
+      </w:r>
       <w:r>
         <w:rPr>
           <w:sz w:val="22"/>
           <w:szCs w:val="22"/>
           <w:lang w:val="en-GB"/>
         </w:rPr>
-        <w:t>torc</w:t>
-      </w:r>
-      <w:proofErr w:type="spellEnd"/>
+        <w:t xml:space="preserve"> and</w:t>
+      </w:r>
       <w:r>
         <w:rPr>
           <w:sz w:val="22"/>
           <w:szCs w:val="22"/>
           <w:lang w:val="en-GB"/>
         </w:rPr>
-        <w:t xml:space="preserve"> and</w:t>
-      </w:r>
+        <w:t xml:space="preserve"> </w:t>
+      </w:r>
+      <w:proofErr w:type="spellStart"/>
       <w:r>
         <w:rPr>
           <w:sz w:val="22"/>
           <w:szCs w:val="22"/>
           <w:lang w:val="en-GB"/>
         </w:rPr>
-        <w:t xml:space="preserve"> </w:t>
-      </w:r>
-      <w:proofErr w:type="spellStart"/>
+        <w:t>nogt</w:t>
+      </w:r>
+      <w:proofErr w:type="spellEnd"/>
       <w:r>
         <w:rPr>
           <w:sz w:val="22"/>
           <w:szCs w:val="22"/>
           <w:lang w:val="en-GB"/>
         </w:rPr>
-        <w:t>nogt</w:t>
-      </w:r>
-      <w:proofErr w:type="spellEnd"/>
-      <w:r>
-        <w:rPr>
-          <w:sz w:val="22"/>
-          <w:szCs w:val="22"/>
-          <w:lang w:val="en-GB"/>
-        </w:rPr>
-        <w:t xml:space="preserve"> are structured and can in principle be described in ESMF with the SCRIP format. However, as detailed in section 7.4 of (</w:t>
-      </w:r>
-      <w:proofErr w:type="spellStart"/>
-      <w:r>
-        <w:rPr>
-          <w:sz w:val="22"/>
-          <w:szCs w:val="22"/>
-          <w:lang w:val="en-GB"/>
-        </w:rPr>
-        <w:t>Valcke</w:t>
-      </w:r>
-      <w:proofErr w:type="spellEnd"/>
-      <w:r>
-        <w:rPr>
-          <w:sz w:val="22"/>
-          <w:szCs w:val="22"/>
-          <w:lang w:val="en-GB"/>
-        </w:rPr>
-        <w:t xml:space="preserve"> et al. 2021), the conservative remapping for a field expressed on a </w:t>
+        <w:t xml:space="preserve"> are structured and can in principle be described in ESMF with the SCRIP format. However, as detailed in section 7.4 of (Valcke et al. 2021), the conservative remapping for a field expressed on a </w:t>
       </w:r>
       <w:proofErr w:type="spellStart"/>
       <w:r>
@@ -15437,7 +15438,7 @@
 </file>
 
 <file path=word/header1.xml><?xml version="1.0" encoding="utf-8"?>
-<w:hdr xmlns:wpc="http://schemas.microsoft.com/office/word/2010/wordprocessingCanvas" xmlns:mo="http://schemas.microsoft.com/office/mac/office/2008/main" xmlns:mc="http://schemas.openxmlformats.org/markup-compatibility/2006" xmlns:mv="urn:schemas-microsoft-com:mac:vml" xmlns:o="urn:schemas-microsoft-com:office:office" xmlns:r="http://schemas.openxmlformats.org/officeDocument/2006/relationships" xmlns:m="http://schemas.openxmlformats.org/officeDocument/2006/math" xmlns:v="urn:schemas-microsoft-com:vml" xmlns:wp14="http://schemas.microsoft.com/office/word/2010/wordprocessingDrawing" xmlns:wp="http://schemas.openxmlformats.org/drawingml/2006/wordprocessingDrawing" xmlns:w10="urn:schemas-microsoft-com:office:word" xmlns:w="http://schemas.openxmlformats.org/wordprocessingml/2006/main" xmlns:w14="http://schemas.microsoft.com/office/word/2010/wordml" xmlns:wpg="http://schemas.microsoft.com/office/word/2010/wordprocessingGroup" xmlns:wpi="http://schemas.microsoft.com/office/word/2010/wordprocessingInk" xmlns:wne="http://schemas.microsoft.com/office/word/2006/wordml" xmlns:wps="http://schemas.microsoft.com/office/word/2010/wordprocessingShape" mc:Ignorable="w14 wp14">
+<w:hdr xmlns:wpc="http://schemas.microsoft.com/office/word/2010/wordprocessingCanvas" xmlns:cx="http://schemas.microsoft.com/office/drawing/2014/chartex" xmlns:cx1="http://schemas.microsoft.com/office/drawing/2015/9/8/chartex" xmlns:cx2="http://schemas.microsoft.com/office/drawing/2015/10/21/chartex" xmlns:cx3="http://schemas.microsoft.com/office/drawing/2016/5/9/chartex" xmlns:cx4="http://schemas.microsoft.com/office/drawing/2016/5/10/chartex" xmlns:cx5="http://schemas.microsoft.com/office/drawing/2016/5/11/chartex" xmlns:cx6="http://schemas.microsoft.com/office/drawing/2016/5/12/chartex" xmlns:cx7="http://schemas.microsoft.com/office/drawing/2016/5/13/chartex" xmlns:cx8="http://schemas.microsoft.com/office/drawing/2016/5/14/chartex" xmlns:mc="http://schemas.openxmlformats.org/markup-compatibility/2006" xmlns:aink="http://schemas.microsoft.com/office/drawing/2016/ink" xmlns:am3d="http://schemas.microsoft.com/office/drawing/2017/model3d" xmlns:o="urn:schemas-microsoft-com:office:office" xmlns:oel="http://schemas.microsoft.com/office/2019/extlst" xmlns:r="http://schemas.openxmlformats.org/officeDocument/2006/relationships" xmlns:m="http://schemas.openxmlformats.org/officeDocument/2006/math" xmlns:v="urn:schemas-microsoft-com:vml" xmlns:wp14="http://schemas.microsoft.com/office/word/2010/wordprocessingDrawing" xmlns:wp="http://schemas.openxmlformats.org/drawingml/2006/wordprocessingDrawing" xmlns:w10="urn:schemas-microsoft-com:office:word" xmlns:w="http://schemas.openxmlformats.org/wordprocessingml/2006/main" xmlns:w14="http://schemas.microsoft.com/office/word/2010/wordml" xmlns:w15="http://schemas.microsoft.com/office/word/2012/wordml" xmlns:w16cex="http://schemas.microsoft.com/office/word/2018/wordml/cex" xmlns:w16cid="http://schemas.microsoft.com/office/word/2016/wordml/cid" xmlns:w16="http://schemas.microsoft.com/office/word/2018/wordml" xmlns:w16sdtdh="http://schemas.microsoft.com/office/word/2020/wordml/sdtdatahash" xmlns:w16se="http://schemas.microsoft.com/office/word/2015/wordml/symex" xmlns:wpg="http://schemas.microsoft.com/office/word/2010/wordprocessingGroup" xmlns:wpi="http://schemas.microsoft.com/office/word/2010/wordprocessingInk" xmlns:wne="http://schemas.microsoft.com/office/word/2006/wordml" xmlns:wps="http://schemas.microsoft.com/office/word/2010/wordprocessingShape" mc:Ignorable="w14 w15 w16se w16cid w16 w16cex w16sdtdh wp14">
   <w:p>
     <w:pPr>
       <w:pStyle w:val="En-tte"/>
@@ -15447,7 +15448,7 @@
 </file>
 
 <file path=word/header2.xml><?xml version="1.0" encoding="utf-8"?>
-<w:hdr xmlns:wpc="http://schemas.microsoft.com/office/word/2010/wordprocessingCanvas" xmlns:mo="http://schemas.microsoft.com/office/mac/office/2008/main" xmlns:mc="http://schemas.openxmlformats.org/markup-compatibility/2006" xmlns:mv="urn:schemas-microsoft-com:mac:vml" xmlns:o="urn:schemas-microsoft-com:office:office" xmlns:r="http://schemas.openxmlformats.org/officeDocument/2006/relationships" xmlns:m="http://schemas.openxmlformats.org/officeDocument/2006/math" xmlns:v="urn:schemas-microsoft-com:vml" xmlns:wp14="http://schemas.microsoft.com/office/word/2010/wordprocessingDrawing" xmlns:wp="http://schemas.openxmlformats.org/drawingml/2006/wordprocessingDrawing" xmlns:w10="urn:schemas-microsoft-com:office:word" xmlns:w="http://schemas.openxmlformats.org/wordprocessingml/2006/main" xmlns:w14="http://schemas.microsoft.com/office/word/2010/wordml" xmlns:wpg="http://schemas.microsoft.com/office/word/2010/wordprocessingGroup" xmlns:wpi="http://schemas.microsoft.com/office/word/2010/wordprocessingInk" xmlns:wne="http://schemas.microsoft.com/office/word/2006/wordml" xmlns:wps="http://schemas.microsoft.com/office/word/2010/wordprocessingShape" mc:Ignorable="w14 wp14">
+<w:hdr xmlns:wpc="http://schemas.microsoft.com/office/word/2010/wordprocessingCanvas" xmlns:cx="http://schemas.microsoft.com/office/drawing/2014/chartex" xmlns:cx1="http://schemas.microsoft.com/office/drawing/2015/9/8/chartex" xmlns:cx2="http://schemas.microsoft.com/office/drawing/2015/10/21/chartex" xmlns:cx3="http://schemas.microsoft.com/office/drawing/2016/5/9/chartex" xmlns:cx4="http://schemas.microsoft.com/office/drawing/2016/5/10/chartex" xmlns:cx5="http://schemas.microsoft.com/office/drawing/2016/5/11/chartex" xmlns:cx6="http://schemas.microsoft.com/office/drawing/2016/5/12/chartex" xmlns:cx7="http://schemas.microsoft.com/office/drawing/2016/5/13/chartex" xmlns:cx8="http://schemas.microsoft.com/office/drawing/2016/5/14/chartex" xmlns:mc="http://schemas.openxmlformats.org/markup-compatibility/2006" xmlns:aink="http://schemas.microsoft.com/office/drawing/2016/ink" xmlns:am3d="http://schemas.microsoft.com/office/drawing/2017/model3d" xmlns:o="urn:schemas-microsoft-com:office:office" xmlns:oel="http://schemas.microsoft.com/office/2019/extlst" xmlns:r="http://schemas.openxmlformats.org/officeDocument/2006/relationships" xmlns:m="http://schemas.openxmlformats.org/officeDocument/2006/math" xmlns:v="urn:schemas-microsoft-com:vml" xmlns:wp14="http://schemas.microsoft.com/office/word/2010/wordprocessingDrawing" xmlns:wp="http://schemas.openxmlformats.org/drawingml/2006/wordprocessingDrawing" xmlns:w10="urn:schemas-microsoft-com:office:word" xmlns:w="http://schemas.openxmlformats.org/wordprocessingml/2006/main" xmlns:w14="http://schemas.microsoft.com/office/word/2010/wordml" xmlns:w15="http://schemas.microsoft.com/office/word/2012/wordml" xmlns:w16cex="http://schemas.microsoft.com/office/word/2018/wordml/cex" xmlns:w16cid="http://schemas.microsoft.com/office/word/2016/wordml/cid" xmlns:w16="http://schemas.microsoft.com/office/word/2018/wordml" xmlns:w16sdtdh="http://schemas.microsoft.com/office/word/2020/wordml/sdtdatahash" xmlns:w16se="http://schemas.microsoft.com/office/word/2015/wordml/symex" xmlns:wpg="http://schemas.microsoft.com/office/word/2010/wordprocessingGroup" xmlns:wpi="http://schemas.microsoft.com/office/word/2010/wordprocessingInk" xmlns:wne="http://schemas.microsoft.com/office/word/2006/wordml" xmlns:wps="http://schemas.microsoft.com/office/word/2010/wordprocessingShape" mc:Ignorable="w14 w15 w16se w16cid w16 w16cex w16sdtdh wp14">
   <w:p>
     <w:pPr>
       <w:pStyle w:val="En-tte"/>
@@ -15457,7 +15458,7 @@
 </file>
 
 <file path=word/header3.xml><?xml version="1.0" encoding="utf-8"?>
-<w:hdr xmlns:wpc="http://schemas.microsoft.com/office/word/2010/wordprocessingCanvas" xmlns:mo="http://schemas.microsoft.com/office/mac/office/2008/main" xmlns:mc="http://schemas.openxmlformats.org/markup-compatibility/2006" xmlns:mv="urn:schemas-microsoft-com:mac:vml" xmlns:o="urn:schemas-microsoft-com:office:office" xmlns:r="http://schemas.openxmlformats.org/officeDocument/2006/relationships" xmlns:m="http://schemas.openxmlformats.org/officeDocument/2006/math" xmlns:v="urn:schemas-microsoft-com:vml" xmlns:wp14="http://schemas.microsoft.com/office/word/2010/wordprocessingDrawing" xmlns:wp="http://schemas.openxmlformats.org/drawingml/2006/wordprocessingDrawing" xmlns:w10="urn:schemas-microsoft-com:office:word" xmlns:w="http://schemas.openxmlformats.org/wordprocessingml/2006/main" xmlns:w14="http://schemas.microsoft.com/office/word/2010/wordml" xmlns:wpg="http://schemas.microsoft.com/office/word/2010/wordprocessingGroup" xmlns:wpi="http://schemas.microsoft.com/office/word/2010/wordprocessingInk" xmlns:wne="http://schemas.microsoft.com/office/word/2006/wordml" xmlns:wps="http://schemas.microsoft.com/office/word/2010/wordprocessingShape" mc:Ignorable="w14 wp14">
+<w:hdr xmlns:wpc="http://schemas.microsoft.com/office/word/2010/wordprocessingCanvas" xmlns:cx="http://schemas.microsoft.com/office/drawing/2014/chartex" xmlns:cx1="http://schemas.microsoft.com/office/drawing/2015/9/8/chartex" xmlns:cx2="http://schemas.microsoft.com/office/drawing/2015/10/21/chartex" xmlns:cx3="http://schemas.microsoft.com/office/drawing/2016/5/9/chartex" xmlns:cx4="http://schemas.microsoft.com/office/drawing/2016/5/10/chartex" xmlns:cx5="http://schemas.microsoft.com/office/drawing/2016/5/11/chartex" xmlns:cx6="http://schemas.microsoft.com/office/drawing/2016/5/12/chartex" xmlns:cx7="http://schemas.microsoft.com/office/drawing/2016/5/13/chartex" xmlns:cx8="http://schemas.microsoft.com/office/drawing/2016/5/14/chartex" xmlns:mc="http://schemas.openxmlformats.org/markup-compatibility/2006" xmlns:aink="http://schemas.microsoft.com/office/drawing/2016/ink" xmlns:am3d="http://schemas.microsoft.com/office/drawing/2017/model3d" xmlns:o="urn:schemas-microsoft-com:office:office" xmlns:oel="http://schemas.microsoft.com/office/2019/extlst" xmlns:r="http://schemas.openxmlformats.org/officeDocument/2006/relationships" xmlns:m="http://schemas.openxmlformats.org/officeDocument/2006/math" xmlns:v="urn:schemas-microsoft-com:vml" xmlns:wp14="http://schemas.microsoft.com/office/word/2010/wordprocessingDrawing" xmlns:wp="http://schemas.openxmlformats.org/drawingml/2006/wordprocessingDrawing" xmlns:w10="urn:schemas-microsoft-com:office:word" xmlns:w="http://schemas.openxmlformats.org/wordprocessingml/2006/main" xmlns:w14="http://schemas.microsoft.com/office/word/2010/wordml" xmlns:w15="http://schemas.microsoft.com/office/word/2012/wordml" xmlns:w16cex="http://schemas.microsoft.com/office/word/2018/wordml/cex" xmlns:w16cid="http://schemas.microsoft.com/office/word/2016/wordml/cid" xmlns:w16="http://schemas.microsoft.com/office/word/2018/wordml" xmlns:w16sdtdh="http://schemas.microsoft.com/office/word/2020/wordml/sdtdatahash" xmlns:w16se="http://schemas.microsoft.com/office/word/2015/wordml/symex" xmlns:wpg="http://schemas.microsoft.com/office/word/2010/wordprocessingGroup" xmlns:wpi="http://schemas.microsoft.com/office/word/2010/wordprocessingInk" xmlns:wne="http://schemas.microsoft.com/office/word/2006/wordml" xmlns:wps="http://schemas.microsoft.com/office/word/2010/wordprocessingShape" mc:Ignorable="w14 w15 w16se w16cid w16 w16cex w16sdtdh wp14">
   <w:p>
     <w:pPr>
       <w:pStyle w:val="En-tte"/>
@@ -15467,8 +15468,8 @@
 </file>
 
 <file path=word/numbering.xml><?xml version="1.0" encoding="utf-8"?>
-<w:numbering xmlns:wpc="http://schemas.microsoft.com/office/word/2010/wordprocessingCanvas" xmlns:mo="http://schemas.microsoft.com/office/mac/office/2008/main" xmlns:mc="http://schemas.openxmlformats.org/markup-compatibility/2006" xmlns:mv="urn:schemas-microsoft-com:mac:vml" xmlns:o="urn:schemas-microsoft-com:office:office" xmlns:r="http://schemas.openxmlformats.org/officeDocument/2006/relationships" xmlns:m="http://schemas.openxmlformats.org/officeDocument/2006/math" xmlns:v="urn:schemas-microsoft-com:vml" xmlns:wp14="http://schemas.microsoft.com/office/word/2010/wordprocessingDrawing" xmlns:wp="http://schemas.openxmlformats.org/drawingml/2006/wordprocessingDrawing" xmlns:w10="urn:schemas-microsoft-com:office:word" xmlns:w="http://schemas.openxmlformats.org/wordprocessingml/2006/main" xmlns:w14="http://schemas.microsoft.com/office/word/2010/wordml" xmlns:wpg="http://schemas.microsoft.com/office/word/2010/wordprocessingGroup" xmlns:wpi="http://schemas.microsoft.com/office/word/2010/wordprocessingInk" xmlns:wne="http://schemas.microsoft.com/office/word/2006/wordml" xmlns:wps="http://schemas.microsoft.com/office/word/2010/wordprocessingShape" mc:Ignorable="w14 wp14">
-  <w:abstractNum w:abstractNumId="0">
+<w:numbering xmlns:wpc="http://schemas.microsoft.com/office/word/2010/wordprocessingCanvas" xmlns:cx="http://schemas.microsoft.com/office/drawing/2014/chartex" xmlns:cx1="http://schemas.microsoft.com/office/drawing/2015/9/8/chartex" xmlns:cx2="http://schemas.microsoft.com/office/drawing/2015/10/21/chartex" xmlns:cx3="http://schemas.microsoft.com/office/drawing/2016/5/9/chartex" xmlns:cx4="http://schemas.microsoft.com/office/drawing/2016/5/10/chartex" xmlns:cx5="http://schemas.microsoft.com/office/drawing/2016/5/11/chartex" xmlns:cx6="http://schemas.microsoft.com/office/drawing/2016/5/12/chartex" xmlns:cx7="http://schemas.microsoft.com/office/drawing/2016/5/13/chartex" xmlns:cx8="http://schemas.microsoft.com/office/drawing/2016/5/14/chartex" xmlns:mc="http://schemas.openxmlformats.org/markup-compatibility/2006" xmlns:aink="http://schemas.microsoft.com/office/drawing/2016/ink" xmlns:am3d="http://schemas.microsoft.com/office/drawing/2017/model3d" xmlns:o="urn:schemas-microsoft-com:office:office" xmlns:oel="http://schemas.microsoft.com/office/2019/extlst" xmlns:r="http://schemas.openxmlformats.org/officeDocument/2006/relationships" xmlns:m="http://schemas.openxmlformats.org/officeDocument/2006/math" xmlns:v="urn:schemas-microsoft-com:vml" xmlns:wp14="http://schemas.microsoft.com/office/word/2010/wordprocessingDrawing" xmlns:wp="http://schemas.openxmlformats.org/drawingml/2006/wordprocessingDrawing" xmlns:w10="urn:schemas-microsoft-com:office:word" xmlns:w="http://schemas.openxmlformats.org/wordprocessingml/2006/main" xmlns:w14="http://schemas.microsoft.com/office/word/2010/wordml" xmlns:w15="http://schemas.microsoft.com/office/word/2012/wordml" xmlns:w16cex="http://schemas.microsoft.com/office/word/2018/wordml/cex" xmlns:w16cid="http://schemas.microsoft.com/office/word/2016/wordml/cid" xmlns:w16="http://schemas.microsoft.com/office/word/2018/wordml" xmlns:w16sdtdh="http://schemas.microsoft.com/office/word/2020/wordml/sdtdatahash" xmlns:w16se="http://schemas.microsoft.com/office/word/2015/wordml/symex" xmlns:wpg="http://schemas.microsoft.com/office/word/2010/wordprocessingGroup" xmlns:wpi="http://schemas.microsoft.com/office/word/2010/wordprocessingInk" xmlns:wne="http://schemas.microsoft.com/office/word/2006/wordml" xmlns:wps="http://schemas.microsoft.com/office/word/2010/wordprocessingShape" mc:Ignorable="w14 w15 w16se w16cid w16 w16cex w16sdtdh wp14">
+  <w:abstractNum w:abstractNumId="0" w15:restartNumberingAfterBreak="0">
     <w:nsid w:val="00000001"/>
     <w:multiLevelType w:val="singleLevel"/>
     <w:tmpl w:val="00000001"/>
@@ -15486,7 +15487,7 @@
       </w:pPr>
     </w:lvl>
   </w:abstractNum>
-  <w:abstractNum w:abstractNumId="1">
+  <w:abstractNum w:abstractNumId="1" w15:restartNumberingAfterBreak="0">
     <w:nsid w:val="00000002"/>
     <w:multiLevelType w:val="singleLevel"/>
     <w:tmpl w:val="00000002"/>
@@ -15507,7 +15508,7 @@
       </w:rPr>
     </w:lvl>
   </w:abstractNum>
-  <w:abstractNum w:abstractNumId="2">
+  <w:abstractNum w:abstractNumId="2" w15:restartNumberingAfterBreak="0">
     <w:nsid w:val="00000003"/>
     <w:multiLevelType w:val="singleLevel"/>
     <w:tmpl w:val="00000003"/>
@@ -15528,7 +15529,7 @@
       </w:rPr>
     </w:lvl>
   </w:abstractNum>
-  <w:abstractNum w:abstractNumId="3">
+  <w:abstractNum w:abstractNumId="3" w15:restartNumberingAfterBreak="0">
     <w:nsid w:val="00000004"/>
     <w:multiLevelType w:val="singleLevel"/>
     <w:tmpl w:val="00000004"/>
@@ -15549,7 +15550,7 @@
       </w:rPr>
     </w:lvl>
   </w:abstractNum>
-  <w:abstractNum w:abstractNumId="4">
+  <w:abstractNum w:abstractNumId="4" w15:restartNumberingAfterBreak="0">
     <w:nsid w:val="00000005"/>
     <w:multiLevelType w:val="singleLevel"/>
     <w:tmpl w:val="00000005"/>
@@ -15570,7 +15571,7 @@
       </w:rPr>
     </w:lvl>
   </w:abstractNum>
-  <w:abstractNum w:abstractNumId="5">
+  <w:abstractNum w:abstractNumId="5" w15:restartNumberingAfterBreak="0">
     <w:nsid w:val="00000006"/>
     <w:multiLevelType w:val="singleLevel"/>
     <w:tmpl w:val="00000006"/>
@@ -15591,7 +15592,7 @@
       </w:rPr>
     </w:lvl>
   </w:abstractNum>
-  <w:abstractNum w:abstractNumId="6">
+  <w:abstractNum w:abstractNumId="6" w15:restartNumberingAfterBreak="0">
     <w:nsid w:val="00000007"/>
     <w:multiLevelType w:val="singleLevel"/>
     <w:tmpl w:val="00000007"/>
@@ -15612,7 +15613,7 @@
       </w:rPr>
     </w:lvl>
   </w:abstractNum>
-  <w:abstractNum w:abstractNumId="7">
+  <w:abstractNum w:abstractNumId="7" w15:restartNumberingAfterBreak="0">
     <w:nsid w:val="00000008"/>
     <w:multiLevelType w:val="singleLevel"/>
     <w:tmpl w:val="00000008"/>
@@ -15633,7 +15634,7 @@
       </w:rPr>
     </w:lvl>
   </w:abstractNum>
-  <w:abstractNum w:abstractNumId="8">
+  <w:abstractNum w:abstractNumId="8" w15:restartNumberingAfterBreak="0">
     <w:nsid w:val="00000009"/>
     <w:multiLevelType w:val="singleLevel"/>
     <w:tmpl w:val="00000009"/>
@@ -15654,7 +15655,7 @@
       </w:rPr>
     </w:lvl>
   </w:abstractNum>
-  <w:abstractNum w:abstractNumId="9">
+  <w:abstractNum w:abstractNumId="9" w15:restartNumberingAfterBreak="0">
     <w:nsid w:val="0000000A"/>
     <w:multiLevelType w:val="singleLevel"/>
     <w:tmpl w:val="0000000A"/>
@@ -15675,7 +15676,7 @@
       </w:rPr>
     </w:lvl>
   </w:abstractNum>
-  <w:abstractNum w:abstractNumId="10">
+  <w:abstractNum w:abstractNumId="10" w15:restartNumberingAfterBreak="0">
     <w:nsid w:val="0000000B"/>
     <w:multiLevelType w:val="singleLevel"/>
     <w:tmpl w:val="0000000B"/>
@@ -15696,7 +15697,7 @@
       </w:rPr>
     </w:lvl>
   </w:abstractNum>
-  <w:abstractNum w:abstractNumId="11">
+  <w:abstractNum w:abstractNumId="11" w15:restartNumberingAfterBreak="0">
     <w:nsid w:val="0000000C"/>
     <w:multiLevelType w:val="singleLevel"/>
     <w:tmpl w:val="0000000C"/>
@@ -15717,7 +15718,7 @@
       </w:rPr>
     </w:lvl>
   </w:abstractNum>
-  <w:abstractNum w:abstractNumId="12">
+  <w:abstractNum w:abstractNumId="12" w15:restartNumberingAfterBreak="0">
     <w:nsid w:val="0000000D"/>
     <w:multiLevelType w:val="singleLevel"/>
     <w:tmpl w:val="0000000D"/>
@@ -15738,7 +15739,7 @@
       </w:rPr>
     </w:lvl>
   </w:abstractNum>
-  <w:abstractNum w:abstractNumId="13">
+  <w:abstractNum w:abstractNumId="13" w15:restartNumberingAfterBreak="0">
     <w:nsid w:val="0000000E"/>
     <w:multiLevelType w:val="singleLevel"/>
     <w:tmpl w:val="0000000E"/>
@@ -15759,7 +15760,7 @@
       </w:rPr>
     </w:lvl>
   </w:abstractNum>
-  <w:abstractNum w:abstractNumId="14">
+  <w:abstractNum w:abstractNumId="14" w15:restartNumberingAfterBreak="0">
     <w:nsid w:val="0000000F"/>
     <w:multiLevelType w:val="singleLevel"/>
     <w:tmpl w:val="0000000F"/>
@@ -15780,7 +15781,7 @@
       </w:rPr>
     </w:lvl>
   </w:abstractNum>
-  <w:abstractNum w:abstractNumId="15">
+  <w:abstractNum w:abstractNumId="15" w15:restartNumberingAfterBreak="0">
     <w:nsid w:val="00000010"/>
     <w:multiLevelType w:val="singleLevel"/>
     <w:tmpl w:val="00000010"/>
@@ -15801,7 +15802,7 @@
       </w:rPr>
     </w:lvl>
   </w:abstractNum>
-  <w:abstractNum w:abstractNumId="16">
+  <w:abstractNum w:abstractNumId="16" w15:restartNumberingAfterBreak="0">
     <w:nsid w:val="00000011"/>
     <w:multiLevelType w:val="singleLevel"/>
     <w:tmpl w:val="00000011"/>
@@ -15819,7 +15820,7 @@
       </w:pPr>
     </w:lvl>
   </w:abstractNum>
-  <w:abstractNum w:abstractNumId="17">
+  <w:abstractNum w:abstractNumId="17" w15:restartNumberingAfterBreak="0">
     <w:nsid w:val="00000012"/>
     <w:multiLevelType w:val="singleLevel"/>
     <w:tmpl w:val="00000012"/>
@@ -15840,7 +15841,7 @@
       </w:rPr>
     </w:lvl>
   </w:abstractNum>
-  <w:abstractNum w:abstractNumId="18">
+  <w:abstractNum w:abstractNumId="18" w15:restartNumberingAfterBreak="0">
     <w:nsid w:val="00000013"/>
     <w:multiLevelType w:val="singleLevel"/>
     <w:tmpl w:val="00000013"/>
@@ -15861,7 +15862,7 @@
       </w:rPr>
     </w:lvl>
   </w:abstractNum>
-  <w:abstractNum w:abstractNumId="19">
+  <w:abstractNum w:abstractNumId="19" w15:restartNumberingAfterBreak="0">
     <w:nsid w:val="00000014"/>
     <w:multiLevelType w:val="singleLevel"/>
     <w:tmpl w:val="00000014"/>
@@ -15879,7 +15880,7 @@
       </w:pPr>
     </w:lvl>
   </w:abstractNum>
-  <w:abstractNum w:abstractNumId="20">
+  <w:abstractNum w:abstractNumId="20" w15:restartNumberingAfterBreak="0">
     <w:nsid w:val="00000015"/>
     <w:multiLevelType w:val="singleLevel"/>
     <w:tmpl w:val="00000015"/>
@@ -15900,7 +15901,7 @@
       </w:rPr>
     </w:lvl>
   </w:abstractNum>
-  <w:abstractNum w:abstractNumId="21">
+  <w:abstractNum w:abstractNumId="21" w15:restartNumberingAfterBreak="0">
     <w:nsid w:val="00000016"/>
     <w:multiLevelType w:val="singleLevel"/>
     <w:tmpl w:val="00000016"/>
@@ -15921,7 +15922,7 @@
       </w:rPr>
     </w:lvl>
   </w:abstractNum>
-  <w:abstractNum w:abstractNumId="22">
+  <w:abstractNum w:abstractNumId="22" w15:restartNumberingAfterBreak="0">
     <w:nsid w:val="00000017"/>
     <w:multiLevelType w:val="singleLevel"/>
     <w:tmpl w:val="00000017"/>
@@ -15942,7 +15943,7 @@
       </w:rPr>
     </w:lvl>
   </w:abstractNum>
-  <w:abstractNum w:abstractNumId="23">
+  <w:abstractNum w:abstractNumId="23" w15:restartNumberingAfterBreak="0">
     <w:nsid w:val="00000018"/>
     <w:multiLevelType w:val="singleLevel"/>
     <w:tmpl w:val="00000018"/>
@@ -15960,7 +15961,7 @@
       </w:pPr>
     </w:lvl>
   </w:abstractNum>
-  <w:abstractNum w:abstractNumId="24">
+  <w:abstractNum w:abstractNumId="24" w15:restartNumberingAfterBreak="0">
     <w:nsid w:val="00000019"/>
     <w:multiLevelType w:val="singleLevel"/>
     <w:tmpl w:val="00000019"/>
@@ -15981,7 +15982,7 @@
       </w:rPr>
     </w:lvl>
   </w:abstractNum>
-  <w:abstractNum w:abstractNumId="25">
+  <w:abstractNum w:abstractNumId="25" w15:restartNumberingAfterBreak="0">
     <w:nsid w:val="0000001A"/>
     <w:multiLevelType w:val="singleLevel"/>
     <w:tmpl w:val="0000001A"/>
@@ -16002,7 +16003,7 @@
       </w:rPr>
     </w:lvl>
   </w:abstractNum>
-  <w:abstractNum w:abstractNumId="26">
+  <w:abstractNum w:abstractNumId="26" w15:restartNumberingAfterBreak="0">
     <w:nsid w:val="0000001B"/>
     <w:multiLevelType w:val="singleLevel"/>
     <w:tmpl w:val="0000001B"/>
@@ -16023,7 +16024,7 @@
       </w:rPr>
     </w:lvl>
   </w:abstractNum>
-  <w:abstractNum w:abstractNumId="27">
+  <w:abstractNum w:abstractNumId="27" w15:restartNumberingAfterBreak="0">
     <w:nsid w:val="0000001C"/>
     <w:multiLevelType w:val="singleLevel"/>
     <w:tmpl w:val="0000001C"/>
@@ -16044,7 +16045,7 @@
       </w:rPr>
     </w:lvl>
   </w:abstractNum>
-  <w:abstractNum w:abstractNumId="28">
+  <w:abstractNum w:abstractNumId="28" w15:restartNumberingAfterBreak="0">
     <w:nsid w:val="0000001D"/>
     <w:multiLevelType w:val="singleLevel"/>
     <w:tmpl w:val="0000001D"/>
@@ -16065,7 +16066,7 @@
       </w:rPr>
     </w:lvl>
   </w:abstractNum>
-  <w:abstractNum w:abstractNumId="29">
+  <w:abstractNum w:abstractNumId="29" w15:restartNumberingAfterBreak="0">
     <w:nsid w:val="0000001E"/>
     <w:multiLevelType w:val="singleLevel"/>
     <w:tmpl w:val="0000001E"/>
@@ -16086,7 +16087,7 @@
       </w:rPr>
     </w:lvl>
   </w:abstractNum>
-  <w:abstractNum w:abstractNumId="30">
+  <w:abstractNum w:abstractNumId="30" w15:restartNumberingAfterBreak="0">
     <w:nsid w:val="0000001F"/>
     <w:multiLevelType w:val="singleLevel"/>
     <w:tmpl w:val="0000001F"/>
@@ -16107,7 +16108,7 @@
       </w:rPr>
     </w:lvl>
   </w:abstractNum>
-  <w:abstractNum w:abstractNumId="31">
+  <w:abstractNum w:abstractNumId="31" w15:restartNumberingAfterBreak="0">
     <w:nsid w:val="00000020"/>
     <w:multiLevelType w:val="singleLevel"/>
     <w:tmpl w:val="00000020"/>
@@ -16128,7 +16129,7 @@
       </w:rPr>
     </w:lvl>
   </w:abstractNum>
-  <w:abstractNum w:abstractNumId="32">
+  <w:abstractNum w:abstractNumId="32" w15:restartNumberingAfterBreak="0">
     <w:nsid w:val="018C7EBF"/>
     <w:multiLevelType w:val="hybridMultilevel"/>
     <w:tmpl w:val="73FE776C"/>
@@ -16241,7 +16242,7 @@
       </w:rPr>
     </w:lvl>
   </w:abstractNum>
-  <w:abstractNum w:abstractNumId="33">
+  <w:abstractNum w:abstractNumId="33" w15:restartNumberingAfterBreak="0">
     <w:nsid w:val="0C177F38"/>
     <w:multiLevelType w:val="hybridMultilevel"/>
     <w:tmpl w:val="D9CAAADC"/>
@@ -16354,7 +16355,7 @@
       </w:rPr>
     </w:lvl>
   </w:abstractNum>
-  <w:abstractNum w:abstractNumId="34">
+  <w:abstractNum w:abstractNumId="34" w15:restartNumberingAfterBreak="0">
     <w:nsid w:val="0D9240E9"/>
     <w:multiLevelType w:val="hybridMultilevel"/>
     <w:tmpl w:val="C38680C6"/>
@@ -16494,7 +16495,7 @@
       </w:rPr>
     </w:lvl>
   </w:abstractNum>
-  <w:abstractNum w:abstractNumId="35">
+  <w:abstractNum w:abstractNumId="35" w15:restartNumberingAfterBreak="0">
     <w:nsid w:val="1D730026"/>
     <w:multiLevelType w:val="multilevel"/>
     <w:tmpl w:val="0409001F"/>
@@ -16580,7 +16581,7 @@
       </w:pPr>
     </w:lvl>
   </w:abstractNum>
-  <w:abstractNum w:abstractNumId="36">
+  <w:abstractNum w:abstractNumId="36" w15:restartNumberingAfterBreak="0">
     <w:nsid w:val="20934E7F"/>
     <w:multiLevelType w:val="hybridMultilevel"/>
     <w:tmpl w:val="3042B2E0"/>
@@ -16669,7 +16670,7 @@
       </w:pPr>
     </w:lvl>
   </w:abstractNum>
-  <w:abstractNum w:abstractNumId="37">
+  <w:abstractNum w:abstractNumId="37" w15:restartNumberingAfterBreak="0">
     <w:nsid w:val="21EC0A64"/>
     <w:multiLevelType w:val="hybridMultilevel"/>
     <w:tmpl w:val="95822ED4"/>
@@ -16782,7 +16783,7 @@
       </w:rPr>
     </w:lvl>
   </w:abstractNum>
-  <w:abstractNum w:abstractNumId="38">
+  <w:abstractNum w:abstractNumId="38" w15:restartNumberingAfterBreak="0">
     <w:nsid w:val="2F865EB5"/>
     <w:multiLevelType w:val="hybridMultilevel"/>
     <w:tmpl w:val="43962CD6"/>
@@ -16895,7 +16896,7 @@
       </w:rPr>
     </w:lvl>
   </w:abstractNum>
-  <w:abstractNum w:abstractNumId="39">
+  <w:abstractNum w:abstractNumId="39" w15:restartNumberingAfterBreak="0">
     <w:nsid w:val="72127DCC"/>
     <w:multiLevelType w:val="hybridMultilevel"/>
     <w:tmpl w:val="B156D438"/>
@@ -17008,7 +17009,7 @@
       </w:rPr>
     </w:lvl>
   </w:abstractNum>
-  <w:abstractNum w:abstractNumId="40">
+  <w:abstractNum w:abstractNumId="40" w15:restartNumberingAfterBreak="0">
     <w:nsid w:val="79667E29"/>
     <w:multiLevelType w:val="hybridMultilevel"/>
     <w:tmpl w:val="683E9E72"/>
@@ -17121,7 +17122,7 @@
       </w:rPr>
     </w:lvl>
   </w:abstractNum>
-  <w:abstractNum w:abstractNumId="41">
+  <w:abstractNum w:abstractNumId="41" w15:restartNumberingAfterBreak="0">
     <w:nsid w:val="7B943E84"/>
     <w:multiLevelType w:val="hybridMultilevel"/>
     <w:tmpl w:val="0010C52C"/>
@@ -17234,7 +17235,7 @@
       </w:rPr>
     </w:lvl>
   </w:abstractNum>
-  <w:abstractNum w:abstractNumId="42">
+  <w:abstractNum w:abstractNumId="42" w15:restartNumberingAfterBreak="0">
     <w:nsid w:val="7E0562BF"/>
     <w:multiLevelType w:val="hybridMultilevel"/>
     <w:tmpl w:val="F30465E6"/>
@@ -17347,7 +17348,7 @@
       </w:rPr>
     </w:lvl>
   </w:abstractNum>
-  <w:abstractNum w:abstractNumId="43">
+  <w:abstractNum w:abstractNumId="43" w15:restartNumberingAfterBreak="0">
     <w:nsid w:val="7F7505B4"/>
     <w:multiLevelType w:val="hybridMultilevel"/>
     <w:tmpl w:val="E52EB1F0"/>
@@ -17460,40 +17461,40 @@
       </w:rPr>
     </w:lvl>
   </w:abstractNum>
-  <w:num w:numId="1">
+  <w:num w:numId="1" w16cid:durableId="182862857">
     <w:abstractNumId w:val="41"/>
   </w:num>
-  <w:num w:numId="2">
+  <w:num w:numId="2" w16cid:durableId="1507136305">
     <w:abstractNumId w:val="39"/>
   </w:num>
-  <w:num w:numId="3">
+  <w:num w:numId="3" w16cid:durableId="2028021305">
     <w:abstractNumId w:val="34"/>
   </w:num>
-  <w:num w:numId="4">
+  <w:num w:numId="4" w16cid:durableId="2071809151">
     <w:abstractNumId w:val="37"/>
   </w:num>
-  <w:num w:numId="5">
+  <w:num w:numId="5" w16cid:durableId="1308822491">
     <w:abstractNumId w:val="35"/>
   </w:num>
-  <w:num w:numId="6">
+  <w:num w:numId="6" w16cid:durableId="1381249032">
     <w:abstractNumId w:val="42"/>
   </w:num>
-  <w:num w:numId="7">
+  <w:num w:numId="7" w16cid:durableId="1200049734">
     <w:abstractNumId w:val="43"/>
   </w:num>
-  <w:num w:numId="8">
+  <w:num w:numId="8" w16cid:durableId="737829560">
     <w:abstractNumId w:val="33"/>
   </w:num>
-  <w:num w:numId="9">
+  <w:num w:numId="9" w16cid:durableId="624429040">
     <w:abstractNumId w:val="38"/>
   </w:num>
-  <w:num w:numId="10">
+  <w:num w:numId="10" w16cid:durableId="953095678">
     <w:abstractNumId w:val="32"/>
   </w:num>
-  <w:num w:numId="11">
+  <w:num w:numId="11" w16cid:durableId="2008895886">
     <w:abstractNumId w:val="40"/>
   </w:num>
-  <w:num w:numId="12">
+  <w:num w:numId="12" w16cid:durableId="1400443328">
     <w:abstractNumId w:val="36"/>
   </w:num>
   <w:numIdMacAtCleanup w:val="7"/>
@@ -17501,7 +17502,7 @@
 </file>
 
 <file path=word/styles.xml><?xml version="1.0" encoding="utf-8"?>
-<w:styles xmlns:mc="http://schemas.openxmlformats.org/markup-compatibility/2006" xmlns:r="http://schemas.openxmlformats.org/officeDocument/2006/relationships" xmlns:w="http://schemas.openxmlformats.org/wordprocessingml/2006/main" xmlns:w14="http://schemas.microsoft.com/office/word/2010/wordml" mc:Ignorable="w14">
+<w:styles xmlns:mc="http://schemas.openxmlformats.org/markup-compatibility/2006" xmlns:r="http://schemas.openxmlformats.org/officeDocument/2006/relationships" xmlns:w="http://schemas.openxmlformats.org/wordprocessingml/2006/main" xmlns:w14="http://schemas.microsoft.com/office/word/2010/wordml" xmlns:w15="http://schemas.microsoft.com/office/word/2012/wordml" xmlns:w16cex="http://schemas.microsoft.com/office/word/2018/wordml/cex" xmlns:w16cid="http://schemas.microsoft.com/office/word/2016/wordml/cid" xmlns:w16="http://schemas.microsoft.com/office/word/2018/wordml" xmlns:w16sdtdh="http://schemas.microsoft.com/office/word/2020/wordml/sdtdatahash" xmlns:w16se="http://schemas.microsoft.com/office/word/2015/wordml/symex" mc:Ignorable="w14 w15 w16se w16cid w16 w16cex w16sdtdh">
   <w:docDefaults>
     <w:rPrDefault>
       <w:rPr>
@@ -17511,153 +17512,379 @@
     </w:rPrDefault>
     <w:pPrDefault/>
   </w:docDefaults>
-  <w:latentStyles w:defLockedState="0" w:defUIPriority="99" w:defSemiHidden="1" w:defUnhideWhenUsed="1" w:defQFormat="0" w:count="276">
-    <w:lsdException w:name="Normal" w:semiHidden="0" w:uiPriority="0" w:unhideWhenUsed="0" w:qFormat="1"/>
-    <w:lsdException w:name="heading 1" w:semiHidden="0" w:uiPriority="9" w:unhideWhenUsed="0" w:qFormat="1"/>
-    <w:lsdException w:name="heading 2" w:uiPriority="9" w:qFormat="1"/>
-    <w:lsdException w:name="heading 3" w:uiPriority="9" w:qFormat="1"/>
-    <w:lsdException w:name="heading 4" w:uiPriority="9" w:qFormat="1"/>
-    <w:lsdException w:name="heading 5" w:uiPriority="9" w:qFormat="1"/>
-    <w:lsdException w:name="heading 6" w:uiPriority="9" w:qFormat="1"/>
-    <w:lsdException w:name="heading 7" w:uiPriority="9" w:qFormat="1"/>
-    <w:lsdException w:name="heading 8" w:uiPriority="9" w:qFormat="1"/>
-    <w:lsdException w:name="heading 9" w:uiPriority="9" w:qFormat="1"/>
-    <w:lsdException w:name="toc 1" w:uiPriority="39"/>
-    <w:lsdException w:name="toc 2" w:uiPriority="39"/>
-    <w:lsdException w:name="toc 3" w:uiPriority="39"/>
-    <w:lsdException w:name="toc 4" w:uiPriority="39"/>
-    <w:lsdException w:name="toc 5" w:uiPriority="39"/>
-    <w:lsdException w:name="toc 6" w:uiPriority="39"/>
-    <w:lsdException w:name="toc 7" w:uiPriority="39"/>
-    <w:lsdException w:name="toc 8" w:uiPriority="39"/>
-    <w:lsdException w:name="toc 9" w:uiPriority="39"/>
-    <w:lsdException w:name="caption" w:semiHidden="0" w:uiPriority="35" w:unhideWhenUsed="0" w:qFormat="1"/>
-    <w:lsdException w:name="Title" w:semiHidden="0" w:uiPriority="10" w:unhideWhenUsed="0" w:qFormat="1"/>
-    <w:lsdException w:name="Default Paragraph Font" w:uiPriority="1"/>
-    <w:lsdException w:name="Subtitle" w:semiHidden="0" w:uiPriority="11" w:unhideWhenUsed="0" w:qFormat="1"/>
-    <w:lsdException w:name="Strong" w:semiHidden="0" w:uiPriority="22" w:unhideWhenUsed="0" w:qFormat="1"/>
-    <w:lsdException w:name="Emphasis" w:semiHidden="0" w:uiPriority="20" w:unhideWhenUsed="0" w:qFormat="1"/>
-    <w:lsdException w:name="Table Grid" w:semiHidden="0" w:uiPriority="59" w:unhideWhenUsed="0"/>
-    <w:lsdException w:name="Note Level 1" w:semiHidden="0" w:unhideWhenUsed="0"/>
-    <w:lsdException w:name="Note Level 2" w:semiHidden="0" w:unhideWhenUsed="0"/>
-    <w:lsdException w:name="Note Level 3" w:semiHidden="0" w:unhideWhenUsed="0"/>
-    <w:lsdException w:name="Note Level 4" w:semiHidden="0" w:unhideWhenUsed="0"/>
-    <w:lsdException w:name="Note Level 5" w:semiHidden="0" w:unhideWhenUsed="0"/>
-    <w:lsdException w:name="Note Level 6" w:semiHidden="0" w:unhideWhenUsed="0"/>
-    <w:lsdException w:name="Note Level 7" w:semiHidden="0" w:unhideWhenUsed="0"/>
-    <w:lsdException w:name="Note Level 8" w:semiHidden="0" w:unhideWhenUsed="0"/>
-    <w:lsdException w:name="Note Level 9" w:semiHidden="0" w:unhideWhenUsed="0"/>
-    <w:lsdException w:name="Placeholder Text" w:unhideWhenUsed="0"/>
-    <w:lsdException w:name="No Spacing" w:semiHidden="0" w:uiPriority="1" w:unhideWhenUsed="0" w:qFormat="1"/>
-    <w:lsdException w:name="Light Shading" w:semiHidden="0" w:uiPriority="60" w:unhideWhenUsed="0"/>
-    <w:lsdException w:name="Light List" w:semiHidden="0" w:uiPriority="61" w:unhideWhenUsed="0"/>
-    <w:lsdException w:name="Light Grid" w:semiHidden="0" w:uiPriority="62" w:unhideWhenUsed="0"/>
-    <w:lsdException w:name="Medium Shading 1" w:semiHidden="0" w:uiPriority="63" w:unhideWhenUsed="0"/>
-    <w:lsdException w:name="Medium Shading 2" w:semiHidden="0" w:uiPriority="64" w:unhideWhenUsed="0"/>
-    <w:lsdException w:name="Medium List 1" w:semiHidden="0" w:uiPriority="65" w:unhideWhenUsed="0"/>
-    <w:lsdException w:name="Medium List 2" w:semiHidden="0" w:uiPriority="66" w:unhideWhenUsed="0"/>
-    <w:lsdException w:name="Medium Grid 1" w:semiHidden="0" w:uiPriority="67" w:unhideWhenUsed="0"/>
-    <w:lsdException w:name="Medium Grid 2" w:semiHidden="0" w:uiPriority="68" w:unhideWhenUsed="0"/>
-    <w:lsdException w:name="Medium Grid 3" w:semiHidden="0" w:uiPriority="69" w:unhideWhenUsed="0"/>
-    <w:lsdException w:name="Dark List" w:semiHidden="0" w:uiPriority="70" w:unhideWhenUsed="0"/>
-    <w:lsdException w:name="Colorful Shading" w:semiHidden="0" w:uiPriority="71" w:unhideWhenUsed="0"/>
-    <w:lsdException w:name="Colorful List" w:semiHidden="0" w:uiPriority="72" w:unhideWhenUsed="0"/>
-    <w:lsdException w:name="Colorful Grid" w:semiHidden="0" w:uiPriority="73" w:unhideWhenUsed="0"/>
-    <w:lsdException w:name="Light Shading Accent 1" w:semiHidden="0" w:uiPriority="60" w:unhideWhenUsed="0"/>
-    <w:lsdException w:name="Light List Accent 1" w:semiHidden="0" w:uiPriority="61" w:unhideWhenUsed="0"/>
-    <w:lsdException w:name="Light Grid Accent 1" w:semiHidden="0" w:uiPriority="62" w:unhideWhenUsed="0"/>
-    <w:lsdException w:name="Medium Shading 1 Accent 1" w:semiHidden="0" w:uiPriority="63" w:unhideWhenUsed="0"/>
-    <w:lsdException w:name="Medium Shading 2 Accent 1" w:semiHidden="0" w:uiPriority="64" w:unhideWhenUsed="0"/>
-    <w:lsdException w:name="Medium List 1 Accent 1" w:semiHidden="0" w:uiPriority="65" w:unhideWhenUsed="0"/>
-    <w:lsdException w:name="Revision" w:unhideWhenUsed="0"/>
-    <w:lsdException w:name="List Paragraph" w:semiHidden="0" w:uiPriority="34" w:unhideWhenUsed="0" w:qFormat="1"/>
-    <w:lsdException w:name="Quote" w:semiHidden="0" w:uiPriority="29" w:unhideWhenUsed="0" w:qFormat="1"/>
-    <w:lsdException w:name="Intense Quote" w:semiHidden="0" w:uiPriority="30" w:unhideWhenUsed="0" w:qFormat="1"/>
-    <w:lsdException w:name="Medium List 2 Accent 1" w:semiHidden="0" w:uiPriority="66" w:unhideWhenUsed="0"/>
-    <w:lsdException w:name="Medium Grid 1 Accent 1" w:semiHidden="0" w:uiPriority="67" w:unhideWhenUsed="0"/>
-    <w:lsdException w:name="Medium Grid 2 Accent 1" w:semiHidden="0" w:uiPriority="68" w:unhideWhenUsed="0"/>
-    <w:lsdException w:name="Medium Grid 3 Accent 1" w:semiHidden="0" w:uiPriority="69" w:unhideWhenUsed="0"/>
-    <w:lsdException w:name="Dark List Accent 1" w:semiHidden="0" w:uiPriority="70" w:unhideWhenUsed="0"/>
-    <w:lsdException w:name="Colorful Shading Accent 1" w:semiHidden="0" w:uiPriority="71" w:unhideWhenUsed="0"/>
-    <w:lsdException w:name="Colorful List Accent 1" w:semiHidden="0" w:uiPriority="72" w:unhideWhenUsed="0"/>
-    <w:lsdException w:name="Colorful Grid Accent 1" w:semiHidden="0" w:uiPriority="73" w:unhideWhenUsed="0"/>
-    <w:lsdException w:name="Light Shading Accent 2" w:semiHidden="0" w:uiPriority="60" w:unhideWhenUsed="0"/>
-    <w:lsdException w:name="Light List Accent 2" w:semiHidden="0" w:uiPriority="61" w:unhideWhenUsed="0"/>
-    <w:lsdException w:name="Light Grid Accent 2" w:semiHidden="0" w:uiPriority="62" w:unhideWhenUsed="0"/>
-    <w:lsdException w:name="Medium Shading 1 Accent 2" w:semiHidden="0" w:uiPriority="63" w:unhideWhenUsed="0"/>
-    <w:lsdException w:name="Medium Shading 2 Accent 2" w:semiHidden="0" w:uiPriority="64" w:unhideWhenUsed="0"/>
-    <w:lsdException w:name="Medium List 1 Accent 2" w:semiHidden="0" w:uiPriority="65" w:unhideWhenUsed="0"/>
-    <w:lsdException w:name="Medium List 2 Accent 2" w:semiHidden="0" w:uiPriority="66" w:unhideWhenUsed="0"/>
-    <w:lsdException w:name="Medium Grid 1 Accent 2" w:semiHidden="0" w:uiPriority="67" w:unhideWhenUsed="0"/>
-    <w:lsdException w:name="Medium Grid 2 Accent 2" w:semiHidden="0" w:uiPriority="68" w:unhideWhenUsed="0"/>
-    <w:lsdException w:name="Medium Grid 3 Accent 2" w:semiHidden="0" w:uiPriority="69" w:unhideWhenUsed="0"/>
-    <w:lsdException w:name="Dark List Accent 2" w:semiHidden="0" w:uiPriority="70" w:unhideWhenUsed="0"/>
-    <w:lsdException w:name="Colorful Shading Accent 2" w:semiHidden="0" w:uiPriority="71" w:unhideWhenUsed="0"/>
-    <w:lsdException w:name="Colorful List Accent 2" w:semiHidden="0" w:uiPriority="72" w:unhideWhenUsed="0"/>
-    <w:lsdException w:name="Colorful Grid Accent 2" w:semiHidden="0" w:uiPriority="73" w:unhideWhenUsed="0"/>
-    <w:lsdException w:name="Light Shading Accent 3" w:semiHidden="0" w:uiPriority="60" w:unhideWhenUsed="0"/>
-    <w:lsdException w:name="Light List Accent 3" w:semiHidden="0" w:uiPriority="61" w:unhideWhenUsed="0"/>
-    <w:lsdException w:name="Light Grid Accent 3" w:semiHidden="0" w:uiPriority="62" w:unhideWhenUsed="0"/>
-    <w:lsdException w:name="Medium Shading 1 Accent 3" w:semiHidden="0" w:uiPriority="63" w:unhideWhenUsed="0"/>
-    <w:lsdException w:name="Medium Shading 2 Accent 3" w:semiHidden="0" w:uiPriority="64" w:unhideWhenUsed="0"/>
-    <w:lsdException w:name="Medium List 1 Accent 3" w:semiHidden="0" w:uiPriority="65" w:unhideWhenUsed="0"/>
-    <w:lsdException w:name="Medium List 2 Accent 3" w:semiHidden="0" w:uiPriority="66" w:unhideWhenUsed="0"/>
-    <w:lsdException w:name="Medium Grid 1 Accent 3" w:semiHidden="0" w:uiPriority="67" w:unhideWhenUsed="0"/>
-    <w:lsdException w:name="Medium Grid 2 Accent 3" w:semiHidden="0" w:uiPriority="68" w:unhideWhenUsed="0"/>
-    <w:lsdException w:name="Medium Grid 3 Accent 3" w:semiHidden="0" w:uiPriority="69" w:unhideWhenUsed="0"/>
-    <w:lsdException w:name="Dark List Accent 3" w:semiHidden="0" w:uiPriority="70" w:unhideWhenUsed="0"/>
-    <w:lsdException w:name="Colorful Shading Accent 3" w:semiHidden="0" w:uiPriority="71" w:unhideWhenUsed="0"/>
-    <w:lsdException w:name="Colorful List Accent 3" w:semiHidden="0" w:uiPriority="72" w:unhideWhenUsed="0"/>
-    <w:lsdException w:name="Colorful Grid Accent 3" w:semiHidden="0" w:uiPriority="73" w:unhideWhenUsed="0"/>
-    <w:lsdException w:name="Light Shading Accent 4" w:semiHidden="0" w:uiPriority="60" w:unhideWhenUsed="0"/>
-    <w:lsdException w:name="Light List Accent 4" w:semiHidden="0" w:uiPriority="61" w:unhideWhenUsed="0"/>
-    <w:lsdException w:name="Light Grid Accent 4" w:semiHidden="0" w:uiPriority="62" w:unhideWhenUsed="0"/>
-    <w:lsdException w:name="Medium Shading 1 Accent 4" w:semiHidden="0" w:uiPriority="63" w:unhideWhenUsed="0"/>
-    <w:lsdException w:name="Medium Shading 2 Accent 4" w:semiHidden="0" w:uiPriority="64" w:unhideWhenUsed="0"/>
-    <w:lsdException w:name="Medium List 1 Accent 4" w:semiHidden="0" w:uiPriority="65" w:unhideWhenUsed="0"/>
-    <w:lsdException w:name="Medium List 2 Accent 4" w:semiHidden="0" w:uiPriority="66" w:unhideWhenUsed="0"/>
-    <w:lsdException w:name="Medium Grid 1 Accent 4" w:semiHidden="0" w:uiPriority="67" w:unhideWhenUsed="0"/>
-    <w:lsdException w:name="Medium Grid 2 Accent 4" w:semiHidden="0" w:uiPriority="68" w:unhideWhenUsed="0"/>
-    <w:lsdException w:name="Medium Grid 3 Accent 4" w:semiHidden="0" w:uiPriority="69" w:unhideWhenUsed="0"/>
-    <w:lsdException w:name="Dark List Accent 4" w:semiHidden="0" w:uiPriority="70" w:unhideWhenUsed="0"/>
-    <w:lsdException w:name="Colorful Shading Accent 4" w:semiHidden="0" w:uiPriority="71" w:unhideWhenUsed="0"/>
-    <w:lsdException w:name="Colorful List Accent 4" w:semiHidden="0" w:uiPriority="72" w:unhideWhenUsed="0"/>
-    <w:lsdException w:name="Colorful Grid Accent 4" w:semiHidden="0" w:uiPriority="73" w:unhideWhenUsed="0"/>
-    <w:lsdException w:name="Light Shading Accent 5" w:semiHidden="0" w:uiPriority="60" w:unhideWhenUsed="0"/>
-    <w:lsdException w:name="Light List Accent 5" w:semiHidden="0" w:uiPriority="61" w:unhideWhenUsed="0"/>
-    <w:lsdException w:name="Light Grid Accent 5" w:semiHidden="0" w:uiPriority="62" w:unhideWhenUsed="0"/>
-    <w:lsdException w:name="Medium Shading 1 Accent 5" w:semiHidden="0" w:uiPriority="63" w:unhideWhenUsed="0"/>
-    <w:lsdException w:name="Medium Shading 2 Accent 5" w:semiHidden="0" w:uiPriority="64" w:unhideWhenUsed="0"/>
-    <w:lsdException w:name="Medium List 1 Accent 5" w:semiHidden="0" w:uiPriority="65" w:unhideWhenUsed="0"/>
-    <w:lsdException w:name="Medium List 2 Accent 5" w:semiHidden="0" w:uiPriority="66" w:unhideWhenUsed="0"/>
-    <w:lsdException w:name="Medium Grid 1 Accent 5" w:semiHidden="0" w:uiPriority="67" w:unhideWhenUsed="0"/>
-    <w:lsdException w:name="Medium Grid 2 Accent 5" w:semiHidden="0" w:uiPriority="68" w:unhideWhenUsed="0"/>
-    <w:lsdException w:name="Medium Grid 3 Accent 5" w:semiHidden="0" w:uiPriority="69" w:unhideWhenUsed="0"/>
-    <w:lsdException w:name="Dark List Accent 5" w:semiHidden="0" w:uiPriority="70" w:unhideWhenUsed="0"/>
-    <w:lsdException w:name="Colorful Shading Accent 5" w:semiHidden="0" w:uiPriority="71" w:unhideWhenUsed="0"/>
-    <w:lsdException w:name="Colorful List Accent 5" w:semiHidden="0" w:uiPriority="72" w:unhideWhenUsed="0"/>
-    <w:lsdException w:name="Colorful Grid Accent 5" w:semiHidden="0" w:uiPriority="73" w:unhideWhenUsed="0"/>
-    <w:lsdException w:name="Light Shading Accent 6" w:semiHidden="0" w:uiPriority="60" w:unhideWhenUsed="0"/>
-    <w:lsdException w:name="Light List Accent 6" w:semiHidden="0" w:uiPriority="61" w:unhideWhenUsed="0"/>
-    <w:lsdException w:name="Light Grid Accent 6" w:semiHidden="0" w:uiPriority="62" w:unhideWhenUsed="0"/>
-    <w:lsdException w:name="Medium Shading 1 Accent 6" w:semiHidden="0" w:uiPriority="63" w:unhideWhenUsed="0"/>
-    <w:lsdException w:name="Medium Shading 2 Accent 6" w:semiHidden="0" w:uiPriority="64" w:unhideWhenUsed="0"/>
-    <w:lsdException w:name="Medium List 1 Accent 6" w:semiHidden="0" w:uiPriority="65" w:unhideWhenUsed="0"/>
-    <w:lsdException w:name="Medium List 2 Accent 6" w:semiHidden="0" w:uiPriority="66" w:unhideWhenUsed="0"/>
-    <w:lsdException w:name="Medium Grid 1 Accent 6" w:semiHidden="0" w:uiPriority="67" w:unhideWhenUsed="0"/>
-    <w:lsdException w:name="Medium Grid 2 Accent 6" w:semiHidden="0" w:uiPriority="68" w:unhideWhenUsed="0"/>
-    <w:lsdException w:name="Medium Grid 3 Accent 6" w:semiHidden="0" w:uiPriority="69" w:unhideWhenUsed="0"/>
-    <w:lsdException w:name="Dark List Accent 6" w:semiHidden="0" w:uiPriority="70" w:unhideWhenUsed="0"/>
-    <w:lsdException w:name="Colorful Shading Accent 6" w:semiHidden="0" w:uiPriority="71" w:unhideWhenUsed="0"/>
-    <w:lsdException w:name="Colorful List Accent 6" w:semiHidden="0" w:uiPriority="72" w:unhideWhenUsed="0"/>
-    <w:lsdException w:name="Colorful Grid Accent 6" w:semiHidden="0" w:uiPriority="73" w:unhideWhenUsed="0"/>
-    <w:lsdException w:name="Subtle Emphasis" w:semiHidden="0" w:uiPriority="19" w:unhideWhenUsed="0" w:qFormat="1"/>
-    <w:lsdException w:name="Intense Emphasis" w:semiHidden="0" w:uiPriority="21" w:unhideWhenUsed="0" w:qFormat="1"/>
-    <w:lsdException w:name="Subtle Reference" w:semiHidden="0" w:uiPriority="31" w:unhideWhenUsed="0" w:qFormat="1"/>
-    <w:lsdException w:name="Intense Reference" w:semiHidden="0" w:uiPriority="32" w:unhideWhenUsed="0" w:qFormat="1"/>
-    <w:lsdException w:name="Book Title" w:semiHidden="0" w:uiPriority="33" w:unhideWhenUsed="0" w:qFormat="1"/>
-    <w:lsdException w:name="Bibliography" w:uiPriority="37"/>
-    <w:lsdException w:name="TOC Heading" w:uiPriority="39" w:qFormat="1"/>
+  <w:latentStyles w:defLockedState="0" w:defUIPriority="99" w:defSemiHidden="0" w:defUnhideWhenUsed="0" w:defQFormat="0" w:count="376">
+    <w:lsdException w:name="Normal" w:uiPriority="0" w:qFormat="1"/>
+    <w:lsdException w:name="heading 1" w:uiPriority="9" w:qFormat="1"/>
+    <w:lsdException w:name="heading 2" w:semiHidden="1" w:uiPriority="9" w:unhideWhenUsed="1" w:qFormat="1"/>
+    <w:lsdException w:name="heading 3" w:semiHidden="1" w:uiPriority="9" w:unhideWhenUsed="1" w:qFormat="1"/>
+    <w:lsdException w:name="heading 4" w:semiHidden="1" w:uiPriority="9" w:unhideWhenUsed="1" w:qFormat="1"/>
+    <w:lsdException w:name="heading 5" w:semiHidden="1" w:uiPriority="9" w:unhideWhenUsed="1" w:qFormat="1"/>
+    <w:lsdException w:name="heading 6" w:semiHidden="1" w:uiPriority="9" w:unhideWhenUsed="1" w:qFormat="1"/>
+    <w:lsdException w:name="heading 7" w:semiHidden="1" w:uiPriority="9" w:unhideWhenUsed="1" w:qFormat="1"/>
+    <w:lsdException w:name="heading 8" w:semiHidden="1" w:uiPriority="9" w:unhideWhenUsed="1" w:qFormat="1"/>
+    <w:lsdException w:name="heading 9" w:semiHidden="1" w:uiPriority="9" w:unhideWhenUsed="1" w:qFormat="1"/>
+    <w:lsdException w:name="index 1" w:semiHidden="1" w:unhideWhenUsed="1"/>
+    <w:lsdException w:name="index 2" w:semiHidden="1" w:unhideWhenUsed="1"/>
+    <w:lsdException w:name="index 3" w:semiHidden="1" w:unhideWhenUsed="1"/>
+    <w:lsdException w:name="index 4" w:semiHidden="1" w:unhideWhenUsed="1"/>
+    <w:lsdException w:name="index 5" w:semiHidden="1" w:unhideWhenUsed="1"/>
+    <w:lsdException w:name="index 6" w:semiHidden="1" w:unhideWhenUsed="1"/>
+    <w:lsdException w:name="index 7" w:semiHidden="1" w:unhideWhenUsed="1"/>
+    <w:lsdException w:name="index 8" w:semiHidden="1" w:unhideWhenUsed="1"/>
+    <w:lsdException w:name="index 9" w:semiHidden="1" w:unhideWhenUsed="1"/>
+    <w:lsdException w:name="toc 1" w:semiHidden="1" w:uiPriority="39" w:unhideWhenUsed="1"/>
+    <w:lsdException w:name="toc 2" w:semiHidden="1" w:uiPriority="39" w:unhideWhenUsed="1"/>
+    <w:lsdException w:name="toc 3" w:semiHidden="1" w:uiPriority="39" w:unhideWhenUsed="1"/>
+    <w:lsdException w:name="toc 4" w:semiHidden="1" w:uiPriority="39" w:unhideWhenUsed="1"/>
+    <w:lsdException w:name="toc 5" w:semiHidden="1" w:uiPriority="39" w:unhideWhenUsed="1"/>
+    <w:lsdException w:name="toc 6" w:semiHidden="1" w:uiPriority="39" w:unhideWhenUsed="1"/>
+    <w:lsdException w:name="toc 7" w:semiHidden="1" w:uiPriority="39" w:unhideWhenUsed="1"/>
+    <w:lsdException w:name="toc 8" w:semiHidden="1" w:uiPriority="39" w:unhideWhenUsed="1"/>
+    <w:lsdException w:name="toc 9" w:semiHidden="1" w:uiPriority="39" w:unhideWhenUsed="1"/>
+    <w:lsdException w:name="Normal Indent" w:semiHidden="1" w:unhideWhenUsed="1"/>
+    <w:lsdException w:name="footnote text" w:semiHidden="1" w:unhideWhenUsed="1"/>
+    <w:lsdException w:name="annotation text" w:semiHidden="1" w:unhideWhenUsed="1"/>
+    <w:lsdException w:name="header" w:semiHidden="1" w:unhideWhenUsed="1"/>
+    <w:lsdException w:name="footer" w:semiHidden="1" w:unhideWhenUsed="1"/>
+    <w:lsdException w:name="index heading" w:semiHidden="1" w:unhideWhenUsed="1"/>
+    <w:lsdException w:name="caption" w:uiPriority="35" w:qFormat="1"/>
+    <w:lsdException w:name="table of figures" w:semiHidden="1" w:unhideWhenUsed="1"/>
+    <w:lsdException w:name="envelope address" w:semiHidden="1" w:unhideWhenUsed="1"/>
+    <w:lsdException w:name="envelope return" w:semiHidden="1" w:unhideWhenUsed="1"/>
+    <w:lsdException w:name="footnote reference" w:semiHidden="1" w:unhideWhenUsed="1"/>
+    <w:lsdException w:name="annotation reference" w:semiHidden="1" w:unhideWhenUsed="1"/>
+    <w:lsdException w:name="line number" w:semiHidden="1" w:unhideWhenUsed="1"/>
+    <w:lsdException w:name="page number" w:semiHidden="1" w:unhideWhenUsed="1"/>
+    <w:lsdException w:name="endnote reference" w:semiHidden="1" w:unhideWhenUsed="1"/>
+    <w:lsdException w:name="endnote text" w:semiHidden="1" w:unhideWhenUsed="1"/>
+    <w:lsdException w:name="table of authorities" w:semiHidden="1" w:unhideWhenUsed="1"/>
+    <w:lsdException w:name="macro" w:semiHidden="1" w:unhideWhenUsed="1"/>
+    <w:lsdException w:name="toa heading" w:semiHidden="1" w:unhideWhenUsed="1"/>
+    <w:lsdException w:name="List" w:semiHidden="1" w:unhideWhenUsed="1"/>
+    <w:lsdException w:name="List Bullet" w:semiHidden="1" w:unhideWhenUsed="1"/>
+    <w:lsdException w:name="List Number" w:semiHidden="1" w:unhideWhenUsed="1"/>
+    <w:lsdException w:name="List 2" w:semiHidden="1" w:unhideWhenUsed="1"/>
+    <w:lsdException w:name="List 3" w:semiHidden="1" w:unhideWhenUsed="1"/>
+    <w:lsdException w:name="List 4" w:semiHidden="1" w:unhideWhenUsed="1"/>
+    <w:lsdException w:name="List 5" w:semiHidden="1" w:unhideWhenUsed="1"/>
+    <w:lsdException w:name="List Bullet 2" w:semiHidden="1" w:unhideWhenUsed="1"/>
+    <w:lsdException w:name="List Bullet 3" w:semiHidden="1" w:unhideWhenUsed="1"/>
+    <w:lsdException w:name="List Bullet 4" w:semiHidden="1" w:unhideWhenUsed="1"/>
+    <w:lsdException w:name="List Bullet 5" w:semiHidden="1" w:unhideWhenUsed="1"/>
+    <w:lsdException w:name="List Number 2" w:semiHidden="1" w:unhideWhenUsed="1"/>
+    <w:lsdException w:name="List Number 3" w:semiHidden="1" w:unhideWhenUsed="1"/>
+    <w:lsdException w:name="List Number 4" w:semiHidden="1" w:unhideWhenUsed="1"/>
+    <w:lsdException w:name="List Number 5" w:semiHidden="1" w:unhideWhenUsed="1"/>
+    <w:lsdException w:name="Title" w:uiPriority="10" w:qFormat="1"/>
+    <w:lsdException w:name="Closing" w:semiHidden="1" w:unhideWhenUsed="1"/>
+    <w:lsdException w:name="Signature" w:semiHidden="1" w:unhideWhenUsed="1"/>
+    <w:lsdException w:name="Default Paragraph Font" w:semiHidden="1" w:uiPriority="1" w:unhideWhenUsed="1"/>
+    <w:lsdException w:name="Body Text" w:semiHidden="1" w:unhideWhenUsed="1"/>
+    <w:lsdException w:name="Body Text Indent" w:semiHidden="1" w:unhideWhenUsed="1"/>
+    <w:lsdException w:name="List Continue" w:semiHidden="1" w:unhideWhenUsed="1"/>
+    <w:lsdException w:name="List Continue 2" w:semiHidden="1" w:unhideWhenUsed="1"/>
+    <w:lsdException w:name="List Continue 3" w:semiHidden="1" w:unhideWhenUsed="1"/>
+    <w:lsdException w:name="List Continue 4" w:semiHidden="1" w:unhideWhenUsed="1"/>
+    <w:lsdException w:name="List Continue 5" w:semiHidden="1" w:unhideWhenUsed="1"/>
+    <w:lsdException w:name="Message Header" w:semiHidden="1" w:unhideWhenUsed="1"/>
+    <w:lsdException w:name="Subtitle" w:uiPriority="11" w:qFormat="1"/>
+    <w:lsdException w:name="Salutation" w:semiHidden="1" w:unhideWhenUsed="1"/>
+    <w:lsdException w:name="Date" w:semiHidden="1" w:unhideWhenUsed="1"/>
+    <w:lsdException w:name="Body Text First Indent" w:semiHidden="1" w:unhideWhenUsed="1"/>
+    <w:lsdException w:name="Body Text First Indent 2" w:semiHidden="1" w:unhideWhenUsed="1"/>
+    <w:lsdException w:name="Note Heading" w:semiHidden="1" w:unhideWhenUsed="1"/>
+    <w:lsdException w:name="Body Text 2" w:semiHidden="1" w:unhideWhenUsed="1"/>
+    <w:lsdException w:name="Body Text 3" w:semiHidden="1" w:unhideWhenUsed="1"/>
+    <w:lsdException w:name="Body Text Indent 2" w:semiHidden="1" w:unhideWhenUsed="1"/>
+    <w:lsdException w:name="Body Text Indent 3" w:semiHidden="1" w:unhideWhenUsed="1"/>
+    <w:lsdException w:name="Block Text" w:semiHidden="1" w:unhideWhenUsed="1"/>
+    <w:lsdException w:name="Hyperlink" w:semiHidden="1" w:unhideWhenUsed="1"/>
+    <w:lsdException w:name="FollowedHyperlink" w:semiHidden="1" w:unhideWhenUsed="1"/>
+    <w:lsdException w:name="Strong" w:uiPriority="22" w:qFormat="1"/>
+    <w:lsdException w:name="Emphasis" w:uiPriority="20" w:qFormat="1"/>
+    <w:lsdException w:name="Document Map" w:semiHidden="1" w:unhideWhenUsed="1"/>
+    <w:lsdException w:name="Plain Text" w:semiHidden="1" w:unhideWhenUsed="1"/>
+    <w:lsdException w:name="E-mail Signature" w:semiHidden="1" w:unhideWhenUsed="1"/>
+    <w:lsdException w:name="HTML Top of Form" w:semiHidden="1" w:unhideWhenUsed="1"/>
+    <w:lsdException w:name="HTML Bottom of Form" w:semiHidden="1" w:unhideWhenUsed="1"/>
+    <w:lsdException w:name="Normal (Web)" w:semiHidden="1" w:unhideWhenUsed="1"/>
+    <w:lsdException w:name="HTML Acronym" w:semiHidden="1" w:unhideWhenUsed="1"/>
+    <w:lsdException w:name="HTML Address" w:semiHidden="1" w:unhideWhenUsed="1"/>
+    <w:lsdException w:name="HTML Cite" w:semiHidden="1" w:unhideWhenUsed="1"/>
+    <w:lsdException w:name="HTML Code" w:semiHidden="1" w:unhideWhenUsed="1"/>
+    <w:lsdException w:name="HTML Definition" w:semiHidden="1" w:unhideWhenUsed="1"/>
+    <w:lsdException w:name="HTML Keyboard" w:semiHidden="1" w:unhideWhenUsed="1"/>
+    <w:lsdException w:name="HTML Preformatted" w:semiHidden="1" w:unhideWhenUsed="1"/>
+    <w:lsdException w:name="HTML Sample" w:semiHidden="1" w:unhideWhenUsed="1"/>
+    <w:lsdException w:name="HTML Typewriter" w:semiHidden="1" w:unhideWhenUsed="1"/>
+    <w:lsdException w:name="HTML Variable" w:semiHidden="1" w:unhideWhenUsed="1"/>
+    <w:lsdException w:name="Normal Table" w:semiHidden="1" w:unhideWhenUsed="1"/>
+    <w:lsdException w:name="annotation subject" w:semiHidden="1" w:unhideWhenUsed="1"/>
+    <w:lsdException w:name="No List" w:semiHidden="1" w:unhideWhenUsed="1"/>
+    <w:lsdException w:name="Outline List 1" w:semiHidden="1" w:unhideWhenUsed="1"/>
+    <w:lsdException w:name="Outline List 2" w:semiHidden="1" w:unhideWhenUsed="1"/>
+    <w:lsdException w:name="Outline List 3" w:semiHidden="1" w:unhideWhenUsed="1"/>
+    <w:lsdException w:name="Table Simple 1" w:semiHidden="1" w:unhideWhenUsed="1"/>
+    <w:lsdException w:name="Table Simple 2" w:semiHidden="1" w:unhideWhenUsed="1"/>
+    <w:lsdException w:name="Table Simple 3" w:semiHidden="1" w:unhideWhenUsed="1"/>
+    <w:lsdException w:name="Table Classic 1" w:semiHidden="1" w:unhideWhenUsed="1"/>
+    <w:lsdException w:name="Table Classic 2" w:semiHidden="1" w:unhideWhenUsed="1"/>
+    <w:lsdException w:name="Table Classic 3" w:semiHidden="1" w:unhideWhenUsed="1"/>
+    <w:lsdException w:name="Table Classic 4" w:semiHidden="1" w:unhideWhenUsed="1"/>
+    <w:lsdException w:name="Table Colorful 1" w:semiHidden="1" w:unhideWhenUsed="1"/>
+    <w:lsdException w:name="Table Colorful 2" w:semiHidden="1" w:unhideWhenUsed="1"/>
+    <w:lsdException w:name="Table Colorful 3" w:semiHidden="1" w:unhideWhenUsed="1"/>
+    <w:lsdException w:name="Table Columns 1" w:semiHidden="1" w:unhideWhenUsed="1"/>
+    <w:lsdException w:name="Table Columns 2" w:semiHidden="1" w:unhideWhenUsed="1"/>
+    <w:lsdException w:name="Table Columns 3" w:semiHidden="1" w:unhideWhenUsed="1"/>
+    <w:lsdException w:name="Table Columns 4" w:semiHidden="1" w:unhideWhenUsed="1"/>
+    <w:lsdException w:name="Table Columns 5" w:semiHidden="1" w:unhideWhenUsed="1"/>
+    <w:lsdException w:name="Table Grid 1" w:semiHidden="1" w:unhideWhenUsed="1"/>
+    <w:lsdException w:name="Table Grid 2" w:semiHidden="1" w:unhideWhenUsed="1"/>
+    <w:lsdException w:name="Table Grid 3" w:semiHidden="1" w:unhideWhenUsed="1"/>
+    <w:lsdException w:name="Table Grid 4" w:semiHidden="1" w:unhideWhenUsed="1"/>
+    <w:lsdException w:name="Table Grid 5" w:semiHidden="1" w:unhideWhenUsed="1"/>
+    <w:lsdException w:name="Table Grid 6" w:semiHidden="1" w:unhideWhenUsed="1"/>
+    <w:lsdException w:name="Table Grid 7" w:semiHidden="1" w:unhideWhenUsed="1"/>
+    <w:lsdException w:name="Table Grid 8" w:semiHidden="1" w:unhideWhenUsed="1"/>
+    <w:lsdException w:name="Table List 1" w:semiHidden="1" w:unhideWhenUsed="1"/>
+    <w:lsdException w:name="Table List 2" w:semiHidden="1" w:unhideWhenUsed="1"/>
+    <w:lsdException w:name="Table List 3" w:semiHidden="1" w:unhideWhenUsed="1"/>
+    <w:lsdException w:name="Table List 4" w:semiHidden="1" w:unhideWhenUsed="1"/>
+    <w:lsdException w:name="Table List 5" w:semiHidden="1" w:unhideWhenUsed="1"/>
+    <w:lsdException w:name="Table List 6" w:semiHidden="1" w:unhideWhenUsed="1"/>
+    <w:lsdException w:name="Table List 7" w:semiHidden="1" w:unhideWhenUsed="1"/>
+    <w:lsdException w:name="Table List 8" w:semiHidden="1" w:unhideWhenUsed="1"/>
+    <w:lsdException w:name="Table 3D effects 1" w:semiHidden="1" w:unhideWhenUsed="1"/>
+    <w:lsdException w:name="Table 3D effects 2" w:semiHidden="1" w:unhideWhenUsed="1"/>
+    <w:lsdException w:name="Table 3D effects 3" w:semiHidden="1" w:unhideWhenUsed="1"/>
+    <w:lsdException w:name="Table Contemporary" w:semiHidden="1" w:unhideWhenUsed="1"/>
+    <w:lsdException w:name="Table Elegant" w:semiHidden="1" w:unhideWhenUsed="1"/>
+    <w:lsdException w:name="Table Professional" w:semiHidden="1" w:unhideWhenUsed="1"/>
+    <w:lsdException w:name="Table Subtle 1" w:semiHidden="1" w:unhideWhenUsed="1"/>
+    <w:lsdException w:name="Table Subtle 2" w:semiHidden="1" w:unhideWhenUsed="1"/>
+    <w:lsdException w:name="Table Web 1" w:semiHidden="1" w:unhideWhenUsed="1"/>
+    <w:lsdException w:name="Table Web 2" w:semiHidden="1" w:unhideWhenUsed="1"/>
+    <w:lsdException w:name="Table Web 3" w:semiHidden="1" w:unhideWhenUsed="1"/>
+    <w:lsdException w:name="Balloon Text" w:semiHidden="1" w:unhideWhenUsed="1"/>
+    <w:lsdException w:name="Table Grid" w:uiPriority="59"/>
+    <w:lsdException w:name="Table Theme" w:semiHidden="1" w:unhideWhenUsed="1"/>
+    <w:lsdException w:name="Placeholder Text" w:semiHidden="1"/>
+    <w:lsdException w:name="No Spacing" w:uiPriority="1" w:qFormat="1"/>
+    <w:lsdException w:name="Light Shading" w:uiPriority="60"/>
+    <w:lsdException w:name="Light List" w:uiPriority="61"/>
+    <w:lsdException w:name="Light Grid" w:uiPriority="62"/>
+    <w:lsdException w:name="Medium Shading 1" w:uiPriority="63"/>
+    <w:lsdException w:name="Medium Shading 2" w:uiPriority="64"/>
+    <w:lsdException w:name="Medium List 1" w:uiPriority="65"/>
+    <w:lsdException w:name="Medium List 2" w:uiPriority="66"/>
+    <w:lsdException w:name="Medium Grid 1" w:uiPriority="67"/>
+    <w:lsdException w:name="Medium Grid 2" w:uiPriority="68"/>
+    <w:lsdException w:name="Medium Grid 3" w:uiPriority="69"/>
+    <w:lsdException w:name="Dark List" w:uiPriority="70"/>
+    <w:lsdException w:name="Colorful Shading" w:uiPriority="71"/>
+    <w:lsdException w:name="Colorful List" w:uiPriority="72"/>
+    <w:lsdException w:name="Colorful Grid" w:uiPriority="73"/>
+    <w:lsdException w:name="Light Shading Accent 1" w:uiPriority="60"/>
+    <w:lsdException w:name="Light List Accent 1" w:uiPriority="61"/>
+    <w:lsdException w:name="Light Grid Accent 1" w:uiPriority="62"/>
+    <w:lsdException w:name="Medium Shading 1 Accent 1" w:uiPriority="63"/>
+    <w:lsdException w:name="Medium Shading 2 Accent 1" w:uiPriority="64"/>
+    <w:lsdException w:name="Medium List 1 Accent 1" w:uiPriority="65"/>
+    <w:lsdException w:name="Revision" w:semiHidden="1"/>
+    <w:lsdException w:name="List Paragraph" w:uiPriority="34" w:qFormat="1"/>
+    <w:lsdException w:name="Quote" w:uiPriority="29" w:qFormat="1"/>
+    <w:lsdException w:name="Intense Quote" w:uiPriority="30" w:qFormat="1"/>
+    <w:lsdException w:name="Medium List 2 Accent 1" w:uiPriority="66"/>
+    <w:lsdException w:name="Medium Grid 1 Accent 1" w:uiPriority="67"/>
+    <w:lsdException w:name="Medium Grid 2 Accent 1" w:uiPriority="68"/>
+    <w:lsdException w:name="Medium Grid 3 Accent 1" w:uiPriority="69"/>
+    <w:lsdException w:name="Dark List Accent 1" w:uiPriority="70"/>
+    <w:lsdException w:name="Colorful Shading Accent 1" w:uiPriority="71"/>
+    <w:lsdException w:name="Colorful List Accent 1" w:uiPriority="72"/>
+    <w:lsdException w:name="Colorful Grid Accent 1" w:uiPriority="73"/>
+    <w:lsdException w:name="Light Shading Accent 2" w:uiPriority="60"/>
+    <w:lsdException w:name="Light List Accent 2" w:uiPriority="61"/>
+    <w:lsdException w:name="Light Grid Accent 2" w:uiPriority="62"/>
+    <w:lsdException w:name="Medium Shading 1 Accent 2" w:uiPriority="63"/>
+    <w:lsdException w:name="Medium Shading 2 Accent 2" w:uiPriority="64"/>
+    <w:lsdException w:name="Medium List 1 Accent 2" w:uiPriority="65"/>
+    <w:lsdException w:name="Medium List 2 Accent 2" w:uiPriority="66"/>
+    <w:lsdException w:name="Medium Grid 1 Accent 2" w:uiPriority="67"/>
+    <w:lsdException w:name="Medium Grid 2 Accent 2" w:uiPriority="68"/>
+    <w:lsdException w:name="Medium Grid 3 Accent 2" w:uiPriority="69"/>
+    <w:lsdException w:name="Dark List Accent 2" w:uiPriority="70"/>
+    <w:lsdException w:name="Colorful Shading Accent 2" w:uiPriority="71"/>
+    <w:lsdException w:name="Colorful List Accent 2" w:uiPriority="72"/>
+    <w:lsdException w:name="Colorful Grid Accent 2" w:uiPriority="73"/>
+    <w:lsdException w:name="Light Shading Accent 3" w:uiPriority="60"/>
+    <w:lsdException w:name="Light List Accent 3" w:uiPriority="61"/>
+    <w:lsdException w:name="Light Grid Accent 3" w:uiPriority="62"/>
+    <w:lsdException w:name="Medium Shading 1 Accent 3" w:uiPriority="63"/>
+    <w:lsdException w:name="Medium Shading 2 Accent 3" w:uiPriority="64"/>
+    <w:lsdException w:name="Medium List 1 Accent 3" w:uiPriority="65"/>
+    <w:lsdException w:name="Medium List 2 Accent 3" w:uiPriority="66"/>
+    <w:lsdException w:name="Medium Grid 1 Accent 3" w:uiPriority="67"/>
+    <w:lsdException w:name="Medium Grid 2 Accent 3" w:uiPriority="68"/>
+    <w:lsdException w:name="Medium Grid 3 Accent 3" w:uiPriority="69"/>
+    <w:lsdException w:name="Dark List Accent 3" w:uiPriority="70"/>
+    <w:lsdException w:name="Colorful Shading Accent 3" w:uiPriority="71"/>
+    <w:lsdException w:name="Colorful List Accent 3" w:uiPriority="72"/>
+    <w:lsdException w:name="Colorful Grid Accent 3" w:uiPriority="73"/>
+    <w:lsdException w:name="Light Shading Accent 4" w:uiPriority="60"/>
+    <w:lsdException w:name="Light List Accent 4" w:uiPriority="61"/>
+    <w:lsdException w:name="Light Grid Accent 4" w:uiPriority="62"/>
+    <w:lsdException w:name="Medium Shading 1 Accent 4" w:uiPriority="63"/>
+    <w:lsdException w:name="Medium Shading 2 Accent 4" w:uiPriority="64"/>
+    <w:lsdException w:name="Medium List 1 Accent 4" w:uiPriority="65"/>
+    <w:lsdException w:name="Medium List 2 Accent 4" w:uiPriority="66"/>
+    <w:lsdException w:name="Medium Grid 1 Accent 4" w:uiPriority="67"/>
+    <w:lsdException w:name="Medium Grid 2 Accent 4" w:uiPriority="68"/>
+    <w:lsdException w:name="Medium Grid 3 Accent 4" w:uiPriority="69"/>
+    <w:lsdException w:name="Dark List Accent 4" w:uiPriority="70"/>
+    <w:lsdException w:name="Colorful Shading Accent 4" w:uiPriority="71"/>
+    <w:lsdException w:name="Colorful List Accent 4" w:uiPriority="72"/>
+    <w:lsdException w:name="Colorful Grid Accent 4" w:uiPriority="73"/>
+    <w:lsdException w:name="Light Shading Accent 5" w:uiPriority="60"/>
+    <w:lsdException w:name="Light List Accent 5" w:uiPriority="61"/>
+    <w:lsdException w:name="Light Grid Accent 5" w:uiPriority="62"/>
+    <w:lsdException w:name="Medium Shading 1 Accent 5" w:uiPriority="63"/>
+    <w:lsdException w:name="Medium Shading 2 Accent 5" w:uiPriority="64"/>
+    <w:lsdException w:name="Medium List 1 Accent 5" w:uiPriority="65"/>
+    <w:lsdException w:name="Medium List 2 Accent 5" w:uiPriority="66"/>
+    <w:lsdException w:name="Medium Grid 1 Accent 5" w:uiPriority="67"/>
+    <w:lsdException w:name="Medium Grid 2 Accent 5" w:uiPriority="68"/>
+    <w:lsdException w:name="Medium Grid 3 Accent 5" w:uiPriority="69"/>
+    <w:lsdException w:name="Dark List Accent 5" w:uiPriority="70"/>
+    <w:lsdException w:name="Colorful Shading Accent 5" w:uiPriority="71"/>
+    <w:lsdException w:name="Colorful List Accent 5" w:uiPriority="72"/>
+    <w:lsdException w:name="Colorful Grid Accent 5" w:uiPriority="73"/>
+    <w:lsdException w:name="Light Shading Accent 6" w:uiPriority="60"/>
+    <w:lsdException w:name="Light List Accent 6" w:uiPriority="61"/>
+    <w:lsdException w:name="Light Grid Accent 6" w:uiPriority="62"/>
+    <w:lsdException w:name="Medium Shading 1 Accent 6" w:uiPriority="63"/>
+    <w:lsdException w:name="Medium Shading 2 Accent 6" w:uiPriority="64"/>
+    <w:lsdException w:name="Medium List 1 Accent 6" w:uiPriority="65"/>
+    <w:lsdException w:name="Medium List 2 Accent 6" w:uiPriority="66"/>
+    <w:lsdException w:name="Medium Grid 1 Accent 6" w:uiPriority="67"/>
+    <w:lsdException w:name="Medium Grid 2 Accent 6" w:uiPriority="68"/>
+    <w:lsdException w:name="Medium Grid 3 Accent 6" w:uiPriority="69"/>
+    <w:lsdException w:name="Dark List Accent 6" w:uiPriority="70"/>
+    <w:lsdException w:name="Colorful Shading Accent 6" w:uiPriority="71"/>
+    <w:lsdException w:name="Colorful List Accent 6" w:uiPriority="72"/>
+    <w:lsdException w:name="Colorful Grid Accent 6" w:uiPriority="73"/>
+    <w:lsdException w:name="Subtle Emphasis" w:uiPriority="19" w:qFormat="1"/>
+    <w:lsdException w:name="Intense Emphasis" w:uiPriority="21" w:qFormat="1"/>
+    <w:lsdException w:name="Subtle Reference" w:uiPriority="31" w:qFormat="1"/>
+    <w:lsdException w:name="Intense Reference" w:uiPriority="32" w:qFormat="1"/>
+    <w:lsdException w:name="Book Title" w:uiPriority="33" w:qFormat="1"/>
+    <w:lsdException w:name="Bibliography" w:semiHidden="1" w:uiPriority="37" w:unhideWhenUsed="1"/>
+    <w:lsdException w:name="TOC Heading" w:semiHidden="1" w:uiPriority="39" w:unhideWhenUsed="1" w:qFormat="1"/>
+    <w:lsdException w:name="Plain Table 5" w:semiHidden="1" w:unhideWhenUsed="1"/>
+    <w:lsdException w:name="Grid Table Light" w:semiHidden="1" w:unhideWhenUsed="1"/>
+    <w:lsdException w:name="Grid Table 1 Light" w:semiHidden="1" w:unhideWhenUsed="1"/>
+    <w:lsdException w:name="Grid Table 2" w:semiHidden="1" w:unhideWhenUsed="1"/>
+    <w:lsdException w:name="Grid Table 3" w:semiHidden="1" w:unhideWhenUsed="1"/>
+    <w:lsdException w:name="Grid Table 4" w:uiPriority="49"/>
+    <w:lsdException w:name="Grid Table 5 Dark" w:uiPriority="50"/>
+    <w:lsdException w:name="Grid Table 6 Colorful" w:uiPriority="51"/>
+    <w:lsdException w:name="Grid Table 7 Colorful" w:uiPriority="52"/>
+    <w:lsdException w:name="Grid Table 1 Light Accent 1" w:uiPriority="46"/>
+    <w:lsdException w:name="Grid Table 2 Accent 1" w:uiPriority="47"/>
+    <w:lsdException w:name="Grid Table 3 Accent 1" w:uiPriority="48"/>
+    <w:lsdException w:name="Grid Table 4 Accent 1" w:uiPriority="49"/>
+    <w:lsdException w:name="Grid Table 5 Dark Accent 1" w:uiPriority="50"/>
+    <w:lsdException w:name="Grid Table 6 Colorful Accent 1" w:uiPriority="51"/>
+    <w:lsdException w:name="Grid Table 7 Colorful Accent 1" w:uiPriority="52"/>
+    <w:lsdException w:name="Grid Table 1 Light Accent 2" w:uiPriority="46"/>
+    <w:lsdException w:name="Grid Table 2 Accent 2" w:uiPriority="47"/>
+    <w:lsdException w:name="Grid Table 3 Accent 2" w:uiPriority="48"/>
+    <w:lsdException w:name="Grid Table 4 Accent 2" w:uiPriority="49"/>
+    <w:lsdException w:name="Grid Table 5 Dark Accent 2" w:uiPriority="50"/>
+    <w:lsdException w:name="Grid Table 6 Colorful Accent 2" w:uiPriority="51"/>
+    <w:lsdException w:name="Grid Table 7 Colorful Accent 2" w:uiPriority="52"/>
+    <w:lsdException w:name="Grid Table 1 Light Accent 3" w:uiPriority="46"/>
+    <w:lsdException w:name="Grid Table 2 Accent 3" w:uiPriority="47"/>
+    <w:lsdException w:name="Grid Table 3 Accent 3" w:uiPriority="48"/>
+    <w:lsdException w:name="Grid Table 4 Accent 3" w:uiPriority="49"/>
+    <w:lsdException w:name="Grid Table 5 Dark Accent 3" w:uiPriority="50"/>
+    <w:lsdException w:name="Grid Table 6 Colorful Accent 3" w:uiPriority="51"/>
+    <w:lsdException w:name="Grid Table 7 Colorful Accent 3" w:uiPriority="52"/>
+    <w:lsdException w:name="Grid Table 1 Light Accent 4" w:uiPriority="46"/>
+    <w:lsdException w:name="Grid Table 2 Accent 4" w:uiPriority="47"/>
+    <w:lsdException w:name="Grid Table 3 Accent 4" w:uiPriority="48"/>
+    <w:lsdException w:name="Grid Table 4 Accent 4" w:uiPriority="49"/>
+    <w:lsdException w:name="Grid Table 5 Dark Accent 4" w:uiPriority="50"/>
+    <w:lsdException w:name="Grid Table 6 Colorful Accent 4" w:uiPriority="51"/>
+    <w:lsdException w:name="Grid Table 7 Colorful Accent 4" w:uiPriority="52"/>
+    <w:lsdException w:name="Grid Table 1 Light Accent 5" w:uiPriority="46"/>
+    <w:lsdException w:name="Grid Table 2 Accent 5" w:uiPriority="47"/>
+    <w:lsdException w:name="Grid Table 3 Accent 5" w:uiPriority="48"/>
+    <w:lsdException w:name="Grid Table 4 Accent 5" w:uiPriority="49"/>
+    <w:lsdException w:name="Grid Table 5 Dark Accent 5" w:uiPriority="50"/>
+    <w:lsdException w:name="Grid Table 6 Colorful Accent 5" w:uiPriority="51"/>
+    <w:lsdException w:name="Grid Table 7 Colorful Accent 5" w:uiPriority="52"/>
+    <w:lsdException w:name="Grid Table 1 Light Accent 6" w:uiPriority="46"/>
+    <w:lsdException w:name="Grid Table 2 Accent 6" w:uiPriority="47"/>
+    <w:lsdException w:name="Grid Table 3 Accent 6" w:uiPriority="48"/>
+    <w:lsdException w:name="Grid Table 4 Accent 6" w:uiPriority="49"/>
+    <w:lsdException w:name="Grid Table 5 Dark Accent 6" w:uiPriority="50"/>
+    <w:lsdException w:name="Grid Table 6 Colorful Accent 6" w:uiPriority="51"/>
+    <w:lsdException w:name="Grid Table 7 Colorful Accent 6" w:uiPriority="52"/>
+    <w:lsdException w:name="List Table 1 Light" w:uiPriority="46"/>
+    <w:lsdException w:name="List Table 2" w:uiPriority="47"/>
+    <w:lsdException w:name="List Table 3" w:uiPriority="48"/>
+    <w:lsdException w:name="List Table 4" w:uiPriority="49"/>
+    <w:lsdException w:name="List Table 5 Dark" w:uiPriority="50"/>
+    <w:lsdException w:name="List Table 6 Colorful" w:uiPriority="51"/>
+    <w:lsdException w:name="List Table 7 Colorful" w:uiPriority="52"/>
+    <w:lsdException w:name="List Table 1 Light Accent 1" w:uiPriority="46"/>
+    <w:lsdException w:name="List Table 2 Accent 1" w:uiPriority="47"/>
+    <w:lsdException w:name="List Table 3 Accent 1" w:uiPriority="48"/>
+    <w:lsdException w:name="List Table 4 Accent 1" w:uiPriority="49"/>
+    <w:lsdException w:name="List Table 5 Dark Accent 1" w:uiPriority="50"/>
+    <w:lsdException w:name="List Table 6 Colorful Accent 1" w:uiPriority="51"/>
+    <w:lsdException w:name="List Table 7 Colorful Accent 1" w:uiPriority="52"/>
+    <w:lsdException w:name="List Table 1 Light Accent 2" w:uiPriority="46"/>
+    <w:lsdException w:name="List Table 2 Accent 2" w:uiPriority="47"/>
+    <w:lsdException w:name="List Table 3 Accent 2" w:uiPriority="48"/>
+    <w:lsdException w:name="List Table 4 Accent 2" w:uiPriority="49"/>
+    <w:lsdException w:name="List Table 5 Dark Accent 2" w:uiPriority="50"/>
+    <w:lsdException w:name="List Table 6 Colorful Accent 2" w:uiPriority="51"/>
+    <w:lsdException w:name="List Table 7 Colorful Accent 2" w:uiPriority="52"/>
+    <w:lsdException w:name="List Table 1 Light Accent 3" w:uiPriority="46"/>
+    <w:lsdException w:name="List Table 2 Accent 3" w:uiPriority="47"/>
+    <w:lsdException w:name="List Table 3 Accent 3" w:uiPriority="48"/>
+    <w:lsdException w:name="List Table 4 Accent 3" w:uiPriority="49"/>
+    <w:lsdException w:name="List Table 5 Dark Accent 3" w:uiPriority="50"/>
+    <w:lsdException w:name="List Table 6 Colorful Accent 3" w:uiPriority="51"/>
+    <w:lsdException w:name="List Table 7 Colorful Accent 3" w:uiPriority="52"/>
+    <w:lsdException w:name="List Table 1 Light Accent 4" w:uiPriority="46"/>
+    <w:lsdException w:name="List Table 2 Accent 4" w:uiPriority="47"/>
+    <w:lsdException w:name="List Table 3 Accent 4" w:uiPriority="48"/>
+    <w:lsdException w:name="List Table 4 Accent 4" w:uiPriority="49"/>
+    <w:lsdException w:name="List Table 5 Dark Accent 4" w:uiPriority="50"/>
+    <w:lsdException w:name="List Table 6 Colorful Accent 4" w:uiPriority="51"/>
+    <w:lsdException w:name="List Table 7 Colorful Accent 4" w:uiPriority="52"/>
+    <w:lsdException w:name="List Table 1 Light Accent 5" w:uiPriority="46"/>
+    <w:lsdException w:name="List Table 2 Accent 5" w:uiPriority="47"/>
+    <w:lsdException w:name="List Table 3 Accent 5" w:uiPriority="48"/>
+    <w:lsdException w:name="List Table 4 Accent 5" w:uiPriority="49"/>
+    <w:lsdException w:name="List Table 5 Dark Accent 5" w:uiPriority="50"/>
+    <w:lsdException w:name="List Table 6 Colorful Accent 5" w:uiPriority="51"/>
+    <w:lsdException w:name="List Table 7 Colorful Accent 5" w:uiPriority="52"/>
+    <w:lsdException w:name="List Table 1 Light Accent 6" w:uiPriority="46"/>
+    <w:lsdException w:name="List Table 2 Accent 6" w:uiPriority="47"/>
+    <w:lsdException w:name="List Table 3 Accent 6" w:uiPriority="48"/>
+    <w:lsdException w:name="List Table 4 Accent 6" w:uiPriority="49"/>
+    <w:lsdException w:name="List Table 5 Dark Accent 6" w:uiPriority="50"/>
+    <w:lsdException w:name="List Table 6 Colorful Accent 6" w:uiPriority="51"/>
+    <w:lsdException w:name="List Table 7 Colorful Accent 6" w:uiPriority="52"/>
+    <w:lsdException w:name="Mention" w:semiHidden="1" w:unhideWhenUsed="1"/>
+    <w:lsdException w:name="Smart Hyperlink" w:semiHidden="1" w:unhideWhenUsed="1"/>
+    <w:lsdException w:name="Hashtag" w:semiHidden="1" w:unhideWhenUsed="1"/>
+    <w:lsdException w:name="Unresolved Mention" w:semiHidden="1" w:unhideWhenUsed="1"/>
+    <w:lsdException w:name="Smart Link" w:semiHidden="1" w:unhideWhenUsed="1"/>
   </w:latentStyles>
   <w:style w:type="paragraph" w:default="1" w:styleId="Normal">
     <w:name w:val="Normal"/>
@@ -18423,7 +18650,7 @@
       <w:bCs/>
     </w:rPr>
   </w:style>
-  <w:style w:type="character" w:styleId="Marquedannotation">
+  <w:style w:type="character" w:styleId="Marquedecommentaire">
     <w:name w:val="annotation reference"/>
     <w:uiPriority w:val="99"/>
     <w:rPr>
@@ -18569,7 +18796,7 @@
       <w:szCs w:val="16"/>
     </w:rPr>
   </w:style>
-  <w:style w:type="paragraph" w:styleId="Explorateurdedocument">
+  <w:style w:type="paragraph" w:styleId="Explorateurdedocuments">
     <w:name w:val="Document Map"/>
     <w:basedOn w:val="Normal"/>
     <w:rPr>
@@ -18615,7 +18842,7 @@
       <w:lang w:val="fr-FR" w:eastAsia="ar-SA"/>
     </w:rPr>
   </w:style>
-  <w:style w:type="character" w:styleId="Marquenotebasdepage">
+  <w:style w:type="character" w:styleId="Appelnotedebasdep">
     <w:name w:val="footnote reference"/>
     <w:uiPriority w:val="99"/>
     <w:unhideWhenUsed/>
@@ -18682,1204 +18909,7 @@
     <w:basedOn w:val="Policepardfaut"/>
     <w:rsid w:val="0063015F"/>
   </w:style>
-  <w:style w:type="character" w:styleId="Lienhypertextesuivi">
-    <w:name w:val="FollowedHyperlink"/>
-    <w:basedOn w:val="Policepardfaut"/>
-    <w:uiPriority w:val="99"/>
-    <w:semiHidden/>
-    <w:unhideWhenUsed/>
-    <w:rsid w:val="008020FE"/>
-    <w:rPr>
-      <w:color w:val="954F72" w:themeColor="followedHyperlink"/>
-      <w:u w:val="single"/>
-    </w:rPr>
-  </w:style>
-</w:styles>
-</file>
-
-<file path=word/stylesWithEffects.xml><?xml version="1.0" encoding="utf-8"?>
-<w:styles xmlns:wpc="http://schemas.microsoft.com/office/word/2010/wordprocessingCanvas" xmlns:mo="http://schemas.microsoft.com/office/mac/office/2008/main" xmlns:mc="http://schemas.openxmlformats.org/markup-compatibility/2006" xmlns:mv="urn:schemas-microsoft-com:mac:vml" xmlns:o="urn:schemas-microsoft-com:office:office" xmlns:r="http://schemas.openxmlformats.org/officeDocument/2006/relationships" xmlns:m="http://schemas.openxmlformats.org/officeDocument/2006/math" xmlns:v="urn:schemas-microsoft-com:vml" xmlns:wp14="http://schemas.microsoft.com/office/word/2010/wordprocessingDrawing" xmlns:wp="http://schemas.openxmlformats.org/drawingml/2006/wordprocessingDrawing" xmlns:w10="urn:schemas-microsoft-com:office:word" xmlns:w="http://schemas.openxmlformats.org/wordprocessingml/2006/main" xmlns:w14="http://schemas.microsoft.com/office/word/2010/wordml" xmlns:wpg="http://schemas.microsoft.com/office/word/2010/wordprocessingGroup" xmlns:wpi="http://schemas.microsoft.com/office/word/2010/wordprocessingInk" xmlns:wne="http://schemas.microsoft.com/office/word/2006/wordml" xmlns:wps="http://schemas.microsoft.com/office/word/2010/wordprocessingShape" mc:Ignorable="w14 wp14">
-  <w:docDefaults>
-    <w:rPrDefault>
-      <w:rPr>
-        <w:rFonts w:ascii="Times New Roman" w:eastAsia="Times New Roman" w:hAnsi="Times New Roman" w:cs="Times New Roman"/>
-        <w:lang w:val="uz-Cyrl-UZ" w:eastAsia="en-GB" w:bidi="ar-SA"/>
-      </w:rPr>
-    </w:rPrDefault>
-    <w:pPrDefault/>
-  </w:docDefaults>
-  <w:latentStyles w:defLockedState="0" w:defUIPriority="99" w:defSemiHidden="1" w:defUnhideWhenUsed="1" w:defQFormat="0" w:count="276">
-    <w:lsdException w:name="Normal" w:semiHidden="0" w:uiPriority="0" w:unhideWhenUsed="0" w:qFormat="1"/>
-    <w:lsdException w:name="heading 1" w:semiHidden="0" w:uiPriority="9" w:unhideWhenUsed="0" w:qFormat="1"/>
-    <w:lsdException w:name="heading 2" w:uiPriority="9" w:qFormat="1"/>
-    <w:lsdException w:name="heading 3" w:uiPriority="9" w:qFormat="1"/>
-    <w:lsdException w:name="heading 4" w:uiPriority="9" w:qFormat="1"/>
-    <w:lsdException w:name="heading 5" w:uiPriority="9" w:qFormat="1"/>
-    <w:lsdException w:name="heading 6" w:uiPriority="9" w:qFormat="1"/>
-    <w:lsdException w:name="heading 7" w:uiPriority="9" w:qFormat="1"/>
-    <w:lsdException w:name="heading 8" w:uiPriority="9" w:qFormat="1"/>
-    <w:lsdException w:name="heading 9" w:uiPriority="9" w:qFormat="1"/>
-    <w:lsdException w:name="toc 1" w:uiPriority="39"/>
-    <w:lsdException w:name="toc 2" w:uiPriority="39"/>
-    <w:lsdException w:name="toc 3" w:uiPriority="39"/>
-    <w:lsdException w:name="toc 4" w:uiPriority="39"/>
-    <w:lsdException w:name="toc 5" w:uiPriority="39"/>
-    <w:lsdException w:name="toc 6" w:uiPriority="39"/>
-    <w:lsdException w:name="toc 7" w:uiPriority="39"/>
-    <w:lsdException w:name="toc 8" w:uiPriority="39"/>
-    <w:lsdException w:name="toc 9" w:uiPriority="39"/>
-    <w:lsdException w:name="caption" w:semiHidden="0" w:uiPriority="35" w:unhideWhenUsed="0" w:qFormat="1"/>
-    <w:lsdException w:name="Title" w:semiHidden="0" w:uiPriority="10" w:unhideWhenUsed="0" w:qFormat="1"/>
-    <w:lsdException w:name="Default Paragraph Font" w:uiPriority="1"/>
-    <w:lsdException w:name="Subtitle" w:semiHidden="0" w:uiPriority="11" w:unhideWhenUsed="0" w:qFormat="1"/>
-    <w:lsdException w:name="Strong" w:semiHidden="0" w:uiPriority="22" w:unhideWhenUsed="0" w:qFormat="1"/>
-    <w:lsdException w:name="Emphasis" w:semiHidden="0" w:uiPriority="20" w:unhideWhenUsed="0" w:qFormat="1"/>
-    <w:lsdException w:name="Table Grid" w:semiHidden="0" w:uiPriority="59" w:unhideWhenUsed="0"/>
-    <w:lsdException w:name="Note Level 1" w:semiHidden="0" w:unhideWhenUsed="0"/>
-    <w:lsdException w:name="Note Level 2" w:semiHidden="0" w:unhideWhenUsed="0"/>
-    <w:lsdException w:name="Note Level 3" w:semiHidden="0" w:unhideWhenUsed="0"/>
-    <w:lsdException w:name="Note Level 4" w:semiHidden="0" w:unhideWhenUsed="0"/>
-    <w:lsdException w:name="Note Level 5" w:semiHidden="0" w:unhideWhenUsed="0"/>
-    <w:lsdException w:name="Note Level 6" w:semiHidden="0" w:unhideWhenUsed="0"/>
-    <w:lsdException w:name="Note Level 7" w:semiHidden="0" w:unhideWhenUsed="0"/>
-    <w:lsdException w:name="Note Level 8" w:semiHidden="0" w:unhideWhenUsed="0"/>
-    <w:lsdException w:name="Note Level 9" w:semiHidden="0" w:unhideWhenUsed="0"/>
-    <w:lsdException w:name="Placeholder Text" w:unhideWhenUsed="0"/>
-    <w:lsdException w:name="No Spacing" w:semiHidden="0" w:uiPriority="1" w:unhideWhenUsed="0" w:qFormat="1"/>
-    <w:lsdException w:name="Light Shading" w:semiHidden="0" w:uiPriority="60" w:unhideWhenUsed="0"/>
-    <w:lsdException w:name="Light List" w:semiHidden="0" w:uiPriority="61" w:unhideWhenUsed="0"/>
-    <w:lsdException w:name="Light Grid" w:semiHidden="0" w:uiPriority="62" w:unhideWhenUsed="0"/>
-    <w:lsdException w:name="Medium Shading 1" w:semiHidden="0" w:uiPriority="63" w:unhideWhenUsed="0"/>
-    <w:lsdException w:name="Medium Shading 2" w:semiHidden="0" w:uiPriority="64" w:unhideWhenUsed="0"/>
-    <w:lsdException w:name="Medium List 1" w:semiHidden="0" w:uiPriority="65" w:unhideWhenUsed="0"/>
-    <w:lsdException w:name="Medium List 2" w:semiHidden="0" w:uiPriority="66" w:unhideWhenUsed="0"/>
-    <w:lsdException w:name="Medium Grid 1" w:semiHidden="0" w:uiPriority="67" w:unhideWhenUsed="0"/>
-    <w:lsdException w:name="Medium Grid 2" w:semiHidden="0" w:uiPriority="68" w:unhideWhenUsed="0"/>
-    <w:lsdException w:name="Medium Grid 3" w:semiHidden="0" w:uiPriority="69" w:unhideWhenUsed="0"/>
-    <w:lsdException w:name="Dark List" w:semiHidden="0" w:uiPriority="70" w:unhideWhenUsed="0"/>
-    <w:lsdException w:name="Colorful Shading" w:semiHidden="0" w:uiPriority="71" w:unhideWhenUsed="0"/>
-    <w:lsdException w:name="Colorful List" w:semiHidden="0" w:uiPriority="72" w:unhideWhenUsed="0"/>
-    <w:lsdException w:name="Colorful Grid" w:semiHidden="0" w:uiPriority="73" w:unhideWhenUsed="0"/>
-    <w:lsdException w:name="Light Shading Accent 1" w:semiHidden="0" w:uiPriority="60" w:unhideWhenUsed="0"/>
-    <w:lsdException w:name="Light List Accent 1" w:semiHidden="0" w:uiPriority="61" w:unhideWhenUsed="0"/>
-    <w:lsdException w:name="Light Grid Accent 1" w:semiHidden="0" w:uiPriority="62" w:unhideWhenUsed="0"/>
-    <w:lsdException w:name="Medium Shading 1 Accent 1" w:semiHidden="0" w:uiPriority="63" w:unhideWhenUsed="0"/>
-    <w:lsdException w:name="Medium Shading 2 Accent 1" w:semiHidden="0" w:uiPriority="64" w:unhideWhenUsed="0"/>
-    <w:lsdException w:name="Medium List 1 Accent 1" w:semiHidden="0" w:uiPriority="65" w:unhideWhenUsed="0"/>
-    <w:lsdException w:name="Revision" w:unhideWhenUsed="0"/>
-    <w:lsdException w:name="List Paragraph" w:semiHidden="0" w:uiPriority="34" w:unhideWhenUsed="0" w:qFormat="1"/>
-    <w:lsdException w:name="Quote" w:semiHidden="0" w:uiPriority="29" w:unhideWhenUsed="0" w:qFormat="1"/>
-    <w:lsdException w:name="Intense Quote" w:semiHidden="0" w:uiPriority="30" w:unhideWhenUsed="0" w:qFormat="1"/>
-    <w:lsdException w:name="Medium List 2 Accent 1" w:semiHidden="0" w:uiPriority="66" w:unhideWhenUsed="0"/>
-    <w:lsdException w:name="Medium Grid 1 Accent 1" w:semiHidden="0" w:uiPriority="67" w:unhideWhenUsed="0"/>
-    <w:lsdException w:name="Medium Grid 2 Accent 1" w:semiHidden="0" w:uiPriority="68" w:unhideWhenUsed="0"/>
-    <w:lsdException w:name="Medium Grid 3 Accent 1" w:semiHidden="0" w:uiPriority="69" w:unhideWhenUsed="0"/>
-    <w:lsdException w:name="Dark List Accent 1" w:semiHidden="0" w:uiPriority="70" w:unhideWhenUsed="0"/>
-    <w:lsdException w:name="Colorful Shading Accent 1" w:semiHidden="0" w:uiPriority="71" w:unhideWhenUsed="0"/>
-    <w:lsdException w:name="Colorful List Accent 1" w:semiHidden="0" w:uiPriority="72" w:unhideWhenUsed="0"/>
-    <w:lsdException w:name="Colorful Grid Accent 1" w:semiHidden="0" w:uiPriority="73" w:unhideWhenUsed="0"/>
-    <w:lsdException w:name="Light Shading Accent 2" w:semiHidden="0" w:uiPriority="60" w:unhideWhenUsed="0"/>
-    <w:lsdException w:name="Light List Accent 2" w:semiHidden="0" w:uiPriority="61" w:unhideWhenUsed="0"/>
-    <w:lsdException w:name="Light Grid Accent 2" w:semiHidden="0" w:uiPriority="62" w:unhideWhenUsed="0"/>
-    <w:lsdException w:name="Medium Shading 1 Accent 2" w:semiHidden="0" w:uiPriority="63" w:unhideWhenUsed="0"/>
-    <w:lsdException w:name="Medium Shading 2 Accent 2" w:semiHidden="0" w:uiPriority="64" w:unhideWhenUsed="0"/>
-    <w:lsdException w:name="Medium List 1 Accent 2" w:semiHidden="0" w:uiPriority="65" w:unhideWhenUsed="0"/>
-    <w:lsdException w:name="Medium List 2 Accent 2" w:semiHidden="0" w:uiPriority="66" w:unhideWhenUsed="0"/>
-    <w:lsdException w:name="Medium Grid 1 Accent 2" w:semiHidden="0" w:uiPriority="67" w:unhideWhenUsed="0"/>
-    <w:lsdException w:name="Medium Grid 2 Accent 2" w:semiHidden="0" w:uiPriority="68" w:unhideWhenUsed="0"/>
-    <w:lsdException w:name="Medium Grid 3 Accent 2" w:semiHidden="0" w:uiPriority="69" w:unhideWhenUsed="0"/>
-    <w:lsdException w:name="Dark List Accent 2" w:semiHidden="0" w:uiPriority="70" w:unhideWhenUsed="0"/>
-    <w:lsdException w:name="Colorful Shading Accent 2" w:semiHidden="0" w:uiPriority="71" w:unhideWhenUsed="0"/>
-    <w:lsdException w:name="Colorful List Accent 2" w:semiHidden="0" w:uiPriority="72" w:unhideWhenUsed="0"/>
-    <w:lsdException w:name="Colorful Grid Accent 2" w:semiHidden="0" w:uiPriority="73" w:unhideWhenUsed="0"/>
-    <w:lsdException w:name="Light Shading Accent 3" w:semiHidden="0" w:uiPriority="60" w:unhideWhenUsed="0"/>
-    <w:lsdException w:name="Light List Accent 3" w:semiHidden="0" w:uiPriority="61" w:unhideWhenUsed="0"/>
-    <w:lsdException w:name="Light Grid Accent 3" w:semiHidden="0" w:uiPriority="62" w:unhideWhenUsed="0"/>
-    <w:lsdException w:name="Medium Shading 1 Accent 3" w:semiHidden="0" w:uiPriority="63" w:unhideWhenUsed="0"/>
-    <w:lsdException w:name="Medium Shading 2 Accent 3" w:semiHidden="0" w:uiPriority="64" w:unhideWhenUsed="0"/>
-    <w:lsdException w:name="Medium List 1 Accent 3" w:semiHidden="0" w:uiPriority="65" w:unhideWhenUsed="0"/>
-    <w:lsdException w:name="Medium List 2 Accent 3" w:semiHidden="0" w:uiPriority="66" w:unhideWhenUsed="0"/>
-    <w:lsdException w:name="Medium Grid 1 Accent 3" w:semiHidden="0" w:uiPriority="67" w:unhideWhenUsed="0"/>
-    <w:lsdException w:name="Medium Grid 2 Accent 3" w:semiHidden="0" w:uiPriority="68" w:unhideWhenUsed="0"/>
-    <w:lsdException w:name="Medium Grid 3 Accent 3" w:semiHidden="0" w:uiPriority="69" w:unhideWhenUsed="0"/>
-    <w:lsdException w:name="Dark List Accent 3" w:semiHidden="0" w:uiPriority="70" w:unhideWhenUsed="0"/>
-    <w:lsdException w:name="Colorful Shading Accent 3" w:semiHidden="0" w:uiPriority="71" w:unhideWhenUsed="0"/>
-    <w:lsdException w:name="Colorful List Accent 3" w:semiHidden="0" w:uiPriority="72" w:unhideWhenUsed="0"/>
-    <w:lsdException w:name="Colorful Grid Accent 3" w:semiHidden="0" w:uiPriority="73" w:unhideWhenUsed="0"/>
-    <w:lsdException w:name="Light Shading Accent 4" w:semiHidden="0" w:uiPriority="60" w:unhideWhenUsed="0"/>
-    <w:lsdException w:name="Light List Accent 4" w:semiHidden="0" w:uiPriority="61" w:unhideWhenUsed="0"/>
-    <w:lsdException w:name="Light Grid Accent 4" w:semiHidden="0" w:uiPriority="62" w:unhideWhenUsed="0"/>
-    <w:lsdException w:name="Medium Shading 1 Accent 4" w:semiHidden="0" w:uiPriority="63" w:unhideWhenUsed="0"/>
-    <w:lsdException w:name="Medium Shading 2 Accent 4" w:semiHidden="0" w:uiPriority="64" w:unhideWhenUsed="0"/>
-    <w:lsdException w:name="Medium List 1 Accent 4" w:semiHidden="0" w:uiPriority="65" w:unhideWhenUsed="0"/>
-    <w:lsdException w:name="Medium List 2 Accent 4" w:semiHidden="0" w:uiPriority="66" w:unhideWhenUsed="0"/>
-    <w:lsdException w:name="Medium Grid 1 Accent 4" w:semiHidden="0" w:uiPriority="67" w:unhideWhenUsed="0"/>
-    <w:lsdException w:name="Medium Grid 2 Accent 4" w:semiHidden="0" w:uiPriority="68" w:unhideWhenUsed="0"/>
-    <w:lsdException w:name="Medium Grid 3 Accent 4" w:semiHidden="0" w:uiPriority="69" w:unhideWhenUsed="0"/>
-    <w:lsdException w:name="Dark List Accent 4" w:semiHidden="0" w:uiPriority="70" w:unhideWhenUsed="0"/>
-    <w:lsdException w:name="Colorful Shading Accent 4" w:semiHidden="0" w:uiPriority="71" w:unhideWhenUsed="0"/>
-    <w:lsdException w:name="Colorful List Accent 4" w:semiHidden="0" w:uiPriority="72" w:unhideWhenUsed="0"/>
-    <w:lsdException w:name="Colorful Grid Accent 4" w:semiHidden="0" w:uiPriority="73" w:unhideWhenUsed="0"/>
-    <w:lsdException w:name="Light Shading Accent 5" w:semiHidden="0" w:uiPriority="60" w:unhideWhenUsed="0"/>
-    <w:lsdException w:name="Light List Accent 5" w:semiHidden="0" w:uiPriority="61" w:unhideWhenUsed="0"/>
-    <w:lsdException w:name="Light Grid Accent 5" w:semiHidden="0" w:uiPriority="62" w:unhideWhenUsed="0"/>
-    <w:lsdException w:name="Medium Shading 1 Accent 5" w:semiHidden="0" w:uiPriority="63" w:unhideWhenUsed="0"/>
-    <w:lsdException w:name="Medium Shading 2 Accent 5" w:semiHidden="0" w:uiPriority="64" w:unhideWhenUsed="0"/>
-    <w:lsdException w:name="Medium List 1 Accent 5" w:semiHidden="0" w:uiPriority="65" w:unhideWhenUsed="0"/>
-    <w:lsdException w:name="Medium List 2 Accent 5" w:semiHidden="0" w:uiPriority="66" w:unhideWhenUsed="0"/>
-    <w:lsdException w:name="Medium Grid 1 Accent 5" w:semiHidden="0" w:uiPriority="67" w:unhideWhenUsed="0"/>
-    <w:lsdException w:name="Medium Grid 2 Accent 5" w:semiHidden="0" w:uiPriority="68" w:unhideWhenUsed="0"/>
-    <w:lsdException w:name="Medium Grid 3 Accent 5" w:semiHidden="0" w:uiPriority="69" w:unhideWhenUsed="0"/>
-    <w:lsdException w:name="Dark List Accent 5" w:semiHidden="0" w:uiPriority="70" w:unhideWhenUsed="0"/>
-    <w:lsdException w:name="Colorful Shading Accent 5" w:semiHidden="0" w:uiPriority="71" w:unhideWhenUsed="0"/>
-    <w:lsdException w:name="Colorful List Accent 5" w:semiHidden="0" w:uiPriority="72" w:unhideWhenUsed="0"/>
-    <w:lsdException w:name="Colorful Grid Accent 5" w:semiHidden="0" w:uiPriority="73" w:unhideWhenUsed="0"/>
-    <w:lsdException w:name="Light Shading Accent 6" w:semiHidden="0" w:uiPriority="60" w:unhideWhenUsed="0"/>
-    <w:lsdException w:name="Light List Accent 6" w:semiHidden="0" w:uiPriority="61" w:unhideWhenUsed="0"/>
-    <w:lsdException w:name="Light Grid Accent 6" w:semiHidden="0" w:uiPriority="62" w:unhideWhenUsed="0"/>
-    <w:lsdException w:name="Medium Shading 1 Accent 6" w:semiHidden="0" w:uiPriority="63" w:unhideWhenUsed="0"/>
-    <w:lsdException w:name="Medium Shading 2 Accent 6" w:semiHidden="0" w:uiPriority="64" w:unhideWhenUsed="0"/>
-    <w:lsdException w:name="Medium List 1 Accent 6" w:semiHidden="0" w:uiPriority="65" w:unhideWhenUsed="0"/>
-    <w:lsdException w:name="Medium List 2 Accent 6" w:semiHidden="0" w:uiPriority="66" w:unhideWhenUsed="0"/>
-    <w:lsdException w:name="Medium Grid 1 Accent 6" w:semiHidden="0" w:uiPriority="67" w:unhideWhenUsed="0"/>
-    <w:lsdException w:name="Medium Grid 2 Accent 6" w:semiHidden="0" w:uiPriority="68" w:unhideWhenUsed="0"/>
-    <w:lsdException w:name="Medium Grid 3 Accent 6" w:semiHidden="0" w:uiPriority="69" w:unhideWhenUsed="0"/>
-    <w:lsdException w:name="Dark List Accent 6" w:semiHidden="0" w:uiPriority="70" w:unhideWhenUsed="0"/>
-    <w:lsdException w:name="Colorful Shading Accent 6" w:semiHidden="0" w:uiPriority="71" w:unhideWhenUsed="0"/>
-    <w:lsdException w:name="Colorful List Accent 6" w:semiHidden="0" w:uiPriority="72" w:unhideWhenUsed="0"/>
-    <w:lsdException w:name="Colorful Grid Accent 6" w:semiHidden="0" w:uiPriority="73" w:unhideWhenUsed="0"/>
-    <w:lsdException w:name="Subtle Emphasis" w:semiHidden="0" w:uiPriority="19" w:unhideWhenUsed="0" w:qFormat="1"/>
-    <w:lsdException w:name="Intense Emphasis" w:semiHidden="0" w:uiPriority="21" w:unhideWhenUsed="0" w:qFormat="1"/>
-    <w:lsdException w:name="Subtle Reference" w:semiHidden="0" w:uiPriority="31" w:unhideWhenUsed="0" w:qFormat="1"/>
-    <w:lsdException w:name="Intense Reference" w:semiHidden="0" w:uiPriority="32" w:unhideWhenUsed="0" w:qFormat="1"/>
-    <w:lsdException w:name="Book Title" w:semiHidden="0" w:uiPriority="33" w:unhideWhenUsed="0" w:qFormat="1"/>
-    <w:lsdException w:name="Bibliography" w:uiPriority="37"/>
-    <w:lsdException w:name="TOC Heading" w:uiPriority="39" w:qFormat="1"/>
-  </w:latentStyles>
-  <w:style w:type="paragraph" w:default="1" w:styleId="Normal">
-    <w:name w:val="Normal"/>
-    <w:qFormat/>
-    <w:pPr>
-      <w:suppressAutoHyphens/>
-    </w:pPr>
-    <w:rPr>
-      <w:sz w:val="24"/>
-      <w:szCs w:val="24"/>
-      <w:lang w:val="fr-FR" w:eastAsia="ar-SA"/>
-    </w:rPr>
-  </w:style>
-  <w:style w:type="character" w:default="1" w:styleId="Policepardfaut">
-    <w:name w:val="Default Paragraph Font"/>
-    <w:uiPriority w:val="1"/>
-    <w:semiHidden/>
-    <w:unhideWhenUsed/>
-  </w:style>
-  <w:style w:type="table" w:default="1" w:styleId="TableauNormal">
-    <w:name w:val="Normal Table"/>
-    <w:uiPriority w:val="99"/>
-    <w:semiHidden/>
-    <w:unhideWhenUsed/>
-    <w:tblPr>
-      <w:tblInd w:w="0" w:type="dxa"/>
-      <w:tblCellMar>
-        <w:top w:w="0" w:type="dxa"/>
-        <w:left w:w="108" w:type="dxa"/>
-        <w:bottom w:w="0" w:type="dxa"/>
-        <w:right w:w="108" w:type="dxa"/>
-      </w:tblCellMar>
-    </w:tblPr>
-  </w:style>
-  <w:style w:type="numbering" w:default="1" w:styleId="Aucuneliste">
-    <w:name w:val="No List"/>
-    <w:uiPriority w:val="99"/>
-    <w:semiHidden/>
-    <w:unhideWhenUsed/>
-  </w:style>
-  <w:style w:type="character" w:customStyle="1" w:styleId="WW8Num2z0">
-    <w:name w:val="WW8Num2z0"/>
-    <w:rPr>
-      <w:rFonts w:ascii="Wingdings" w:hAnsi="Wingdings"/>
-    </w:rPr>
-  </w:style>
-  <w:style w:type="character" w:customStyle="1" w:styleId="WW8Num3z0">
-    <w:name w:val="WW8Num3z0"/>
-    <w:rPr>
-      <w:rFonts w:ascii="Wingdings" w:hAnsi="Wingdings"/>
-    </w:rPr>
-  </w:style>
-  <w:style w:type="character" w:customStyle="1" w:styleId="WW8Num4z0">
-    <w:name w:val="WW8Num4z0"/>
-    <w:rPr>
-      <w:rFonts w:ascii="Symbol" w:hAnsi="Symbol"/>
-    </w:rPr>
-  </w:style>
-  <w:style w:type="character" w:customStyle="1" w:styleId="WW8Num5z0">
-    <w:name w:val="WW8Num5z0"/>
-    <w:rPr>
-      <w:rFonts w:ascii="Symbol" w:hAnsi="Symbol"/>
-    </w:rPr>
-  </w:style>
-  <w:style w:type="character" w:customStyle="1" w:styleId="WW8Num6z0">
-    <w:name w:val="WW8Num6z0"/>
-    <w:rPr>
-      <w:rFonts w:ascii="Symbol" w:hAnsi="Symbol"/>
-    </w:rPr>
-  </w:style>
-  <w:style w:type="character" w:customStyle="1" w:styleId="WW8Num7z0">
-    <w:name w:val="WW8Num7z0"/>
-    <w:rPr>
-      <w:rFonts w:ascii="Symbol" w:hAnsi="Symbol"/>
-    </w:rPr>
-  </w:style>
-  <w:style w:type="character" w:customStyle="1" w:styleId="WW8Num8z0">
-    <w:name w:val="WW8Num8z0"/>
-    <w:rPr>
-      <w:rFonts w:ascii="Symbol" w:hAnsi="Symbol"/>
-    </w:rPr>
-  </w:style>
-  <w:style w:type="character" w:customStyle="1" w:styleId="WW8Num9z0">
-    <w:name w:val="WW8Num9z0"/>
-    <w:rPr>
-      <w:rFonts w:ascii="Symbol" w:hAnsi="Symbol"/>
-    </w:rPr>
-  </w:style>
-  <w:style w:type="character" w:customStyle="1" w:styleId="WW8Num10z0">
-    <w:name w:val="WW8Num10z0"/>
-    <w:rPr>
-      <w:rFonts w:ascii="Symbol" w:hAnsi="Symbol"/>
-    </w:rPr>
-  </w:style>
-  <w:style w:type="character" w:customStyle="1" w:styleId="WW8Num11z0">
-    <w:name w:val="WW8Num11z0"/>
-    <w:rPr>
-      <w:rFonts w:ascii="Symbol" w:hAnsi="Symbol"/>
-    </w:rPr>
-  </w:style>
-  <w:style w:type="character" w:customStyle="1" w:styleId="WW8Num12z0">
-    <w:name w:val="WW8Num12z0"/>
-    <w:rPr>
-      <w:rFonts w:ascii="Wingdings" w:hAnsi="Wingdings"/>
-    </w:rPr>
-  </w:style>
-  <w:style w:type="character" w:customStyle="1" w:styleId="WW8Num13z0">
-    <w:name w:val="WW8Num13z0"/>
-    <w:rPr>
-      <w:rFonts w:ascii="Symbol" w:hAnsi="Symbol"/>
-    </w:rPr>
-  </w:style>
-  <w:style w:type="character" w:customStyle="1" w:styleId="WW8Num14z0">
-    <w:name w:val="WW8Num14z0"/>
-    <w:rPr>
-      <w:rFonts w:ascii="Symbol" w:hAnsi="Symbol"/>
-    </w:rPr>
-  </w:style>
-  <w:style w:type="character" w:customStyle="1" w:styleId="WW8Num15z0">
-    <w:name w:val="WW8Num15z0"/>
-    <w:rPr>
-      <w:rFonts w:ascii="Symbol" w:hAnsi="Symbol"/>
-    </w:rPr>
-  </w:style>
-  <w:style w:type="character" w:customStyle="1" w:styleId="WW8Num16z0">
-    <w:name w:val="WW8Num16z0"/>
-    <w:rPr>
-      <w:rFonts w:ascii="Symbol" w:hAnsi="Symbol"/>
-    </w:rPr>
-  </w:style>
-  <w:style w:type="character" w:customStyle="1" w:styleId="WW8Num18z0">
-    <w:name w:val="WW8Num18z0"/>
-    <w:rPr>
-      <w:rFonts w:ascii="Symbol" w:hAnsi="Symbol"/>
-    </w:rPr>
-  </w:style>
-  <w:style w:type="character" w:customStyle="1" w:styleId="WW8Num19z0">
-    <w:name w:val="WW8Num19z0"/>
-    <w:rPr>
-      <w:rFonts w:ascii="Wingdings" w:hAnsi="Wingdings"/>
-    </w:rPr>
-  </w:style>
-  <w:style w:type="character" w:customStyle="1" w:styleId="WW8Num21z0">
-    <w:name w:val="WW8Num21z0"/>
-    <w:rPr>
-      <w:rFonts w:ascii="Wingdings" w:hAnsi="Wingdings"/>
-    </w:rPr>
-  </w:style>
-  <w:style w:type="character" w:customStyle="1" w:styleId="WW8Num22z0">
-    <w:name w:val="WW8Num22z0"/>
-    <w:rPr>
-      <w:rFonts w:ascii="Symbol" w:hAnsi="Symbol"/>
-    </w:rPr>
-  </w:style>
-  <w:style w:type="character" w:customStyle="1" w:styleId="WW8Num23z0">
-    <w:name w:val="WW8Num23z0"/>
-    <w:rPr>
-      <w:rFonts w:ascii="Wingdings" w:hAnsi="Wingdings"/>
-    </w:rPr>
-  </w:style>
-  <w:style w:type="character" w:customStyle="1" w:styleId="WW8Num25z0">
-    <w:name w:val="WW8Num25z0"/>
-    <w:rPr>
-      <w:rFonts w:ascii="Wingdings" w:hAnsi="Wingdings"/>
-    </w:rPr>
-  </w:style>
-  <w:style w:type="character" w:customStyle="1" w:styleId="WW8Num26z0">
-    <w:name w:val="WW8Num26z0"/>
-    <w:rPr>
-      <w:rFonts w:ascii="Symbol" w:hAnsi="Symbol"/>
-    </w:rPr>
-  </w:style>
-  <w:style w:type="character" w:customStyle="1" w:styleId="WW8Num27z0">
-    <w:name w:val="WW8Num27z0"/>
-    <w:rPr>
-      <w:rFonts w:ascii="Wingdings" w:hAnsi="Wingdings"/>
-    </w:rPr>
-  </w:style>
-  <w:style w:type="character" w:customStyle="1" w:styleId="WW8Num28z0">
-    <w:name w:val="WW8Num28z0"/>
-    <w:rPr>
-      <w:rFonts w:ascii="Symbol" w:hAnsi="Symbol"/>
-    </w:rPr>
-  </w:style>
-  <w:style w:type="character" w:customStyle="1" w:styleId="WW8Num29z0">
-    <w:name w:val="WW8Num29z0"/>
-    <w:rPr>
-      <w:rFonts w:ascii="Wingdings" w:hAnsi="Wingdings"/>
-    </w:rPr>
-  </w:style>
-  <w:style w:type="character" w:customStyle="1" w:styleId="WW8Num30z0">
-    <w:name w:val="WW8Num30z0"/>
-    <w:rPr>
-      <w:rFonts w:ascii="Wingdings" w:hAnsi="Wingdings"/>
-    </w:rPr>
-  </w:style>
-  <w:style w:type="character" w:customStyle="1" w:styleId="WW8Num31z0">
-    <w:name w:val="WW8Num31z0"/>
-    <w:rPr>
-      <w:rFonts w:ascii="Symbol" w:hAnsi="Symbol"/>
-    </w:rPr>
-  </w:style>
-  <w:style w:type="character" w:customStyle="1" w:styleId="WW8Num32z0">
-    <w:name w:val="WW8Num32z0"/>
-    <w:rPr>
-      <w:rFonts w:ascii="Wingdings" w:hAnsi="Wingdings"/>
-    </w:rPr>
-  </w:style>
-  <w:style w:type="character" w:customStyle="1" w:styleId="Absatz-Standardschriftart">
-    <w:name w:val="Absatz-Standardschriftart"/>
-  </w:style>
-  <w:style w:type="character" w:customStyle="1" w:styleId="WW8Num1z0">
-    <w:name w:val="WW8Num1z0"/>
-    <w:rPr>
-      <w:rFonts w:ascii="Symbol" w:hAnsi="Symbol"/>
-    </w:rPr>
-  </w:style>
-  <w:style w:type="character" w:customStyle="1" w:styleId="WW8Num1z2">
-    <w:name w:val="WW8Num1z2"/>
-    <w:rPr>
-      <w:rFonts w:ascii="Courier New" w:hAnsi="Courier New"/>
-    </w:rPr>
-  </w:style>
-  <w:style w:type="character" w:customStyle="1" w:styleId="WW8Num1z3">
-    <w:name w:val="WW8Num1z3"/>
-    <w:rPr>
-      <w:rFonts w:ascii="Wingdings" w:hAnsi="Wingdings"/>
-    </w:rPr>
-  </w:style>
-  <w:style w:type="character" w:customStyle="1" w:styleId="WW8Num2z1">
-    <w:name w:val="WW8Num2z1"/>
-    <w:rPr>
-      <w:rFonts w:ascii="Wingdings" w:hAnsi="Wingdings"/>
-    </w:rPr>
-  </w:style>
-  <w:style w:type="character" w:customStyle="1" w:styleId="WW8Num3z1">
-    <w:name w:val="WW8Num3z1"/>
-    <w:rPr>
-      <w:rFonts w:ascii="Courier New" w:hAnsi="Courier New" w:cs="Courier New"/>
-    </w:rPr>
-  </w:style>
-  <w:style w:type="character" w:customStyle="1" w:styleId="WW8Num3z3">
-    <w:name w:val="WW8Num3z3"/>
-    <w:rPr>
-      <w:rFonts w:ascii="Symbol" w:hAnsi="Symbol"/>
-    </w:rPr>
-  </w:style>
-  <w:style w:type="character" w:customStyle="1" w:styleId="WW8Num4z1">
-    <w:name w:val="WW8Num4z1"/>
-    <w:rPr>
-      <w:rFonts w:ascii="Courier New" w:hAnsi="Courier New" w:cs="Courier New"/>
-    </w:rPr>
-  </w:style>
-  <w:style w:type="character" w:customStyle="1" w:styleId="WW8Num4z2">
-    <w:name w:val="WW8Num4z2"/>
-    <w:rPr>
-      <w:rFonts w:ascii="Wingdings" w:hAnsi="Wingdings"/>
-    </w:rPr>
-  </w:style>
-  <w:style w:type="character" w:customStyle="1" w:styleId="WW8Num5z1">
-    <w:name w:val="WW8Num5z1"/>
-    <w:rPr>
-      <w:rFonts w:ascii="Courier New" w:hAnsi="Courier New" w:cs="Courier New"/>
-    </w:rPr>
-  </w:style>
-  <w:style w:type="character" w:customStyle="1" w:styleId="WW8Num5z2">
-    <w:name w:val="WW8Num5z2"/>
-    <w:rPr>
-      <w:rFonts w:ascii="Wingdings" w:hAnsi="Wingdings"/>
-    </w:rPr>
-  </w:style>
-  <w:style w:type="character" w:customStyle="1" w:styleId="WW8Num6z1">
-    <w:name w:val="WW8Num6z1"/>
-    <w:rPr>
-      <w:rFonts w:ascii="Courier New" w:hAnsi="Courier New" w:cs="Courier New"/>
-    </w:rPr>
-  </w:style>
-  <w:style w:type="character" w:customStyle="1" w:styleId="WW8Num6z2">
-    <w:name w:val="WW8Num6z2"/>
-    <w:rPr>
-      <w:rFonts w:ascii="Wingdings" w:hAnsi="Wingdings"/>
-    </w:rPr>
-  </w:style>
-  <w:style w:type="character" w:customStyle="1" w:styleId="WW8Num7z1">
-    <w:name w:val="WW8Num7z1"/>
-    <w:rPr>
-      <w:rFonts w:ascii="Courier New" w:hAnsi="Courier New" w:cs="Courier New"/>
-    </w:rPr>
-  </w:style>
-  <w:style w:type="character" w:customStyle="1" w:styleId="WW8Num7z2">
-    <w:name w:val="WW8Num7z2"/>
-    <w:rPr>
-      <w:rFonts w:ascii="Wingdings" w:hAnsi="Wingdings"/>
-    </w:rPr>
-  </w:style>
-  <w:style w:type="character" w:customStyle="1" w:styleId="WW8Num8z1">
-    <w:name w:val="WW8Num8z1"/>
-    <w:rPr>
-      <w:rFonts w:ascii="Courier New" w:hAnsi="Courier New" w:cs="Courier New"/>
-    </w:rPr>
-  </w:style>
-  <w:style w:type="character" w:customStyle="1" w:styleId="WW8Num8z2">
-    <w:name w:val="WW8Num8z2"/>
-    <w:rPr>
-      <w:rFonts w:ascii="Wingdings" w:hAnsi="Wingdings"/>
-    </w:rPr>
-  </w:style>
-  <w:style w:type="character" w:customStyle="1" w:styleId="WW8Num9z1">
-    <w:name w:val="WW8Num9z1"/>
-    <w:rPr>
-      <w:rFonts w:ascii="Courier New" w:hAnsi="Courier New" w:cs="Courier New"/>
-    </w:rPr>
-  </w:style>
-  <w:style w:type="character" w:customStyle="1" w:styleId="WW8Num9z2">
-    <w:name w:val="WW8Num9z2"/>
-    <w:rPr>
-      <w:rFonts w:ascii="Wingdings" w:hAnsi="Wingdings"/>
-    </w:rPr>
-  </w:style>
-  <w:style w:type="character" w:customStyle="1" w:styleId="WW8Num10z1">
-    <w:name w:val="WW8Num10z1"/>
-    <w:rPr>
-      <w:rFonts w:ascii="Courier New" w:hAnsi="Courier New" w:cs="Courier New"/>
-    </w:rPr>
-  </w:style>
-  <w:style w:type="character" w:customStyle="1" w:styleId="WW8Num10z2">
-    <w:name w:val="WW8Num10z2"/>
-    <w:rPr>
-      <w:rFonts w:ascii="Wingdings" w:hAnsi="Wingdings"/>
-    </w:rPr>
-  </w:style>
-  <w:style w:type="character" w:customStyle="1" w:styleId="WW8Num11z1">
-    <w:name w:val="WW8Num11z1"/>
-    <w:rPr>
-      <w:rFonts w:ascii="Courier New" w:hAnsi="Courier New"/>
-    </w:rPr>
-  </w:style>
-  <w:style w:type="character" w:customStyle="1" w:styleId="WW8Num11z2">
-    <w:name w:val="WW8Num11z2"/>
-    <w:rPr>
-      <w:rFonts w:ascii="Wingdings" w:hAnsi="Wingdings"/>
-    </w:rPr>
-  </w:style>
-  <w:style w:type="character" w:customStyle="1" w:styleId="WW8Num12z1">
-    <w:name w:val="WW8Num12z1"/>
-    <w:rPr>
-      <w:rFonts w:ascii="Courier New" w:hAnsi="Courier New" w:cs="Courier New"/>
-    </w:rPr>
-  </w:style>
-  <w:style w:type="character" w:customStyle="1" w:styleId="WW8Num12z3">
-    <w:name w:val="WW8Num12z3"/>
-    <w:rPr>
-      <w:rFonts w:ascii="Symbol" w:hAnsi="Symbol"/>
-    </w:rPr>
-  </w:style>
-  <w:style w:type="character" w:customStyle="1" w:styleId="WW8Num13z1">
-    <w:name w:val="WW8Num13z1"/>
-    <w:rPr>
-      <w:rFonts w:ascii="Courier New" w:hAnsi="Courier New" w:cs="Courier New"/>
-    </w:rPr>
-  </w:style>
-  <w:style w:type="character" w:customStyle="1" w:styleId="WW8Num13z2">
-    <w:name w:val="WW8Num13z2"/>
-    <w:rPr>
-      <w:rFonts w:ascii="Wingdings" w:hAnsi="Wingdings"/>
-    </w:rPr>
-  </w:style>
-  <w:style w:type="character" w:customStyle="1" w:styleId="WW8Num14z1">
-    <w:name w:val="WW8Num14z1"/>
-    <w:rPr>
-      <w:rFonts w:ascii="Courier New" w:hAnsi="Courier New" w:cs="Courier New"/>
-    </w:rPr>
-  </w:style>
-  <w:style w:type="character" w:customStyle="1" w:styleId="WW8Num14z2">
-    <w:name w:val="WW8Num14z2"/>
-    <w:rPr>
-      <w:rFonts w:ascii="Wingdings" w:hAnsi="Wingdings"/>
-    </w:rPr>
-  </w:style>
-  <w:style w:type="character" w:customStyle="1" w:styleId="WW8Num15z1">
-    <w:name w:val="WW8Num15z1"/>
-    <w:rPr>
-      <w:rFonts w:ascii="Courier New" w:hAnsi="Courier New" w:cs="Courier New"/>
-    </w:rPr>
-  </w:style>
-  <w:style w:type="character" w:customStyle="1" w:styleId="WW8Num15z2">
-    <w:name w:val="WW8Num15z2"/>
-    <w:rPr>
-      <w:rFonts w:ascii="Wingdings" w:hAnsi="Wingdings"/>
-    </w:rPr>
-  </w:style>
-  <w:style w:type="character" w:customStyle="1" w:styleId="WW8Num16z1">
-    <w:name w:val="WW8Num16z1"/>
-    <w:rPr>
-      <w:rFonts w:ascii="Courier New" w:hAnsi="Courier New"/>
-    </w:rPr>
-  </w:style>
-  <w:style w:type="character" w:customStyle="1" w:styleId="WW8Num16z2">
-    <w:name w:val="WW8Num16z2"/>
-    <w:rPr>
-      <w:rFonts w:ascii="Wingdings" w:hAnsi="Wingdings"/>
-    </w:rPr>
-  </w:style>
-  <w:style w:type="character" w:customStyle="1" w:styleId="WW8Num17z0">
-    <w:name w:val="WW8Num17z0"/>
-    <w:rPr>
-      <w:rFonts w:ascii="Wingdings" w:hAnsi="Wingdings"/>
-    </w:rPr>
-  </w:style>
-  <w:style w:type="character" w:customStyle="1" w:styleId="WW8Num17z1">
-    <w:name w:val="WW8Num17z1"/>
-    <w:rPr>
-      <w:rFonts w:ascii="Courier New" w:hAnsi="Courier New" w:cs="Courier New"/>
-    </w:rPr>
-  </w:style>
-  <w:style w:type="character" w:customStyle="1" w:styleId="WW8Num17z3">
-    <w:name w:val="WW8Num17z3"/>
-    <w:rPr>
-      <w:rFonts w:ascii="Symbol" w:hAnsi="Symbol"/>
-    </w:rPr>
-  </w:style>
-  <w:style w:type="character" w:customStyle="1" w:styleId="WW8Num18z1">
-    <w:name w:val="WW8Num18z1"/>
-    <w:rPr>
-      <w:rFonts w:ascii="Courier New" w:hAnsi="Courier New" w:cs="Courier New"/>
-    </w:rPr>
-  </w:style>
-  <w:style w:type="character" w:customStyle="1" w:styleId="WW8Num18z2">
-    <w:name w:val="WW8Num18z2"/>
-    <w:rPr>
-      <w:rFonts w:ascii="Wingdings" w:hAnsi="Wingdings"/>
-    </w:rPr>
-  </w:style>
-  <w:style w:type="character" w:customStyle="1" w:styleId="WW8Num19z1">
-    <w:name w:val="WW8Num19z1"/>
-    <w:rPr>
-      <w:rFonts w:ascii="Courier New" w:hAnsi="Courier New" w:cs="Courier New"/>
-    </w:rPr>
-  </w:style>
-  <w:style w:type="character" w:customStyle="1" w:styleId="WW8Num19z2">
-    <w:name w:val="WW8Num19z2"/>
-    <w:rPr>
-      <w:rFonts w:ascii="Wingdings" w:hAnsi="Wingdings"/>
-    </w:rPr>
-  </w:style>
-  <w:style w:type="character" w:customStyle="1" w:styleId="WW8Num19z3">
-    <w:name w:val="WW8Num19z3"/>
-    <w:rPr>
-      <w:rFonts w:ascii="Symbol" w:hAnsi="Symbol"/>
-    </w:rPr>
-  </w:style>
-  <w:style w:type="character" w:customStyle="1" w:styleId="WW8Num20z0">
-    <w:name w:val="WW8Num20z0"/>
-    <w:rPr>
-      <w:rFonts w:ascii="Symbol" w:hAnsi="Symbol"/>
-    </w:rPr>
-  </w:style>
-  <w:style w:type="character" w:customStyle="1" w:styleId="WW8Num20z1">
-    <w:name w:val="WW8Num20z1"/>
-    <w:rPr>
-      <w:rFonts w:ascii="Courier New" w:hAnsi="Courier New" w:cs="Courier New"/>
-    </w:rPr>
-  </w:style>
-  <w:style w:type="character" w:customStyle="1" w:styleId="WW8Num20z2">
-    <w:name w:val="WW8Num20z2"/>
-    <w:rPr>
-      <w:rFonts w:ascii="Wingdings" w:hAnsi="Wingdings"/>
-    </w:rPr>
-  </w:style>
-  <w:style w:type="character" w:customStyle="1" w:styleId="WW8Num21z1">
-    <w:name w:val="WW8Num21z1"/>
-    <w:rPr>
-      <w:rFonts w:ascii="Courier New" w:hAnsi="Courier New"/>
-    </w:rPr>
-  </w:style>
-  <w:style w:type="character" w:customStyle="1" w:styleId="WW8Num21z3">
-    <w:name w:val="WW8Num21z3"/>
-    <w:rPr>
-      <w:rFonts w:ascii="Symbol" w:hAnsi="Symbol"/>
-    </w:rPr>
-  </w:style>
-  <w:style w:type="character" w:customStyle="1" w:styleId="WW8Num23z1">
-    <w:name w:val="WW8Num23z1"/>
-    <w:rPr>
-      <w:rFonts w:ascii="Courier New" w:hAnsi="Courier New" w:cs="Courier New"/>
-    </w:rPr>
-  </w:style>
-  <w:style w:type="character" w:customStyle="1" w:styleId="WW8Num23z3">
-    <w:name w:val="WW8Num23z3"/>
-    <w:rPr>
-      <w:rFonts w:ascii="Symbol" w:hAnsi="Symbol"/>
-    </w:rPr>
-  </w:style>
-  <w:style w:type="character" w:customStyle="1" w:styleId="WW8Num24z1">
-    <w:name w:val="WW8Num24z1"/>
-    <w:rPr>
-      <w:rFonts w:ascii="Courier New" w:hAnsi="Courier New" w:cs="Courier New"/>
-    </w:rPr>
-  </w:style>
-  <w:style w:type="character" w:customStyle="1" w:styleId="WW8Num24z2">
-    <w:name w:val="WW8Num24z2"/>
-    <w:rPr>
-      <w:rFonts w:ascii="Wingdings" w:hAnsi="Wingdings"/>
-    </w:rPr>
-  </w:style>
-  <w:style w:type="character" w:customStyle="1" w:styleId="WW8Num24z3">
-    <w:name w:val="WW8Num24z3"/>
-    <w:rPr>
-      <w:rFonts w:ascii="Symbol" w:hAnsi="Symbol"/>
-    </w:rPr>
-  </w:style>
-  <w:style w:type="character" w:customStyle="1" w:styleId="WW8Num25z1">
-    <w:name w:val="WW8Num25z1"/>
-    <w:rPr>
-      <w:rFonts w:ascii="Courier New" w:hAnsi="Courier New" w:cs="Courier New"/>
-    </w:rPr>
-  </w:style>
-  <w:style w:type="character" w:customStyle="1" w:styleId="WW8Num25z3">
-    <w:name w:val="WW8Num25z3"/>
-    <w:rPr>
-      <w:rFonts w:ascii="Symbol" w:hAnsi="Symbol"/>
-    </w:rPr>
-  </w:style>
-  <w:style w:type="character" w:customStyle="1" w:styleId="WW8Num26z1">
-    <w:name w:val="WW8Num26z1"/>
-    <w:rPr>
-      <w:rFonts w:ascii="Courier New" w:hAnsi="Courier New" w:cs="Courier New"/>
-    </w:rPr>
-  </w:style>
-  <w:style w:type="character" w:customStyle="1" w:styleId="WW8Num26z2">
-    <w:name w:val="WW8Num26z2"/>
-    <w:rPr>
-      <w:rFonts w:ascii="Wingdings" w:hAnsi="Wingdings"/>
-    </w:rPr>
-  </w:style>
-  <w:style w:type="character" w:customStyle="1" w:styleId="WW8Num27z1">
-    <w:name w:val="WW8Num27z1"/>
-    <w:rPr>
-      <w:rFonts w:ascii="Courier New" w:hAnsi="Courier New" w:cs="Courier New"/>
-    </w:rPr>
-  </w:style>
-  <w:style w:type="character" w:customStyle="1" w:styleId="WW8Num27z3">
-    <w:name w:val="WW8Num27z3"/>
-    <w:rPr>
-      <w:rFonts w:ascii="Symbol" w:hAnsi="Symbol"/>
-    </w:rPr>
-  </w:style>
-  <w:style w:type="character" w:customStyle="1" w:styleId="WW8Num28z1">
-    <w:name w:val="WW8Num28z1"/>
-    <w:rPr>
-      <w:rFonts w:ascii="Courier New" w:hAnsi="Courier New" w:cs="Courier New"/>
-    </w:rPr>
-  </w:style>
-  <w:style w:type="character" w:customStyle="1" w:styleId="WW8Num28z2">
-    <w:name w:val="WW8Num28z2"/>
-    <w:rPr>
-      <w:rFonts w:ascii="Wingdings" w:hAnsi="Wingdings"/>
-    </w:rPr>
-  </w:style>
-  <w:style w:type="character" w:customStyle="1" w:styleId="WW8Num30z1">
-    <w:name w:val="WW8Num30z1"/>
-    <w:rPr>
-      <w:rFonts w:ascii="Courier New" w:hAnsi="Courier New" w:cs="Courier New"/>
-    </w:rPr>
-  </w:style>
-  <w:style w:type="character" w:customStyle="1" w:styleId="WW8Num30z3">
-    <w:name w:val="WW8Num30z3"/>
-    <w:rPr>
-      <w:rFonts w:ascii="Symbol" w:hAnsi="Symbol"/>
-    </w:rPr>
-  </w:style>
-  <w:style w:type="character" w:customStyle="1" w:styleId="WW8Num31z1">
-    <w:name w:val="WW8Num31z1"/>
-    <w:rPr>
-      <w:rFonts w:ascii="Courier New" w:hAnsi="Courier New" w:cs="Courier New"/>
-    </w:rPr>
-  </w:style>
-  <w:style w:type="character" w:customStyle="1" w:styleId="WW8Num31z2">
-    <w:name w:val="WW8Num31z2"/>
-    <w:rPr>
-      <w:rFonts w:ascii="Wingdings" w:hAnsi="Wingdings"/>
-    </w:rPr>
-  </w:style>
-  <w:style w:type="character" w:customStyle="1" w:styleId="WW8Num32z1">
-    <w:name w:val="WW8Num32z1"/>
-    <w:rPr>
-      <w:rFonts w:ascii="Courier New" w:hAnsi="Courier New" w:cs="Courier New"/>
-    </w:rPr>
-  </w:style>
-  <w:style w:type="character" w:customStyle="1" w:styleId="WW8Num32z3">
-    <w:name w:val="WW8Num32z3"/>
-    <w:rPr>
-      <w:rFonts w:ascii="Symbol" w:hAnsi="Symbol"/>
-    </w:rPr>
-  </w:style>
-  <w:style w:type="character" w:customStyle="1" w:styleId="WW8Num33z0">
-    <w:name w:val="WW8Num33z0"/>
-    <w:rPr>
-      <w:rFonts w:ascii="Wingdings" w:hAnsi="Wingdings"/>
-    </w:rPr>
-  </w:style>
-  <w:style w:type="character" w:customStyle="1" w:styleId="WW8Num33z1">
-    <w:name w:val="WW8Num33z1"/>
-    <w:rPr>
-      <w:rFonts w:ascii="Courier New" w:hAnsi="Courier New" w:cs="Courier New"/>
-    </w:rPr>
-  </w:style>
-  <w:style w:type="character" w:customStyle="1" w:styleId="WW8Num33z3">
-    <w:name w:val="WW8Num33z3"/>
-    <w:rPr>
-      <w:rFonts w:ascii="Symbol" w:hAnsi="Symbol"/>
-    </w:rPr>
-  </w:style>
-  <w:style w:type="character" w:customStyle="1" w:styleId="WW8Num34z0">
-    <w:name w:val="WW8Num34z0"/>
-    <w:rPr>
-      <w:rFonts w:ascii="Symbol" w:hAnsi="Symbol"/>
-    </w:rPr>
-  </w:style>
-  <w:style w:type="character" w:customStyle="1" w:styleId="WW8Num34z1">
-    <w:name w:val="WW8Num34z1"/>
-    <w:rPr>
-      <w:rFonts w:ascii="Courier New" w:hAnsi="Courier New" w:cs="Courier New"/>
-    </w:rPr>
-  </w:style>
-  <w:style w:type="character" w:customStyle="1" w:styleId="WW8Num34z2">
-    <w:name w:val="WW8Num34z2"/>
-    <w:rPr>
-      <w:rFonts w:ascii="Wingdings" w:hAnsi="Wingdings"/>
-    </w:rPr>
-  </w:style>
-  <w:style w:type="character" w:customStyle="1" w:styleId="WW8Num35z0">
-    <w:name w:val="WW8Num35z0"/>
-    <w:rPr>
-      <w:rFonts w:ascii="Wingdings" w:hAnsi="Wingdings"/>
-    </w:rPr>
-  </w:style>
-  <w:style w:type="character" w:customStyle="1" w:styleId="WW8Num35z1">
-    <w:name w:val="WW8Num35z1"/>
-    <w:rPr>
-      <w:rFonts w:ascii="Courier New" w:hAnsi="Courier New" w:cs="Courier New"/>
-    </w:rPr>
-  </w:style>
-  <w:style w:type="character" w:customStyle="1" w:styleId="WW8Num35z3">
-    <w:name w:val="WW8Num35z3"/>
-    <w:rPr>
-      <w:rFonts w:ascii="Symbol" w:hAnsi="Symbol"/>
-    </w:rPr>
-  </w:style>
-  <w:style w:type="character" w:customStyle="1" w:styleId="WW8Num36z0">
-    <w:name w:val="WW8Num36z0"/>
-    <w:rPr>
-      <w:rFonts w:ascii="Wingdings" w:hAnsi="Wingdings"/>
-    </w:rPr>
-  </w:style>
-  <w:style w:type="character" w:customStyle="1" w:styleId="WW8Num36z1">
-    <w:name w:val="WW8Num36z1"/>
-    <w:rPr>
-      <w:rFonts w:ascii="Courier New" w:hAnsi="Courier New" w:cs="Courier New"/>
-    </w:rPr>
-  </w:style>
-  <w:style w:type="character" w:customStyle="1" w:styleId="WW8Num36z3">
-    <w:name w:val="WW8Num36z3"/>
-    <w:rPr>
-      <w:rFonts w:ascii="Symbol" w:hAnsi="Symbol"/>
-    </w:rPr>
-  </w:style>
-  <w:style w:type="character" w:customStyle="1" w:styleId="WW8Num37z0">
-    <w:name w:val="WW8Num37z0"/>
-    <w:rPr>
-      <w:rFonts w:ascii="Wingdings" w:hAnsi="Wingdings"/>
-    </w:rPr>
-  </w:style>
-  <w:style w:type="character" w:customStyle="1" w:styleId="WW8Num37z1">
-    <w:name w:val="WW8Num37z1"/>
-    <w:rPr>
-      <w:rFonts w:ascii="Courier New" w:hAnsi="Courier New" w:cs="Courier New"/>
-    </w:rPr>
-  </w:style>
-  <w:style w:type="character" w:customStyle="1" w:styleId="WW8Num37z3">
-    <w:name w:val="WW8Num37z3"/>
-    <w:rPr>
-      <w:rFonts w:ascii="Symbol" w:hAnsi="Symbol"/>
-    </w:rPr>
-  </w:style>
-  <w:style w:type="character" w:customStyle="1" w:styleId="WW8Num39z0">
-    <w:name w:val="WW8Num39z0"/>
-    <w:rPr>
-      <w:rFonts w:ascii="Symbol" w:hAnsi="Symbol"/>
-    </w:rPr>
-  </w:style>
-  <w:style w:type="character" w:customStyle="1" w:styleId="WW8Num39z1">
-    <w:name w:val="WW8Num39z1"/>
-    <w:rPr>
-      <w:rFonts w:ascii="Courier New" w:hAnsi="Courier New" w:cs="Courier New"/>
-    </w:rPr>
-  </w:style>
-  <w:style w:type="character" w:customStyle="1" w:styleId="WW8Num39z2">
-    <w:name w:val="WW8Num39z2"/>
-    <w:rPr>
-      <w:rFonts w:ascii="Wingdings" w:hAnsi="Wingdings"/>
-    </w:rPr>
-  </w:style>
-  <w:style w:type="character" w:customStyle="1" w:styleId="WW8Num40z0">
-    <w:name w:val="WW8Num40z0"/>
-    <w:rPr>
-      <w:rFonts w:ascii="Symbol" w:hAnsi="Symbol"/>
-    </w:rPr>
-  </w:style>
-  <w:style w:type="character" w:customStyle="1" w:styleId="WW8Num40z1">
-    <w:name w:val="WW8Num40z1"/>
-    <w:rPr>
-      <w:rFonts w:ascii="Courier New" w:hAnsi="Courier New" w:cs="Courier New"/>
-    </w:rPr>
-  </w:style>
-  <w:style w:type="character" w:customStyle="1" w:styleId="WW8Num40z2">
-    <w:name w:val="WW8Num40z2"/>
-    <w:rPr>
-      <w:rFonts w:ascii="Wingdings" w:hAnsi="Wingdings"/>
-    </w:rPr>
-  </w:style>
-  <w:style w:type="character" w:customStyle="1" w:styleId="WW8Num41z0">
-    <w:name w:val="WW8Num41z0"/>
-    <w:rPr>
-      <w:rFonts w:ascii="Wingdings" w:hAnsi="Wingdings"/>
-    </w:rPr>
-  </w:style>
-  <w:style w:type="character" w:customStyle="1" w:styleId="WW8Num41z1">
-    <w:name w:val="WW8Num41z1"/>
-    <w:rPr>
-      <w:rFonts w:ascii="Courier New" w:hAnsi="Courier New" w:cs="Courier New"/>
-    </w:rPr>
-  </w:style>
-  <w:style w:type="character" w:customStyle="1" w:styleId="WW8Num41z3">
-    <w:name w:val="WW8Num41z3"/>
-    <w:rPr>
-      <w:rFonts w:ascii="Symbol" w:hAnsi="Symbol"/>
-    </w:rPr>
-  </w:style>
-  <w:style w:type="character" w:customStyle="1" w:styleId="WW8Num42z0">
-    <w:name w:val="WW8Num42z0"/>
-    <w:rPr>
-      <w:rFonts w:ascii="Symbol" w:hAnsi="Symbol"/>
-    </w:rPr>
-  </w:style>
-  <w:style w:type="character" w:customStyle="1" w:styleId="WW8Num42z1">
-    <w:name w:val="WW8Num42z1"/>
-    <w:rPr>
-      <w:rFonts w:ascii="Courier New" w:hAnsi="Courier New" w:cs="Courier New"/>
-    </w:rPr>
-  </w:style>
-  <w:style w:type="character" w:customStyle="1" w:styleId="WW8Num42z2">
-    <w:name w:val="WW8Num42z2"/>
-    <w:rPr>
-      <w:rFonts w:ascii="Wingdings" w:hAnsi="Wingdings"/>
-    </w:rPr>
-  </w:style>
-  <w:style w:type="character" w:styleId="lev">
-    <w:name w:val="Strong"/>
-    <w:qFormat/>
-    <w:rPr>
-      <w:b/>
-      <w:bCs/>
-    </w:rPr>
-  </w:style>
-  <w:style w:type="character" w:styleId="Marquedannotation">
-    <w:name w:val="annotation reference"/>
-    <w:uiPriority w:val="99"/>
-    <w:rPr>
-      <w:sz w:val="16"/>
-      <w:szCs w:val="16"/>
-    </w:rPr>
-  </w:style>
-  <w:style w:type="character" w:styleId="Lienhypertexte">
-    <w:name w:val="Hyperlink"/>
-    <w:uiPriority w:val="99"/>
-    <w:rPr>
-      <w:color w:val="0000FF"/>
-      <w:u w:val="single"/>
-    </w:rPr>
-  </w:style>
-  <w:style w:type="character" w:customStyle="1" w:styleId="DocumentMapChar">
-    <w:name w:val="Document Map Char"/>
-    <w:rPr>
-      <w:rFonts w:ascii="Lucida Grande" w:hAnsi="Lucida Grande"/>
-      <w:sz w:val="24"/>
-      <w:szCs w:val="24"/>
-      <w:lang w:val="fr-FR"/>
-    </w:rPr>
-  </w:style>
-  <w:style w:type="character" w:customStyle="1" w:styleId="HeaderChar">
-    <w:name w:val="Header Char"/>
-    <w:rPr>
-      <w:sz w:val="24"/>
-      <w:szCs w:val="24"/>
-    </w:rPr>
-  </w:style>
-  <w:style w:type="character" w:customStyle="1" w:styleId="FooterChar">
-    <w:name w:val="Footer Char"/>
-    <w:rPr>
-      <w:sz w:val="24"/>
-      <w:szCs w:val="24"/>
-    </w:rPr>
-  </w:style>
-  <w:style w:type="paragraph" w:customStyle="1" w:styleId="Heading">
-    <w:name w:val="Heading"/>
-    <w:basedOn w:val="Normal"/>
-    <w:next w:val="Corpsdetexte"/>
-    <w:pPr>
-      <w:keepNext/>
-      <w:spacing w:before="240" w:after="120"/>
-    </w:pPr>
-    <w:rPr>
-      <w:rFonts w:ascii="Liberation Sans" w:eastAsia="WenQuanYi Zen Hei" w:hAnsi="Liberation Sans" w:cs="Lohit Devanagari"/>
-      <w:sz w:val="28"/>
-      <w:szCs w:val="28"/>
-    </w:rPr>
-  </w:style>
-  <w:style w:type="paragraph" w:styleId="Corpsdetexte">
-    <w:name w:val="Body Text"/>
-    <w:basedOn w:val="Normal"/>
-    <w:pPr>
-      <w:spacing w:after="120"/>
-    </w:pPr>
-  </w:style>
-  <w:style w:type="paragraph" w:styleId="Liste">
-    <w:name w:val="List"/>
-    <w:basedOn w:val="Corpsdetexte"/>
-    <w:rPr>
-      <w:rFonts w:cs="Lohit Devanagari"/>
-    </w:rPr>
-  </w:style>
-  <w:style w:type="paragraph" w:styleId="Lgende">
-    <w:name w:val="caption"/>
-    <w:basedOn w:val="Normal"/>
-    <w:qFormat/>
-    <w:pPr>
-      <w:suppressLineNumbers/>
-      <w:spacing w:before="120" w:after="120"/>
-    </w:pPr>
-    <w:rPr>
-      <w:rFonts w:cs="Lohit Devanagari"/>
-      <w:i/>
-      <w:iCs/>
-    </w:rPr>
-  </w:style>
-  <w:style w:type="paragraph" w:customStyle="1" w:styleId="Index">
-    <w:name w:val="Index"/>
-    <w:basedOn w:val="Normal"/>
-    <w:pPr>
-      <w:suppressLineNumbers/>
-    </w:pPr>
-    <w:rPr>
-      <w:rFonts w:cs="Lohit Devanagari"/>
-    </w:rPr>
-  </w:style>
-  <w:style w:type="paragraph" w:styleId="Titre">
-    <w:name w:val="Title"/>
-    <w:basedOn w:val="Normal"/>
-    <w:next w:val="Sous-titre"/>
-    <w:qFormat/>
-    <w:pPr>
-      <w:jc w:val="center"/>
-    </w:pPr>
-    <w:rPr>
-      <w:b/>
-      <w:bCs/>
-      <w:lang w:val="en-GB"/>
-    </w:rPr>
-  </w:style>
-  <w:style w:type="paragraph" w:styleId="Sous-titre">
-    <w:name w:val="Subtitle"/>
-    <w:basedOn w:val="Heading"/>
-    <w:next w:val="Corpsdetexte"/>
-    <w:qFormat/>
-    <w:pPr>
-      <w:jc w:val="center"/>
-    </w:pPr>
-    <w:rPr>
-      <w:i/>
-      <w:iCs/>
-    </w:rPr>
-  </w:style>
-  <w:style w:type="paragraph" w:styleId="Commentaire">
-    <w:name w:val="annotation text"/>
-    <w:basedOn w:val="Normal"/>
-    <w:link w:val="CommentaireCar"/>
-    <w:uiPriority w:val="99"/>
-    <w:rPr>
-      <w:sz w:val="20"/>
-      <w:szCs w:val="20"/>
-    </w:rPr>
-  </w:style>
-  <w:style w:type="paragraph" w:styleId="Objetducommentaire">
-    <w:name w:val="annotation subject"/>
-    <w:basedOn w:val="Commentaire"/>
-    <w:next w:val="Commentaire"/>
-    <w:rPr>
-      <w:b/>
-      <w:bCs/>
-    </w:rPr>
-  </w:style>
-  <w:style w:type="paragraph" w:styleId="Textedebulles">
-    <w:name w:val="Balloon Text"/>
-    <w:basedOn w:val="Normal"/>
-    <w:rPr>
-      <w:rFonts w:ascii="Tahoma" w:hAnsi="Tahoma" w:cs="Tahoma"/>
-      <w:sz w:val="16"/>
-      <w:szCs w:val="16"/>
-    </w:rPr>
-  </w:style>
-  <w:style w:type="paragraph" w:styleId="Explorateurdedocument">
-    <w:name w:val="Document Map"/>
-    <w:basedOn w:val="Normal"/>
-    <w:rPr>
-      <w:rFonts w:ascii="Lucida Grande" w:hAnsi="Lucida Grande"/>
-    </w:rPr>
-  </w:style>
-  <w:style w:type="paragraph" w:styleId="En-tte">
-    <w:name w:val="header"/>
-    <w:basedOn w:val="Normal"/>
-    <w:pPr>
-      <w:tabs>
-        <w:tab w:val="center" w:pos="4536"/>
-        <w:tab w:val="right" w:pos="9072"/>
-      </w:tabs>
-    </w:pPr>
-  </w:style>
-  <w:style w:type="paragraph" w:styleId="Pieddepage">
-    <w:name w:val="footer"/>
-    <w:basedOn w:val="Normal"/>
-    <w:pPr>
-      <w:tabs>
-        <w:tab w:val="center" w:pos="4536"/>
-        <w:tab w:val="right" w:pos="9072"/>
-      </w:tabs>
-    </w:pPr>
-  </w:style>
-  <w:style w:type="paragraph" w:styleId="Notedebasdepage">
-    <w:name w:val="footnote text"/>
-    <w:basedOn w:val="Normal"/>
-    <w:link w:val="NotedebasdepageCar"/>
-    <w:uiPriority w:val="99"/>
-    <w:unhideWhenUsed/>
-    <w:rsid w:val="002721B6"/>
-  </w:style>
-  <w:style w:type="character" w:customStyle="1" w:styleId="NotedebasdepageCar">
-    <w:name w:val="Note de bas de page Car"/>
-    <w:link w:val="Notedebasdepage"/>
-    <w:uiPriority w:val="99"/>
-    <w:rsid w:val="002721B6"/>
-    <w:rPr>
-      <w:sz w:val="24"/>
-      <w:szCs w:val="24"/>
-      <w:lang w:val="fr-FR" w:eastAsia="ar-SA"/>
-    </w:rPr>
-  </w:style>
-  <w:style w:type="character" w:styleId="Marquenotebasdepage">
-    <w:name w:val="footnote reference"/>
-    <w:uiPriority w:val="99"/>
-    <w:unhideWhenUsed/>
-    <w:rsid w:val="002721B6"/>
-    <w:rPr>
-      <w:vertAlign w:val="superscript"/>
-    </w:rPr>
-  </w:style>
-  <w:style w:type="paragraph" w:styleId="Rvision">
-    <w:name w:val="Revision"/>
-    <w:hidden/>
-    <w:uiPriority w:val="99"/>
-    <w:semiHidden/>
-    <w:rsid w:val="00747ADF"/>
-    <w:rPr>
-      <w:sz w:val="24"/>
-      <w:szCs w:val="24"/>
-      <w:lang w:val="fr-FR" w:eastAsia="ar-SA"/>
-    </w:rPr>
-  </w:style>
-  <w:style w:type="character" w:customStyle="1" w:styleId="CommentaireCar">
-    <w:name w:val="Commentaire Car"/>
-    <w:link w:val="Commentaire"/>
-    <w:uiPriority w:val="99"/>
-    <w:rsid w:val="001A3160"/>
-    <w:rPr>
-      <w:lang w:val="fr-FR" w:eastAsia="ar-SA"/>
-    </w:rPr>
-  </w:style>
-  <w:style w:type="paragraph" w:customStyle="1" w:styleId="Normal1">
-    <w:name w:val="Normal1"/>
-    <w:rsid w:val="00313144"/>
-    <w:rPr>
-      <w:sz w:val="24"/>
-      <w:szCs w:val="24"/>
-      <w:lang w:val="fr-FR" w:eastAsia="fr-FR"/>
-    </w:rPr>
-  </w:style>
-  <w:style w:type="paragraph" w:styleId="Paragraphedeliste">
-    <w:name w:val="List Paragraph"/>
-    <w:basedOn w:val="Normal"/>
-    <w:uiPriority w:val="34"/>
-    <w:qFormat/>
-    <w:rsid w:val="00A866E2"/>
-    <w:pPr>
-      <w:ind w:left="720"/>
-      <w:contextualSpacing/>
-    </w:pPr>
-  </w:style>
-  <w:style w:type="character" w:customStyle="1" w:styleId="UnresolvedMention1">
-    <w:name w:val="Unresolved Mention1"/>
-    <w:basedOn w:val="Policepardfaut"/>
-    <w:uiPriority w:val="99"/>
-    <w:semiHidden/>
-    <w:unhideWhenUsed/>
-    <w:rsid w:val="00480A5E"/>
-    <w:rPr>
-      <w:color w:val="605E5C"/>
-      <w:shd w:val="clear" w:color="auto" w:fill="E1DFDD"/>
-    </w:rPr>
-  </w:style>
-  <w:style w:type="character" w:customStyle="1" w:styleId="apple-converted-space">
-    <w:name w:val="apple-converted-space"/>
-    <w:basedOn w:val="Policepardfaut"/>
-    <w:rsid w:val="0063015F"/>
-  </w:style>
-  <w:style w:type="character" w:styleId="Lienhypertextesuivi">
+  <w:style w:type="character" w:styleId="Lienhypertextesuivivisit">
     <w:name w:val="FollowedHyperlink"/>
     <w:basedOn w:val="Policepardfaut"/>
     <w:uiPriority w:val="99"/>
@@ -20183,7 +19213,7 @@
   <a:extraClrSchemeLst/>
   <a:extLst>
     <a:ext uri="{05A4C25C-085E-4340-85A3-A5531E510DB2}">
-      <thm15:themeFamily xmlns="" xmlns:thm15="http://schemas.microsoft.com/office/thememl/2012/main" name="Office Theme" id="{62F939B6-93AF-4DB8-9C6B-D6C7DFDC589F}" vid="{4A3C46E8-61CC-4603-A589-7422A47A8E4A}"/>
+      <thm15:themeFamily xmlns:thm15="http://schemas.microsoft.com/office/thememl/2012/main" name="Office Theme" id="{62F939B6-93AF-4DB8-9C6B-D6C7DFDC589F}" vid="{4A3C46E8-61CC-4603-A589-7422A47A8E4A}"/>
     </a:ext>
   </a:extLst>
 </a:theme>

</xml_diff>

<commit_message>
Adapted to new compiling environment
Former-commit-id: 6318428d55594e6830ebef12d09801896c739d58
</commit_message>
<xml_diff>
--- a/examples/regrid_environment/regrid_environment_documentation.docx
+++ b/examples/regrid_environment/regrid_environment_documentation.docx
@@ -5,7 +5,7 @@
   <w:body>
     <w:p>
       <w:pPr>
-        <w:pStyle w:val="Titre"/>
+        <w:pStyle w:val="Title"/>
         <w:rPr>
           <w:color w:val="FF0000"/>
         </w:rPr>
@@ -13,7 +13,7 @@
     </w:p>
     <w:p>
       <w:pPr>
-        <w:pStyle w:val="Titre"/>
+        <w:pStyle w:val="Title"/>
         <w:rPr>
           <w:color w:val="FF0000"/>
         </w:rPr>
@@ -21,7 +21,7 @@
     </w:p>
     <w:p>
       <w:pPr>
-        <w:pStyle w:val="Titre"/>
+        <w:pStyle w:val="Title"/>
       </w:pPr>
       <w:r>
         <w:rPr>
@@ -83,7 +83,7 @@
     </w:p>
     <w:p>
       <w:pPr>
-        <w:pStyle w:val="Titre"/>
+        <w:pStyle w:val="Title"/>
         <w:jc w:val="left"/>
         <w:rPr>
           <w:b w:val="0"/>
@@ -94,7 +94,7 @@
     </w:p>
     <w:p>
       <w:pPr>
-        <w:pStyle w:val="Titre"/>
+        <w:pStyle w:val="Title"/>
         <w:rPr>
           <w:b w:val="0"/>
           <w:sz w:val="32"/>
@@ -131,7 +131,7 @@
     </w:p>
     <w:p>
       <w:pPr>
-        <w:pStyle w:val="Titre"/>
+        <w:pStyle w:val="Title"/>
         <w:spacing w:before="120"/>
         <w:rPr>
           <w:b w:val="0"/>
@@ -191,7 +191,7 @@
     </w:p>
     <w:p>
       <w:pPr>
-        <w:pStyle w:val="Paragraphedeliste"/>
+        <w:pStyle w:val="ListParagraph"/>
         <w:numPr>
           <w:ilvl w:val="0"/>
           <w:numId w:val="5"/>
@@ -995,7 +995,7 @@
     </w:p>
     <w:p>
       <w:pPr>
-        <w:pStyle w:val="Paragraphedeliste"/>
+        <w:pStyle w:val="ListParagraph"/>
         <w:numPr>
           <w:ilvl w:val="0"/>
           <w:numId w:val="5"/>
@@ -1016,7 +1016,7 @@
     </w:p>
     <w:p>
       <w:pPr>
-        <w:pStyle w:val="Paragraphedeliste"/>
+        <w:pStyle w:val="ListParagraph"/>
         <w:ind w:left="360"/>
         <w:jc w:val="both"/>
         <w:rPr>
@@ -1298,7 +1298,7 @@
     </w:p>
     <w:p>
       <w:pPr>
-        <w:pStyle w:val="Paragraphedeliste"/>
+        <w:pStyle w:val="ListParagraph"/>
         <w:numPr>
           <w:ilvl w:val="1"/>
           <w:numId w:val="5"/>
@@ -1356,7 +1356,7 @@
     </w:p>
     <w:p>
       <w:pPr>
-        <w:pStyle w:val="Paragraphedeliste"/>
+        <w:pStyle w:val="ListParagraph"/>
         <w:numPr>
           <w:ilvl w:val="1"/>
           <w:numId w:val="5"/>
@@ -1820,7 +1820,7 @@
     </w:p>
     <w:p>
       <w:pPr>
-        <w:pStyle w:val="Paragraphedeliste"/>
+        <w:pStyle w:val="ListParagraph"/>
         <w:numPr>
           <w:ilvl w:val="1"/>
           <w:numId w:val="5"/>
@@ -2015,7 +2015,7 @@
       </w:r>
       <w:r>
         <w:rPr>
-          <w:rStyle w:val="Appelnotedebasdep"/>
+          <w:rStyle w:val="FootnoteReference"/>
           <w:lang w:val="en-GB"/>
         </w:rPr>
         <w:footnoteReference w:id="1"/>
@@ -2183,7 +2183,7 @@
     </w:p>
     <w:p>
       <w:pPr>
-        <w:pStyle w:val="Paragraphedeliste"/>
+        <w:pStyle w:val="ListParagraph"/>
         <w:numPr>
           <w:ilvl w:val="1"/>
           <w:numId w:val="5"/>
@@ -2251,7 +2251,7 @@
     </w:p>
     <w:p>
       <w:pPr>
-        <w:pStyle w:val="Paragraphedeliste"/>
+        <w:pStyle w:val="ListParagraph"/>
         <w:numPr>
           <w:ilvl w:val="0"/>
           <w:numId w:val="12"/>
@@ -2282,7 +2282,7 @@
     </w:p>
     <w:p>
       <w:pPr>
-        <w:pStyle w:val="Paragraphedeliste"/>
+        <w:pStyle w:val="ListParagraph"/>
         <w:numPr>
           <w:ilvl w:val="0"/>
           <w:numId w:val="12"/>
@@ -2301,7 +2301,7 @@
     </w:p>
     <w:p>
       <w:pPr>
-        <w:pStyle w:val="Paragraphedeliste"/>
+        <w:pStyle w:val="ListParagraph"/>
         <w:numPr>
           <w:ilvl w:val="0"/>
           <w:numId w:val="12"/>
@@ -2344,7 +2344,7 @@
     </w:p>
     <w:p>
       <w:pPr>
-        <w:pStyle w:val="Paragraphedeliste"/>
+        <w:pStyle w:val="ListParagraph"/>
         <w:numPr>
           <w:ilvl w:val="0"/>
           <w:numId w:val="12"/>
@@ -2565,7 +2565,7 @@
     </w:p>
     <w:p>
       <w:pPr>
-        <w:pStyle w:val="Paragraphedeliste"/>
+        <w:pStyle w:val="ListParagraph"/>
         <w:numPr>
           <w:ilvl w:val="1"/>
           <w:numId w:val="5"/>
@@ -3129,7 +3129,7 @@
     </w:p>
     <w:p>
       <w:pPr>
-        <w:pStyle w:val="Paragraphedeliste"/>
+        <w:pStyle w:val="ListParagraph"/>
         <w:numPr>
           <w:ilvl w:val="0"/>
           <w:numId w:val="5"/>
@@ -3211,7 +3211,7 @@
     </w:p>
     <w:p>
       <w:pPr>
-        <w:pStyle w:val="Paragraphedeliste"/>
+        <w:pStyle w:val="ListParagraph"/>
         <w:numPr>
           <w:ilvl w:val="1"/>
           <w:numId w:val="5"/>
@@ -3256,7 +3256,7 @@
       <w:hyperlink r:id="rId9" w:history="1">
         <w:r>
           <w:rPr>
-            <w:rStyle w:val="Lienhypertexte"/>
+            <w:rStyle w:val="Hyperlink"/>
             <w:lang w:val="en-GB"/>
           </w:rPr>
           <w:t>https://oasis.cerfacs.fr/en/documentation/</w:t>
@@ -3272,7 +3272,7 @@
     </w:p>
     <w:p>
       <w:pPr>
-        <w:pStyle w:val="Paragraphedeliste"/>
+        <w:pStyle w:val="ListParagraph"/>
         <w:numPr>
           <w:ilvl w:val="1"/>
           <w:numId w:val="5"/>
@@ -3333,7 +3333,7 @@
       <w:hyperlink r:id="rId10" w:history="1">
         <w:r>
           <w:rPr>
-            <w:rStyle w:val="Lienhypertexte"/>
+            <w:rStyle w:val="Hyperlink"/>
             <w:lang w:val="en-GB"/>
           </w:rPr>
           <w:t>https://earthsystemmodeling.org</w:t>
@@ -3366,7 +3366,7 @@
       <w:hyperlink r:id="rId11" w:history="1">
         <w:r>
           <w:rPr>
-            <w:rStyle w:val="Lienhypertexte"/>
+            <w:rStyle w:val="Hyperlink"/>
             <w:rFonts w:ascii="Courier New" w:hAnsi="Courier New" w:cs="Courier New"/>
             <w:lang w:val="en-GB" w:eastAsia="en-US"/>
           </w:rPr>
@@ -4153,7 +4153,7 @@
     </w:p>
     <w:p>
       <w:pPr>
-        <w:pStyle w:val="Paragraphedeliste"/>
+        <w:pStyle w:val="ListParagraph"/>
         <w:numPr>
           <w:ilvl w:val="1"/>
           <w:numId w:val="5"/>
@@ -4190,7 +4190,7 @@
       <w:hyperlink r:id="rId12" w:history="1">
         <w:r>
           <w:rPr>
-            <w:rStyle w:val="Lienhypertexte"/>
+            <w:rStyle w:val="Hyperlink"/>
             <w:lang w:val="en-GB"/>
           </w:rPr>
           <w:t>https://forge.ipsl.jussieu.fr/ioserver/wiki/documentation</w:t>
@@ -4282,7 +4282,7 @@
       <w:hyperlink r:id="rId13" w:history="1">
         <w:r>
           <w:rPr>
-            <w:rStyle w:val="Lienhypertexte"/>
+            <w:rStyle w:val="Hyperlink"/>
             <w:rFonts w:ascii="Courier New" w:hAnsi="Courier New" w:cs="Courier New"/>
             <w:sz w:val="21"/>
             <w:szCs w:val="21"/>
@@ -4954,7 +4954,7 @@
     </w:p>
     <w:p>
       <w:pPr>
-        <w:pStyle w:val="Paragraphedeliste"/>
+        <w:pStyle w:val="ListParagraph"/>
         <w:numPr>
           <w:ilvl w:val="0"/>
           <w:numId w:val="5"/>
@@ -4989,7 +4989,7 @@
     </w:p>
     <w:p>
       <w:pPr>
-        <w:pStyle w:val="Paragraphedeliste"/>
+        <w:pStyle w:val="ListParagraph"/>
         <w:numPr>
           <w:ilvl w:val="1"/>
           <w:numId w:val="5"/>
@@ -5292,12 +5292,156 @@
         <w:rPr>
           <w:lang w:val="en-GB"/>
         </w:rPr>
-        <w:t xml:space="preserve">. Note that this </w:t>
-      </w:r>
-      <w:proofErr w:type="spellStart"/>
-      <w:r>
-        <w:rPr>
-          <w:rFonts w:ascii="Courier New" w:hAnsi="Courier New" w:cs="Courier New"/>
+        <w:t xml:space="preserve">. </w:t>
+      </w:r>
+      <w:r>
+        <w:rPr>
+          <w:lang w:val="en-GB"/>
+        </w:rPr>
+        <w:t>Following the rules of OASIS3-MCT compiling environment effective since December 2022,</w:t>
+      </w:r>
+      <w:r>
+        <w:rPr>
+          <w:lang w:val="en-US"/>
+        </w:rPr>
+        <w:t xml:space="preserve"> </w:t>
+      </w:r>
+      <w:r>
+        <w:rPr>
+          <w:rFonts w:ascii="Courier New" w:hAnsi="Courier New" w:cs="Courier New"/>
+          <w:lang w:val="en-GB"/>
+        </w:rPr>
+        <w:t>$</w:t>
+      </w:r>
+      <w:r>
+        <w:rPr>
+          <w:rFonts w:ascii="Courier New" w:hAnsi="Courier New" w:cs="Courier New"/>
+          <w:lang w:val="en-GB"/>
+        </w:rPr>
+        <w:t>OASIS_COUPLE</w:t>
+      </w:r>
+      <w:r>
+        <w:rPr>
+          <w:lang w:val="en-GB"/>
+        </w:rPr>
+        <w:t xml:space="preserve"> and </w:t>
+      </w:r>
+      <w:r>
+        <w:rPr>
+          <w:rFonts w:ascii="Courier New" w:hAnsi="Courier New" w:cs="Courier New"/>
+          <w:lang w:val="en-GB"/>
+        </w:rPr>
+        <w:t>$</w:t>
+      </w:r>
+      <w:r>
+        <w:rPr>
+          <w:rFonts w:ascii="Courier New" w:hAnsi="Courier New" w:cs="Courier New"/>
+          <w:lang w:val="en-GB"/>
+        </w:rPr>
+        <w:t>OASIS_ENV</w:t>
+      </w:r>
+      <w:r>
+        <w:rPr>
+          <w:lang w:val="en-GB"/>
+        </w:rPr>
+        <w:t xml:space="preserve"> </w:t>
+      </w:r>
+      <w:r>
+        <w:rPr>
+          <w:lang w:val="en-GB"/>
+        </w:rPr>
+        <w:t xml:space="preserve">are two environment variables that must be defined. </w:t>
+      </w:r>
+      <w:r>
+        <w:rPr>
+          <w:rFonts w:ascii="Courier New" w:hAnsi="Courier New" w:cs="Courier New"/>
+          <w:lang w:val="en-GB"/>
+        </w:rPr>
+        <w:t>$OASIS_COUPLE</w:t>
+      </w:r>
+      <w:r>
+        <w:rPr>
+          <w:lang w:val="en-GB"/>
+        </w:rPr>
+        <w:t xml:space="preserve"> </w:t>
+      </w:r>
+      <w:r>
+        <w:rPr>
+          <w:lang w:val="en-GB"/>
+        </w:rPr>
+        <w:t>gives</w:t>
+      </w:r>
+      <w:r>
+        <w:rPr>
+          <w:lang w:val="en-GB"/>
+        </w:rPr>
+        <w:t xml:space="preserve"> the </w:t>
+      </w:r>
+      <w:r>
+        <w:rPr>
+          <w:lang w:val="en-GB"/>
+        </w:rPr>
+        <w:t>path</w:t>
+      </w:r>
+      <w:r>
+        <w:rPr>
+          <w:lang w:val="en-GB"/>
+        </w:rPr>
+        <w:t xml:space="preserve"> of the sources of the coupler (/</w:t>
+      </w:r>
+      <w:r>
+        <w:rPr>
+          <w:rFonts w:ascii="Courier New" w:hAnsi="Courier New" w:cs="Courier New"/>
+          <w:lang w:val="en-GB"/>
+        </w:rPr>
+        <w:t>lib, /util, /examples</w:t>
+      </w:r>
+      <w:r>
+        <w:rPr>
+          <w:lang w:val="en-GB"/>
+        </w:rPr>
+        <w:t>, etc. directories)</w:t>
+      </w:r>
+      <w:r>
+        <w:rPr>
+          <w:lang w:val="en-GB"/>
+        </w:rPr>
+        <w:t>.</w:t>
+      </w:r>
+      <w:r>
+        <w:rPr>
+          <w:lang w:val="en-GB"/>
+        </w:rPr>
+        <w:t xml:space="preserve"> </w:t>
+      </w:r>
+      <w:r>
+        <w:rPr>
+          <w:rFonts w:ascii="Courier New" w:hAnsi="Courier New" w:cs="Courier New"/>
+          <w:lang w:val="en-GB"/>
+        </w:rPr>
+        <w:t>$OASIS_ENV</w:t>
+      </w:r>
+      <w:r>
+        <w:rPr>
+          <w:lang w:val="en-GB"/>
+        </w:rPr>
+        <w:t xml:space="preserve"> </w:t>
+      </w:r>
+      <w:r>
+        <w:rPr>
+          <w:lang w:val="en-GB"/>
+        </w:rPr>
+        <w:t xml:space="preserve">gives the extension of the </w:t>
+      </w:r>
+      <w:r>
+        <w:rPr>
+          <w:lang w:val="en-GB"/>
+        </w:rPr>
+        <w:t xml:space="preserve">header </w:t>
+      </w:r>
+      <w:proofErr w:type="spellStart"/>
+      <w:r>
+        <w:rPr>
           <w:lang w:val="en-GB"/>
         </w:rPr>
         <w:t>Makefile</w:t>
@@ -5307,47 +5451,23 @@
         <w:rPr>
           <w:lang w:val="en-GB"/>
         </w:rPr>
-        <w:t xml:space="preserve"> includes the file </w:t>
-      </w:r>
-      <w:proofErr w:type="spellStart"/>
-      <w:r>
-        <w:rPr>
-          <w:rFonts w:ascii="Courier New" w:hAnsi="Courier New" w:cs="Courier New"/>
-          <w:lang w:val="en-GB"/>
-        </w:rPr>
-        <w:t>header_Makefile</w:t>
-      </w:r>
-      <w:proofErr w:type="spellEnd"/>
-      <w:r>
-        <w:rPr>
-          <w:lang w:val="en-GB"/>
-        </w:rPr>
-        <w:t xml:space="preserve"> that automatically uses the </w:t>
-      </w:r>
-      <w:r>
-        <w:rPr>
-          <w:rFonts w:ascii="Courier New" w:hAnsi="Courier New" w:cs="Courier New"/>
-          <w:lang w:val="en-GB"/>
-        </w:rPr>
-        <w:t>make.inc</w:t>
-      </w:r>
-      <w:r>
-        <w:rPr>
-          <w:lang w:val="en-GB"/>
-        </w:rPr>
         <w:t xml:space="preserve"> </w:t>
       </w:r>
-      <w:r>
-        <w:rPr>
-          <w:lang w:val="en-GB"/>
-        </w:rPr>
-        <w:t xml:space="preserve">header </w:t>
-      </w:r>
-      <w:r>
-        <w:rPr>
-          <w:lang w:val="en-GB"/>
-        </w:rPr>
-        <w:t>from</w:t>
+      <w:proofErr w:type="gramStart"/>
+      <w:r>
+        <w:rPr>
+          <w:rFonts w:ascii="Courier New" w:hAnsi="Courier New" w:cs="Courier New"/>
+          <w:lang w:val="en-GB"/>
+        </w:rPr>
+        <w:t>make.$</w:t>
+      </w:r>
+      <w:proofErr w:type="gramEnd"/>
+      <w:r>
+        <w:rPr>
+          <w:rFonts w:ascii="Courier New" w:hAnsi="Courier New" w:cs="Courier New"/>
+          <w:lang w:val="en-GB"/>
+        </w:rPr>
+        <w:t>{OASIS_ENV}</w:t>
       </w:r>
       <w:r>
         <w:rPr>
@@ -5357,10 +5477,23 @@
       </w:r>
       <w:r>
         <w:rPr>
-          <w:rFonts w:ascii="Courier New" w:hAnsi="Courier New" w:cs="Courier New"/>
-          <w:lang w:val="en-GB"/>
-        </w:rPr>
-        <w:t>oasis3-mct/util/</w:t>
+          <w:lang w:val="en-GB"/>
+        </w:rPr>
+        <w:t xml:space="preserve">from the directory </w:t>
+      </w:r>
+      <w:r>
+        <w:rPr>
+          <w:rFonts w:ascii="Courier New" w:hAnsi="Courier New" w:cs="Courier New"/>
+          <w:lang w:val="en-GB"/>
+        </w:rPr>
+        <w:t>${OASIS_COUPLE}</w:t>
+      </w:r>
+      <w:r>
+        <w:rPr>
+          <w:rFonts w:ascii="Courier New" w:hAnsi="Courier New" w:cs="Courier New"/>
+          <w:lang w:val="en-GB"/>
+        </w:rPr>
+        <w:t>/util/</w:t>
       </w:r>
       <w:proofErr w:type="spellStart"/>
       <w:r>
@@ -5382,19 +5515,13 @@
         <w:rPr>
           <w:lang w:val="en-GB"/>
         </w:rPr>
-        <w:t xml:space="preserve">that </w:t>
-      </w:r>
-      <w:r>
-        <w:rPr>
-          <w:lang w:val="en-GB"/>
-        </w:rPr>
-        <w:t>was</w:t>
-      </w:r>
-      <w:r>
-        <w:rPr>
-          <w:lang w:val="en-GB"/>
-        </w:rPr>
-        <w:t xml:space="preserve"> used to compile OASIS3-MCT itself. </w:t>
+        <w:t>that was used to compile OASIS3-MCT itself.</w:t>
+      </w:r>
+      <w:r>
+        <w:rPr>
+          <w:lang w:val="en-GB"/>
+        </w:rPr>
+        <w:t xml:space="preserve"> </w:t>
       </w:r>
       <w:r>
         <w:rPr>
@@ -5475,6 +5602,47 @@
         <w:rPr>
           <w:lang w:val="en-GB"/>
         </w:rPr>
+        <w:t xml:space="preserve">in the </w:t>
+      </w:r>
+      <w:r>
+        <w:rPr>
+          <w:rFonts w:ascii="Courier New" w:hAnsi="Courier New" w:cs="Courier New"/>
+          <w:lang w:val="en-GB"/>
+        </w:rPr>
+        <w:t>/</w:t>
+      </w:r>
+      <w:proofErr w:type="spellStart"/>
+      <w:r>
+        <w:rPr>
+          <w:rFonts w:ascii="Courier New" w:hAnsi="Courier New" w:cs="Courier New"/>
+          <w:lang w:val="en-GB"/>
+        </w:rPr>
+        <w:t>src</w:t>
+      </w:r>
+      <w:proofErr w:type="spellEnd"/>
+      <w:r>
+        <w:rPr>
+          <w:rFonts w:ascii="Courier New" w:hAnsi="Courier New" w:cs="Courier New"/>
+          <w:lang w:val="en-GB"/>
+        </w:rPr>
+        <w:t xml:space="preserve"> </w:t>
+      </w:r>
+      <w:r>
+        <w:rPr>
+          <w:lang w:val="en-GB"/>
+        </w:rPr>
+        <w:t>directory</w:t>
+      </w:r>
+      <w:r>
+        <w:rPr>
+          <w:lang w:val="en-GB"/>
+        </w:rPr>
+        <w:t xml:space="preserve"> </w:t>
+      </w:r>
+      <w:r>
+        <w:rPr>
+          <w:lang w:val="en-GB"/>
+        </w:rPr>
         <w:t xml:space="preserve">will compile </w:t>
       </w:r>
       <w:r>
@@ -5494,24 +5662,14 @@
         <w:rPr>
           <w:lang w:val="en-GB"/>
         </w:rPr>
-        <w:t xml:space="preserve"> in the </w:t>
-      </w:r>
-      <w:r>
-        <w:rPr>
-          <w:rFonts w:ascii="Courier New" w:hAnsi="Courier New" w:cs="Courier New"/>
-          <w:lang w:val="en-GB"/>
-        </w:rPr>
-        <w:t>/</w:t>
-      </w:r>
-      <w:proofErr w:type="spellStart"/>
-      <w:r>
-        <w:rPr>
-          <w:rFonts w:ascii="Courier New" w:hAnsi="Courier New" w:cs="Courier New"/>
-          <w:lang w:val="en-GB"/>
-        </w:rPr>
-        <w:t>src</w:t>
-      </w:r>
-      <w:proofErr w:type="spellEnd"/>
+        <w:t xml:space="preserve"> in </w:t>
+      </w:r>
+      <w:r>
+        <w:rPr>
+          <w:lang w:val="en-GB"/>
+        </w:rPr>
+        <w:t>that</w:t>
+      </w:r>
       <w:r>
         <w:rPr>
           <w:rFonts w:ascii="Courier New" w:hAnsi="Courier New" w:cs="Courier New"/>
@@ -5636,7 +5794,7 @@
     </w:p>
     <w:p>
       <w:pPr>
-        <w:pStyle w:val="Paragraphedeliste"/>
+        <w:pStyle w:val="ListParagraph"/>
         <w:numPr>
           <w:ilvl w:val="1"/>
           <w:numId w:val="5"/>
@@ -5939,7 +6097,7 @@
     </w:p>
     <w:p>
       <w:pPr>
-        <w:pStyle w:val="Paragraphedeliste"/>
+        <w:pStyle w:val="ListParagraph"/>
         <w:numPr>
           <w:ilvl w:val="0"/>
           <w:numId w:val="6"/>
@@ -6050,7 +6208,7 @@
     </w:p>
     <w:p>
       <w:pPr>
-        <w:pStyle w:val="Paragraphedeliste"/>
+        <w:pStyle w:val="ListParagraph"/>
         <w:numPr>
           <w:ilvl w:val="0"/>
           <w:numId w:val="6"/>
@@ -6174,7 +6332,7 @@
     </w:p>
     <w:p>
       <w:pPr>
-        <w:pStyle w:val="Paragraphedeliste"/>
+        <w:pStyle w:val="ListParagraph"/>
         <w:numPr>
           <w:ilvl w:val="0"/>
           <w:numId w:val="6"/>
@@ -6331,7 +6489,7 @@
     </w:p>
     <w:p>
       <w:pPr>
-        <w:pStyle w:val="Paragraphedeliste"/>
+        <w:pStyle w:val="ListParagraph"/>
         <w:numPr>
           <w:ilvl w:val="0"/>
           <w:numId w:val="6"/>
@@ -6365,7 +6523,7 @@
       </w:r>
       <w:r>
         <w:rPr>
-          <w:rStyle w:val="Appelnotedebasdep"/>
+          <w:rStyle w:val="FootnoteReference"/>
           <w:lang w:val="en-GB"/>
         </w:rPr>
         <w:footnoteReference w:id="2"/>
@@ -6373,7 +6531,7 @@
     </w:p>
     <w:p>
       <w:pPr>
-        <w:pStyle w:val="Paragraphedeliste"/>
+        <w:pStyle w:val="ListParagraph"/>
         <w:numPr>
           <w:ilvl w:val="0"/>
           <w:numId w:val="6"/>
@@ -6487,7 +6645,7 @@
     </w:p>
     <w:p>
       <w:pPr>
-        <w:pStyle w:val="Paragraphedeliste"/>
+        <w:pStyle w:val="ListParagraph"/>
         <w:numPr>
           <w:ilvl w:val="0"/>
           <w:numId w:val="6"/>
@@ -6542,7 +6700,7 @@
     </w:p>
     <w:p>
       <w:pPr>
-        <w:pStyle w:val="Paragraphedeliste"/>
+        <w:pStyle w:val="ListParagraph"/>
         <w:numPr>
           <w:ilvl w:val="0"/>
           <w:numId w:val="6"/>
@@ -6650,7 +6808,7 @@
     </w:p>
     <w:p>
       <w:pPr>
-        <w:pStyle w:val="Paragraphedeliste"/>
+        <w:pStyle w:val="ListParagraph"/>
         <w:numPr>
           <w:ilvl w:val="0"/>
           <w:numId w:val="7"/>
@@ -6665,6 +6823,7 @@
         <w:rPr>
           <w:lang w:val="en-GB"/>
         </w:rPr>
+        <w:lastRenderedPageBreak/>
         <w:t xml:space="preserve">ESMF and XIOS are not parallelized with OpenMP; therefore </w:t>
       </w:r>
       <w:r>
@@ -6732,7 +6891,7 @@
     </w:p>
     <w:p>
       <w:pPr>
-        <w:pStyle w:val="Paragraphedeliste"/>
+        <w:pStyle w:val="ListParagraph"/>
         <w:numPr>
           <w:ilvl w:val="0"/>
           <w:numId w:val="7"/>
@@ -6747,7 +6906,6 @@
         <w:rPr>
           <w:lang w:val="en-GB"/>
         </w:rPr>
-        <w:lastRenderedPageBreak/>
         <w:t xml:space="preserve">For SCRP, </w:t>
       </w:r>
       <w:r>
@@ -6814,7 +6972,7 @@
       </w:r>
       <w:r>
         <w:rPr>
-          <w:rStyle w:val="Appelnotedebasdep"/>
+          <w:rStyle w:val="FootnoteReference"/>
           <w:lang w:val="en-GB"/>
         </w:rPr>
         <w:footnoteReference w:id="3"/>
@@ -7197,7 +7355,7 @@
     </w:p>
     <w:p>
       <w:pPr>
-        <w:pStyle w:val="Paragraphedeliste"/>
+        <w:pStyle w:val="ListParagraph"/>
         <w:numPr>
           <w:ilvl w:val="1"/>
           <w:numId w:val="5"/>
@@ -7912,7 +8070,7 @@
     </w:p>
     <w:p>
       <w:pPr>
-        <w:pStyle w:val="Paragraphedeliste"/>
+        <w:pStyle w:val="ListParagraph"/>
         <w:numPr>
           <w:ilvl w:val="1"/>
           <w:numId w:val="5"/>
@@ -7956,7 +8114,7 @@
     </w:p>
     <w:p>
       <w:pPr>
-        <w:pStyle w:val="Paragraphedeliste"/>
+        <w:pStyle w:val="ListParagraph"/>
         <w:numPr>
           <w:ilvl w:val="0"/>
           <w:numId w:val="11"/>
@@ -8029,7 +8187,7 @@
     </w:p>
     <w:p>
       <w:pPr>
-        <w:pStyle w:val="Paragraphedeliste"/>
+        <w:pStyle w:val="ListParagraph"/>
         <w:numPr>
           <w:ilvl w:val="0"/>
           <w:numId w:val="11"/>
@@ -8112,7 +8270,7 @@
     </w:p>
     <w:p>
       <w:pPr>
-        <w:pStyle w:val="Paragraphedeliste"/>
+        <w:pStyle w:val="ListParagraph"/>
         <w:numPr>
           <w:ilvl w:val="0"/>
           <w:numId w:val="11"/>
@@ -8170,7 +8328,7 @@
     </w:p>
     <w:p>
       <w:pPr>
-        <w:pStyle w:val="Paragraphedeliste"/>
+        <w:pStyle w:val="ListParagraph"/>
         <w:spacing w:before="120"/>
         <w:jc w:val="both"/>
         <w:rPr>
@@ -8180,7 +8338,7 @@
     </w:p>
     <w:p>
       <w:pPr>
-        <w:pStyle w:val="Paragraphedeliste"/>
+        <w:pStyle w:val="ListParagraph"/>
         <w:numPr>
           <w:ilvl w:val="1"/>
           <w:numId w:val="5"/>
@@ -8198,6 +8356,7 @@
         <w:rPr>
           <w:lang w:val="en-GB"/>
         </w:rPr>
+        <w:lastRenderedPageBreak/>
         <w:t xml:space="preserve">Using the running script </w:t>
       </w:r>
       <w:r>
@@ -8234,7 +8393,6 @@
         <w:rPr>
           <w:lang w:val="en-GB"/>
         </w:rPr>
-        <w:lastRenderedPageBreak/>
         <w:t xml:space="preserve">The script </w:t>
       </w:r>
       <w:r>
@@ -8463,7 +8621,7 @@
     </w:p>
     <w:p>
       <w:pPr>
-        <w:pStyle w:val="Paragraphedeliste"/>
+        <w:pStyle w:val="ListParagraph"/>
         <w:numPr>
           <w:ilvl w:val="0"/>
           <w:numId w:val="6"/>
@@ -8551,7 +8709,7 @@
     </w:p>
     <w:p>
       <w:pPr>
-        <w:pStyle w:val="Paragraphedeliste"/>
+        <w:pStyle w:val="ListParagraph"/>
         <w:numPr>
           <w:ilvl w:val="0"/>
           <w:numId w:val="6"/>
@@ -8668,7 +8826,7 @@
     </w:p>
     <w:p>
       <w:pPr>
-        <w:pStyle w:val="Paragraphedeliste"/>
+        <w:pStyle w:val="ListParagraph"/>
         <w:numPr>
           <w:ilvl w:val="0"/>
           <w:numId w:val="6"/>
@@ -8776,7 +8934,7 @@
     </w:p>
     <w:p>
       <w:pPr>
-        <w:pStyle w:val="Paragraphedeliste"/>
+        <w:pStyle w:val="ListParagraph"/>
         <w:numPr>
           <w:ilvl w:val="0"/>
           <w:numId w:val="6"/>
@@ -8831,7 +8989,7 @@
     </w:p>
     <w:p>
       <w:pPr>
-        <w:pStyle w:val="Paragraphedeliste"/>
+        <w:pStyle w:val="ListParagraph"/>
         <w:numPr>
           <w:ilvl w:val="0"/>
           <w:numId w:val="6"/>
@@ -8894,7 +9052,7 @@
     </w:p>
     <w:p>
       <w:pPr>
-        <w:pStyle w:val="Paragraphedeliste"/>
+        <w:pStyle w:val="ListParagraph"/>
         <w:spacing w:before="120"/>
         <w:jc w:val="both"/>
         <w:rPr>
@@ -9081,7 +9239,7 @@
     </w:p>
     <w:p>
       <w:pPr>
-        <w:pStyle w:val="Paragraphedeliste"/>
+        <w:pStyle w:val="ListParagraph"/>
         <w:numPr>
           <w:ilvl w:val="0"/>
           <w:numId w:val="5"/>
@@ -9153,7 +9311,7 @@
     </w:p>
     <w:p>
       <w:pPr>
-        <w:pStyle w:val="Paragraphedeliste"/>
+        <w:pStyle w:val="ListParagraph"/>
         <w:numPr>
           <w:ilvl w:val="1"/>
           <w:numId w:val="5"/>
@@ -9510,7 +9668,7 @@
     </w:p>
     <w:p>
       <w:pPr>
-        <w:pStyle w:val="Paragraphedeliste"/>
+        <w:pStyle w:val="ListParagraph"/>
         <w:numPr>
           <w:ilvl w:val="1"/>
           <w:numId w:val="5"/>
@@ -9626,13 +9784,7 @@
         <w:rPr>
           <w:lang w:val="en-GB"/>
         </w:rPr>
-        <w:t xml:space="preserve">. </w:t>
-      </w:r>
-      <w:r>
-        <w:rPr>
-          <w:lang w:val="en-GB"/>
-        </w:rPr>
-        <w:t xml:space="preserve">In order to limit the size of the git repository, the grid file </w:t>
+        <w:t xml:space="preserve">. In order to limit the size of the git repository, the grid file </w:t>
       </w:r>
       <w:r>
         <w:rPr>
@@ -9659,19 +9811,7 @@
           <w:rPr>
             <w:lang w:val="en-GB"/>
           </w:rPr>
-          <w:t>https://mercure.cerfacs.fr/oasis3-mct/examples/regrid_environment/OASIS/</w:t>
-        </w:r>
-        <w:r>
-          <w:rPr>
-            <w:lang w:val="en-GB"/>
-          </w:rPr>
-          <w:t>g</w:t>
-        </w:r>
-        <w:r>
-          <w:rPr>
-            <w:lang w:val="en-GB"/>
-          </w:rPr>
-          <w:t>rids.nc</w:t>
+          <w:t>https://mercure.cerfacs.fr/oasis3-mct/examples/regrid_environment/OASIS/grids.nc</w:t>
         </w:r>
       </w:hyperlink>
       <w:r>
@@ -9895,13 +10035,20 @@
         <w:rPr>
           <w:lang w:val="en-US"/>
         </w:rPr>
-        <w:t>are also copied to the working directory</w:t>
-      </w:r>
-      <w:r>
-        <w:rPr>
-          <w:rStyle w:val="Appelnotedebasdep"/>
+        <w:t xml:space="preserve">are </w:t>
+      </w:r>
+      <w:r>
+        <w:rPr>
           <w:lang w:val="en-US"/>
         </w:rPr>
+        <w:lastRenderedPageBreak/>
+        <w:t>also copied to the working directory</w:t>
+      </w:r>
+      <w:r>
+        <w:rPr>
+          <w:rStyle w:val="FootnoteReference"/>
+          <w:lang w:val="en-US"/>
+        </w:rPr>
         <w:footnoteReference w:id="4"/>
       </w:r>
       <w:r>
@@ -9933,14 +10080,7 @@
         <w:rPr>
           <w:lang w:val="en-US"/>
         </w:rPr>
-        <w:t xml:space="preserve"> which </w:t>
-      </w:r>
-      <w:r>
-        <w:rPr>
-          <w:lang w:val="en-US"/>
-        </w:rPr>
-        <w:lastRenderedPageBreak/>
-        <w:t>transforms the weight file generated by ESMF to the OASIS3-MCT weight file format, is also copied.</w:t>
+        <w:t xml:space="preserve"> which transforms the weight file generated by ESMF to the OASIS3-MCT weight file format, is also copied.</w:t>
       </w:r>
     </w:p>
     <w:p>
@@ -10100,7 +10240,7 @@
     </w:p>
     <w:p>
       <w:pPr>
-        <w:pStyle w:val="Paragraphedeliste"/>
+        <w:pStyle w:val="ListParagraph"/>
         <w:numPr>
           <w:ilvl w:val="1"/>
           <w:numId w:val="5"/>
@@ -10361,7 +10501,7 @@
     </w:p>
     <w:p>
       <w:pPr>
-        <w:pStyle w:val="Paragraphedeliste"/>
+        <w:pStyle w:val="ListParagraph"/>
         <w:numPr>
           <w:ilvl w:val="2"/>
           <w:numId w:val="5"/>
@@ -10428,7 +10568,7 @@
     </w:p>
     <w:p>
       <w:pPr>
-        <w:pStyle w:val="Paragraphedeliste"/>
+        <w:pStyle w:val="ListParagraph"/>
         <w:numPr>
           <w:ilvl w:val="2"/>
           <w:numId w:val="5"/>
@@ -10562,7 +10702,7 @@
     </w:p>
     <w:p>
       <w:pPr>
-        <w:pStyle w:val="Paragraphedeliste"/>
+        <w:pStyle w:val="ListParagraph"/>
         <w:numPr>
           <w:ilvl w:val="0"/>
           <w:numId w:val="8"/>
@@ -10769,7 +10909,7 @@
     </w:p>
     <w:p>
       <w:pPr>
-        <w:pStyle w:val="Paragraphedeliste"/>
+        <w:pStyle w:val="ListParagraph"/>
         <w:numPr>
           <w:ilvl w:val="0"/>
           <w:numId w:val="8"/>
@@ -11026,7 +11166,7 @@
     </w:p>
     <w:p>
       <w:pPr>
-        <w:pStyle w:val="Paragraphedeliste"/>
+        <w:pStyle w:val="ListParagraph"/>
         <w:numPr>
           <w:ilvl w:val="0"/>
           <w:numId w:val="8"/>
@@ -11277,7 +11417,7 @@
     </w:p>
     <w:p>
       <w:pPr>
-        <w:pStyle w:val="Paragraphedeliste"/>
+        <w:pStyle w:val="ListParagraph"/>
         <w:numPr>
           <w:ilvl w:val="0"/>
           <w:numId w:val="8"/>
@@ -11472,7 +11612,7 @@
     </w:p>
     <w:p>
       <w:pPr>
-        <w:pStyle w:val="Paragraphedeliste"/>
+        <w:pStyle w:val="ListParagraph"/>
         <w:numPr>
           <w:ilvl w:val="0"/>
           <w:numId w:val="8"/>
@@ -11710,7 +11850,7 @@
     </w:p>
     <w:p>
       <w:pPr>
-        <w:pStyle w:val="Paragraphedeliste"/>
+        <w:pStyle w:val="ListParagraph"/>
         <w:numPr>
           <w:ilvl w:val="0"/>
           <w:numId w:val="9"/>
@@ -11745,6 +11885,7 @@
           <w:szCs w:val="22"/>
           <w:lang w:val="en-GB"/>
         </w:rPr>
+        <w:lastRenderedPageBreak/>
         <w:t>--</w:t>
       </w:r>
       <w:proofErr w:type="spellStart"/>
@@ -11855,7 +11996,7 @@
     </w:p>
     <w:p>
       <w:pPr>
-        <w:pStyle w:val="Paragraphedeliste"/>
+        <w:pStyle w:val="ListParagraph"/>
         <w:numPr>
           <w:ilvl w:val="0"/>
           <w:numId w:val="9"/>
@@ -11890,7 +12031,6 @@
           <w:szCs w:val="22"/>
           <w:lang w:val="en-GB"/>
         </w:rPr>
-        <w:lastRenderedPageBreak/>
         <w:t>--</w:t>
       </w:r>
       <w:proofErr w:type="spellStart"/>
@@ -11965,7 +12105,7 @@
     </w:p>
     <w:p>
       <w:pPr>
-        <w:pStyle w:val="Paragraphedeliste"/>
+        <w:pStyle w:val="ListParagraph"/>
         <w:numPr>
           <w:ilvl w:val="0"/>
           <w:numId w:val="9"/>
@@ -12063,7 +12203,7 @@
     </w:p>
     <w:p>
       <w:pPr>
-        <w:pStyle w:val="Paragraphedeliste"/>
+        <w:pStyle w:val="ListParagraph"/>
         <w:numPr>
           <w:ilvl w:val="0"/>
           <w:numId w:val="9"/>
@@ -12287,7 +12427,7 @@
     </w:p>
     <w:p>
       <w:pPr>
-        <w:pStyle w:val="Paragraphedeliste"/>
+        <w:pStyle w:val="ListParagraph"/>
         <w:numPr>
           <w:ilvl w:val="2"/>
           <w:numId w:val="5"/>
@@ -12458,7 +12598,7 @@
     </w:p>
     <w:p>
       <w:pPr>
-        <w:pStyle w:val="Paragraphedeliste"/>
+        <w:pStyle w:val="ListParagraph"/>
         <w:numPr>
           <w:ilvl w:val="1"/>
           <w:numId w:val="5"/>
@@ -13276,7 +13416,14 @@
         <w:rPr>
           <w:lang w:val="en-GB"/>
         </w:rPr>
-        <w:t>f conserv2nd is chosen for an LR grid, the gradients in the longitudinal and latitudinal directions</w:t>
+        <w:t xml:space="preserve">f conserv2nd is chosen for an LR grid, the </w:t>
+      </w:r>
+      <w:r>
+        <w:rPr>
+          <w:lang w:val="en-GB"/>
+        </w:rPr>
+        <w:lastRenderedPageBreak/>
+        <w:t>gradients in the longitudinal and latitudinal directions</w:t>
       </w:r>
       <w:r>
         <w:rPr>
@@ -13390,7 +13537,6 @@
         <w:rPr>
           <w:lang w:val="en-GB"/>
         </w:rPr>
-        <w:lastRenderedPageBreak/>
         <w:t xml:space="preserve">The received field is transformed to give the value of 10000 to masked target point and the value of 1.e20 to </w:t>
       </w:r>
       <w:r>
@@ -13607,7 +13753,7 @@
     </w:p>
     <w:p>
       <w:pPr>
-        <w:pStyle w:val="Paragraphedeliste"/>
+        <w:pStyle w:val="ListParagraph"/>
         <w:numPr>
           <w:ilvl w:val="0"/>
           <w:numId w:val="5"/>
@@ -13688,7 +13834,7 @@
     </w:p>
     <w:p>
       <w:pPr>
-        <w:pStyle w:val="Paragraphedeliste"/>
+        <w:pStyle w:val="ListParagraph"/>
         <w:numPr>
           <w:ilvl w:val="0"/>
           <w:numId w:val="10"/>
@@ -13863,7 +14009,7 @@
     </w:p>
     <w:p>
       <w:pPr>
-        <w:pStyle w:val="Paragraphedeliste"/>
+        <w:pStyle w:val="ListParagraph"/>
         <w:numPr>
           <w:ilvl w:val="0"/>
           <w:numId w:val="10"/>
@@ -14053,7 +14199,7 @@
     </w:p>
     <w:p>
       <w:pPr>
-        <w:pStyle w:val="Paragraphedeliste"/>
+        <w:pStyle w:val="ListParagraph"/>
         <w:numPr>
           <w:ilvl w:val="0"/>
           <w:numId w:val="10"/>
@@ -14149,7 +14295,7 @@
     </w:p>
     <w:p>
       <w:pPr>
-        <w:pStyle w:val="Paragraphedeliste"/>
+        <w:pStyle w:val="ListParagraph"/>
         <w:numPr>
           <w:ilvl w:val="0"/>
           <w:numId w:val="10"/>
@@ -14508,7 +14654,7 @@
       <w:hyperlink r:id="rId15" w:history="1">
         <w:r>
           <w:rPr>
-            <w:rStyle w:val="Lienhypertexte"/>
+            <w:rStyle w:val="Hyperlink"/>
             <w:lang w:val="en-GB"/>
           </w:rPr>
           <w:t>oasishelp@cerfacs.fr</w:t>
@@ -14751,7 +14897,7 @@
       <w:hyperlink r:id="rId16" w:history="1">
         <w:r>
           <w:rPr>
-            <w:rStyle w:val="Lienhypertexte"/>
+            <w:rStyle w:val="Hyperlink"/>
           </w:rPr>
           <w:t>https://oasis.cerfacs.fr/wp-content/uploads/sites/114/2021/08/GLOBC_TR_Jonville-SCRIP_CONSERV_TRNORM_partB_2019.pdf</w:t>
         </w:r>
@@ -14812,7 +14958,7 @@
       <w:hyperlink r:id="rId17" w:history="1">
         <w:r>
           <w:rPr>
-            <w:rStyle w:val="Lienhypertexte"/>
+            <w:rStyle w:val="Hyperlink"/>
           </w:rPr>
           <w:t>https://oasis.cerfacs.fr/wp-content/uploads/sites/114/2021/08/GLOBC_WN_Piacentini_Parallel_SCRIP_cmgc_18_34_2018.pdf</w:t>
         </w:r>
@@ -14877,7 +15023,7 @@
       <w:hyperlink r:id="rId18" w:history="1">
         <w:r>
           <w:rPr>
-            <w:rStyle w:val="Lienhypertexte"/>
+            <w:rStyle w:val="Hyperlink"/>
           </w:rPr>
           <w:t>https://oasis.cerfacs.fr/wp-content/uploads/sites/114/2021/08/GLOBC_TR_Valcke-SCRIP_CONSERV_TRNORM_partA_2019.pdf</w:t>
         </w:r>
@@ -15063,7 +15209,7 @@
 <w:ftr xmlns:wpc="http://schemas.microsoft.com/office/word/2010/wordprocessingCanvas" xmlns:cx="http://schemas.microsoft.com/office/drawing/2014/chartex" xmlns:cx1="http://schemas.microsoft.com/office/drawing/2015/9/8/chartex" xmlns:cx2="http://schemas.microsoft.com/office/drawing/2015/10/21/chartex" xmlns:cx3="http://schemas.microsoft.com/office/drawing/2016/5/9/chartex" xmlns:cx4="http://schemas.microsoft.com/office/drawing/2016/5/10/chartex" xmlns:cx5="http://schemas.microsoft.com/office/drawing/2016/5/11/chartex" xmlns:cx6="http://schemas.microsoft.com/office/drawing/2016/5/12/chartex" xmlns:cx7="http://schemas.microsoft.com/office/drawing/2016/5/13/chartex" xmlns:cx8="http://schemas.microsoft.com/office/drawing/2016/5/14/chartex" xmlns:mc="http://schemas.openxmlformats.org/markup-compatibility/2006" xmlns:aink="http://schemas.microsoft.com/office/drawing/2016/ink" xmlns:am3d="http://schemas.microsoft.com/office/drawing/2017/model3d" xmlns:o="urn:schemas-microsoft-com:office:office" xmlns:oel="http://schemas.microsoft.com/office/2019/extlst" xmlns:r="http://schemas.openxmlformats.org/officeDocument/2006/relationships" xmlns:m="http://schemas.openxmlformats.org/officeDocument/2006/math" xmlns:v="urn:schemas-microsoft-com:vml" xmlns:wp14="http://schemas.microsoft.com/office/word/2010/wordprocessingDrawing" xmlns:wp="http://schemas.openxmlformats.org/drawingml/2006/wordprocessingDrawing" xmlns:w10="urn:schemas-microsoft-com:office:word" xmlns:w="http://schemas.openxmlformats.org/wordprocessingml/2006/main" xmlns:w14="http://schemas.microsoft.com/office/word/2010/wordml" xmlns:w15="http://schemas.microsoft.com/office/word/2012/wordml" xmlns:w16cex="http://schemas.microsoft.com/office/word/2018/wordml/cex" xmlns:w16cid="http://schemas.microsoft.com/office/word/2016/wordml/cid" xmlns:w16="http://schemas.microsoft.com/office/word/2018/wordml" xmlns:w16sdtdh="http://schemas.microsoft.com/office/word/2020/wordml/sdtdatahash" xmlns:w16se="http://schemas.microsoft.com/office/word/2015/wordml/symex" xmlns:wpg="http://schemas.microsoft.com/office/word/2010/wordprocessingGroup" xmlns:wpi="http://schemas.microsoft.com/office/word/2010/wordprocessingInk" xmlns:wne="http://schemas.microsoft.com/office/word/2006/wordml" xmlns:wps="http://schemas.microsoft.com/office/word/2010/wordprocessingShape" mc:Ignorable="w14 w15 w16se w16cid w16 w16cex w16sdtdh wp14">
   <w:p>
     <w:pPr>
-      <w:pStyle w:val="Pieddepage"/>
+      <w:pStyle w:val="Footer"/>
     </w:pPr>
   </w:p>
 </w:ftr>
@@ -15073,7 +15219,7 @@
 <w:ftr xmlns:wpc="http://schemas.microsoft.com/office/word/2010/wordprocessingCanvas" xmlns:cx="http://schemas.microsoft.com/office/drawing/2014/chartex" xmlns:cx1="http://schemas.microsoft.com/office/drawing/2015/9/8/chartex" xmlns:cx2="http://schemas.microsoft.com/office/drawing/2015/10/21/chartex" xmlns:cx3="http://schemas.microsoft.com/office/drawing/2016/5/9/chartex" xmlns:cx4="http://schemas.microsoft.com/office/drawing/2016/5/10/chartex" xmlns:cx5="http://schemas.microsoft.com/office/drawing/2016/5/11/chartex" xmlns:cx6="http://schemas.microsoft.com/office/drawing/2016/5/12/chartex" xmlns:cx7="http://schemas.microsoft.com/office/drawing/2016/5/13/chartex" xmlns:cx8="http://schemas.microsoft.com/office/drawing/2016/5/14/chartex" xmlns:mc="http://schemas.openxmlformats.org/markup-compatibility/2006" xmlns:aink="http://schemas.microsoft.com/office/drawing/2016/ink" xmlns:am3d="http://schemas.microsoft.com/office/drawing/2017/model3d" xmlns:o="urn:schemas-microsoft-com:office:office" xmlns:oel="http://schemas.microsoft.com/office/2019/extlst" xmlns:r="http://schemas.openxmlformats.org/officeDocument/2006/relationships" xmlns:m="http://schemas.openxmlformats.org/officeDocument/2006/math" xmlns:v="urn:schemas-microsoft-com:vml" xmlns:wp14="http://schemas.microsoft.com/office/word/2010/wordprocessingDrawing" xmlns:wp="http://schemas.openxmlformats.org/drawingml/2006/wordprocessingDrawing" xmlns:w10="urn:schemas-microsoft-com:office:word" xmlns:w="http://schemas.openxmlformats.org/wordprocessingml/2006/main" xmlns:w14="http://schemas.microsoft.com/office/word/2010/wordml" xmlns:w15="http://schemas.microsoft.com/office/word/2012/wordml" xmlns:w16cex="http://schemas.microsoft.com/office/word/2018/wordml/cex" xmlns:w16cid="http://schemas.microsoft.com/office/word/2016/wordml/cid" xmlns:w16="http://schemas.microsoft.com/office/word/2018/wordml" xmlns:w16sdtdh="http://schemas.microsoft.com/office/word/2020/wordml/sdtdatahash" xmlns:w16se="http://schemas.microsoft.com/office/word/2015/wordml/symex" xmlns:wpg="http://schemas.microsoft.com/office/word/2010/wordprocessingGroup" xmlns:wpi="http://schemas.microsoft.com/office/word/2010/wordprocessingInk" xmlns:wne="http://schemas.microsoft.com/office/word/2006/wordml" xmlns:wps="http://schemas.microsoft.com/office/word/2010/wordprocessingShape" mc:Ignorable="w14 w15 w16se w16cid w16 w16cex w16sdtdh wp14">
   <w:p>
     <w:pPr>
-      <w:pStyle w:val="Pieddepage"/>
+      <w:pStyle w:val="Footer"/>
       <w:jc w:val="right"/>
     </w:pPr>
     <w:r>
@@ -15097,7 +15243,7 @@
   </w:p>
   <w:p>
     <w:pPr>
-      <w:pStyle w:val="Pieddepage"/>
+      <w:pStyle w:val="Footer"/>
     </w:pPr>
   </w:p>
 </w:ftr>
@@ -15107,7 +15253,7 @@
 <w:ftr xmlns:wpc="http://schemas.microsoft.com/office/word/2010/wordprocessingCanvas" xmlns:cx="http://schemas.microsoft.com/office/drawing/2014/chartex" xmlns:cx1="http://schemas.microsoft.com/office/drawing/2015/9/8/chartex" xmlns:cx2="http://schemas.microsoft.com/office/drawing/2015/10/21/chartex" xmlns:cx3="http://schemas.microsoft.com/office/drawing/2016/5/9/chartex" xmlns:cx4="http://schemas.microsoft.com/office/drawing/2016/5/10/chartex" xmlns:cx5="http://schemas.microsoft.com/office/drawing/2016/5/11/chartex" xmlns:cx6="http://schemas.microsoft.com/office/drawing/2016/5/12/chartex" xmlns:cx7="http://schemas.microsoft.com/office/drawing/2016/5/13/chartex" xmlns:cx8="http://schemas.microsoft.com/office/drawing/2016/5/14/chartex" xmlns:mc="http://schemas.openxmlformats.org/markup-compatibility/2006" xmlns:aink="http://schemas.microsoft.com/office/drawing/2016/ink" xmlns:am3d="http://schemas.microsoft.com/office/drawing/2017/model3d" xmlns:o="urn:schemas-microsoft-com:office:office" xmlns:oel="http://schemas.microsoft.com/office/2019/extlst" xmlns:r="http://schemas.openxmlformats.org/officeDocument/2006/relationships" xmlns:m="http://schemas.openxmlformats.org/officeDocument/2006/math" xmlns:v="urn:schemas-microsoft-com:vml" xmlns:wp14="http://schemas.microsoft.com/office/word/2010/wordprocessingDrawing" xmlns:wp="http://schemas.openxmlformats.org/drawingml/2006/wordprocessingDrawing" xmlns:w10="urn:schemas-microsoft-com:office:word" xmlns:w="http://schemas.openxmlformats.org/wordprocessingml/2006/main" xmlns:w14="http://schemas.microsoft.com/office/word/2010/wordml" xmlns:w15="http://schemas.microsoft.com/office/word/2012/wordml" xmlns:w16cex="http://schemas.microsoft.com/office/word/2018/wordml/cex" xmlns:w16cid="http://schemas.microsoft.com/office/word/2016/wordml/cid" xmlns:w16="http://schemas.microsoft.com/office/word/2018/wordml" xmlns:w16sdtdh="http://schemas.microsoft.com/office/word/2020/wordml/sdtdatahash" xmlns:w16se="http://schemas.microsoft.com/office/word/2015/wordml/symex" xmlns:wpg="http://schemas.microsoft.com/office/word/2010/wordprocessingGroup" xmlns:wpi="http://schemas.microsoft.com/office/word/2010/wordprocessingInk" xmlns:wne="http://schemas.microsoft.com/office/word/2006/wordml" xmlns:wps="http://schemas.microsoft.com/office/word/2010/wordprocessingShape" mc:Ignorable="w14 w15 w16se w16cid w16 w16cex w16sdtdh wp14">
   <w:p>
     <w:pPr>
-      <w:pStyle w:val="Pieddepage"/>
+      <w:pStyle w:val="Footer"/>
     </w:pPr>
   </w:p>
 </w:ftr>
@@ -15140,7 +15286,7 @@
       </w:pPr>
       <w:r>
         <w:rPr>
-          <w:rStyle w:val="Appelnotedebasdep"/>
+          <w:rStyle w:val="FootnoteReference"/>
         </w:rPr>
         <w:footnoteRef/>
       </w:r>
@@ -15165,7 +15311,7 @@
     </w:p>
     <w:p>
       <w:pPr>
-        <w:pStyle w:val="Notedebasdepage"/>
+        <w:pStyle w:val="FootnoteText"/>
         <w:rPr>
           <w:lang w:val="en-GB"/>
         </w:rPr>
@@ -15175,14 +15321,14 @@
   <w:footnote w:id="2">
     <w:p>
       <w:pPr>
-        <w:pStyle w:val="Notedebasdepage"/>
+        <w:pStyle w:val="FootnoteText"/>
         <w:rPr>
           <w:lang w:val="en-US"/>
         </w:rPr>
       </w:pPr>
       <w:r>
         <w:rPr>
-          <w:rStyle w:val="Appelnotedebasdep"/>
+          <w:rStyle w:val="FootnoteReference"/>
         </w:rPr>
         <w:footnoteRef/>
       </w:r>
@@ -15239,7 +15385,7 @@
   <w:footnote w:id="3">
     <w:p>
       <w:pPr>
-        <w:pStyle w:val="Notedebasdepage"/>
+        <w:pStyle w:val="FootnoteText"/>
         <w:rPr>
           <w:sz w:val="22"/>
           <w:szCs w:val="22"/>
@@ -15248,7 +15394,7 @@
       </w:pPr>
       <w:r>
         <w:rPr>
-          <w:rStyle w:val="Appelnotedebasdep"/>
+          <w:rStyle w:val="FootnoteReference"/>
         </w:rPr>
         <w:footnoteRef/>
       </w:r>
@@ -15271,7 +15417,7 @@
   <w:footnote w:id="4">
     <w:p>
       <w:pPr>
-        <w:pStyle w:val="Notedebasdepage"/>
+        <w:pStyle w:val="FootnoteText"/>
         <w:rPr>
           <w:sz w:val="22"/>
           <w:szCs w:val="22"/>
@@ -15280,7 +15426,7 @@
       </w:pPr>
       <w:r>
         <w:rPr>
-          <w:rStyle w:val="Appelnotedebasdep"/>
+          <w:rStyle w:val="FootnoteReference"/>
           <w:sz w:val="22"/>
           <w:szCs w:val="22"/>
         </w:rPr>
@@ -15441,7 +15587,7 @@
 <w:hdr xmlns:wpc="http://schemas.microsoft.com/office/word/2010/wordprocessingCanvas" xmlns:cx="http://schemas.microsoft.com/office/drawing/2014/chartex" xmlns:cx1="http://schemas.microsoft.com/office/drawing/2015/9/8/chartex" xmlns:cx2="http://schemas.microsoft.com/office/drawing/2015/10/21/chartex" xmlns:cx3="http://schemas.microsoft.com/office/drawing/2016/5/9/chartex" xmlns:cx4="http://schemas.microsoft.com/office/drawing/2016/5/10/chartex" xmlns:cx5="http://schemas.microsoft.com/office/drawing/2016/5/11/chartex" xmlns:cx6="http://schemas.microsoft.com/office/drawing/2016/5/12/chartex" xmlns:cx7="http://schemas.microsoft.com/office/drawing/2016/5/13/chartex" xmlns:cx8="http://schemas.microsoft.com/office/drawing/2016/5/14/chartex" xmlns:mc="http://schemas.openxmlformats.org/markup-compatibility/2006" xmlns:aink="http://schemas.microsoft.com/office/drawing/2016/ink" xmlns:am3d="http://schemas.microsoft.com/office/drawing/2017/model3d" xmlns:o="urn:schemas-microsoft-com:office:office" xmlns:oel="http://schemas.microsoft.com/office/2019/extlst" xmlns:r="http://schemas.openxmlformats.org/officeDocument/2006/relationships" xmlns:m="http://schemas.openxmlformats.org/officeDocument/2006/math" xmlns:v="urn:schemas-microsoft-com:vml" xmlns:wp14="http://schemas.microsoft.com/office/word/2010/wordprocessingDrawing" xmlns:wp="http://schemas.openxmlformats.org/drawingml/2006/wordprocessingDrawing" xmlns:w10="urn:schemas-microsoft-com:office:word" xmlns:w="http://schemas.openxmlformats.org/wordprocessingml/2006/main" xmlns:w14="http://schemas.microsoft.com/office/word/2010/wordml" xmlns:w15="http://schemas.microsoft.com/office/word/2012/wordml" xmlns:w16cex="http://schemas.microsoft.com/office/word/2018/wordml/cex" xmlns:w16cid="http://schemas.microsoft.com/office/word/2016/wordml/cid" xmlns:w16="http://schemas.microsoft.com/office/word/2018/wordml" xmlns:w16sdtdh="http://schemas.microsoft.com/office/word/2020/wordml/sdtdatahash" xmlns:w16se="http://schemas.microsoft.com/office/word/2015/wordml/symex" xmlns:wpg="http://schemas.microsoft.com/office/word/2010/wordprocessingGroup" xmlns:wpi="http://schemas.microsoft.com/office/word/2010/wordprocessingInk" xmlns:wne="http://schemas.microsoft.com/office/word/2006/wordml" xmlns:wps="http://schemas.microsoft.com/office/word/2010/wordprocessingShape" mc:Ignorable="w14 w15 w16se w16cid w16 w16cex w16sdtdh wp14">
   <w:p>
     <w:pPr>
-      <w:pStyle w:val="En-tte"/>
+      <w:pStyle w:val="Header"/>
     </w:pPr>
   </w:p>
 </w:hdr>
@@ -15451,7 +15597,7 @@
 <w:hdr xmlns:wpc="http://schemas.microsoft.com/office/word/2010/wordprocessingCanvas" xmlns:cx="http://schemas.microsoft.com/office/drawing/2014/chartex" xmlns:cx1="http://schemas.microsoft.com/office/drawing/2015/9/8/chartex" xmlns:cx2="http://schemas.microsoft.com/office/drawing/2015/10/21/chartex" xmlns:cx3="http://schemas.microsoft.com/office/drawing/2016/5/9/chartex" xmlns:cx4="http://schemas.microsoft.com/office/drawing/2016/5/10/chartex" xmlns:cx5="http://schemas.microsoft.com/office/drawing/2016/5/11/chartex" xmlns:cx6="http://schemas.microsoft.com/office/drawing/2016/5/12/chartex" xmlns:cx7="http://schemas.microsoft.com/office/drawing/2016/5/13/chartex" xmlns:cx8="http://schemas.microsoft.com/office/drawing/2016/5/14/chartex" xmlns:mc="http://schemas.openxmlformats.org/markup-compatibility/2006" xmlns:aink="http://schemas.microsoft.com/office/drawing/2016/ink" xmlns:am3d="http://schemas.microsoft.com/office/drawing/2017/model3d" xmlns:o="urn:schemas-microsoft-com:office:office" xmlns:oel="http://schemas.microsoft.com/office/2019/extlst" xmlns:r="http://schemas.openxmlformats.org/officeDocument/2006/relationships" xmlns:m="http://schemas.openxmlformats.org/officeDocument/2006/math" xmlns:v="urn:schemas-microsoft-com:vml" xmlns:wp14="http://schemas.microsoft.com/office/word/2010/wordprocessingDrawing" xmlns:wp="http://schemas.openxmlformats.org/drawingml/2006/wordprocessingDrawing" xmlns:w10="urn:schemas-microsoft-com:office:word" xmlns:w="http://schemas.openxmlformats.org/wordprocessingml/2006/main" xmlns:w14="http://schemas.microsoft.com/office/word/2010/wordml" xmlns:w15="http://schemas.microsoft.com/office/word/2012/wordml" xmlns:w16cex="http://schemas.microsoft.com/office/word/2018/wordml/cex" xmlns:w16cid="http://schemas.microsoft.com/office/word/2016/wordml/cid" xmlns:w16="http://schemas.microsoft.com/office/word/2018/wordml" xmlns:w16sdtdh="http://schemas.microsoft.com/office/word/2020/wordml/sdtdatahash" xmlns:w16se="http://schemas.microsoft.com/office/word/2015/wordml/symex" xmlns:wpg="http://schemas.microsoft.com/office/word/2010/wordprocessingGroup" xmlns:wpi="http://schemas.microsoft.com/office/word/2010/wordprocessingInk" xmlns:wne="http://schemas.microsoft.com/office/word/2006/wordml" xmlns:wps="http://schemas.microsoft.com/office/word/2010/wordprocessingShape" mc:Ignorable="w14 w15 w16se w16cid w16 w16cex w16sdtdh wp14">
   <w:p>
     <w:pPr>
-      <w:pStyle w:val="En-tte"/>
+      <w:pStyle w:val="Header"/>
     </w:pPr>
   </w:p>
 </w:hdr>
@@ -15461,7 +15607,7 @@
 <w:hdr xmlns:wpc="http://schemas.microsoft.com/office/word/2010/wordprocessingCanvas" xmlns:cx="http://schemas.microsoft.com/office/drawing/2014/chartex" xmlns:cx1="http://schemas.microsoft.com/office/drawing/2015/9/8/chartex" xmlns:cx2="http://schemas.microsoft.com/office/drawing/2015/10/21/chartex" xmlns:cx3="http://schemas.microsoft.com/office/drawing/2016/5/9/chartex" xmlns:cx4="http://schemas.microsoft.com/office/drawing/2016/5/10/chartex" xmlns:cx5="http://schemas.microsoft.com/office/drawing/2016/5/11/chartex" xmlns:cx6="http://schemas.microsoft.com/office/drawing/2016/5/12/chartex" xmlns:cx7="http://schemas.microsoft.com/office/drawing/2016/5/13/chartex" xmlns:cx8="http://schemas.microsoft.com/office/drawing/2016/5/14/chartex" xmlns:mc="http://schemas.openxmlformats.org/markup-compatibility/2006" xmlns:aink="http://schemas.microsoft.com/office/drawing/2016/ink" xmlns:am3d="http://schemas.microsoft.com/office/drawing/2017/model3d" xmlns:o="urn:schemas-microsoft-com:office:office" xmlns:oel="http://schemas.microsoft.com/office/2019/extlst" xmlns:r="http://schemas.openxmlformats.org/officeDocument/2006/relationships" xmlns:m="http://schemas.openxmlformats.org/officeDocument/2006/math" xmlns:v="urn:schemas-microsoft-com:vml" xmlns:wp14="http://schemas.microsoft.com/office/word/2010/wordprocessingDrawing" xmlns:wp="http://schemas.openxmlformats.org/drawingml/2006/wordprocessingDrawing" xmlns:w10="urn:schemas-microsoft-com:office:word" xmlns:w="http://schemas.openxmlformats.org/wordprocessingml/2006/main" xmlns:w14="http://schemas.microsoft.com/office/word/2010/wordml" xmlns:w15="http://schemas.microsoft.com/office/word/2012/wordml" xmlns:w16cex="http://schemas.microsoft.com/office/word/2018/wordml/cex" xmlns:w16cid="http://schemas.microsoft.com/office/word/2016/wordml/cid" xmlns:w16="http://schemas.microsoft.com/office/word/2018/wordml" xmlns:w16sdtdh="http://schemas.microsoft.com/office/word/2020/wordml/sdtdatahash" xmlns:w16se="http://schemas.microsoft.com/office/word/2015/wordml/symex" xmlns:wpg="http://schemas.microsoft.com/office/word/2010/wordprocessingGroup" xmlns:wpi="http://schemas.microsoft.com/office/word/2010/wordprocessingInk" xmlns:wne="http://schemas.microsoft.com/office/word/2006/wordml" xmlns:wps="http://schemas.microsoft.com/office/word/2010/wordprocessingShape" mc:Ignorable="w14 w15 w16se w16cid w16 w16cex w16sdtdh wp14">
   <w:p>
     <w:pPr>
-      <w:pStyle w:val="En-tte"/>
+      <w:pStyle w:val="Header"/>
     </w:pPr>
   </w:p>
 </w:hdr>
@@ -17780,11 +17926,6 @@
     <w:lsdException w:name="Book Title" w:uiPriority="33" w:qFormat="1"/>
     <w:lsdException w:name="Bibliography" w:semiHidden="1" w:uiPriority="37" w:unhideWhenUsed="1"/>
     <w:lsdException w:name="TOC Heading" w:semiHidden="1" w:uiPriority="39" w:unhideWhenUsed="1" w:qFormat="1"/>
-    <w:lsdException w:name="Plain Table 5" w:semiHidden="1" w:unhideWhenUsed="1"/>
-    <w:lsdException w:name="Grid Table Light" w:semiHidden="1" w:unhideWhenUsed="1"/>
-    <w:lsdException w:name="Grid Table 1 Light" w:semiHidden="1" w:unhideWhenUsed="1"/>
-    <w:lsdException w:name="Grid Table 2" w:semiHidden="1" w:unhideWhenUsed="1"/>
-    <w:lsdException w:name="Grid Table 3" w:semiHidden="1" w:unhideWhenUsed="1"/>
     <w:lsdException w:name="Grid Table 4" w:uiPriority="49"/>
     <w:lsdException w:name="Grid Table 5 Dark" w:uiPriority="50"/>
     <w:lsdException w:name="Grid Table 6 Colorful" w:uiPriority="51"/>
@@ -17898,13 +18039,13 @@
       <w:lang w:val="fr-FR" w:eastAsia="ar-SA"/>
     </w:rPr>
   </w:style>
-  <w:style w:type="character" w:default="1" w:styleId="Policepardfaut">
+  <w:style w:type="character" w:default="1" w:styleId="DefaultParagraphFont">
     <w:name w:val="Default Paragraph Font"/>
     <w:uiPriority w:val="1"/>
     <w:semiHidden/>
     <w:unhideWhenUsed/>
   </w:style>
-  <w:style w:type="table" w:default="1" w:styleId="TableauNormal">
+  <w:style w:type="table" w:default="1" w:styleId="TableNormal">
     <w:name w:val="Normal Table"/>
     <w:uiPriority w:val="99"/>
     <w:semiHidden/>
@@ -17919,7 +18060,7 @@
       </w:tblCellMar>
     </w:tblPr>
   </w:style>
-  <w:style w:type="numbering" w:default="1" w:styleId="Aucuneliste">
+  <w:style w:type="numbering" w:default="1" w:styleId="NoList">
     <w:name w:val="No List"/>
     <w:uiPriority w:val="99"/>
     <w:semiHidden/>
@@ -18642,7 +18783,7 @@
       <w:rFonts w:ascii="Wingdings" w:hAnsi="Wingdings"/>
     </w:rPr>
   </w:style>
-  <w:style w:type="character" w:styleId="lev">
+  <w:style w:type="character" w:styleId="Strong">
     <w:name w:val="Strong"/>
     <w:qFormat/>
     <w:rPr>
@@ -18650,7 +18791,7 @@
       <w:bCs/>
     </w:rPr>
   </w:style>
-  <w:style w:type="character" w:styleId="Marquedecommentaire">
+  <w:style w:type="character" w:styleId="CommentReference">
     <w:name w:val="annotation reference"/>
     <w:uiPriority w:val="99"/>
     <w:rPr>
@@ -18658,7 +18799,7 @@
       <w:szCs w:val="16"/>
     </w:rPr>
   </w:style>
-  <w:style w:type="character" w:styleId="Lienhypertexte">
+  <w:style w:type="character" w:styleId="Hyperlink">
     <w:name w:val="Hyperlink"/>
     <w:uiPriority w:val="99"/>
     <w:rPr>
@@ -18692,7 +18833,7 @@
   <w:style w:type="paragraph" w:customStyle="1" w:styleId="Heading">
     <w:name w:val="Heading"/>
     <w:basedOn w:val="Normal"/>
-    <w:next w:val="Corpsdetexte"/>
+    <w:next w:val="BodyText"/>
     <w:pPr>
       <w:keepNext/>
       <w:spacing w:before="240" w:after="120"/>
@@ -18703,21 +18844,21 @@
       <w:szCs w:val="28"/>
     </w:rPr>
   </w:style>
-  <w:style w:type="paragraph" w:styleId="Corpsdetexte">
+  <w:style w:type="paragraph" w:styleId="BodyText">
     <w:name w:val="Body Text"/>
     <w:basedOn w:val="Normal"/>
     <w:pPr>
       <w:spacing w:after="120"/>
     </w:pPr>
   </w:style>
-  <w:style w:type="paragraph" w:styleId="Liste">
+  <w:style w:type="paragraph" w:styleId="List">
     <w:name w:val="List"/>
-    <w:basedOn w:val="Corpsdetexte"/>
+    <w:basedOn w:val="BodyText"/>
     <w:rPr>
       <w:rFonts w:cs="Lohit Devanagari"/>
     </w:rPr>
   </w:style>
-  <w:style w:type="paragraph" w:styleId="Lgende">
+  <w:style w:type="paragraph" w:styleId="Caption">
     <w:name w:val="caption"/>
     <w:basedOn w:val="Normal"/>
     <w:qFormat/>
@@ -18741,10 +18882,10 @@
       <w:rFonts w:cs="Lohit Devanagari"/>
     </w:rPr>
   </w:style>
-  <w:style w:type="paragraph" w:styleId="Titre">
+  <w:style w:type="paragraph" w:styleId="Title">
     <w:name w:val="Title"/>
     <w:basedOn w:val="Normal"/>
-    <w:next w:val="Sous-titre"/>
+    <w:next w:val="Subtitle"/>
     <w:qFormat/>
     <w:pPr>
       <w:jc w:val="center"/>
@@ -18755,10 +18896,10 @@
       <w:lang w:val="en-GB"/>
     </w:rPr>
   </w:style>
-  <w:style w:type="paragraph" w:styleId="Sous-titre">
+  <w:style w:type="paragraph" w:styleId="Subtitle">
     <w:name w:val="Subtitle"/>
     <w:basedOn w:val="Heading"/>
-    <w:next w:val="Corpsdetexte"/>
+    <w:next w:val="BodyText"/>
     <w:qFormat/>
     <w:pPr>
       <w:jc w:val="center"/>
@@ -18768,26 +18909,26 @@
       <w:iCs/>
     </w:rPr>
   </w:style>
-  <w:style w:type="paragraph" w:styleId="Commentaire">
+  <w:style w:type="paragraph" w:styleId="CommentText">
     <w:name w:val="annotation text"/>
     <w:basedOn w:val="Normal"/>
-    <w:link w:val="CommentaireCar"/>
+    <w:link w:val="CommentTextChar"/>
     <w:uiPriority w:val="99"/>
     <w:rPr>
       <w:sz w:val="20"/>
       <w:szCs w:val="20"/>
     </w:rPr>
   </w:style>
-  <w:style w:type="paragraph" w:styleId="Objetducommentaire">
+  <w:style w:type="paragraph" w:styleId="CommentSubject">
     <w:name w:val="annotation subject"/>
-    <w:basedOn w:val="Commentaire"/>
-    <w:next w:val="Commentaire"/>
+    <w:basedOn w:val="CommentText"/>
+    <w:next w:val="CommentText"/>
     <w:rPr>
       <w:b/>
       <w:bCs/>
     </w:rPr>
   </w:style>
-  <w:style w:type="paragraph" w:styleId="Textedebulles">
+  <w:style w:type="paragraph" w:styleId="BalloonText">
     <w:name w:val="Balloon Text"/>
     <w:basedOn w:val="Normal"/>
     <w:rPr>
@@ -18796,14 +18937,14 @@
       <w:szCs w:val="16"/>
     </w:rPr>
   </w:style>
-  <w:style w:type="paragraph" w:styleId="Explorateurdedocuments">
+  <w:style w:type="paragraph" w:styleId="DocumentMap">
     <w:name w:val="Document Map"/>
     <w:basedOn w:val="Normal"/>
     <w:rPr>
       <w:rFonts w:ascii="Lucida Grande" w:hAnsi="Lucida Grande"/>
     </w:rPr>
   </w:style>
-  <w:style w:type="paragraph" w:styleId="En-tte">
+  <w:style w:type="paragraph" w:styleId="Header">
     <w:name w:val="header"/>
     <w:basedOn w:val="Normal"/>
     <w:pPr>
@@ -18813,7 +18954,7 @@
       </w:tabs>
     </w:pPr>
   </w:style>
-  <w:style w:type="paragraph" w:styleId="Pieddepage">
+  <w:style w:type="paragraph" w:styleId="Footer">
     <w:name w:val="footer"/>
     <w:basedOn w:val="Normal"/>
     <w:pPr>
@@ -18823,17 +18964,17 @@
       </w:tabs>
     </w:pPr>
   </w:style>
-  <w:style w:type="paragraph" w:styleId="Notedebasdepage">
+  <w:style w:type="paragraph" w:styleId="FootnoteText">
     <w:name w:val="footnote text"/>
     <w:basedOn w:val="Normal"/>
-    <w:link w:val="NotedebasdepageCar"/>
+    <w:link w:val="FootnoteTextChar"/>
     <w:uiPriority w:val="99"/>
     <w:unhideWhenUsed/>
     <w:rsid w:val="002721B6"/>
   </w:style>
-  <w:style w:type="character" w:customStyle="1" w:styleId="NotedebasdepageCar">
-    <w:name w:val="Note de bas de page Car"/>
-    <w:link w:val="Notedebasdepage"/>
+  <w:style w:type="character" w:customStyle="1" w:styleId="FootnoteTextChar">
+    <w:name w:val="Footnote Text Char"/>
+    <w:link w:val="FootnoteText"/>
     <w:uiPriority w:val="99"/>
     <w:rsid w:val="002721B6"/>
     <w:rPr>
@@ -18842,7 +18983,7 @@
       <w:lang w:val="fr-FR" w:eastAsia="ar-SA"/>
     </w:rPr>
   </w:style>
-  <w:style w:type="character" w:styleId="Appelnotedebasdep">
+  <w:style w:type="character" w:styleId="FootnoteReference">
     <w:name w:val="footnote reference"/>
     <w:uiPriority w:val="99"/>
     <w:unhideWhenUsed/>
@@ -18851,7 +18992,7 @@
       <w:vertAlign w:val="superscript"/>
     </w:rPr>
   </w:style>
-  <w:style w:type="paragraph" w:styleId="Rvision">
+  <w:style w:type="paragraph" w:styleId="Revision">
     <w:name w:val="Revision"/>
     <w:hidden/>
     <w:uiPriority w:val="99"/>
@@ -18863,9 +19004,9 @@
       <w:lang w:val="fr-FR" w:eastAsia="ar-SA"/>
     </w:rPr>
   </w:style>
-  <w:style w:type="character" w:customStyle="1" w:styleId="CommentaireCar">
-    <w:name w:val="Commentaire Car"/>
-    <w:link w:val="Commentaire"/>
+  <w:style w:type="character" w:customStyle="1" w:styleId="CommentTextChar">
+    <w:name w:val="Comment Text Char"/>
+    <w:link w:val="CommentText"/>
     <w:uiPriority w:val="99"/>
     <w:rsid w:val="001A3160"/>
     <w:rPr>
@@ -18881,7 +19022,7 @@
       <w:lang w:val="fr-FR" w:eastAsia="fr-FR"/>
     </w:rPr>
   </w:style>
-  <w:style w:type="paragraph" w:styleId="Paragraphedeliste">
+  <w:style w:type="paragraph" w:styleId="ListParagraph">
     <w:name w:val="List Paragraph"/>
     <w:basedOn w:val="Normal"/>
     <w:uiPriority w:val="34"/>
@@ -18894,7 +19035,7 @@
   </w:style>
   <w:style w:type="character" w:customStyle="1" w:styleId="UnresolvedMention1">
     <w:name w:val="Unresolved Mention1"/>
-    <w:basedOn w:val="Policepardfaut"/>
+    <w:basedOn w:val="DefaultParagraphFont"/>
     <w:uiPriority w:val="99"/>
     <w:semiHidden/>
     <w:unhideWhenUsed/>
@@ -18906,12 +19047,12 @@
   </w:style>
   <w:style w:type="character" w:customStyle="1" w:styleId="apple-converted-space">
     <w:name w:val="apple-converted-space"/>
-    <w:basedOn w:val="Policepardfaut"/>
+    <w:basedOn w:val="DefaultParagraphFont"/>
     <w:rsid w:val="0063015F"/>
   </w:style>
-  <w:style w:type="character" w:styleId="Lienhypertextesuivivisit">
+  <w:style w:type="character" w:styleId="FollowedHyperlink">
     <w:name w:val="FollowedHyperlink"/>
-    <w:basedOn w:val="Policepardfaut"/>
+    <w:basedOn w:val="DefaultParagraphFont"/>
     <w:uiPriority w:val="99"/>
     <w:semiHidden/>
     <w:unhideWhenUsed/>

</xml_diff>

<commit_message>
Further adaptations to standard compiling environment for regrid_environment
Former-commit-id: 6b6eeb9fb919fedc2a9976827795fecb613fd89d
</commit_message>
<xml_diff>
--- a/examples/regrid_environment/regrid_environment_documentation.docx
+++ b/examples/regrid_environment/regrid_environment_documentation.docx
@@ -5254,7 +5254,233 @@
         <w:rPr>
           <w:lang w:val="en-GB"/>
         </w:rPr>
-        <w:t xml:space="preserve">, using the </w:t>
+        <w:t>, using the</w:t>
+      </w:r>
+      <w:r>
+        <w:rPr>
+          <w:lang w:val="en-GB"/>
+        </w:rPr>
+        <w:t xml:space="preserve"> script</w:t>
+      </w:r>
+      <w:r>
+        <w:rPr>
+          <w:lang w:val="en-GB"/>
+        </w:rPr>
+        <w:t xml:space="preserve"> </w:t>
+      </w:r>
+      <w:proofErr w:type="gramStart"/>
+      <w:r>
+        <w:rPr>
+          <w:rFonts w:ascii="Courier New" w:hAnsi="Courier New" w:cs="Courier New"/>
+          <w:lang w:val="en-GB"/>
+        </w:rPr>
+        <w:t>src/</w:t>
+      </w:r>
+      <w:r>
+        <w:rPr>
+          <w:rFonts w:ascii="Courier New" w:hAnsi="Courier New" w:cs="Courier New"/>
+          <w:lang w:val="en-GB"/>
+        </w:rPr>
+        <w:t>oasis_test_build.sh</w:t>
+      </w:r>
+      <w:r>
+        <w:rPr>
+          <w:rFonts w:ascii="Courier New" w:hAnsi="Courier New" w:cs="Courier New"/>
+          <w:lang w:val="en-GB"/>
+        </w:rPr>
+        <w:t xml:space="preserve"> </w:t>
+      </w:r>
+      <w:r>
+        <w:rPr>
+          <w:lang w:val="en-GB"/>
+        </w:rPr>
+        <w:t>.</w:t>
+      </w:r>
+      <w:proofErr w:type="gramEnd"/>
+      <w:r>
+        <w:rPr>
+          <w:lang w:val="en-GB"/>
+        </w:rPr>
+        <w:t xml:space="preserve"> </w:t>
+      </w:r>
+      <w:r>
+        <w:rPr>
+          <w:lang w:val="en-GB"/>
+        </w:rPr>
+        <w:t>Following the rules of OASIS3-MCT compiling environment effective since December 2022,</w:t>
+      </w:r>
+      <w:r>
+        <w:rPr>
+          <w:lang w:val="en-US"/>
+        </w:rPr>
+        <w:t xml:space="preserve"> </w:t>
+      </w:r>
+      <w:r>
+        <w:rPr>
+          <w:rFonts w:ascii="Courier New" w:hAnsi="Courier New" w:cs="Courier New"/>
+          <w:lang w:val="en-GB"/>
+        </w:rPr>
+        <w:t>$OASIS_COUPLE</w:t>
+      </w:r>
+      <w:r>
+        <w:rPr>
+          <w:lang w:val="en-GB"/>
+        </w:rPr>
+        <w:t xml:space="preserve"> and </w:t>
+      </w:r>
+      <w:r>
+        <w:rPr>
+          <w:rFonts w:ascii="Courier New" w:hAnsi="Courier New" w:cs="Courier New"/>
+          <w:lang w:val="en-GB"/>
+        </w:rPr>
+        <w:t>$OASIS_ENV</w:t>
+      </w:r>
+      <w:r>
+        <w:rPr>
+          <w:lang w:val="en-GB"/>
+        </w:rPr>
+        <w:t xml:space="preserve"> </w:t>
+      </w:r>
+      <w:r>
+        <w:rPr>
+          <w:lang w:val="en-GB"/>
+        </w:rPr>
+        <w:t xml:space="preserve">are two environment variables that must be defined. </w:t>
+      </w:r>
+      <w:r>
+        <w:rPr>
+          <w:rFonts w:ascii="Courier New" w:hAnsi="Courier New" w:cs="Courier New"/>
+          <w:lang w:val="en-GB"/>
+        </w:rPr>
+        <w:t>$OASIS_COUPLE</w:t>
+      </w:r>
+      <w:r>
+        <w:rPr>
+          <w:lang w:val="en-GB"/>
+        </w:rPr>
+        <w:t xml:space="preserve"> gives the path</w:t>
+      </w:r>
+      <w:r>
+        <w:rPr>
+          <w:lang w:val="en-GB"/>
+        </w:rPr>
+        <w:t xml:space="preserve"> of the sources of the coupler (/</w:t>
+      </w:r>
+      <w:r>
+        <w:rPr>
+          <w:rFonts w:ascii="Courier New" w:hAnsi="Courier New" w:cs="Courier New"/>
+          <w:lang w:val="en-GB"/>
+        </w:rPr>
+        <w:t>lib, /util, /examples</w:t>
+      </w:r>
+      <w:r>
+        <w:rPr>
+          <w:lang w:val="en-GB"/>
+        </w:rPr>
+        <w:t>, etc. directories)</w:t>
+      </w:r>
+      <w:r>
+        <w:rPr>
+          <w:lang w:val="en-GB"/>
+        </w:rPr>
+        <w:t xml:space="preserve">. </w:t>
+      </w:r>
+      <w:r>
+        <w:rPr>
+          <w:rFonts w:ascii="Courier New" w:hAnsi="Courier New" w:cs="Courier New"/>
+          <w:lang w:val="en-GB"/>
+        </w:rPr>
+        <w:t>$OASIS_ENV</w:t>
+      </w:r>
+      <w:r>
+        <w:rPr>
+          <w:lang w:val="en-GB"/>
+        </w:rPr>
+        <w:t xml:space="preserve"> </w:t>
+      </w:r>
+      <w:r>
+        <w:rPr>
+          <w:lang w:val="en-GB"/>
+        </w:rPr>
+        <w:t xml:space="preserve">gives the extension of the header </w:t>
+      </w:r>
+      <w:proofErr w:type="spellStart"/>
+      <w:r>
+        <w:rPr>
+          <w:lang w:val="en-GB"/>
+        </w:rPr>
+        <w:t>Makefile</w:t>
+      </w:r>
+      <w:proofErr w:type="spellEnd"/>
+      <w:r>
+        <w:rPr>
+          <w:lang w:val="en-GB"/>
+        </w:rPr>
+        <w:t xml:space="preserve"> </w:t>
+      </w:r>
+      <w:proofErr w:type="gramStart"/>
+      <w:r>
+        <w:rPr>
+          <w:rFonts w:ascii="Courier New" w:hAnsi="Courier New" w:cs="Courier New"/>
+          <w:lang w:val="en-GB"/>
+        </w:rPr>
+        <w:t>make.$</w:t>
+      </w:r>
+      <w:proofErr w:type="gramEnd"/>
+      <w:r>
+        <w:rPr>
+          <w:rFonts w:ascii="Courier New" w:hAnsi="Courier New" w:cs="Courier New"/>
+          <w:lang w:val="en-GB"/>
+        </w:rPr>
+        <w:t>{OASIS_ENV}</w:t>
+      </w:r>
+      <w:r>
+        <w:rPr>
+          <w:lang w:val="en-GB"/>
+        </w:rPr>
+        <w:t xml:space="preserve"> from the directory </w:t>
+      </w:r>
+      <w:r>
+        <w:rPr>
+          <w:rFonts w:ascii="Courier New" w:hAnsi="Courier New" w:cs="Courier New"/>
+          <w:lang w:val="en-GB"/>
+        </w:rPr>
+        <w:t>${OASIS_COUPLE}</w:t>
+      </w:r>
+      <w:r>
+        <w:rPr>
+          <w:rFonts w:ascii="Courier New" w:hAnsi="Courier New" w:cs="Courier New"/>
+          <w:lang w:val="en-GB"/>
+        </w:rPr>
+        <w:t>/util/</w:t>
+      </w:r>
+      <w:proofErr w:type="spellStart"/>
+      <w:r>
+        <w:rPr>
+          <w:rFonts w:ascii="Courier New" w:hAnsi="Courier New" w:cs="Courier New"/>
+          <w:lang w:val="en-GB"/>
+        </w:rPr>
+        <w:t>make_dir</w:t>
+      </w:r>
+      <w:proofErr w:type="spellEnd"/>
+      <w:r>
+        <w:rPr>
+          <w:rFonts w:ascii="Courier New" w:hAnsi="Courier New" w:cs="Courier New"/>
+          <w:lang w:val="en-GB"/>
+        </w:rPr>
+        <w:t xml:space="preserve"> </w:t>
+      </w:r>
+      <w:r>
+        <w:rPr>
+          <w:lang w:val="en-GB"/>
+        </w:rPr>
+        <w:t xml:space="preserve">used to compile OASIS3-MCT itself. </w:t>
+      </w:r>
+      <w:r>
+        <w:rPr>
+          <w:lang w:val="en-GB"/>
+        </w:rPr>
+        <w:t xml:space="preserve">Note that </w:t>
       </w:r>
       <w:proofErr w:type="spellStart"/>
       <w:r>
@@ -5286,256 +5512,6 @@
           <w:lang w:val="en-GB"/>
         </w:rPr>
         <w:t>akefile</w:t>
-      </w:r>
-      <w:proofErr w:type="spellEnd"/>
-      <w:r>
-        <w:rPr>
-          <w:lang w:val="en-GB"/>
-        </w:rPr>
-        <w:t xml:space="preserve">. </w:t>
-      </w:r>
-      <w:r>
-        <w:rPr>
-          <w:lang w:val="en-GB"/>
-        </w:rPr>
-        <w:t>Following the rules of OASIS3-MCT compiling environment effective since December 2022,</w:t>
-      </w:r>
-      <w:r>
-        <w:rPr>
-          <w:lang w:val="en-US"/>
-        </w:rPr>
-        <w:t xml:space="preserve"> </w:t>
-      </w:r>
-      <w:r>
-        <w:rPr>
-          <w:rFonts w:ascii="Courier New" w:hAnsi="Courier New" w:cs="Courier New"/>
-          <w:lang w:val="en-GB"/>
-        </w:rPr>
-        <w:t>$</w:t>
-      </w:r>
-      <w:r>
-        <w:rPr>
-          <w:rFonts w:ascii="Courier New" w:hAnsi="Courier New" w:cs="Courier New"/>
-          <w:lang w:val="en-GB"/>
-        </w:rPr>
-        <w:t>OASIS_COUPLE</w:t>
-      </w:r>
-      <w:r>
-        <w:rPr>
-          <w:lang w:val="en-GB"/>
-        </w:rPr>
-        <w:t xml:space="preserve"> and </w:t>
-      </w:r>
-      <w:r>
-        <w:rPr>
-          <w:rFonts w:ascii="Courier New" w:hAnsi="Courier New" w:cs="Courier New"/>
-          <w:lang w:val="en-GB"/>
-        </w:rPr>
-        <w:t>$</w:t>
-      </w:r>
-      <w:r>
-        <w:rPr>
-          <w:rFonts w:ascii="Courier New" w:hAnsi="Courier New" w:cs="Courier New"/>
-          <w:lang w:val="en-GB"/>
-        </w:rPr>
-        <w:t>OASIS_ENV</w:t>
-      </w:r>
-      <w:r>
-        <w:rPr>
-          <w:lang w:val="en-GB"/>
-        </w:rPr>
-        <w:t xml:space="preserve"> </w:t>
-      </w:r>
-      <w:r>
-        <w:rPr>
-          <w:lang w:val="en-GB"/>
-        </w:rPr>
-        <w:t xml:space="preserve">are two environment variables that must be defined. </w:t>
-      </w:r>
-      <w:r>
-        <w:rPr>
-          <w:rFonts w:ascii="Courier New" w:hAnsi="Courier New" w:cs="Courier New"/>
-          <w:lang w:val="en-GB"/>
-        </w:rPr>
-        <w:t>$OASIS_COUPLE</w:t>
-      </w:r>
-      <w:r>
-        <w:rPr>
-          <w:lang w:val="en-GB"/>
-        </w:rPr>
-        <w:t xml:space="preserve"> </w:t>
-      </w:r>
-      <w:r>
-        <w:rPr>
-          <w:lang w:val="en-GB"/>
-        </w:rPr>
-        <w:t>gives</w:t>
-      </w:r>
-      <w:r>
-        <w:rPr>
-          <w:lang w:val="en-GB"/>
-        </w:rPr>
-        <w:t xml:space="preserve"> the </w:t>
-      </w:r>
-      <w:r>
-        <w:rPr>
-          <w:lang w:val="en-GB"/>
-        </w:rPr>
-        <w:t>path</w:t>
-      </w:r>
-      <w:r>
-        <w:rPr>
-          <w:lang w:val="en-GB"/>
-        </w:rPr>
-        <w:t xml:space="preserve"> of the sources of the coupler (/</w:t>
-      </w:r>
-      <w:r>
-        <w:rPr>
-          <w:rFonts w:ascii="Courier New" w:hAnsi="Courier New" w:cs="Courier New"/>
-          <w:lang w:val="en-GB"/>
-        </w:rPr>
-        <w:t>lib, /util, /examples</w:t>
-      </w:r>
-      <w:r>
-        <w:rPr>
-          <w:lang w:val="en-GB"/>
-        </w:rPr>
-        <w:t>, etc. directories)</w:t>
-      </w:r>
-      <w:r>
-        <w:rPr>
-          <w:lang w:val="en-GB"/>
-        </w:rPr>
-        <w:t>.</w:t>
-      </w:r>
-      <w:r>
-        <w:rPr>
-          <w:lang w:val="en-GB"/>
-        </w:rPr>
-        <w:t xml:space="preserve"> </w:t>
-      </w:r>
-      <w:r>
-        <w:rPr>
-          <w:rFonts w:ascii="Courier New" w:hAnsi="Courier New" w:cs="Courier New"/>
-          <w:lang w:val="en-GB"/>
-        </w:rPr>
-        <w:t>$OASIS_ENV</w:t>
-      </w:r>
-      <w:r>
-        <w:rPr>
-          <w:lang w:val="en-GB"/>
-        </w:rPr>
-        <w:t xml:space="preserve"> </w:t>
-      </w:r>
-      <w:r>
-        <w:rPr>
-          <w:lang w:val="en-GB"/>
-        </w:rPr>
-        <w:t xml:space="preserve">gives the extension of the </w:t>
-      </w:r>
-      <w:r>
-        <w:rPr>
-          <w:lang w:val="en-GB"/>
-        </w:rPr>
-        <w:t xml:space="preserve">header </w:t>
-      </w:r>
-      <w:proofErr w:type="spellStart"/>
-      <w:r>
-        <w:rPr>
-          <w:lang w:val="en-GB"/>
-        </w:rPr>
-        <w:t>Makefile</w:t>
-      </w:r>
-      <w:proofErr w:type="spellEnd"/>
-      <w:r>
-        <w:rPr>
-          <w:lang w:val="en-GB"/>
-        </w:rPr>
-        <w:t xml:space="preserve"> </w:t>
-      </w:r>
-      <w:proofErr w:type="gramStart"/>
-      <w:r>
-        <w:rPr>
-          <w:rFonts w:ascii="Courier New" w:hAnsi="Courier New" w:cs="Courier New"/>
-          <w:lang w:val="en-GB"/>
-        </w:rPr>
-        <w:t>make.$</w:t>
-      </w:r>
-      <w:proofErr w:type="gramEnd"/>
-      <w:r>
-        <w:rPr>
-          <w:rFonts w:ascii="Courier New" w:hAnsi="Courier New" w:cs="Courier New"/>
-          <w:lang w:val="en-GB"/>
-        </w:rPr>
-        <w:t>{OASIS_ENV}</w:t>
-      </w:r>
-      <w:r>
-        <w:rPr>
-          <w:lang w:val="en-GB"/>
-        </w:rPr>
-        <w:t xml:space="preserve"> </w:t>
-      </w:r>
-      <w:r>
-        <w:rPr>
-          <w:lang w:val="en-GB"/>
-        </w:rPr>
-        <w:t xml:space="preserve">from the directory </w:t>
-      </w:r>
-      <w:r>
-        <w:rPr>
-          <w:rFonts w:ascii="Courier New" w:hAnsi="Courier New" w:cs="Courier New"/>
-          <w:lang w:val="en-GB"/>
-        </w:rPr>
-        <w:t>${OASIS_COUPLE}</w:t>
-      </w:r>
-      <w:r>
-        <w:rPr>
-          <w:rFonts w:ascii="Courier New" w:hAnsi="Courier New" w:cs="Courier New"/>
-          <w:lang w:val="en-GB"/>
-        </w:rPr>
-        <w:t>/util/</w:t>
-      </w:r>
-      <w:proofErr w:type="spellStart"/>
-      <w:r>
-        <w:rPr>
-          <w:rFonts w:ascii="Courier New" w:hAnsi="Courier New" w:cs="Courier New"/>
-          <w:lang w:val="en-GB"/>
-        </w:rPr>
-        <w:t>make_dir</w:t>
-      </w:r>
-      <w:proofErr w:type="spellEnd"/>
-      <w:r>
-        <w:rPr>
-          <w:rFonts w:ascii="Courier New" w:hAnsi="Courier New" w:cs="Courier New"/>
-          <w:lang w:val="en-GB"/>
-        </w:rPr>
-        <w:t xml:space="preserve"> </w:t>
-      </w:r>
-      <w:r>
-        <w:rPr>
-          <w:lang w:val="en-GB"/>
-        </w:rPr>
-        <w:t>that was used to compile OASIS3-MCT itself.</w:t>
-      </w:r>
-      <w:r>
-        <w:rPr>
-          <w:lang w:val="en-GB"/>
-        </w:rPr>
-        <w:t xml:space="preserve"> </w:t>
-      </w:r>
-      <w:r>
-        <w:rPr>
-          <w:lang w:val="en-GB"/>
-        </w:rPr>
-        <w:t xml:space="preserve">The </w:t>
-      </w:r>
-      <w:proofErr w:type="spellStart"/>
-      <w:r>
-        <w:rPr>
-          <w:rFonts w:ascii="Courier New" w:hAnsi="Courier New" w:cs="Courier New"/>
-          <w:lang w:val="en-GB"/>
-        </w:rPr>
-        <w:t>Makefile</w:t>
       </w:r>
       <w:proofErr w:type="spellEnd"/>
       <w:r>
@@ -5587,10 +5563,16 @@
       </w:r>
       <w:r>
         <w:rPr>
-          <w:rFonts w:ascii="Courier New" w:hAnsi="Courier New" w:cs="Courier New"/>
-          <w:lang w:val="en-GB"/>
-        </w:rPr>
-        <w:t>make</w:t>
+          <w:lang w:val="en-GB"/>
+        </w:rPr>
+        <w:t>./</w:t>
+      </w:r>
+      <w:r>
+        <w:rPr>
+          <w:rFonts w:ascii="Courier New" w:hAnsi="Courier New" w:cs="Courier New"/>
+          <w:lang w:val="en-GB"/>
+        </w:rPr>
+        <w:t>oasis_test_build.sh</w:t>
       </w:r>
       <w:r>
         <w:rPr>
@@ -5631,13 +5613,7 @@
         <w:rPr>
           <w:lang w:val="en-GB"/>
         </w:rPr>
-        <w:t>directory</w:t>
-      </w:r>
-      <w:r>
-        <w:rPr>
-          <w:lang w:val="en-GB"/>
-        </w:rPr>
-        <w:t xml:space="preserve"> </w:t>
+        <w:t xml:space="preserve">directory </w:t>
       </w:r>
       <w:r>
         <w:rPr>
@@ -7028,20 +7004,39 @@
       </w:r>
       <w:r>
         <w:rPr>
+          <w:rFonts w:ascii="Courier New" w:hAnsi="Courier New" w:cs="Courier New"/>
+          <w:lang w:val="en-GB"/>
+        </w:rPr>
+        <w:t>=$OASIS_ENV</w:t>
+      </w:r>
+      <w:r>
+        <w:rPr>
           <w:color w:val="000000" w:themeColor="text1"/>
           <w:lang w:val="en-US" w:eastAsia="fr-FR"/>
         </w:rPr>
         <w:t>”). Currently, CERFACS LENOVO cluster kraken (“</w:t>
       </w:r>
-      <w:proofErr w:type="spellStart"/>
-      <w:r>
-        <w:rPr>
-          <w:rFonts w:ascii="Courier New" w:hAnsi="Courier New" w:cs="Courier New"/>
-          <w:lang w:val="en-GB"/>
-        </w:rPr>
-        <w:t>kraken_intel_impi_openm</w:t>
-      </w:r>
-      <w:proofErr w:type="spellEnd"/>
+      <w:r>
+        <w:rPr>
+          <w:rFonts w:ascii="Courier New" w:hAnsi="Courier New" w:cs="Courier New"/>
+          <w:lang w:val="en-GB"/>
+        </w:rPr>
+        <w:t>=$OASIS_ENV</w:t>
+      </w:r>
+      <w:r>
+        <w:rPr>
+          <w:rFonts w:ascii="Courier New" w:hAnsi="Courier New" w:cs="Courier New"/>
+          <w:lang w:val="en-GB"/>
+        </w:rPr>
+        <w:t>=</w:t>
+      </w:r>
+      <w:r>
+        <w:rPr>
+          <w:rFonts w:ascii="Courier New" w:hAnsi="Courier New" w:cs="Courier New"/>
+          <w:lang w:val="en-GB"/>
+        </w:rPr>
+        <w:t>kraken_intel18.0.1.163_intelmpi2018.1.163</w:t>
+      </w:r>
       <w:r>
         <w:rPr>
           <w:color w:val="000000" w:themeColor="text1"/>
@@ -7081,15 +7076,34 @@
         </w:rPr>
         <w:t xml:space="preserve"> (“</w:t>
       </w:r>
-      <w:proofErr w:type="spellStart"/>
-      <w:r>
-        <w:rPr>
-          <w:rFonts w:ascii="Courier New" w:hAnsi="Courier New" w:cs="Courier New"/>
-          <w:lang w:val="en-GB"/>
-        </w:rPr>
-        <w:t>belenos</w:t>
-      </w:r>
-      <w:proofErr w:type="spellEnd"/>
+      <w:r>
+        <w:rPr>
+          <w:rFonts w:ascii="Courier New" w:hAnsi="Courier New" w:cs="Courier New"/>
+          <w:lang w:val="en-GB"/>
+        </w:rPr>
+        <w:t>=$OASIS_ENV</w:t>
+      </w:r>
+      <w:r>
+        <w:rPr>
+          <w:rFonts w:ascii="Courier New" w:hAnsi="Courier New" w:cs="Courier New"/>
+          <w:lang w:val="en-GB"/>
+        </w:rPr>
+        <w:t xml:space="preserve"> </w:t>
+      </w:r>
+      <w:r>
+        <w:rPr>
+          <w:rFonts w:ascii="Courier New" w:hAnsi="Courier New" w:cs="Courier New"/>
+          <w:lang w:val="en-GB"/>
+        </w:rPr>
+        <w:t>=</w:t>
+      </w:r>
+      <w:r>
+        <w:rPr>
+          <w:rFonts w:ascii="Courier New" w:hAnsi="Courier New" w:cs="Courier New"/>
+          <w:lang w:val="en-GB"/>
+        </w:rPr>
+        <w:t>belenos_intel2018.5.274_intelmpi2018.5.274</w:t>
+      </w:r>
       <w:r>
         <w:rPr>
           <w:color w:val="000000" w:themeColor="text1"/>
@@ -8356,7 +8370,6 @@
         <w:rPr>
           <w:lang w:val="en-GB"/>
         </w:rPr>
-        <w:lastRenderedPageBreak/>
         <w:t xml:space="preserve">Using the running script </w:t>
       </w:r>
       <w:r>
@@ -10343,6 +10356,20 @@
       </w:r>
       <w:r>
         <w:rPr>
+          <w:rFonts w:ascii="Courier New" w:hAnsi="Courier New" w:cs="Courier New"/>
+          <w:lang w:val="en-GB"/>
+        </w:rPr>
+        <w:t>=</w:t>
+      </w:r>
+      <w:r>
+        <w:rPr>
+          <w:rFonts w:ascii="Courier New" w:hAnsi="Courier New" w:cs="Courier New"/>
+          <w:lang w:val="en-GB"/>
+        </w:rPr>
+        <w:t>$OASIS_ENV</w:t>
+      </w:r>
+      <w:r>
+        <w:rPr>
           <w:color w:val="000000" w:themeColor="text1"/>
           <w:lang w:val="en-US" w:eastAsia="fr-FR"/>
         </w:rPr>
@@ -10383,15 +10410,13 @@
         </w:rPr>
         <w:t>(“</w:t>
       </w:r>
-      <w:proofErr w:type="spellStart"/>
-      <w:r>
-        <w:rPr>
-          <w:rFonts w:ascii="Courier New" w:hAnsi="Courier New" w:cs="Courier New"/>
-          <w:lang w:val="en-GB"/>
-        </w:rPr>
-        <w:t>kraken_intel_impi_openm</w:t>
-      </w:r>
-      <w:proofErr w:type="spellEnd"/>
+      <w:r>
+        <w:rPr>
+          <w:rFonts w:ascii="Courier New" w:hAnsi="Courier New" w:cs="Courier New"/>
+          <w:lang w:val="en-GB"/>
+        </w:rPr>
+        <w:t>kraken_intel18.0.1.163_intelmpi2018.1.163</w:t>
+      </w:r>
       <w:r>
         <w:rPr>
           <w:color w:val="000000" w:themeColor="text1"/>
@@ -10452,15 +10477,13 @@
         </w:rPr>
         <w:t>(“</w:t>
       </w:r>
-      <w:proofErr w:type="spellStart"/>
-      <w:r>
-        <w:rPr>
-          <w:rFonts w:ascii="Courier New" w:hAnsi="Courier New" w:cs="Courier New"/>
-          <w:lang w:val="en-GB"/>
-        </w:rPr>
-        <w:t>belenos</w:t>
-      </w:r>
-      <w:proofErr w:type="spellEnd"/>
+      <w:r>
+        <w:rPr>
+          <w:rFonts w:ascii="Courier New" w:hAnsi="Courier New" w:cs="Courier New"/>
+          <w:lang w:val="en-GB"/>
+        </w:rPr>
+        <w:t>belenos_intel2018.5.274_intelmpi2018.5.274</w:t>
+      </w:r>
       <w:r>
         <w:rPr>
           <w:color w:val="000000" w:themeColor="text1"/>
@@ -11845,6 +11868,7 @@
         <w:rPr>
           <w:lang w:val="en-GB"/>
         </w:rPr>
+        <w:lastRenderedPageBreak/>
         <w:t>These options have the following effect:</w:t>
       </w:r>
     </w:p>
@@ -11885,7 +11909,6 @@
           <w:szCs w:val="22"/>
           <w:lang w:val="en-GB"/>
         </w:rPr>
-        <w:lastRenderedPageBreak/>
         <w:t>--</w:t>
       </w:r>
       <w:proofErr w:type="spellStart"/>
@@ -13361,6 +13384,7 @@
         <w:rPr>
           <w:lang w:val="en-GB"/>
         </w:rPr>
+        <w:lastRenderedPageBreak/>
         <w:t xml:space="preserve">If SCRP is used and if </w:t>
       </w:r>
       <w:proofErr w:type="spellStart"/>
@@ -13416,14 +13440,7 @@
         <w:rPr>
           <w:lang w:val="en-GB"/>
         </w:rPr>
-        <w:t xml:space="preserve">f conserv2nd is chosen for an LR grid, the </w:t>
-      </w:r>
-      <w:r>
-        <w:rPr>
-          <w:lang w:val="en-GB"/>
-        </w:rPr>
-        <w:lastRenderedPageBreak/>
-        <w:t>gradients in the longitudinal and latitudinal directions</w:t>
+        <w:t>f conserv2nd is chosen for an LR grid, the gradients in the longitudinal and latitudinal directions</w:t>
       </w:r>
       <w:r>
         <w:rPr>

</xml_diff>